<commit_message>
Add deep RL (numpy DQN) controller, seed-selected on validation paths; stress test includes it; docs updated
Co-Authored-By: Claude Sonnet 5.5 <noreply@anthropic.com>
Claude-Session: https://claude.ai/code/session_01NX2zRNpdVAnzFNKmqomzKu
</commit_message>
<xml_diff>
--- a/docs/RUDP_Final_Project_Report.docx
+++ b/docs/RUDP_Final_Project_Report.docx
@@ -14545,6 +14545,20 @@
           <w:sz w:val="24"/>
           <w:szCs w:val="24"/>
         </w:rPr>
+        <w:t xml:space="preserve">Deep reinforcement learning. The abstract proposed a deep agent, so a neural version was added (web/dqn.py, web/train_deep.py). It is a Deep Q-Network written in numpy: a network with two hidden layers of 32 units reads five continuous inputs (RTT growth, loss fraction, window size, throughput share and the last action) and outputs a value for each of the same five window actions. It learns from a replay buffer with a separate target network, using the same reward, the same no-shrink rule and the same 6,000 simulated training paths as the table agent. Training is not stable: of four random seeds, three produced a good agent and one (seed 12) was slower than AIMD. The agent used here was therefore chosen by its score on 16 separate validation paths, which are not the held-out paths and not the stress paths. On the six held-out paths of Table 11 it was faster than the table on five and equal on one (40 seeds each). On the 48 unseen stress paths its mean delivery time was 3.20 s, against 3.73 s for the table, 3.88 s for the fixed window and 7.16 s for AIMD; it was faster than the table on 19 paths and slower on 6, and faster than AIMD on 27 and slower on 5. The gain over the table is modest, which fits a small state space, and the deep agent is weak on the same tight bottleneck queues as the table agent. It runs only in the Python chat gateway and the simulator; the C implementation (Section 8) still uses the table. All results are from simulation.</w:t>
+      </w:r>
+    </w:p>
+    <w:p>
+      <w:pPr>
+        <w:spacing w:after="120" w:line="360"/>
+        <w:jc w:val="both"/>
+      </w:pPr>
+      <w:r>
+        <w:rPr>
+          <w:rFonts w:ascii="Times New Roman" w:cs="Times New Roman" w:eastAsia="Times New Roman" w:hAnsi="Times New Roman"/>
+          <w:sz w:val="24"/>
+          <w:szCs w:val="24"/>
+        </w:rPr>
         <w:t xml:space="preserve">Smart-RUDP was faster than AIMD on five of the six paths and equal on the sixth, and faster than the fixed window on five paths. The reason is specific: AIMD resets its window to one packet after every timeout, which is expensive when loss is random and not caused by congestion, while the agent learned to hold its window in that case. The advantage is therefore largest on high-loss paths and absent on a clean bottleneck, where there is nothing to learn. These are simulated paths. A real-time check of the gateway with two copies on one machine (four runs per controller) gave a mean of 1.2 s for Smart-RUDP against 2.6 s for AIMD at 10% loss and 40 ms, and 2.3 s against 3.0 s at 2% loss and 100 ms, with the fixed window at 0.8 s and 1.8 s; the run-to-run spread there is large, so those numbers support the direction and not the size of the effect. Section 8 stands as reported: on the 5G-like, lossy and satellite-like paths of that experiment the learned controller did not beat AIMD. </w:t>
       </w:r>
     </w:p>
@@ -14937,7 +14951,7 @@
           <w:sz w:val="24"/>
           <w:szCs w:val="24"/>
         </w:rPr>
-        <w:t xml:space="preserve">A stronger learning agent (more training, richer state, or a deep network as in [9][10]) combined with selective acknowledgments, since the tabular agent here only matched AIMD.</w:t>
+        <w:t xml:space="preserve">Porting the deep agent to the C transport and testing it on the Section 8 scenarios, where the tabular agent only matched AIMD, and combining it with selective acknowledgments.</w:t>
       </w:r>
     </w:p>
     <w:p>

</xml_diff>

<commit_message>
Final docs: baselines, SACK, reordering, confidence intervals in report, deck, notes, manual, cheat sheet, runbook
Co-Authored-By: Claude Sonnet 5.5 <noreply@anthropic.com>
Claude-Session: https://claude.ai/code/session_01NX2zRNpdVAnzFNKmqomzKu
</commit_message>
<xml_diff>
--- a/docs/RUDP_Final_Project_Report.docx
+++ b/docs/RUDP_Final_Project_Report.docx
@@ -9959,8 +9959,739 @@
           <w:sz w:val="24"/>
           <w:szCs w:val="24"/>
         </w:rPr>
-        <w:t xml:space="preserve">Smart-RUDP did not beat the baseline on completion time. It was slower on the 5G-like and satellite-like paths (by about 63% and 10%) and equal within noise on the lossy path. It sent fewer retransmissions on the 5G-like and satellite-like paths and had a slightly lower mean RTT, but the retransmission differences are within one standard deviation across runs and should not be treated as significant. The result is reported as obtained: with a tabular agent, 40 training episodes per scenario and six evaluation runs, learning-based control matched but did not outperform a well-tuned rule on these paths.</w:t>
-      </w:r>
+        <w:t xml:space="preserve">Smart-RUDP did not beat the baseline on completion time. With six runs it was slower on the 5G-like and satellite-like paths (by about 63% and 10%) and equal within noise on the lossy path; a repeat with 20 runs per mode (Table 8b) gave tighter intervals and confirms the same pattern, with a larger satellite gap. It sent fewer retransmissions on the 5G-like and satellite-like paths and had a slightly lower mean RTT, but the retransmission differences are within one standard deviation across runs and should not be treated as significant. The result is reported as obtained: with a tabular agent, 40 training episodes per scenario and six evaluation runs, learning-based control matched but did not outperform a well-tuned rule on these paths.</w:t>
+      </w:r>
+    </w:p>
+    <w:p>
+      <w:pPr>
+        <w:keepNext/>
+        <w:spacing w:after="80" w:before="120"/>
+        <w:jc w:val="center"/>
+      </w:pPr>
+      <w:r>
+        <w:rPr>
+          <w:rFonts w:ascii="Times New Roman" w:cs="Times New Roman" w:eastAsia="Times New Roman" w:hAnsi="Times New Roman"/>
+          <w:b/>
+          <w:bCs/>
+          <w:sz w:val="24"/>
+          <w:szCs w:val="24"/>
+        </w:rPr>
+        <w:t xml:space="preserve">Table 8b: Mean of 20 runs per mode and scenario with 95% confidence intervals (frozen Q-tables, 1,200 packets, seeds 2001 to 2020; scripts eval_ci.sh and ci_summary.py)</w:t>
+      </w:r>
+    </w:p>
+    <w:tbl>
+      <w:tblPr>
+        <w:tblW w:type="dxa" w:w="9026"/>
+        <w:tblBorders>
+          <w:top w:val="single" w:color="auto" w:sz="4"/>
+          <w:left w:val="single" w:color="auto" w:sz="4"/>
+          <w:bottom w:val="single" w:color="auto" w:sz="4"/>
+          <w:right w:val="single" w:color="auto" w:sz="4"/>
+          <w:insideH w:val="single" w:color="auto" w:sz="4"/>
+          <w:insideV w:val="single" w:color="auto" w:sz="4"/>
+        </w:tblBorders>
+      </w:tblPr>
+      <w:tblGrid>
+        <w:gridCol w:w="1900"/>
+        <w:gridCol w:w="1500"/>
+        <w:gridCol w:w="1500"/>
+        <w:gridCol w:w="1900"/>
+        <w:gridCol w:w="2226"/>
+      </w:tblGrid>
+      <w:tr>
+        <w:trPr>
+          <w:cantSplit/>
+          <w:tblHeader/>
+        </w:trPr>
+        <w:tc>
+          <w:tcPr>
+            <w:tcW w:type="dxa" w:w="1900"/>
+            <w:tcBorders>
+              <w:top w:val="single" w:color="000000" w:sz="4"/>
+              <w:left w:val="single" w:color="000000" w:sz="4"/>
+              <w:bottom w:val="single" w:color="000000" w:sz="4"/>
+              <w:right w:val="single" w:color="000000" w:sz="4"/>
+            </w:tcBorders>
+            <w:shd w:fill="D9D9D9" w:color="auto" w:val="clear"/>
+            <w:tcMar>
+              <w:top w:type="dxa" w:w="60"/>
+              <w:left w:type="dxa" w:w="100"/>
+              <w:bottom w:type="dxa" w:w="60"/>
+              <w:right w:type="dxa" w:w="100"/>
+            </w:tcMar>
+          </w:tcPr>
+          <w:p>
+            <w:pPr>
+              <w:spacing w:line="276"/>
+              <w:jc w:val="left"/>
+            </w:pPr>
+            <w:r>
+              <w:rPr>
+                <w:rFonts w:ascii="Times New Roman" w:cs="Times New Roman" w:eastAsia="Times New Roman" w:hAnsi="Times New Roman"/>
+                <w:b/>
+                <w:bCs/>
+                <w:sz w:val="24"/>
+                <w:szCs w:val="24"/>
+              </w:rPr>
+              <w:t xml:space="preserve">Scenario</w:t>
+            </w:r>
+          </w:p>
+        </w:tc>
+        <w:tc>
+          <w:tcPr>
+            <w:tcW w:type="dxa" w:w="1500"/>
+            <w:tcBorders>
+              <w:top w:val="single" w:color="000000" w:sz="4"/>
+              <w:left w:val="single" w:color="000000" w:sz="4"/>
+              <w:bottom w:val="single" w:color="000000" w:sz="4"/>
+              <w:right w:val="single" w:color="000000" w:sz="4"/>
+            </w:tcBorders>
+            <w:shd w:fill="D9D9D9" w:color="auto" w:val="clear"/>
+            <w:tcMar>
+              <w:top w:type="dxa" w:w="60"/>
+              <w:left w:type="dxa" w:w="100"/>
+              <w:bottom w:type="dxa" w:w="60"/>
+              <w:right w:type="dxa" w:w="100"/>
+            </w:tcMar>
+          </w:tcPr>
+          <w:p>
+            <w:pPr>
+              <w:spacing w:line="276"/>
+              <w:jc w:val="left"/>
+            </w:pPr>
+            <w:r>
+              <w:rPr>
+                <w:rFonts w:ascii="Times New Roman" w:cs="Times New Roman" w:eastAsia="Times New Roman" w:hAnsi="Times New Roman"/>
+                <w:b/>
+                <w:bCs/>
+                <w:sz w:val="24"/>
+                <w:szCs w:val="24"/>
+              </w:rPr>
+              <w:t xml:space="preserve">AIMD time (s)</w:t>
+            </w:r>
+          </w:p>
+        </w:tc>
+        <w:tc>
+          <w:tcPr>
+            <w:tcW w:type="dxa" w:w="1500"/>
+            <w:tcBorders>
+              <w:top w:val="single" w:color="000000" w:sz="4"/>
+              <w:left w:val="single" w:color="000000" w:sz="4"/>
+              <w:bottom w:val="single" w:color="000000" w:sz="4"/>
+              <w:right w:val="single" w:color="000000" w:sz="4"/>
+            </w:tcBorders>
+            <w:shd w:fill="D9D9D9" w:color="auto" w:val="clear"/>
+            <w:tcMar>
+              <w:top w:type="dxa" w:w="60"/>
+              <w:left w:type="dxa" w:w="100"/>
+              <w:bottom w:type="dxa" w:w="60"/>
+              <w:right w:type="dxa" w:w="100"/>
+            </w:tcMar>
+          </w:tcPr>
+          <w:p>
+            <w:pPr>
+              <w:spacing w:line="276"/>
+              <w:jc w:val="left"/>
+            </w:pPr>
+            <w:r>
+              <w:rPr>
+                <w:rFonts w:ascii="Times New Roman" w:cs="Times New Roman" w:eastAsia="Times New Roman" w:hAnsi="Times New Roman"/>
+                <w:b/>
+                <w:bCs/>
+                <w:sz w:val="24"/>
+                <w:szCs w:val="24"/>
+              </w:rPr>
+              <w:t xml:space="preserve">Smart time (s)</w:t>
+            </w:r>
+          </w:p>
+        </w:tc>
+        <w:tc>
+          <w:tcPr>
+            <w:tcW w:type="dxa" w:w="1900"/>
+            <w:tcBorders>
+              <w:top w:val="single" w:color="000000" w:sz="4"/>
+              <w:left w:val="single" w:color="000000" w:sz="4"/>
+              <w:bottom w:val="single" w:color="000000" w:sz="4"/>
+              <w:right w:val="single" w:color="000000" w:sz="4"/>
+            </w:tcBorders>
+            <w:shd w:fill="D9D9D9" w:color="auto" w:val="clear"/>
+            <w:tcMar>
+              <w:top w:type="dxa" w:w="60"/>
+              <w:left w:type="dxa" w:w="100"/>
+              <w:bottom w:type="dxa" w:w="60"/>
+              <w:right w:type="dxa" w:w="100"/>
+            </w:tcMar>
+          </w:tcPr>
+          <w:p>
+            <w:pPr>
+              <w:spacing w:line="276"/>
+              <w:jc w:val="left"/>
+            </w:pPr>
+            <w:r>
+              <w:rPr>
+                <w:rFonts w:ascii="Times New Roman" w:cs="Times New Roman" w:eastAsia="Times New Roman" w:hAnsi="Times New Roman"/>
+                <w:b/>
+                <w:bCs/>
+                <w:sz w:val="24"/>
+                <w:szCs w:val="24"/>
+              </w:rPr>
+              <w:t xml:space="preserve">Paired difference (s)</w:t>
+            </w:r>
+          </w:p>
+        </w:tc>
+        <w:tc>
+          <w:tcPr>
+            <w:tcW w:type="dxa" w:w="2226"/>
+            <w:tcBorders>
+              <w:top w:val="single" w:color="000000" w:sz="4"/>
+              <w:left w:val="single" w:color="000000" w:sz="4"/>
+              <w:bottom w:val="single" w:color="000000" w:sz="4"/>
+              <w:right w:val="single" w:color="000000" w:sz="4"/>
+            </w:tcBorders>
+            <w:shd w:fill="D9D9D9" w:color="auto" w:val="clear"/>
+            <w:tcMar>
+              <w:top w:type="dxa" w:w="60"/>
+              <w:left w:type="dxa" w:w="100"/>
+              <w:bottom w:type="dxa" w:w="60"/>
+              <w:right w:type="dxa" w:w="100"/>
+            </w:tcMar>
+          </w:tcPr>
+          <w:p>
+            <w:pPr>
+              <w:spacing w:line="276"/>
+              <w:jc w:val="left"/>
+            </w:pPr>
+            <w:r>
+              <w:rPr>
+                <w:rFonts w:ascii="Times New Roman" w:cs="Times New Roman" w:eastAsia="Times New Roman" w:hAnsi="Times New Roman"/>
+                <w:b/>
+                <w:bCs/>
+                <w:sz w:val="24"/>
+                <w:szCs w:val="24"/>
+              </w:rPr>
+              <w:t xml:space="preserve">Significant?</w:t>
+            </w:r>
+          </w:p>
+        </w:tc>
+      </w:tr>
+      <w:tr>
+        <w:trPr>
+          <w:cantSplit/>
+          <w:tblHeader w:val="false"/>
+        </w:trPr>
+        <w:tc>
+          <w:tcPr>
+            <w:tcW w:type="dxa" w:w="1900"/>
+            <w:tcBorders>
+              <w:top w:val="single" w:color="000000" w:sz="4"/>
+              <w:left w:val="single" w:color="000000" w:sz="4"/>
+              <w:bottom w:val="single" w:color="000000" w:sz="4"/>
+              <w:right w:val="single" w:color="000000" w:sz="4"/>
+            </w:tcBorders>
+            <w:tcMar>
+              <w:top w:type="dxa" w:w="60"/>
+              <w:left w:type="dxa" w:w="100"/>
+              <w:bottom w:type="dxa" w:w="60"/>
+              <w:right w:type="dxa" w:w="100"/>
+            </w:tcMar>
+          </w:tcPr>
+          <w:p>
+            <w:pPr>
+              <w:spacing w:line="276"/>
+              <w:jc w:val="left"/>
+            </w:pPr>
+            <w:r>
+              <w:rPr>
+                <w:rFonts w:ascii="Times New Roman" w:cs="Times New Roman" w:eastAsia="Times New Roman" w:hAnsi="Times New Roman"/>
+                <w:b w:val="false"/>
+                <w:bCs w:val="false"/>
+                <w:sz w:val="24"/>
+                <w:szCs w:val="24"/>
+              </w:rPr>
+              <w:t xml:space="preserve">5G-like</w:t>
+            </w:r>
+          </w:p>
+        </w:tc>
+        <w:tc>
+          <w:tcPr>
+            <w:tcW w:type="dxa" w:w="1500"/>
+            <w:tcBorders>
+              <w:top w:val="single" w:color="000000" w:sz="4"/>
+              <w:left w:val="single" w:color="000000" w:sz="4"/>
+              <w:bottom w:val="single" w:color="000000" w:sz="4"/>
+              <w:right w:val="single" w:color="000000" w:sz="4"/>
+            </w:tcBorders>
+            <w:tcMar>
+              <w:top w:type="dxa" w:w="60"/>
+              <w:left w:type="dxa" w:w="100"/>
+              <w:bottom w:type="dxa" w:w="60"/>
+              <w:right w:type="dxa" w:w="100"/>
+            </w:tcMar>
+          </w:tcPr>
+          <w:p>
+            <w:pPr>
+              <w:spacing w:line="276"/>
+              <w:jc w:val="left"/>
+            </w:pPr>
+            <w:r>
+              <w:rPr>
+                <w:rFonts w:ascii="Times New Roman" w:cs="Times New Roman" w:eastAsia="Times New Roman" w:hAnsi="Times New Roman"/>
+                <w:b w:val="false"/>
+                <w:bCs w:val="false"/>
+                <w:sz w:val="24"/>
+                <w:szCs w:val="24"/>
+              </w:rPr>
+              <w:t xml:space="preserve">1.36 +/- 0.09</w:t>
+            </w:r>
+          </w:p>
+        </w:tc>
+        <w:tc>
+          <w:tcPr>
+            <w:tcW w:type="dxa" w:w="1500"/>
+            <w:tcBorders>
+              <w:top w:val="single" w:color="000000" w:sz="4"/>
+              <w:left w:val="single" w:color="000000" w:sz="4"/>
+              <w:bottom w:val="single" w:color="000000" w:sz="4"/>
+              <w:right w:val="single" w:color="000000" w:sz="4"/>
+            </w:tcBorders>
+            <w:tcMar>
+              <w:top w:type="dxa" w:w="60"/>
+              <w:left w:type="dxa" w:w="100"/>
+              <w:bottom w:type="dxa" w:w="60"/>
+              <w:right w:type="dxa" w:w="100"/>
+            </w:tcMar>
+          </w:tcPr>
+          <w:p>
+            <w:pPr>
+              <w:spacing w:line="276"/>
+              <w:jc w:val="left"/>
+            </w:pPr>
+            <w:r>
+              <w:rPr>
+                <w:rFonts w:ascii="Times New Roman" w:cs="Times New Roman" w:eastAsia="Times New Roman" w:hAnsi="Times New Roman"/>
+                <w:b w:val="false"/>
+                <w:bCs w:val="false"/>
+                <w:sz w:val="24"/>
+                <w:szCs w:val="24"/>
+              </w:rPr>
+              <w:t xml:space="preserve">2.29 +/- 0.06</w:t>
+            </w:r>
+          </w:p>
+        </w:tc>
+        <w:tc>
+          <w:tcPr>
+            <w:tcW w:type="dxa" w:w="1900"/>
+            <w:tcBorders>
+              <w:top w:val="single" w:color="000000" w:sz="4"/>
+              <w:left w:val="single" w:color="000000" w:sz="4"/>
+              <w:bottom w:val="single" w:color="000000" w:sz="4"/>
+              <w:right w:val="single" w:color="000000" w:sz="4"/>
+            </w:tcBorders>
+            <w:tcMar>
+              <w:top w:type="dxa" w:w="60"/>
+              <w:left w:type="dxa" w:w="100"/>
+              <w:bottom w:type="dxa" w:w="60"/>
+              <w:right w:type="dxa" w:w="100"/>
+            </w:tcMar>
+          </w:tcPr>
+          <w:p>
+            <w:pPr>
+              <w:spacing w:line="276"/>
+              <w:jc w:val="left"/>
+            </w:pPr>
+            <w:r>
+              <w:rPr>
+                <w:rFonts w:ascii="Times New Roman" w:cs="Times New Roman" w:eastAsia="Times New Roman" w:hAnsi="Times New Roman"/>
+                <w:b w:val="false"/>
+                <w:bCs w:val="false"/>
+                <w:sz w:val="24"/>
+                <w:szCs w:val="24"/>
+              </w:rPr>
+              <w:t xml:space="preserve">+0.92 +/- 0.12</w:t>
+            </w:r>
+          </w:p>
+        </w:tc>
+        <w:tc>
+          <w:tcPr>
+            <w:tcW w:type="dxa" w:w="2226"/>
+            <w:tcBorders>
+              <w:top w:val="single" w:color="000000" w:sz="4"/>
+              <w:left w:val="single" w:color="000000" w:sz="4"/>
+              <w:bottom w:val="single" w:color="000000" w:sz="4"/>
+              <w:right w:val="single" w:color="000000" w:sz="4"/>
+            </w:tcBorders>
+            <w:tcMar>
+              <w:top w:type="dxa" w:w="60"/>
+              <w:left w:type="dxa" w:w="100"/>
+              <w:bottom w:type="dxa" w:w="60"/>
+              <w:right w:type="dxa" w:w="100"/>
+            </w:tcMar>
+          </w:tcPr>
+          <w:p>
+            <w:pPr>
+              <w:spacing w:line="276"/>
+              <w:jc w:val="left"/>
+            </w:pPr>
+            <w:r>
+              <w:rPr>
+                <w:rFonts w:ascii="Times New Roman" w:cs="Times New Roman" w:eastAsia="Times New Roman" w:hAnsi="Times New Roman"/>
+                <w:b w:val="false"/>
+                <w:bCs w:val="false"/>
+                <w:sz w:val="24"/>
+                <w:szCs w:val="24"/>
+              </w:rPr>
+              <w:t xml:space="preserve">yes, slower</w:t>
+            </w:r>
+          </w:p>
+        </w:tc>
+      </w:tr>
+      <w:tr>
+        <w:trPr>
+          <w:cantSplit/>
+          <w:tblHeader w:val="false"/>
+        </w:trPr>
+        <w:tc>
+          <w:tcPr>
+            <w:tcW w:type="dxa" w:w="1900"/>
+            <w:tcBorders>
+              <w:top w:val="single" w:color="000000" w:sz="4"/>
+              <w:left w:val="single" w:color="000000" w:sz="4"/>
+              <w:bottom w:val="single" w:color="000000" w:sz="4"/>
+              <w:right w:val="single" w:color="000000" w:sz="4"/>
+            </w:tcBorders>
+            <w:tcMar>
+              <w:top w:type="dxa" w:w="60"/>
+              <w:left w:type="dxa" w:w="100"/>
+              <w:bottom w:type="dxa" w:w="60"/>
+              <w:right w:type="dxa" w:w="100"/>
+            </w:tcMar>
+          </w:tcPr>
+          <w:p>
+            <w:pPr>
+              <w:spacing w:line="276"/>
+              <w:jc w:val="left"/>
+            </w:pPr>
+            <w:r>
+              <w:rPr>
+                <w:rFonts w:ascii="Times New Roman" w:cs="Times New Roman" w:eastAsia="Times New Roman" w:hAnsi="Times New Roman"/>
+                <w:b w:val="false"/>
+                <w:bCs w:val="false"/>
+                <w:sz w:val="24"/>
+                <w:szCs w:val="24"/>
+              </w:rPr>
+              <w:t xml:space="preserve">Lossy wireless</w:t>
+            </w:r>
+          </w:p>
+        </w:tc>
+        <w:tc>
+          <w:tcPr>
+            <w:tcW w:type="dxa" w:w="1500"/>
+            <w:tcBorders>
+              <w:top w:val="single" w:color="000000" w:sz="4"/>
+              <w:left w:val="single" w:color="000000" w:sz="4"/>
+              <w:bottom w:val="single" w:color="000000" w:sz="4"/>
+              <w:right w:val="single" w:color="000000" w:sz="4"/>
+            </w:tcBorders>
+            <w:tcMar>
+              <w:top w:type="dxa" w:w="60"/>
+              <w:left w:type="dxa" w:w="100"/>
+              <w:bottom w:type="dxa" w:w="60"/>
+              <w:right w:type="dxa" w:w="100"/>
+            </w:tcMar>
+          </w:tcPr>
+          <w:p>
+            <w:pPr>
+              <w:spacing w:line="276"/>
+              <w:jc w:val="left"/>
+            </w:pPr>
+            <w:r>
+              <w:rPr>
+                <w:rFonts w:ascii="Times New Roman" w:cs="Times New Roman" w:eastAsia="Times New Roman" w:hAnsi="Times New Roman"/>
+                <w:b w:val="false"/>
+                <w:bCs w:val="false"/>
+                <w:sz w:val="24"/>
+                <w:szCs w:val="24"/>
+              </w:rPr>
+              <w:t xml:space="preserve">9.27 +/- 0.54</w:t>
+            </w:r>
+          </w:p>
+        </w:tc>
+        <w:tc>
+          <w:tcPr>
+            <w:tcW w:type="dxa" w:w="1500"/>
+            <w:tcBorders>
+              <w:top w:val="single" w:color="000000" w:sz="4"/>
+              <w:left w:val="single" w:color="000000" w:sz="4"/>
+              <w:bottom w:val="single" w:color="000000" w:sz="4"/>
+              <w:right w:val="single" w:color="000000" w:sz="4"/>
+            </w:tcBorders>
+            <w:tcMar>
+              <w:top w:type="dxa" w:w="60"/>
+              <w:left w:type="dxa" w:w="100"/>
+              <w:bottom w:type="dxa" w:w="60"/>
+              <w:right w:type="dxa" w:w="100"/>
+            </w:tcMar>
+          </w:tcPr>
+          <w:p>
+            <w:pPr>
+              <w:spacing w:line="276"/>
+              <w:jc w:val="left"/>
+            </w:pPr>
+            <w:r>
+              <w:rPr>
+                <w:rFonts w:ascii="Times New Roman" w:cs="Times New Roman" w:eastAsia="Times New Roman" w:hAnsi="Times New Roman"/>
+                <w:b w:val="false"/>
+                <w:bCs w:val="false"/>
+                <w:sz w:val="24"/>
+                <w:szCs w:val="24"/>
+              </w:rPr>
+              <w:t xml:space="preserve">8.90 +/- 0.46</w:t>
+            </w:r>
+          </w:p>
+        </w:tc>
+        <w:tc>
+          <w:tcPr>
+            <w:tcW w:type="dxa" w:w="1900"/>
+            <w:tcBorders>
+              <w:top w:val="single" w:color="000000" w:sz="4"/>
+              <w:left w:val="single" w:color="000000" w:sz="4"/>
+              <w:bottom w:val="single" w:color="000000" w:sz="4"/>
+              <w:right w:val="single" w:color="000000" w:sz="4"/>
+            </w:tcBorders>
+            <w:tcMar>
+              <w:top w:type="dxa" w:w="60"/>
+              <w:left w:type="dxa" w:w="100"/>
+              <w:bottom w:type="dxa" w:w="60"/>
+              <w:right w:type="dxa" w:w="100"/>
+            </w:tcMar>
+          </w:tcPr>
+          <w:p>
+            <w:pPr>
+              <w:spacing w:line="276"/>
+              <w:jc w:val="left"/>
+            </w:pPr>
+            <w:r>
+              <w:rPr>
+                <w:rFonts w:ascii="Times New Roman" w:cs="Times New Roman" w:eastAsia="Times New Roman" w:hAnsi="Times New Roman"/>
+                <w:b w:val="false"/>
+                <w:bCs w:val="false"/>
+                <w:sz w:val="24"/>
+                <w:szCs w:val="24"/>
+              </w:rPr>
+              <w:t xml:space="preserve">-0.37 +/- 0.45</w:t>
+            </w:r>
+          </w:p>
+        </w:tc>
+        <w:tc>
+          <w:tcPr>
+            <w:tcW w:type="dxa" w:w="2226"/>
+            <w:tcBorders>
+              <w:top w:val="single" w:color="000000" w:sz="4"/>
+              <w:left w:val="single" w:color="000000" w:sz="4"/>
+              <w:bottom w:val="single" w:color="000000" w:sz="4"/>
+              <w:right w:val="single" w:color="000000" w:sz="4"/>
+            </w:tcBorders>
+            <w:tcMar>
+              <w:top w:type="dxa" w:w="60"/>
+              <w:left w:type="dxa" w:w="100"/>
+              <w:bottom w:type="dxa" w:w="60"/>
+              <w:right w:type="dxa" w:w="100"/>
+            </w:tcMar>
+          </w:tcPr>
+          <w:p>
+            <w:pPr>
+              <w:spacing w:line="276"/>
+              <w:jc w:val="left"/>
+            </w:pPr>
+            <w:r>
+              <w:rPr>
+                <w:rFonts w:ascii="Times New Roman" w:cs="Times New Roman" w:eastAsia="Times New Roman" w:hAnsi="Times New Roman"/>
+                <w:b w:val="false"/>
+                <w:bCs w:val="false"/>
+                <w:sz w:val="24"/>
+                <w:szCs w:val="24"/>
+              </w:rPr>
+              <w:t xml:space="preserve">no (tie)</w:t>
+            </w:r>
+          </w:p>
+        </w:tc>
+      </w:tr>
+      <w:tr>
+        <w:trPr>
+          <w:cantSplit/>
+          <w:tblHeader w:val="false"/>
+        </w:trPr>
+        <w:tc>
+          <w:tcPr>
+            <w:tcW w:type="dxa" w:w="1900"/>
+            <w:tcBorders>
+              <w:top w:val="single" w:color="000000" w:sz="4"/>
+              <w:left w:val="single" w:color="000000" w:sz="4"/>
+              <w:bottom w:val="single" w:color="000000" w:sz="4"/>
+              <w:right w:val="single" w:color="000000" w:sz="4"/>
+            </w:tcBorders>
+            <w:tcMar>
+              <w:top w:type="dxa" w:w="60"/>
+              <w:left w:type="dxa" w:w="100"/>
+              <w:bottom w:type="dxa" w:w="60"/>
+              <w:right w:type="dxa" w:w="100"/>
+            </w:tcMar>
+          </w:tcPr>
+          <w:p>
+            <w:pPr>
+              <w:spacing w:line="276"/>
+              <w:jc w:val="left"/>
+            </w:pPr>
+            <w:r>
+              <w:rPr>
+                <w:rFonts w:ascii="Times New Roman" w:cs="Times New Roman" w:eastAsia="Times New Roman" w:hAnsi="Times New Roman"/>
+                <w:b w:val="false"/>
+                <w:bCs w:val="false"/>
+                <w:sz w:val="24"/>
+                <w:szCs w:val="24"/>
+              </w:rPr>
+              <w:t xml:space="preserve">Satellite-like</w:t>
+            </w:r>
+          </w:p>
+        </w:tc>
+        <w:tc>
+          <w:tcPr>
+            <w:tcW w:type="dxa" w:w="1500"/>
+            <w:tcBorders>
+              <w:top w:val="single" w:color="000000" w:sz="4"/>
+              <w:left w:val="single" w:color="000000" w:sz="4"/>
+              <w:bottom w:val="single" w:color="000000" w:sz="4"/>
+              <w:right w:val="single" w:color="000000" w:sz="4"/>
+            </w:tcBorders>
+            <w:tcMar>
+              <w:top w:type="dxa" w:w="60"/>
+              <w:left w:type="dxa" w:w="100"/>
+              <w:bottom w:type="dxa" w:w="60"/>
+              <w:right w:type="dxa" w:w="100"/>
+            </w:tcMar>
+          </w:tcPr>
+          <w:p>
+            <w:pPr>
+              <w:spacing w:line="276"/>
+              <w:jc w:val="left"/>
+            </w:pPr>
+            <w:r>
+              <w:rPr>
+                <w:rFonts w:ascii="Times New Roman" w:cs="Times New Roman" w:eastAsia="Times New Roman" w:hAnsi="Times New Roman"/>
+                <w:b w:val="false"/>
+                <w:bCs w:val="false"/>
+                <w:sz w:val="24"/>
+                <w:szCs w:val="24"/>
+              </w:rPr>
+              <w:t xml:space="preserve">19.14 +/- 1.75</w:t>
+            </w:r>
+          </w:p>
+        </w:tc>
+        <w:tc>
+          <w:tcPr>
+            <w:tcW w:type="dxa" w:w="1500"/>
+            <w:tcBorders>
+              <w:top w:val="single" w:color="000000" w:sz="4"/>
+              <w:left w:val="single" w:color="000000" w:sz="4"/>
+              <w:bottom w:val="single" w:color="000000" w:sz="4"/>
+              <w:right w:val="single" w:color="000000" w:sz="4"/>
+            </w:tcBorders>
+            <w:tcMar>
+              <w:top w:type="dxa" w:w="60"/>
+              <w:left w:type="dxa" w:w="100"/>
+              <w:bottom w:type="dxa" w:w="60"/>
+              <w:right w:type="dxa" w:w="100"/>
+            </w:tcMar>
+          </w:tcPr>
+          <w:p>
+            <w:pPr>
+              <w:spacing w:line="276"/>
+              <w:jc w:val="left"/>
+            </w:pPr>
+            <w:r>
+              <w:rPr>
+                <w:rFonts w:ascii="Times New Roman" w:cs="Times New Roman" w:eastAsia="Times New Roman" w:hAnsi="Times New Roman"/>
+                <w:b w:val="false"/>
+                <w:bCs w:val="false"/>
+                <w:sz w:val="24"/>
+                <w:szCs w:val="24"/>
+              </w:rPr>
+              <w:t xml:space="preserve">25.46 +/- 1.22</w:t>
+            </w:r>
+          </w:p>
+        </w:tc>
+        <w:tc>
+          <w:tcPr>
+            <w:tcW w:type="dxa" w:w="1900"/>
+            <w:tcBorders>
+              <w:top w:val="single" w:color="000000" w:sz="4"/>
+              <w:left w:val="single" w:color="000000" w:sz="4"/>
+              <w:bottom w:val="single" w:color="000000" w:sz="4"/>
+              <w:right w:val="single" w:color="000000" w:sz="4"/>
+            </w:tcBorders>
+            <w:tcMar>
+              <w:top w:type="dxa" w:w="60"/>
+              <w:left w:type="dxa" w:w="100"/>
+              <w:bottom w:type="dxa" w:w="60"/>
+              <w:right w:type="dxa" w:w="100"/>
+            </w:tcMar>
+          </w:tcPr>
+          <w:p>
+            <w:pPr>
+              <w:spacing w:line="276"/>
+              <w:jc w:val="left"/>
+            </w:pPr>
+            <w:r>
+              <w:rPr>
+                <w:rFonts w:ascii="Times New Roman" w:cs="Times New Roman" w:eastAsia="Times New Roman" w:hAnsi="Times New Roman"/>
+                <w:b w:val="false"/>
+                <w:bCs w:val="false"/>
+                <w:sz w:val="24"/>
+                <w:szCs w:val="24"/>
+              </w:rPr>
+              <w:t xml:space="preserve">+6.31 +/- 2.24</w:t>
+            </w:r>
+          </w:p>
+        </w:tc>
+        <w:tc>
+          <w:tcPr>
+            <w:tcW w:type="dxa" w:w="2226"/>
+            <w:tcBorders>
+              <w:top w:val="single" w:color="000000" w:sz="4"/>
+              <w:left w:val="single" w:color="000000" w:sz="4"/>
+              <w:bottom w:val="single" w:color="000000" w:sz="4"/>
+              <w:right w:val="single" w:color="000000" w:sz="4"/>
+            </w:tcBorders>
+            <w:tcMar>
+              <w:top w:type="dxa" w:w="60"/>
+              <w:left w:type="dxa" w:w="100"/>
+              <w:bottom w:type="dxa" w:w="60"/>
+              <w:right w:type="dxa" w:w="100"/>
+            </w:tcMar>
+          </w:tcPr>
+          <w:p>
+            <w:pPr>
+              <w:spacing w:line="276"/>
+              <w:jc w:val="left"/>
+            </w:pPr>
+            <w:r>
+              <w:rPr>
+                <w:rFonts w:ascii="Times New Roman" w:cs="Times New Roman" w:eastAsia="Times New Roman" w:hAnsi="Times New Roman"/>
+                <w:b w:val="false"/>
+                <w:bCs w:val="false"/>
+                <w:sz w:val="24"/>
+                <w:szCs w:val="24"/>
+              </w:rPr>
+              <w:t xml:space="preserve">yes, slower</w:t>
+            </w:r>
+          </w:p>
+        </w:tc>
+      </w:tr>
+    </w:tbl>
+    <w:p>
+      <w:pPr>
+        <w:spacing w:after="160"/>
+      </w:pPr>
     </w:p>
     <w:p>
       <w:pPr>
@@ -10193,7 +10924,7 @@
           <w:sz w:val="24"/>
           <w:szCs w:val="24"/>
         </w:rPr>
-        <w:t xml:space="preserve">The emulated path keeps packets in order, so reordering was not tested. The TCP and plain-UDP comparisons proposed in the Smart-RUDP abstract were not run.</w:t>
+        <w:t xml:space="preserve">The emulated path in the C program keeps packets in order, so reordering was tested only in the Python simulator (Section 11). A TCP model and plain UDP were compared in simulation; real kernel TCP over an impaired path was not run because the build environment has no tc/netem (a script, netem_baselines.sh, is provided for a Linux machine).</w:t>
       </w:r>
     </w:p>
     <w:p>
@@ -14559,6 +15290,2292 @@
           <w:sz w:val="24"/>
           <w:szCs w:val="24"/>
         </w:rPr>
+        <w:t xml:space="preserve">Baselines: plain UDP and TCP. The abstract also proposed TCP and plain-UDP baselines. Plain UDP and a model of TCP were run on the same 48 stress paths (web/baselines.py). The TCP model has slow start, congestion avoidance, fast recovery with selective acknowledgments and a retransmission timer after RFC 6298, with the same initial window of 10 and cap of 32 as the chat. It is a model of TCP, not the kernel stack. Plain UDP delivered on average 68% of the messages and delivered every message on only 4 of the 48 paths, which is the reason reliability is needed. Table 12 gives the times.</w:t>
+      </w:r>
+    </w:p>
+    <w:p>
+      <w:pPr>
+        <w:keepNext/>
+        <w:spacing w:after="80" w:before="120"/>
+        <w:jc w:val="center"/>
+      </w:pPr>
+      <w:r>
+        <w:rPr>
+          <w:rFonts w:ascii="Times New Roman" w:cs="Times New Roman" w:eastAsia="Times New Roman" w:hAnsi="Times New Roman"/>
+          <w:b/>
+          <w:bCs/>
+          <w:sz w:val="24"/>
+          <w:szCs w:val="24"/>
+        </w:rPr>
+        <w:t xml:space="preserve">Table 12: 48 unseen random paths, 3 seeds each, simulated, 60 messages unless the path says otherwise</w:t>
+      </w:r>
+    </w:p>
+    <w:tbl>
+      <w:tblPr>
+        <w:tblW w:type="dxa" w:w="9026"/>
+        <w:tblBorders>
+          <w:top w:val="single" w:color="auto" w:sz="4"/>
+          <w:left w:val="single" w:color="auto" w:sz="4"/>
+          <w:bottom w:val="single" w:color="auto" w:sz="4"/>
+          <w:right w:val="single" w:color="auto" w:sz="4"/>
+          <w:insideH w:val="single" w:color="auto" w:sz="4"/>
+          <w:insideV w:val="single" w:color="auto" w:sz="4"/>
+        </w:tblBorders>
+      </w:tblPr>
+      <w:tblGrid>
+        <w:gridCol w:w="3200"/>
+        <w:gridCol w:w="1900"/>
+        <w:gridCol w:w="1900"/>
+        <w:gridCol w:w="2026"/>
+      </w:tblGrid>
+      <w:tr>
+        <w:trPr>
+          <w:cantSplit/>
+          <w:tblHeader/>
+        </w:trPr>
+        <w:tc>
+          <w:tcPr>
+            <w:tcW w:type="dxa" w:w="3200"/>
+            <w:tcBorders>
+              <w:top w:val="single" w:color="000000" w:sz="4"/>
+              <w:left w:val="single" w:color="000000" w:sz="4"/>
+              <w:bottom w:val="single" w:color="000000" w:sz="4"/>
+              <w:right w:val="single" w:color="000000" w:sz="4"/>
+            </w:tcBorders>
+            <w:shd w:fill="D9D9D9" w:color="auto" w:val="clear"/>
+            <w:tcMar>
+              <w:top w:type="dxa" w:w="60"/>
+              <w:left w:type="dxa" w:w="100"/>
+              <w:bottom w:type="dxa" w:w="60"/>
+              <w:right w:type="dxa" w:w="100"/>
+            </w:tcMar>
+          </w:tcPr>
+          <w:p>
+            <w:pPr>
+              <w:spacing w:line="276"/>
+              <w:jc w:val="left"/>
+            </w:pPr>
+            <w:r>
+              <w:rPr>
+                <w:rFonts w:ascii="Times New Roman" w:cs="Times New Roman" w:eastAsia="Times New Roman" w:hAnsi="Times New Roman"/>
+                <w:b/>
+                <w:bCs/>
+                <w:sz w:val="24"/>
+                <w:szCs w:val="24"/>
+              </w:rPr>
+              <w:t xml:space="preserve">Transport / controller</w:t>
+            </w:r>
+          </w:p>
+        </w:tc>
+        <w:tc>
+          <w:tcPr>
+            <w:tcW w:type="dxa" w:w="1900"/>
+            <w:tcBorders>
+              <w:top w:val="single" w:color="000000" w:sz="4"/>
+              <w:left w:val="single" w:color="000000" w:sz="4"/>
+              <w:bottom w:val="single" w:color="000000" w:sz="4"/>
+              <w:right w:val="single" w:color="000000" w:sz="4"/>
+            </w:tcBorders>
+            <w:shd w:fill="D9D9D9" w:color="auto" w:val="clear"/>
+            <w:tcMar>
+              <w:top w:type="dxa" w:w="60"/>
+              <w:left w:type="dxa" w:w="100"/>
+              <w:bottom w:type="dxa" w:w="60"/>
+              <w:right w:type="dxa" w:w="100"/>
+            </w:tcMar>
+          </w:tcPr>
+          <w:p>
+            <w:pPr>
+              <w:spacing w:line="276"/>
+              <w:jc w:val="left"/>
+            </w:pPr>
+            <w:r>
+              <w:rPr>
+                <w:rFonts w:ascii="Times New Roman" w:cs="Times New Roman" w:eastAsia="Times New Roman" w:hAnsi="Times New Roman"/>
+                <w:b/>
+                <w:bCs/>
+                <w:sz w:val="24"/>
+                <w:szCs w:val="24"/>
+              </w:rPr>
+              <w:t xml:space="preserve">Mean time (s)</w:t>
+            </w:r>
+          </w:p>
+        </w:tc>
+        <w:tc>
+          <w:tcPr>
+            <w:tcW w:type="dxa" w:w="1900"/>
+            <w:tcBorders>
+              <w:top w:val="single" w:color="000000" w:sz="4"/>
+              <w:left w:val="single" w:color="000000" w:sz="4"/>
+              <w:bottom w:val="single" w:color="000000" w:sz="4"/>
+              <w:right w:val="single" w:color="000000" w:sz="4"/>
+            </w:tcBorders>
+            <w:shd w:fill="D9D9D9" w:color="auto" w:val="clear"/>
+            <w:tcMar>
+              <w:top w:type="dxa" w:w="60"/>
+              <w:left w:type="dxa" w:w="100"/>
+              <w:bottom w:type="dxa" w:w="60"/>
+              <w:right w:type="dxa" w:w="100"/>
+            </w:tcMar>
+          </w:tcPr>
+          <w:p>
+            <w:pPr>
+              <w:spacing w:line="276"/>
+              <w:jc w:val="left"/>
+            </w:pPr>
+            <w:r>
+              <w:rPr>
+                <w:rFonts w:ascii="Times New Roman" w:cs="Times New Roman" w:eastAsia="Times New Roman" w:hAnsi="Times New Roman"/>
+                <w:b/>
+                <w:bCs/>
+                <w:sz w:val="24"/>
+                <w:szCs w:val="24"/>
+              </w:rPr>
+              <w:t xml:space="preserve">Median time (s)</w:t>
+            </w:r>
+          </w:p>
+        </w:tc>
+        <w:tc>
+          <w:tcPr>
+            <w:tcW w:type="dxa" w:w="2026"/>
+            <w:tcBorders>
+              <w:top w:val="single" w:color="000000" w:sz="4"/>
+              <w:left w:val="single" w:color="000000" w:sz="4"/>
+              <w:bottom w:val="single" w:color="000000" w:sz="4"/>
+              <w:right w:val="single" w:color="000000" w:sz="4"/>
+            </w:tcBorders>
+            <w:shd w:fill="D9D9D9" w:color="auto" w:val="clear"/>
+            <w:tcMar>
+              <w:top w:type="dxa" w:w="60"/>
+              <w:left w:type="dxa" w:w="100"/>
+              <w:bottom w:type="dxa" w:w="60"/>
+              <w:right w:type="dxa" w:w="100"/>
+            </w:tcMar>
+          </w:tcPr>
+          <w:p>
+            <w:pPr>
+              <w:spacing w:line="276"/>
+              <w:jc w:val="left"/>
+            </w:pPr>
+            <w:r>
+              <w:rPr>
+                <w:rFonts w:ascii="Times New Roman" w:cs="Times New Roman" w:eastAsia="Times New Roman" w:hAnsi="Times New Roman"/>
+                <w:b/>
+                <w:bCs/>
+                <w:sz w:val="24"/>
+                <w:szCs w:val="24"/>
+              </w:rPr>
+              <w:t xml:space="preserve">Note</w:t>
+            </w:r>
+          </w:p>
+        </w:tc>
+      </w:tr>
+      <w:tr>
+        <w:trPr>
+          <w:cantSplit/>
+          <w:tblHeader w:val="false"/>
+        </w:trPr>
+        <w:tc>
+          <w:tcPr>
+            <w:tcW w:type="dxa" w:w="3200"/>
+            <w:tcBorders>
+              <w:top w:val="single" w:color="000000" w:sz="4"/>
+              <w:left w:val="single" w:color="000000" w:sz="4"/>
+              <w:bottom w:val="single" w:color="000000" w:sz="4"/>
+              <w:right w:val="single" w:color="000000" w:sz="4"/>
+            </w:tcBorders>
+            <w:tcMar>
+              <w:top w:type="dxa" w:w="60"/>
+              <w:left w:type="dxa" w:w="100"/>
+              <w:bottom w:type="dxa" w:w="60"/>
+              <w:right w:type="dxa" w:w="100"/>
+            </w:tcMar>
+          </w:tcPr>
+          <w:p>
+            <w:pPr>
+              <w:spacing w:line="276"/>
+              <w:jc w:val="left"/>
+            </w:pPr>
+            <w:r>
+              <w:rPr>
+                <w:rFonts w:ascii="Times New Roman" w:cs="Times New Roman" w:eastAsia="Times New Roman" w:hAnsi="Times New Roman"/>
+                <w:b w:val="false"/>
+                <w:bCs w:val="false"/>
+                <w:sz w:val="24"/>
+                <w:szCs w:val="24"/>
+              </w:rPr>
+              <w:t xml:space="preserve">Plain UDP</w:t>
+            </w:r>
+          </w:p>
+        </w:tc>
+        <w:tc>
+          <w:tcPr>
+            <w:tcW w:type="dxa" w:w="1900"/>
+            <w:tcBorders>
+              <w:top w:val="single" w:color="000000" w:sz="4"/>
+              <w:left w:val="single" w:color="000000" w:sz="4"/>
+              <w:bottom w:val="single" w:color="000000" w:sz="4"/>
+              <w:right w:val="single" w:color="000000" w:sz="4"/>
+            </w:tcBorders>
+            <w:tcMar>
+              <w:top w:type="dxa" w:w="60"/>
+              <w:left w:type="dxa" w:w="100"/>
+              <w:bottom w:type="dxa" w:w="60"/>
+              <w:right w:type="dxa" w:w="100"/>
+            </w:tcMar>
+          </w:tcPr>
+          <w:p>
+            <w:pPr>
+              <w:spacing w:line="276"/>
+              <w:jc w:val="left"/>
+            </w:pPr>
+            <w:r>
+              <w:rPr>
+                <w:rFonts w:ascii="Times New Roman" w:cs="Times New Roman" w:eastAsia="Times New Roman" w:hAnsi="Times New Roman"/>
+                <w:b w:val="false"/>
+                <w:bCs w:val="false"/>
+                <w:sz w:val="24"/>
+                <w:szCs w:val="24"/>
+              </w:rPr>
+              <w:t xml:space="preserve">n/a</w:t>
+            </w:r>
+          </w:p>
+        </w:tc>
+        <w:tc>
+          <w:tcPr>
+            <w:tcW w:type="dxa" w:w="1900"/>
+            <w:tcBorders>
+              <w:top w:val="single" w:color="000000" w:sz="4"/>
+              <w:left w:val="single" w:color="000000" w:sz="4"/>
+              <w:bottom w:val="single" w:color="000000" w:sz="4"/>
+              <w:right w:val="single" w:color="000000" w:sz="4"/>
+            </w:tcBorders>
+            <w:tcMar>
+              <w:top w:type="dxa" w:w="60"/>
+              <w:left w:type="dxa" w:w="100"/>
+              <w:bottom w:type="dxa" w:w="60"/>
+              <w:right w:type="dxa" w:w="100"/>
+            </w:tcMar>
+          </w:tcPr>
+          <w:p>
+            <w:pPr>
+              <w:spacing w:line="276"/>
+              <w:jc w:val="left"/>
+            </w:pPr>
+            <w:r>
+              <w:rPr>
+                <w:rFonts w:ascii="Times New Roman" w:cs="Times New Roman" w:eastAsia="Times New Roman" w:hAnsi="Times New Roman"/>
+                <w:b w:val="false"/>
+                <w:bCs w:val="false"/>
+                <w:sz w:val="24"/>
+                <w:szCs w:val="24"/>
+              </w:rPr>
+              <w:t xml:space="preserve">n/a</w:t>
+            </w:r>
+          </w:p>
+        </w:tc>
+        <w:tc>
+          <w:tcPr>
+            <w:tcW w:type="dxa" w:w="2026"/>
+            <w:tcBorders>
+              <w:top w:val="single" w:color="000000" w:sz="4"/>
+              <w:left w:val="single" w:color="000000" w:sz="4"/>
+              <w:bottom w:val="single" w:color="000000" w:sz="4"/>
+              <w:right w:val="single" w:color="000000" w:sz="4"/>
+            </w:tcBorders>
+            <w:tcMar>
+              <w:top w:type="dxa" w:w="60"/>
+              <w:left w:type="dxa" w:w="100"/>
+              <w:bottom w:type="dxa" w:w="60"/>
+              <w:right w:type="dxa" w:w="100"/>
+            </w:tcMar>
+          </w:tcPr>
+          <w:p>
+            <w:pPr>
+              <w:spacing w:line="276"/>
+              <w:jc w:val="left"/>
+            </w:pPr>
+            <w:r>
+              <w:rPr>
+                <w:rFonts w:ascii="Times New Roman" w:cs="Times New Roman" w:eastAsia="Times New Roman" w:hAnsi="Times New Roman"/>
+                <w:b w:val="false"/>
+                <w:bCs w:val="false"/>
+                <w:sz w:val="24"/>
+                <w:szCs w:val="24"/>
+              </w:rPr>
+              <w:t xml:space="preserve">68% delivered</w:t>
+            </w:r>
+          </w:p>
+        </w:tc>
+      </w:tr>
+      <w:tr>
+        <w:trPr>
+          <w:cantSplit/>
+          <w:tblHeader w:val="false"/>
+        </w:trPr>
+        <w:tc>
+          <w:tcPr>
+            <w:tcW w:type="dxa" w:w="3200"/>
+            <w:tcBorders>
+              <w:top w:val="single" w:color="000000" w:sz="4"/>
+              <w:left w:val="single" w:color="000000" w:sz="4"/>
+              <w:bottom w:val="single" w:color="000000" w:sz="4"/>
+              <w:right w:val="single" w:color="000000" w:sz="4"/>
+            </w:tcBorders>
+            <w:tcMar>
+              <w:top w:type="dxa" w:w="60"/>
+              <w:left w:type="dxa" w:w="100"/>
+              <w:bottom w:type="dxa" w:w="60"/>
+              <w:right w:type="dxa" w:w="100"/>
+            </w:tcMar>
+          </w:tcPr>
+          <w:p>
+            <w:pPr>
+              <w:spacing w:line="276"/>
+              <w:jc w:val="left"/>
+            </w:pPr>
+            <w:r>
+              <w:rPr>
+                <w:rFonts w:ascii="Times New Roman" w:cs="Times New Roman" w:eastAsia="Times New Roman" w:hAnsi="Times New Roman"/>
+                <w:b w:val="false"/>
+                <w:bCs w:val="false"/>
+                <w:sz w:val="24"/>
+                <w:szCs w:val="24"/>
+              </w:rPr>
+              <w:t xml:space="preserve">TCP model (selective ACK)</w:t>
+            </w:r>
+          </w:p>
+        </w:tc>
+        <w:tc>
+          <w:tcPr>
+            <w:tcW w:type="dxa" w:w="1900"/>
+            <w:tcBorders>
+              <w:top w:val="single" w:color="000000" w:sz="4"/>
+              <w:left w:val="single" w:color="000000" w:sz="4"/>
+              <w:bottom w:val="single" w:color="000000" w:sz="4"/>
+              <w:right w:val="single" w:color="000000" w:sz="4"/>
+            </w:tcBorders>
+            <w:tcMar>
+              <w:top w:type="dxa" w:w="60"/>
+              <w:left w:type="dxa" w:w="100"/>
+              <w:bottom w:type="dxa" w:w="60"/>
+              <w:right w:type="dxa" w:w="100"/>
+            </w:tcMar>
+          </w:tcPr>
+          <w:p>
+            <w:pPr>
+              <w:spacing w:line="276"/>
+              <w:jc w:val="left"/>
+            </w:pPr>
+            <w:r>
+              <w:rPr>
+                <w:rFonts w:ascii="Times New Roman" w:cs="Times New Roman" w:eastAsia="Times New Roman" w:hAnsi="Times New Roman"/>
+                <w:b w:val="false"/>
+                <w:bCs w:val="false"/>
+                <w:sz w:val="24"/>
+                <w:szCs w:val="24"/>
+              </w:rPr>
+              <w:t xml:space="preserve">4.56</w:t>
+            </w:r>
+          </w:p>
+        </w:tc>
+        <w:tc>
+          <w:tcPr>
+            <w:tcW w:type="dxa" w:w="1900"/>
+            <w:tcBorders>
+              <w:top w:val="single" w:color="000000" w:sz="4"/>
+              <w:left w:val="single" w:color="000000" w:sz="4"/>
+              <w:bottom w:val="single" w:color="000000" w:sz="4"/>
+              <w:right w:val="single" w:color="000000" w:sz="4"/>
+            </w:tcBorders>
+            <w:tcMar>
+              <w:top w:type="dxa" w:w="60"/>
+              <w:left w:type="dxa" w:w="100"/>
+              <w:bottom w:type="dxa" w:w="60"/>
+              <w:right w:type="dxa" w:w="100"/>
+            </w:tcMar>
+          </w:tcPr>
+          <w:p>
+            <w:pPr>
+              <w:spacing w:line="276"/>
+              <w:jc w:val="left"/>
+            </w:pPr>
+            <w:r>
+              <w:rPr>
+                <w:rFonts w:ascii="Times New Roman" w:cs="Times New Roman" w:eastAsia="Times New Roman" w:hAnsi="Times New Roman"/>
+                <w:b w:val="false"/>
+                <w:bCs w:val="false"/>
+                <w:sz w:val="24"/>
+                <w:szCs w:val="24"/>
+              </w:rPr>
+              <w:t xml:space="preserve">1.48</w:t>
+            </w:r>
+          </w:p>
+        </w:tc>
+        <w:tc>
+          <w:tcPr>
+            <w:tcW w:type="dxa" w:w="2026"/>
+            <w:tcBorders>
+              <w:top w:val="single" w:color="000000" w:sz="4"/>
+              <w:left w:val="single" w:color="000000" w:sz="4"/>
+              <w:bottom w:val="single" w:color="000000" w:sz="4"/>
+              <w:right w:val="single" w:color="000000" w:sz="4"/>
+            </w:tcBorders>
+            <w:tcMar>
+              <w:top w:type="dxa" w:w="60"/>
+              <w:left w:type="dxa" w:w="100"/>
+              <w:bottom w:type="dxa" w:w="60"/>
+              <w:right w:type="dxa" w:w="100"/>
+            </w:tcMar>
+          </w:tcPr>
+          <w:p>
+            <w:pPr>
+              <w:spacing w:line="276"/>
+              <w:jc w:val="left"/>
+            </w:pPr>
+            <w:r>
+              <w:rPr>
+                <w:rFonts w:ascii="Times New Roman" w:cs="Times New Roman" w:eastAsia="Times New Roman" w:hAnsi="Times New Roman"/>
+                <w:b w:val="false"/>
+                <w:bCs w:val="false"/>
+                <w:sz w:val="24"/>
+                <w:szCs w:val="24"/>
+              </w:rPr>
+              <w:t xml:space="preserve">Go-Back-N not used</w:t>
+            </w:r>
+          </w:p>
+        </w:tc>
+      </w:tr>
+      <w:tr>
+        <w:trPr>
+          <w:cantSplit/>
+          <w:tblHeader w:val="false"/>
+        </w:trPr>
+        <w:tc>
+          <w:tcPr>
+            <w:tcW w:type="dxa" w:w="3200"/>
+            <w:tcBorders>
+              <w:top w:val="single" w:color="000000" w:sz="4"/>
+              <w:left w:val="single" w:color="000000" w:sz="4"/>
+              <w:bottom w:val="single" w:color="000000" w:sz="4"/>
+              <w:right w:val="single" w:color="000000" w:sz="4"/>
+            </w:tcBorders>
+            <w:tcMar>
+              <w:top w:type="dxa" w:w="60"/>
+              <w:left w:type="dxa" w:w="100"/>
+              <w:bottom w:type="dxa" w:w="60"/>
+              <w:right w:type="dxa" w:w="100"/>
+            </w:tcMar>
+          </w:tcPr>
+          <w:p>
+            <w:pPr>
+              <w:spacing w:line="276"/>
+              <w:jc w:val="left"/>
+            </w:pPr>
+            <w:r>
+              <w:rPr>
+                <w:rFonts w:ascii="Times New Roman" w:cs="Times New Roman" w:eastAsia="Times New Roman" w:hAnsi="Times New Roman"/>
+                <w:b w:val="false"/>
+                <w:bCs w:val="false"/>
+                <w:sz w:val="24"/>
+                <w:szCs w:val="24"/>
+              </w:rPr>
+              <w:t xml:space="preserve">RUDP, fixed window 8</w:t>
+            </w:r>
+          </w:p>
+        </w:tc>
+        <w:tc>
+          <w:tcPr>
+            <w:tcW w:type="dxa" w:w="1900"/>
+            <w:tcBorders>
+              <w:top w:val="single" w:color="000000" w:sz="4"/>
+              <w:left w:val="single" w:color="000000" w:sz="4"/>
+              <w:bottom w:val="single" w:color="000000" w:sz="4"/>
+              <w:right w:val="single" w:color="000000" w:sz="4"/>
+            </w:tcBorders>
+            <w:tcMar>
+              <w:top w:type="dxa" w:w="60"/>
+              <w:left w:type="dxa" w:w="100"/>
+              <w:bottom w:type="dxa" w:w="60"/>
+              <w:right w:type="dxa" w:w="100"/>
+            </w:tcMar>
+          </w:tcPr>
+          <w:p>
+            <w:pPr>
+              <w:spacing w:line="276"/>
+              <w:jc w:val="left"/>
+            </w:pPr>
+            <w:r>
+              <w:rPr>
+                <w:rFonts w:ascii="Times New Roman" w:cs="Times New Roman" w:eastAsia="Times New Roman" w:hAnsi="Times New Roman"/>
+                <w:b w:val="false"/>
+                <w:bCs w:val="false"/>
+                <w:sz w:val="24"/>
+                <w:szCs w:val="24"/>
+              </w:rPr>
+              <w:t xml:space="preserve">3.88</w:t>
+            </w:r>
+          </w:p>
+        </w:tc>
+        <w:tc>
+          <w:tcPr>
+            <w:tcW w:type="dxa" w:w="1900"/>
+            <w:tcBorders>
+              <w:top w:val="single" w:color="000000" w:sz="4"/>
+              <w:left w:val="single" w:color="000000" w:sz="4"/>
+              <w:bottom w:val="single" w:color="000000" w:sz="4"/>
+              <w:right w:val="single" w:color="000000" w:sz="4"/>
+            </w:tcBorders>
+            <w:tcMar>
+              <w:top w:type="dxa" w:w="60"/>
+              <w:left w:type="dxa" w:w="100"/>
+              <w:bottom w:type="dxa" w:w="60"/>
+              <w:right w:type="dxa" w:w="100"/>
+            </w:tcMar>
+          </w:tcPr>
+          <w:p>
+            <w:pPr>
+              <w:spacing w:line="276"/>
+              <w:jc w:val="left"/>
+            </w:pPr>
+            <w:r>
+              <w:rPr>
+                <w:rFonts w:ascii="Times New Roman" w:cs="Times New Roman" w:eastAsia="Times New Roman" w:hAnsi="Times New Roman"/>
+                <w:b w:val="false"/>
+                <w:bCs w:val="false"/>
+                <w:sz w:val="24"/>
+                <w:szCs w:val="24"/>
+              </w:rPr>
+              <w:t xml:space="preserve">2.00</w:t>
+            </w:r>
+          </w:p>
+        </w:tc>
+        <w:tc>
+          <w:tcPr>
+            <w:tcW w:type="dxa" w:w="2026"/>
+            <w:tcBorders>
+              <w:top w:val="single" w:color="000000" w:sz="4"/>
+              <w:left w:val="single" w:color="000000" w:sz="4"/>
+              <w:bottom w:val="single" w:color="000000" w:sz="4"/>
+              <w:right w:val="single" w:color="000000" w:sz="4"/>
+            </w:tcBorders>
+            <w:tcMar>
+              <w:top w:type="dxa" w:w="60"/>
+              <w:left w:type="dxa" w:w="100"/>
+              <w:bottom w:type="dxa" w:w="60"/>
+              <w:right w:type="dxa" w:w="100"/>
+            </w:tcMar>
+          </w:tcPr>
+          <w:p>
+            <w:pPr>
+              <w:spacing w:line="276"/>
+              <w:jc w:val="left"/>
+            </w:pPr>
+          </w:p>
+        </w:tc>
+      </w:tr>
+      <w:tr>
+        <w:trPr>
+          <w:cantSplit/>
+          <w:tblHeader w:val="false"/>
+        </w:trPr>
+        <w:tc>
+          <w:tcPr>
+            <w:tcW w:type="dxa" w:w="3200"/>
+            <w:tcBorders>
+              <w:top w:val="single" w:color="000000" w:sz="4"/>
+              <w:left w:val="single" w:color="000000" w:sz="4"/>
+              <w:bottom w:val="single" w:color="000000" w:sz="4"/>
+              <w:right w:val="single" w:color="000000" w:sz="4"/>
+            </w:tcBorders>
+            <w:tcMar>
+              <w:top w:type="dxa" w:w="60"/>
+              <w:left w:type="dxa" w:w="100"/>
+              <w:bottom w:type="dxa" w:w="60"/>
+              <w:right w:type="dxa" w:w="100"/>
+            </w:tcMar>
+          </w:tcPr>
+          <w:p>
+            <w:pPr>
+              <w:spacing w:line="276"/>
+              <w:jc w:val="left"/>
+            </w:pPr>
+            <w:r>
+              <w:rPr>
+                <w:rFonts w:ascii="Times New Roman" w:cs="Times New Roman" w:eastAsia="Times New Roman" w:hAnsi="Times New Roman"/>
+                <w:b w:val="false"/>
+                <w:bCs w:val="false"/>
+                <w:sz w:val="24"/>
+                <w:szCs w:val="24"/>
+              </w:rPr>
+              <w:t xml:space="preserve">RUDP, AIMD</w:t>
+            </w:r>
+          </w:p>
+        </w:tc>
+        <w:tc>
+          <w:tcPr>
+            <w:tcW w:type="dxa" w:w="1900"/>
+            <w:tcBorders>
+              <w:top w:val="single" w:color="000000" w:sz="4"/>
+              <w:left w:val="single" w:color="000000" w:sz="4"/>
+              <w:bottom w:val="single" w:color="000000" w:sz="4"/>
+              <w:right w:val="single" w:color="000000" w:sz="4"/>
+            </w:tcBorders>
+            <w:tcMar>
+              <w:top w:type="dxa" w:w="60"/>
+              <w:left w:type="dxa" w:w="100"/>
+              <w:bottom w:type="dxa" w:w="60"/>
+              <w:right w:type="dxa" w:w="100"/>
+            </w:tcMar>
+          </w:tcPr>
+          <w:p>
+            <w:pPr>
+              <w:spacing w:line="276"/>
+              <w:jc w:val="left"/>
+            </w:pPr>
+            <w:r>
+              <w:rPr>
+                <w:rFonts w:ascii="Times New Roman" w:cs="Times New Roman" w:eastAsia="Times New Roman" w:hAnsi="Times New Roman"/>
+                <w:b w:val="false"/>
+                <w:bCs w:val="false"/>
+                <w:sz w:val="24"/>
+                <w:szCs w:val="24"/>
+              </w:rPr>
+              <w:t xml:space="preserve">7.16</w:t>
+            </w:r>
+          </w:p>
+        </w:tc>
+        <w:tc>
+          <w:tcPr>
+            <w:tcW w:type="dxa" w:w="1900"/>
+            <w:tcBorders>
+              <w:top w:val="single" w:color="000000" w:sz="4"/>
+              <w:left w:val="single" w:color="000000" w:sz="4"/>
+              <w:bottom w:val="single" w:color="000000" w:sz="4"/>
+              <w:right w:val="single" w:color="000000" w:sz="4"/>
+            </w:tcBorders>
+            <w:tcMar>
+              <w:top w:type="dxa" w:w="60"/>
+              <w:left w:type="dxa" w:w="100"/>
+              <w:bottom w:type="dxa" w:w="60"/>
+              <w:right w:type="dxa" w:w="100"/>
+            </w:tcMar>
+          </w:tcPr>
+          <w:p>
+            <w:pPr>
+              <w:spacing w:line="276"/>
+              <w:jc w:val="left"/>
+            </w:pPr>
+            <w:r>
+              <w:rPr>
+                <w:rFonts w:ascii="Times New Roman" w:cs="Times New Roman" w:eastAsia="Times New Roman" w:hAnsi="Times New Roman"/>
+                <w:b w:val="false"/>
+                <w:bCs w:val="false"/>
+                <w:sz w:val="24"/>
+                <w:szCs w:val="24"/>
+              </w:rPr>
+              <w:t xml:space="preserve">2.72</w:t>
+            </w:r>
+          </w:p>
+        </w:tc>
+        <w:tc>
+          <w:tcPr>
+            <w:tcW w:type="dxa" w:w="2026"/>
+            <w:tcBorders>
+              <w:top w:val="single" w:color="000000" w:sz="4"/>
+              <w:left w:val="single" w:color="000000" w:sz="4"/>
+              <w:bottom w:val="single" w:color="000000" w:sz="4"/>
+              <w:right w:val="single" w:color="000000" w:sz="4"/>
+            </w:tcBorders>
+            <w:tcMar>
+              <w:top w:type="dxa" w:w="60"/>
+              <w:left w:type="dxa" w:w="100"/>
+              <w:bottom w:type="dxa" w:w="60"/>
+              <w:right w:type="dxa" w:w="100"/>
+            </w:tcMar>
+          </w:tcPr>
+          <w:p>
+            <w:pPr>
+              <w:spacing w:line="276"/>
+              <w:jc w:val="left"/>
+            </w:pPr>
+          </w:p>
+        </w:tc>
+      </w:tr>
+      <w:tr>
+        <w:trPr>
+          <w:cantSplit/>
+          <w:tblHeader w:val="false"/>
+        </w:trPr>
+        <w:tc>
+          <w:tcPr>
+            <w:tcW w:type="dxa" w:w="3200"/>
+            <w:tcBorders>
+              <w:top w:val="single" w:color="000000" w:sz="4"/>
+              <w:left w:val="single" w:color="000000" w:sz="4"/>
+              <w:bottom w:val="single" w:color="000000" w:sz="4"/>
+              <w:right w:val="single" w:color="000000" w:sz="4"/>
+            </w:tcBorders>
+            <w:tcMar>
+              <w:top w:type="dxa" w:w="60"/>
+              <w:left w:type="dxa" w:w="100"/>
+              <w:bottom w:type="dxa" w:w="60"/>
+              <w:right w:type="dxa" w:w="100"/>
+            </w:tcMar>
+          </w:tcPr>
+          <w:p>
+            <w:pPr>
+              <w:spacing w:line="276"/>
+              <w:jc w:val="left"/>
+            </w:pPr>
+            <w:r>
+              <w:rPr>
+                <w:rFonts w:ascii="Times New Roman" w:cs="Times New Roman" w:eastAsia="Times New Roman" w:hAnsi="Times New Roman"/>
+                <w:b w:val="false"/>
+                <w:bCs w:val="false"/>
+                <w:sz w:val="24"/>
+                <w:szCs w:val="24"/>
+              </w:rPr>
+              <w:t xml:space="preserve">RUDP, Smart-RUDP table</w:t>
+            </w:r>
+          </w:p>
+        </w:tc>
+        <w:tc>
+          <w:tcPr>
+            <w:tcW w:type="dxa" w:w="1900"/>
+            <w:tcBorders>
+              <w:top w:val="single" w:color="000000" w:sz="4"/>
+              <w:left w:val="single" w:color="000000" w:sz="4"/>
+              <w:bottom w:val="single" w:color="000000" w:sz="4"/>
+              <w:right w:val="single" w:color="000000" w:sz="4"/>
+            </w:tcBorders>
+            <w:tcMar>
+              <w:top w:type="dxa" w:w="60"/>
+              <w:left w:type="dxa" w:w="100"/>
+              <w:bottom w:type="dxa" w:w="60"/>
+              <w:right w:type="dxa" w:w="100"/>
+            </w:tcMar>
+          </w:tcPr>
+          <w:p>
+            <w:pPr>
+              <w:spacing w:line="276"/>
+              <w:jc w:val="left"/>
+            </w:pPr>
+            <w:r>
+              <w:rPr>
+                <w:rFonts w:ascii="Times New Roman" w:cs="Times New Roman" w:eastAsia="Times New Roman" w:hAnsi="Times New Roman"/>
+                <w:b w:val="false"/>
+                <w:bCs w:val="false"/>
+                <w:sz w:val="24"/>
+                <w:szCs w:val="24"/>
+              </w:rPr>
+              <w:t xml:space="preserve">3.73</w:t>
+            </w:r>
+          </w:p>
+        </w:tc>
+        <w:tc>
+          <w:tcPr>
+            <w:tcW w:type="dxa" w:w="1900"/>
+            <w:tcBorders>
+              <w:top w:val="single" w:color="000000" w:sz="4"/>
+              <w:left w:val="single" w:color="000000" w:sz="4"/>
+              <w:bottom w:val="single" w:color="000000" w:sz="4"/>
+              <w:right w:val="single" w:color="000000" w:sz="4"/>
+            </w:tcBorders>
+            <w:tcMar>
+              <w:top w:type="dxa" w:w="60"/>
+              <w:left w:type="dxa" w:w="100"/>
+              <w:bottom w:type="dxa" w:w="60"/>
+              <w:right w:type="dxa" w:w="100"/>
+            </w:tcMar>
+          </w:tcPr>
+          <w:p>
+            <w:pPr>
+              <w:spacing w:line="276"/>
+              <w:jc w:val="left"/>
+            </w:pPr>
+            <w:r>
+              <w:rPr>
+                <w:rFonts w:ascii="Times New Roman" w:cs="Times New Roman" w:eastAsia="Times New Roman" w:hAnsi="Times New Roman"/>
+                <w:b w:val="false"/>
+                <w:bCs w:val="false"/>
+                <w:sz w:val="24"/>
+                <w:szCs w:val="24"/>
+              </w:rPr>
+              <w:t xml:space="preserve">1.99</w:t>
+            </w:r>
+          </w:p>
+        </w:tc>
+        <w:tc>
+          <w:tcPr>
+            <w:tcW w:type="dxa" w:w="2026"/>
+            <w:tcBorders>
+              <w:top w:val="single" w:color="000000" w:sz="4"/>
+              <w:left w:val="single" w:color="000000" w:sz="4"/>
+              <w:bottom w:val="single" w:color="000000" w:sz="4"/>
+              <w:right w:val="single" w:color="000000" w:sz="4"/>
+            </w:tcBorders>
+            <w:tcMar>
+              <w:top w:type="dxa" w:w="60"/>
+              <w:left w:type="dxa" w:w="100"/>
+              <w:bottom w:type="dxa" w:w="60"/>
+              <w:right w:type="dxa" w:w="100"/>
+            </w:tcMar>
+          </w:tcPr>
+          <w:p>
+            <w:pPr>
+              <w:spacing w:line="276"/>
+              <w:jc w:val="left"/>
+            </w:pPr>
+          </w:p>
+        </w:tc>
+      </w:tr>
+      <w:tr>
+        <w:trPr>
+          <w:cantSplit/>
+          <w:tblHeader w:val="false"/>
+        </w:trPr>
+        <w:tc>
+          <w:tcPr>
+            <w:tcW w:type="dxa" w:w="3200"/>
+            <w:tcBorders>
+              <w:top w:val="single" w:color="000000" w:sz="4"/>
+              <w:left w:val="single" w:color="000000" w:sz="4"/>
+              <w:bottom w:val="single" w:color="000000" w:sz="4"/>
+              <w:right w:val="single" w:color="000000" w:sz="4"/>
+            </w:tcBorders>
+            <w:tcMar>
+              <w:top w:type="dxa" w:w="60"/>
+              <w:left w:type="dxa" w:w="100"/>
+              <w:bottom w:type="dxa" w:w="60"/>
+              <w:right w:type="dxa" w:w="100"/>
+            </w:tcMar>
+          </w:tcPr>
+          <w:p>
+            <w:pPr>
+              <w:spacing w:line="276"/>
+              <w:jc w:val="left"/>
+            </w:pPr>
+            <w:r>
+              <w:rPr>
+                <w:rFonts w:ascii="Times New Roman" w:cs="Times New Roman" w:eastAsia="Times New Roman" w:hAnsi="Times New Roman"/>
+                <w:b w:val="false"/>
+                <w:bCs w:val="false"/>
+                <w:sz w:val="24"/>
+                <w:szCs w:val="24"/>
+              </w:rPr>
+              <w:t xml:space="preserve">RUDP, Smart-RUDP deep</w:t>
+            </w:r>
+          </w:p>
+        </w:tc>
+        <w:tc>
+          <w:tcPr>
+            <w:tcW w:type="dxa" w:w="1900"/>
+            <w:tcBorders>
+              <w:top w:val="single" w:color="000000" w:sz="4"/>
+              <w:left w:val="single" w:color="000000" w:sz="4"/>
+              <w:bottom w:val="single" w:color="000000" w:sz="4"/>
+              <w:right w:val="single" w:color="000000" w:sz="4"/>
+            </w:tcBorders>
+            <w:tcMar>
+              <w:top w:type="dxa" w:w="60"/>
+              <w:left w:type="dxa" w:w="100"/>
+              <w:bottom w:type="dxa" w:w="60"/>
+              <w:right w:type="dxa" w:w="100"/>
+            </w:tcMar>
+          </w:tcPr>
+          <w:p>
+            <w:pPr>
+              <w:spacing w:line="276"/>
+              <w:jc w:val="left"/>
+            </w:pPr>
+            <w:r>
+              <w:rPr>
+                <w:rFonts w:ascii="Times New Roman" w:cs="Times New Roman" w:eastAsia="Times New Roman" w:hAnsi="Times New Roman"/>
+                <w:b w:val="false"/>
+                <w:bCs w:val="false"/>
+                <w:sz w:val="24"/>
+                <w:szCs w:val="24"/>
+              </w:rPr>
+              <w:t xml:space="preserve">3.20</w:t>
+            </w:r>
+          </w:p>
+        </w:tc>
+        <w:tc>
+          <w:tcPr>
+            <w:tcW w:type="dxa" w:w="1900"/>
+            <w:tcBorders>
+              <w:top w:val="single" w:color="000000" w:sz="4"/>
+              <w:left w:val="single" w:color="000000" w:sz="4"/>
+              <w:bottom w:val="single" w:color="000000" w:sz="4"/>
+              <w:right w:val="single" w:color="000000" w:sz="4"/>
+            </w:tcBorders>
+            <w:tcMar>
+              <w:top w:type="dxa" w:w="60"/>
+              <w:left w:type="dxa" w:w="100"/>
+              <w:bottom w:type="dxa" w:w="60"/>
+              <w:right w:type="dxa" w:w="100"/>
+            </w:tcMar>
+          </w:tcPr>
+          <w:p>
+            <w:pPr>
+              <w:spacing w:line="276"/>
+              <w:jc w:val="left"/>
+            </w:pPr>
+            <w:r>
+              <w:rPr>
+                <w:rFonts w:ascii="Times New Roman" w:cs="Times New Roman" w:eastAsia="Times New Roman" w:hAnsi="Times New Roman"/>
+                <w:b w:val="false"/>
+                <w:bCs w:val="false"/>
+                <w:sz w:val="24"/>
+                <w:szCs w:val="24"/>
+              </w:rPr>
+              <w:t xml:space="preserve">1.79</w:t>
+            </w:r>
+          </w:p>
+        </w:tc>
+        <w:tc>
+          <w:tcPr>
+            <w:tcW w:type="dxa" w:w="2026"/>
+            <w:tcBorders>
+              <w:top w:val="single" w:color="000000" w:sz="4"/>
+              <w:left w:val="single" w:color="000000" w:sz="4"/>
+              <w:bottom w:val="single" w:color="000000" w:sz="4"/>
+              <w:right w:val="single" w:color="000000" w:sz="4"/>
+            </w:tcBorders>
+            <w:tcMar>
+              <w:top w:type="dxa" w:w="60"/>
+              <w:left w:type="dxa" w:w="100"/>
+              <w:bottom w:type="dxa" w:w="60"/>
+              <w:right w:type="dxa" w:w="100"/>
+            </w:tcMar>
+          </w:tcPr>
+          <w:p>
+            <w:pPr>
+              <w:spacing w:line="276"/>
+              <w:jc w:val="left"/>
+            </w:pPr>
+          </w:p>
+        </w:tc>
+      </w:tr>
+    </w:tbl>
+    <w:p>
+      <w:pPr>
+        <w:spacing w:after="160"/>
+      </w:pPr>
+    </w:p>
+    <w:p>
+      <w:pPr>
+        <w:spacing w:after="120" w:line="360"/>
+        <w:jc w:val="both"/>
+      </w:pPr>
+      <w:r>
+        <w:rPr>
+          <w:rFonts w:ascii="Times New Roman" w:cs="Times New Roman" w:eastAsia="Times New Roman" w:hAnsi="Times New Roman"/>
+          <w:sz w:val="24"/>
+          <w:szCs w:val="24"/>
+        </w:rPr>
+        <w:t xml:space="preserve">The TCP model was faster than RUDP with AIMD on 33 of the 48 paths, and its median is the lowest of all. Its mean is higher than the learned controllers because its timer backs off at very high loss, where RUDP's fixed 300 ms timer does not. The deep agent was faster than the TCP model on 22 paths and slower on 23. The main reason for the gap to AIMD is Go-Back-N, which resends the whole window after a loss. A basic selective-acknowledgment variant of the same simulated transport (web/sack_test.py) cut the mean time with the fixed window from 3.88 s to 2.53 s and with AIMD from 7.16 s to 4.90 s (median 2.72 s to 1.44 s), and was faster on 39 and 34 of the 48 paths respectively. Selective acknowledgment is therefore the most valuable next change to the protocol. One regime goes the other way: at 10 to 20% random loss the whole-window resend of Go-Back-N acts as redundancy and the fixed window was slightly faster without SACK.</w:t>
+      </w:r>
+    </w:p>
+    <w:p>
+      <w:pPr>
+        <w:spacing w:after="120" w:line="360"/>
+        <w:jc w:val="both"/>
+      </w:pPr>
+      <w:r>
+        <w:rPr>
+          <w:rFonts w:ascii="Times New Roman" w:cs="Times New Roman" w:eastAsia="Times New Roman" w:hAnsi="Times New Roman"/>
+          <w:sz w:val="24"/>
+          <w:szCs w:val="24"/>
+        </w:rPr>
+        <w:t xml:space="preserve">Reordering. The C emulator keeps packets in order, so reordering was tested in the simulator by adding jitter larger than the packet spacing (2% loss, 50 ms delay, 60 messages, 40 seeds; web/reorder_test.py). A Go-Back-N receiver drops out-of-order packets and sends duplicate ACKs, so reordering looks like loss. AIMD with Go-Back-N went from 0.82 s with no jitter to 6.79 s at 20 ms jitter. The learned agents were more tolerant, and selective acknowledgment removed most of the damage (Table 13). The learned agents were trained only on in-order paths with Go-Back-N.</w:t>
+      </w:r>
+    </w:p>
+    <w:p>
+      <w:pPr>
+        <w:keepNext/>
+        <w:spacing w:after="80" w:before="120"/>
+        <w:jc w:val="center"/>
+      </w:pPr>
+      <w:r>
+        <w:rPr>
+          <w:rFonts w:ascii="Times New Roman" w:cs="Times New Roman" w:eastAsia="Times New Roman" w:hAnsi="Times New Roman"/>
+          <w:b/>
+          <w:bCs/>
+          <w:sz w:val="24"/>
+          <w:szCs w:val="24"/>
+        </w:rPr>
+        <w:t xml:space="preserve">Table 13: Mean time to deliver 60 messages (s) under reordering; GBN is Go-Back-N, SACK is selective acknowledgment; simulated</w:t>
+      </w:r>
+    </w:p>
+    <w:tbl>
+      <w:tblPr>
+        <w:tblW w:type="dxa" w:w="9026"/>
+        <w:tblBorders>
+          <w:top w:val="single" w:color="auto" w:sz="4"/>
+          <w:left w:val="single" w:color="auto" w:sz="4"/>
+          <w:bottom w:val="single" w:color="auto" w:sz="4"/>
+          <w:right w:val="single" w:color="auto" w:sz="4"/>
+          <w:insideH w:val="single" w:color="auto" w:sz="4"/>
+          <w:insideV w:val="single" w:color="auto" w:sz="4"/>
+        </w:tblBorders>
+      </w:tblPr>
+      <w:tblGrid>
+        <w:gridCol w:w="1500"/>
+        <w:gridCol w:w="1500"/>
+        <w:gridCol w:w="1500"/>
+        <w:gridCol w:w="1500"/>
+        <w:gridCol w:w="1500"/>
+        <w:gridCol w:w="1526"/>
+      </w:tblGrid>
+      <w:tr>
+        <w:trPr>
+          <w:cantSplit/>
+          <w:tblHeader/>
+        </w:trPr>
+        <w:tc>
+          <w:tcPr>
+            <w:tcW w:type="dxa" w:w="1500"/>
+            <w:tcBorders>
+              <w:top w:val="single" w:color="000000" w:sz="4"/>
+              <w:left w:val="single" w:color="000000" w:sz="4"/>
+              <w:bottom w:val="single" w:color="000000" w:sz="4"/>
+              <w:right w:val="single" w:color="000000" w:sz="4"/>
+            </w:tcBorders>
+            <w:shd w:fill="D9D9D9" w:color="auto" w:val="clear"/>
+            <w:tcMar>
+              <w:top w:type="dxa" w:w="60"/>
+              <w:left w:type="dxa" w:w="100"/>
+              <w:bottom w:type="dxa" w:w="60"/>
+              <w:right w:type="dxa" w:w="100"/>
+            </w:tcMar>
+          </w:tcPr>
+          <w:p>
+            <w:pPr>
+              <w:spacing w:line="276"/>
+              <w:jc w:val="left"/>
+            </w:pPr>
+            <w:r>
+              <w:rPr>
+                <w:rFonts w:ascii="Times New Roman" w:cs="Times New Roman" w:eastAsia="Times New Roman" w:hAnsi="Times New Roman"/>
+                <w:b/>
+                <w:bCs/>
+                <w:sz w:val="24"/>
+                <w:szCs w:val="24"/>
+              </w:rPr>
+              <w:t xml:space="preserve">Jitter</w:t>
+            </w:r>
+          </w:p>
+        </w:tc>
+        <w:tc>
+          <w:tcPr>
+            <w:tcW w:type="dxa" w:w="1500"/>
+            <w:tcBorders>
+              <w:top w:val="single" w:color="000000" w:sz="4"/>
+              <w:left w:val="single" w:color="000000" w:sz="4"/>
+              <w:bottom w:val="single" w:color="000000" w:sz="4"/>
+              <w:right w:val="single" w:color="000000" w:sz="4"/>
+            </w:tcBorders>
+            <w:shd w:fill="D9D9D9" w:color="auto" w:val="clear"/>
+            <w:tcMar>
+              <w:top w:type="dxa" w:w="60"/>
+              <w:left w:type="dxa" w:w="100"/>
+              <w:bottom w:type="dxa" w:w="60"/>
+              <w:right w:type="dxa" w:w="100"/>
+            </w:tcMar>
+          </w:tcPr>
+          <w:p>
+            <w:pPr>
+              <w:spacing w:line="276"/>
+              <w:jc w:val="left"/>
+            </w:pPr>
+            <w:r>
+              <w:rPr>
+                <w:rFonts w:ascii="Times New Roman" w:cs="Times New Roman" w:eastAsia="Times New Roman" w:hAnsi="Times New Roman"/>
+                <w:b/>
+                <w:bCs/>
+                <w:sz w:val="24"/>
+                <w:szCs w:val="24"/>
+              </w:rPr>
+              <w:t xml:space="preserve">AIMD, GBN</w:t>
+            </w:r>
+          </w:p>
+        </w:tc>
+        <w:tc>
+          <w:tcPr>
+            <w:tcW w:type="dxa" w:w="1500"/>
+            <w:tcBorders>
+              <w:top w:val="single" w:color="000000" w:sz="4"/>
+              <w:left w:val="single" w:color="000000" w:sz="4"/>
+              <w:bottom w:val="single" w:color="000000" w:sz="4"/>
+              <w:right w:val="single" w:color="000000" w:sz="4"/>
+            </w:tcBorders>
+            <w:shd w:fill="D9D9D9" w:color="auto" w:val="clear"/>
+            <w:tcMar>
+              <w:top w:type="dxa" w:w="60"/>
+              <w:left w:type="dxa" w:w="100"/>
+              <w:bottom w:type="dxa" w:w="60"/>
+              <w:right w:type="dxa" w:w="100"/>
+            </w:tcMar>
+          </w:tcPr>
+          <w:p>
+            <w:pPr>
+              <w:spacing w:line="276"/>
+              <w:jc w:val="left"/>
+            </w:pPr>
+            <w:r>
+              <w:rPr>
+                <w:rFonts w:ascii="Times New Roman" w:cs="Times New Roman" w:eastAsia="Times New Roman" w:hAnsi="Times New Roman"/>
+                <w:b/>
+                <w:bCs/>
+                <w:sz w:val="24"/>
+                <w:szCs w:val="24"/>
+              </w:rPr>
+              <w:t xml:space="preserve">AIMD, SACK</w:t>
+            </w:r>
+          </w:p>
+        </w:tc>
+        <w:tc>
+          <w:tcPr>
+            <w:tcW w:type="dxa" w:w="1500"/>
+            <w:tcBorders>
+              <w:top w:val="single" w:color="000000" w:sz="4"/>
+              <w:left w:val="single" w:color="000000" w:sz="4"/>
+              <w:bottom w:val="single" w:color="000000" w:sz="4"/>
+              <w:right w:val="single" w:color="000000" w:sz="4"/>
+            </w:tcBorders>
+            <w:shd w:fill="D9D9D9" w:color="auto" w:val="clear"/>
+            <w:tcMar>
+              <w:top w:type="dxa" w:w="60"/>
+              <w:left w:type="dxa" w:w="100"/>
+              <w:bottom w:type="dxa" w:w="60"/>
+              <w:right w:type="dxa" w:w="100"/>
+            </w:tcMar>
+          </w:tcPr>
+          <w:p>
+            <w:pPr>
+              <w:spacing w:line="276"/>
+              <w:jc w:val="left"/>
+            </w:pPr>
+            <w:r>
+              <w:rPr>
+                <w:rFonts w:ascii="Times New Roman" w:cs="Times New Roman" w:eastAsia="Times New Roman" w:hAnsi="Times New Roman"/>
+                <w:b/>
+                <w:bCs/>
+                <w:sz w:val="24"/>
+                <w:szCs w:val="24"/>
+              </w:rPr>
+              <w:t xml:space="preserve">Table, GBN</w:t>
+            </w:r>
+          </w:p>
+        </w:tc>
+        <w:tc>
+          <w:tcPr>
+            <w:tcW w:type="dxa" w:w="1500"/>
+            <w:tcBorders>
+              <w:top w:val="single" w:color="000000" w:sz="4"/>
+              <w:left w:val="single" w:color="000000" w:sz="4"/>
+              <w:bottom w:val="single" w:color="000000" w:sz="4"/>
+              <w:right w:val="single" w:color="000000" w:sz="4"/>
+            </w:tcBorders>
+            <w:shd w:fill="D9D9D9" w:color="auto" w:val="clear"/>
+            <w:tcMar>
+              <w:top w:type="dxa" w:w="60"/>
+              <w:left w:type="dxa" w:w="100"/>
+              <w:bottom w:type="dxa" w:w="60"/>
+              <w:right w:type="dxa" w:w="100"/>
+            </w:tcMar>
+          </w:tcPr>
+          <w:p>
+            <w:pPr>
+              <w:spacing w:line="276"/>
+              <w:jc w:val="left"/>
+            </w:pPr>
+            <w:r>
+              <w:rPr>
+                <w:rFonts w:ascii="Times New Roman" w:cs="Times New Roman" w:eastAsia="Times New Roman" w:hAnsi="Times New Roman"/>
+                <w:b/>
+                <w:bCs/>
+                <w:sz w:val="24"/>
+                <w:szCs w:val="24"/>
+              </w:rPr>
+              <w:t xml:space="preserve">Deep, GBN</w:t>
+            </w:r>
+          </w:p>
+        </w:tc>
+        <w:tc>
+          <w:tcPr>
+            <w:tcW w:type="dxa" w:w="1526"/>
+            <w:tcBorders>
+              <w:top w:val="single" w:color="000000" w:sz="4"/>
+              <w:left w:val="single" w:color="000000" w:sz="4"/>
+              <w:bottom w:val="single" w:color="000000" w:sz="4"/>
+              <w:right w:val="single" w:color="000000" w:sz="4"/>
+            </w:tcBorders>
+            <w:shd w:fill="D9D9D9" w:color="auto" w:val="clear"/>
+            <w:tcMar>
+              <w:top w:type="dxa" w:w="60"/>
+              <w:left w:type="dxa" w:w="100"/>
+              <w:bottom w:type="dxa" w:w="60"/>
+              <w:right w:type="dxa" w:w="100"/>
+            </w:tcMar>
+          </w:tcPr>
+          <w:p>
+            <w:pPr>
+              <w:spacing w:line="276"/>
+              <w:jc w:val="left"/>
+            </w:pPr>
+            <w:r>
+              <w:rPr>
+                <w:rFonts w:ascii="Times New Roman" w:cs="Times New Roman" w:eastAsia="Times New Roman" w:hAnsi="Times New Roman"/>
+                <w:b/>
+                <w:bCs/>
+                <w:sz w:val="24"/>
+                <w:szCs w:val="24"/>
+              </w:rPr>
+              <w:t xml:space="preserve">Deep, SACK</w:t>
+            </w:r>
+          </w:p>
+        </w:tc>
+      </w:tr>
+      <w:tr>
+        <w:trPr>
+          <w:cantSplit/>
+          <w:tblHeader w:val="false"/>
+        </w:trPr>
+        <w:tc>
+          <w:tcPr>
+            <w:tcW w:type="dxa" w:w="1500"/>
+            <w:tcBorders>
+              <w:top w:val="single" w:color="000000" w:sz="4"/>
+              <w:left w:val="single" w:color="000000" w:sz="4"/>
+              <w:bottom w:val="single" w:color="000000" w:sz="4"/>
+              <w:right w:val="single" w:color="000000" w:sz="4"/>
+            </w:tcBorders>
+            <w:tcMar>
+              <w:top w:type="dxa" w:w="60"/>
+              <w:left w:type="dxa" w:w="100"/>
+              <w:bottom w:type="dxa" w:w="60"/>
+              <w:right w:type="dxa" w:w="100"/>
+            </w:tcMar>
+          </w:tcPr>
+          <w:p>
+            <w:pPr>
+              <w:spacing w:line="276"/>
+              <w:jc w:val="left"/>
+            </w:pPr>
+            <w:r>
+              <w:rPr>
+                <w:rFonts w:ascii="Times New Roman" w:cs="Times New Roman" w:eastAsia="Times New Roman" w:hAnsi="Times New Roman"/>
+                <w:b w:val="false"/>
+                <w:bCs w:val="false"/>
+                <w:sz w:val="24"/>
+                <w:szCs w:val="24"/>
+              </w:rPr>
+              <w:t xml:space="preserve">0 ms</w:t>
+            </w:r>
+          </w:p>
+        </w:tc>
+        <w:tc>
+          <w:tcPr>
+            <w:tcW w:type="dxa" w:w="1500"/>
+            <w:tcBorders>
+              <w:top w:val="single" w:color="000000" w:sz="4"/>
+              <w:left w:val="single" w:color="000000" w:sz="4"/>
+              <w:bottom w:val="single" w:color="000000" w:sz="4"/>
+              <w:right w:val="single" w:color="000000" w:sz="4"/>
+            </w:tcBorders>
+            <w:tcMar>
+              <w:top w:type="dxa" w:w="60"/>
+              <w:left w:type="dxa" w:w="100"/>
+              <w:bottom w:type="dxa" w:w="60"/>
+              <w:right w:type="dxa" w:w="100"/>
+            </w:tcMar>
+          </w:tcPr>
+          <w:p>
+            <w:pPr>
+              <w:spacing w:line="276"/>
+              <w:jc w:val="left"/>
+            </w:pPr>
+            <w:r>
+              <w:rPr>
+                <w:rFonts w:ascii="Times New Roman" w:cs="Times New Roman" w:eastAsia="Times New Roman" w:hAnsi="Times New Roman"/>
+                <w:b w:val="false"/>
+                <w:bCs w:val="false"/>
+                <w:sz w:val="24"/>
+                <w:szCs w:val="24"/>
+              </w:rPr>
+              <w:t xml:space="preserve">0.82</w:t>
+            </w:r>
+          </w:p>
+        </w:tc>
+        <w:tc>
+          <w:tcPr>
+            <w:tcW w:type="dxa" w:w="1500"/>
+            <w:tcBorders>
+              <w:top w:val="single" w:color="000000" w:sz="4"/>
+              <w:left w:val="single" w:color="000000" w:sz="4"/>
+              <w:bottom w:val="single" w:color="000000" w:sz="4"/>
+              <w:right w:val="single" w:color="000000" w:sz="4"/>
+            </w:tcBorders>
+            <w:tcMar>
+              <w:top w:type="dxa" w:w="60"/>
+              <w:left w:type="dxa" w:w="100"/>
+              <w:bottom w:type="dxa" w:w="60"/>
+              <w:right w:type="dxa" w:w="100"/>
+            </w:tcMar>
+          </w:tcPr>
+          <w:p>
+            <w:pPr>
+              <w:spacing w:line="276"/>
+              <w:jc w:val="left"/>
+            </w:pPr>
+            <w:r>
+              <w:rPr>
+                <w:rFonts w:ascii="Times New Roman" w:cs="Times New Roman" w:eastAsia="Times New Roman" w:hAnsi="Times New Roman"/>
+                <w:b w:val="false"/>
+                <w:bCs w:val="false"/>
+                <w:sz w:val="24"/>
+                <w:szCs w:val="24"/>
+              </w:rPr>
+              <w:t xml:space="preserve">0.77</w:t>
+            </w:r>
+          </w:p>
+        </w:tc>
+        <w:tc>
+          <w:tcPr>
+            <w:tcW w:type="dxa" w:w="1500"/>
+            <w:tcBorders>
+              <w:top w:val="single" w:color="000000" w:sz="4"/>
+              <w:left w:val="single" w:color="000000" w:sz="4"/>
+              <w:bottom w:val="single" w:color="000000" w:sz="4"/>
+              <w:right w:val="single" w:color="000000" w:sz="4"/>
+            </w:tcBorders>
+            <w:tcMar>
+              <w:top w:type="dxa" w:w="60"/>
+              <w:left w:type="dxa" w:w="100"/>
+              <w:bottom w:type="dxa" w:w="60"/>
+              <w:right w:type="dxa" w:w="100"/>
+            </w:tcMar>
+          </w:tcPr>
+          <w:p>
+            <w:pPr>
+              <w:spacing w:line="276"/>
+              <w:jc w:val="left"/>
+            </w:pPr>
+            <w:r>
+              <w:rPr>
+                <w:rFonts w:ascii="Times New Roman" w:cs="Times New Roman" w:eastAsia="Times New Roman" w:hAnsi="Times New Roman"/>
+                <w:b w:val="false"/>
+                <w:bCs w:val="false"/>
+                <w:sz w:val="24"/>
+                <w:szCs w:val="24"/>
+              </w:rPr>
+              <w:t xml:space="preserve">0.77</w:t>
+            </w:r>
+          </w:p>
+        </w:tc>
+        <w:tc>
+          <w:tcPr>
+            <w:tcW w:type="dxa" w:w="1500"/>
+            <w:tcBorders>
+              <w:top w:val="single" w:color="000000" w:sz="4"/>
+              <w:left w:val="single" w:color="000000" w:sz="4"/>
+              <w:bottom w:val="single" w:color="000000" w:sz="4"/>
+              <w:right w:val="single" w:color="000000" w:sz="4"/>
+            </w:tcBorders>
+            <w:tcMar>
+              <w:top w:type="dxa" w:w="60"/>
+              <w:left w:type="dxa" w:w="100"/>
+              <w:bottom w:type="dxa" w:w="60"/>
+              <w:right w:type="dxa" w:w="100"/>
+            </w:tcMar>
+          </w:tcPr>
+          <w:p>
+            <w:pPr>
+              <w:spacing w:line="276"/>
+              <w:jc w:val="left"/>
+            </w:pPr>
+            <w:r>
+              <w:rPr>
+                <w:rFonts w:ascii="Times New Roman" w:cs="Times New Roman" w:eastAsia="Times New Roman" w:hAnsi="Times New Roman"/>
+                <w:b w:val="false"/>
+                <w:bCs w:val="false"/>
+                <w:sz w:val="24"/>
+                <w:szCs w:val="24"/>
+              </w:rPr>
+              <w:t xml:space="preserve">0.49</w:t>
+            </w:r>
+          </w:p>
+        </w:tc>
+        <w:tc>
+          <w:tcPr>
+            <w:tcW w:type="dxa" w:w="1526"/>
+            <w:tcBorders>
+              <w:top w:val="single" w:color="000000" w:sz="4"/>
+              <w:left w:val="single" w:color="000000" w:sz="4"/>
+              <w:bottom w:val="single" w:color="000000" w:sz="4"/>
+              <w:right w:val="single" w:color="000000" w:sz="4"/>
+            </w:tcBorders>
+            <w:tcMar>
+              <w:top w:type="dxa" w:w="60"/>
+              <w:left w:type="dxa" w:w="100"/>
+              <w:bottom w:type="dxa" w:w="60"/>
+              <w:right w:type="dxa" w:w="100"/>
+            </w:tcMar>
+          </w:tcPr>
+          <w:p>
+            <w:pPr>
+              <w:spacing w:line="276"/>
+              <w:jc w:val="left"/>
+            </w:pPr>
+            <w:r>
+              <w:rPr>
+                <w:rFonts w:ascii="Times New Roman" w:cs="Times New Roman" w:eastAsia="Times New Roman" w:hAnsi="Times New Roman"/>
+                <w:b w:val="false"/>
+                <w:bCs w:val="false"/>
+                <w:sz w:val="24"/>
+                <w:szCs w:val="24"/>
+              </w:rPr>
+              <w:t xml:space="preserve">0.48</w:t>
+            </w:r>
+          </w:p>
+        </w:tc>
+      </w:tr>
+      <w:tr>
+        <w:trPr>
+          <w:cantSplit/>
+          <w:tblHeader w:val="false"/>
+        </w:trPr>
+        <w:tc>
+          <w:tcPr>
+            <w:tcW w:type="dxa" w:w="1500"/>
+            <w:tcBorders>
+              <w:top w:val="single" w:color="000000" w:sz="4"/>
+              <w:left w:val="single" w:color="000000" w:sz="4"/>
+              <w:bottom w:val="single" w:color="000000" w:sz="4"/>
+              <w:right w:val="single" w:color="000000" w:sz="4"/>
+            </w:tcBorders>
+            <w:tcMar>
+              <w:top w:type="dxa" w:w="60"/>
+              <w:left w:type="dxa" w:w="100"/>
+              <w:bottom w:type="dxa" w:w="60"/>
+              <w:right w:type="dxa" w:w="100"/>
+            </w:tcMar>
+          </w:tcPr>
+          <w:p>
+            <w:pPr>
+              <w:spacing w:line="276"/>
+              <w:jc w:val="left"/>
+            </w:pPr>
+            <w:r>
+              <w:rPr>
+                <w:rFonts w:ascii="Times New Roman" w:cs="Times New Roman" w:eastAsia="Times New Roman" w:hAnsi="Times New Roman"/>
+                <w:b w:val="false"/>
+                <w:bCs w:val="false"/>
+                <w:sz w:val="24"/>
+                <w:szCs w:val="24"/>
+              </w:rPr>
+              <w:t xml:space="preserve">20 ms</w:t>
+            </w:r>
+          </w:p>
+        </w:tc>
+        <w:tc>
+          <w:tcPr>
+            <w:tcW w:type="dxa" w:w="1500"/>
+            <w:tcBorders>
+              <w:top w:val="single" w:color="000000" w:sz="4"/>
+              <w:left w:val="single" w:color="000000" w:sz="4"/>
+              <w:bottom w:val="single" w:color="000000" w:sz="4"/>
+              <w:right w:val="single" w:color="000000" w:sz="4"/>
+            </w:tcBorders>
+            <w:tcMar>
+              <w:top w:type="dxa" w:w="60"/>
+              <w:left w:type="dxa" w:w="100"/>
+              <w:bottom w:type="dxa" w:w="60"/>
+              <w:right w:type="dxa" w:w="100"/>
+            </w:tcMar>
+          </w:tcPr>
+          <w:p>
+            <w:pPr>
+              <w:spacing w:line="276"/>
+              <w:jc w:val="left"/>
+            </w:pPr>
+            <w:r>
+              <w:rPr>
+                <w:rFonts w:ascii="Times New Roman" w:cs="Times New Roman" w:eastAsia="Times New Roman" w:hAnsi="Times New Roman"/>
+                <w:b w:val="false"/>
+                <w:bCs w:val="false"/>
+                <w:sz w:val="24"/>
+                <w:szCs w:val="24"/>
+              </w:rPr>
+              <w:t xml:space="preserve">6.79</w:t>
+            </w:r>
+          </w:p>
+        </w:tc>
+        <w:tc>
+          <w:tcPr>
+            <w:tcW w:type="dxa" w:w="1500"/>
+            <w:tcBorders>
+              <w:top w:val="single" w:color="000000" w:sz="4"/>
+              <w:left w:val="single" w:color="000000" w:sz="4"/>
+              <w:bottom w:val="single" w:color="000000" w:sz="4"/>
+              <w:right w:val="single" w:color="000000" w:sz="4"/>
+            </w:tcBorders>
+            <w:tcMar>
+              <w:top w:type="dxa" w:w="60"/>
+              <w:left w:type="dxa" w:w="100"/>
+              <w:bottom w:type="dxa" w:w="60"/>
+              <w:right w:type="dxa" w:w="100"/>
+            </w:tcMar>
+          </w:tcPr>
+          <w:p>
+            <w:pPr>
+              <w:spacing w:line="276"/>
+              <w:jc w:val="left"/>
+            </w:pPr>
+            <w:r>
+              <w:rPr>
+                <w:rFonts w:ascii="Times New Roman" w:cs="Times New Roman" w:eastAsia="Times New Roman" w:hAnsi="Times New Roman"/>
+                <w:b w:val="false"/>
+                <w:bCs w:val="false"/>
+                <w:sz w:val="24"/>
+                <w:szCs w:val="24"/>
+              </w:rPr>
+              <w:t xml:space="preserve">1.61</w:t>
+            </w:r>
+          </w:p>
+        </w:tc>
+        <w:tc>
+          <w:tcPr>
+            <w:tcW w:type="dxa" w:w="1500"/>
+            <w:tcBorders>
+              <w:top w:val="single" w:color="000000" w:sz="4"/>
+              <w:left w:val="single" w:color="000000" w:sz="4"/>
+              <w:bottom w:val="single" w:color="000000" w:sz="4"/>
+              <w:right w:val="single" w:color="000000" w:sz="4"/>
+            </w:tcBorders>
+            <w:tcMar>
+              <w:top w:type="dxa" w:w="60"/>
+              <w:left w:type="dxa" w:w="100"/>
+              <w:bottom w:type="dxa" w:w="60"/>
+              <w:right w:type="dxa" w:w="100"/>
+            </w:tcMar>
+          </w:tcPr>
+          <w:p>
+            <w:pPr>
+              <w:spacing w:line="276"/>
+              <w:jc w:val="left"/>
+            </w:pPr>
+            <w:r>
+              <w:rPr>
+                <w:rFonts w:ascii="Times New Roman" w:cs="Times New Roman" w:eastAsia="Times New Roman" w:hAnsi="Times New Roman"/>
+                <w:b w:val="false"/>
+                <w:bCs w:val="false"/>
+                <w:sz w:val="24"/>
+                <w:szCs w:val="24"/>
+              </w:rPr>
+              <w:t xml:space="preserve">1.25</w:t>
+            </w:r>
+          </w:p>
+        </w:tc>
+        <w:tc>
+          <w:tcPr>
+            <w:tcW w:type="dxa" w:w="1500"/>
+            <w:tcBorders>
+              <w:top w:val="single" w:color="000000" w:sz="4"/>
+              <w:left w:val="single" w:color="000000" w:sz="4"/>
+              <w:bottom w:val="single" w:color="000000" w:sz="4"/>
+              <w:right w:val="single" w:color="000000" w:sz="4"/>
+            </w:tcBorders>
+            <w:tcMar>
+              <w:top w:type="dxa" w:w="60"/>
+              <w:left w:type="dxa" w:w="100"/>
+              <w:bottom w:type="dxa" w:w="60"/>
+              <w:right w:type="dxa" w:w="100"/>
+            </w:tcMar>
+          </w:tcPr>
+          <w:p>
+            <w:pPr>
+              <w:spacing w:line="276"/>
+              <w:jc w:val="left"/>
+            </w:pPr>
+            <w:r>
+              <w:rPr>
+                <w:rFonts w:ascii="Times New Roman" w:cs="Times New Roman" w:eastAsia="Times New Roman" w:hAnsi="Times New Roman"/>
+                <w:b w:val="false"/>
+                <w:bCs w:val="false"/>
+                <w:sz w:val="24"/>
+                <w:szCs w:val="24"/>
+              </w:rPr>
+              <w:t xml:space="preserve">0.93</w:t>
+            </w:r>
+          </w:p>
+        </w:tc>
+        <w:tc>
+          <w:tcPr>
+            <w:tcW w:type="dxa" w:w="1526"/>
+            <w:tcBorders>
+              <w:top w:val="single" w:color="000000" w:sz="4"/>
+              <w:left w:val="single" w:color="000000" w:sz="4"/>
+              <w:bottom w:val="single" w:color="000000" w:sz="4"/>
+              <w:right w:val="single" w:color="000000" w:sz="4"/>
+            </w:tcBorders>
+            <w:tcMar>
+              <w:top w:type="dxa" w:w="60"/>
+              <w:left w:type="dxa" w:w="100"/>
+              <w:bottom w:type="dxa" w:w="60"/>
+              <w:right w:type="dxa" w:w="100"/>
+            </w:tcMar>
+          </w:tcPr>
+          <w:p>
+            <w:pPr>
+              <w:spacing w:line="276"/>
+              <w:jc w:val="left"/>
+            </w:pPr>
+            <w:r>
+              <w:rPr>
+                <w:rFonts w:ascii="Times New Roman" w:cs="Times New Roman" w:eastAsia="Times New Roman" w:hAnsi="Times New Roman"/>
+                <w:b w:val="false"/>
+                <w:bCs w:val="false"/>
+                <w:sz w:val="24"/>
+                <w:szCs w:val="24"/>
+              </w:rPr>
+              <w:t xml:space="preserve">0.64</w:t>
+            </w:r>
+          </w:p>
+        </w:tc>
+      </w:tr>
+      <w:tr>
+        <w:trPr>
+          <w:cantSplit/>
+          <w:tblHeader w:val="false"/>
+        </w:trPr>
+        <w:tc>
+          <w:tcPr>
+            <w:tcW w:type="dxa" w:w="1500"/>
+            <w:tcBorders>
+              <w:top w:val="single" w:color="000000" w:sz="4"/>
+              <w:left w:val="single" w:color="000000" w:sz="4"/>
+              <w:bottom w:val="single" w:color="000000" w:sz="4"/>
+              <w:right w:val="single" w:color="000000" w:sz="4"/>
+            </w:tcBorders>
+            <w:tcMar>
+              <w:top w:type="dxa" w:w="60"/>
+              <w:left w:type="dxa" w:w="100"/>
+              <w:bottom w:type="dxa" w:w="60"/>
+              <w:right w:type="dxa" w:w="100"/>
+            </w:tcMar>
+          </w:tcPr>
+          <w:p>
+            <w:pPr>
+              <w:spacing w:line="276"/>
+              <w:jc w:val="left"/>
+            </w:pPr>
+            <w:r>
+              <w:rPr>
+                <w:rFonts w:ascii="Times New Roman" w:cs="Times New Roman" w:eastAsia="Times New Roman" w:hAnsi="Times New Roman"/>
+                <w:b w:val="false"/>
+                <w:bCs w:val="false"/>
+                <w:sz w:val="24"/>
+                <w:szCs w:val="24"/>
+              </w:rPr>
+              <w:t xml:space="preserve">50 ms</w:t>
+            </w:r>
+          </w:p>
+        </w:tc>
+        <w:tc>
+          <w:tcPr>
+            <w:tcW w:type="dxa" w:w="1500"/>
+            <w:tcBorders>
+              <w:top w:val="single" w:color="000000" w:sz="4"/>
+              <w:left w:val="single" w:color="000000" w:sz="4"/>
+              <w:bottom w:val="single" w:color="000000" w:sz="4"/>
+              <w:right w:val="single" w:color="000000" w:sz="4"/>
+            </w:tcBorders>
+            <w:tcMar>
+              <w:top w:type="dxa" w:w="60"/>
+              <w:left w:type="dxa" w:w="100"/>
+              <w:bottom w:type="dxa" w:w="60"/>
+              <w:right w:type="dxa" w:w="100"/>
+            </w:tcMar>
+          </w:tcPr>
+          <w:p>
+            <w:pPr>
+              <w:spacing w:line="276"/>
+              <w:jc w:val="left"/>
+            </w:pPr>
+            <w:r>
+              <w:rPr>
+                <w:rFonts w:ascii="Times New Roman" w:cs="Times New Roman" w:eastAsia="Times New Roman" w:hAnsi="Times New Roman"/>
+                <w:b w:val="false"/>
+                <w:bCs w:val="false"/>
+                <w:sz w:val="24"/>
+                <w:szCs w:val="24"/>
+              </w:rPr>
+              <w:t xml:space="preserve">7.06</w:t>
+            </w:r>
+          </w:p>
+        </w:tc>
+        <w:tc>
+          <w:tcPr>
+            <w:tcW w:type="dxa" w:w="1500"/>
+            <w:tcBorders>
+              <w:top w:val="single" w:color="000000" w:sz="4"/>
+              <w:left w:val="single" w:color="000000" w:sz="4"/>
+              <w:bottom w:val="single" w:color="000000" w:sz="4"/>
+              <w:right w:val="single" w:color="000000" w:sz="4"/>
+            </w:tcBorders>
+            <w:tcMar>
+              <w:top w:type="dxa" w:w="60"/>
+              <w:left w:type="dxa" w:w="100"/>
+              <w:bottom w:type="dxa" w:w="60"/>
+              <w:right w:type="dxa" w:w="100"/>
+            </w:tcMar>
+          </w:tcPr>
+          <w:p>
+            <w:pPr>
+              <w:spacing w:line="276"/>
+              <w:jc w:val="left"/>
+            </w:pPr>
+            <w:r>
+              <w:rPr>
+                <w:rFonts w:ascii="Times New Roman" w:cs="Times New Roman" w:eastAsia="Times New Roman" w:hAnsi="Times New Roman"/>
+                <w:b w:val="false"/>
+                <w:bCs w:val="false"/>
+                <w:sz w:val="24"/>
+                <w:szCs w:val="24"/>
+              </w:rPr>
+              <w:t xml:space="preserve">1.82</w:t>
+            </w:r>
+          </w:p>
+        </w:tc>
+        <w:tc>
+          <w:tcPr>
+            <w:tcW w:type="dxa" w:w="1500"/>
+            <w:tcBorders>
+              <w:top w:val="single" w:color="000000" w:sz="4"/>
+              <w:left w:val="single" w:color="000000" w:sz="4"/>
+              <w:bottom w:val="single" w:color="000000" w:sz="4"/>
+              <w:right w:val="single" w:color="000000" w:sz="4"/>
+            </w:tcBorders>
+            <w:tcMar>
+              <w:top w:type="dxa" w:w="60"/>
+              <w:left w:type="dxa" w:w="100"/>
+              <w:bottom w:type="dxa" w:w="60"/>
+              <w:right w:type="dxa" w:w="100"/>
+            </w:tcMar>
+          </w:tcPr>
+          <w:p>
+            <w:pPr>
+              <w:spacing w:line="276"/>
+              <w:jc w:val="left"/>
+            </w:pPr>
+            <w:r>
+              <w:rPr>
+                <w:rFonts w:ascii="Times New Roman" w:cs="Times New Roman" w:eastAsia="Times New Roman" w:hAnsi="Times New Roman"/>
+                <w:b w:val="false"/>
+                <w:bCs w:val="false"/>
+                <w:sz w:val="24"/>
+                <w:szCs w:val="24"/>
+              </w:rPr>
+              <w:t xml:space="preserve">1.67</w:t>
+            </w:r>
+          </w:p>
+        </w:tc>
+        <w:tc>
+          <w:tcPr>
+            <w:tcW w:type="dxa" w:w="1500"/>
+            <w:tcBorders>
+              <w:top w:val="single" w:color="000000" w:sz="4"/>
+              <w:left w:val="single" w:color="000000" w:sz="4"/>
+              <w:bottom w:val="single" w:color="000000" w:sz="4"/>
+              <w:right w:val="single" w:color="000000" w:sz="4"/>
+            </w:tcBorders>
+            <w:tcMar>
+              <w:top w:type="dxa" w:w="60"/>
+              <w:left w:type="dxa" w:w="100"/>
+              <w:bottom w:type="dxa" w:w="60"/>
+              <w:right w:type="dxa" w:w="100"/>
+            </w:tcMar>
+          </w:tcPr>
+          <w:p>
+            <w:pPr>
+              <w:spacing w:line="276"/>
+              <w:jc w:val="left"/>
+            </w:pPr>
+            <w:r>
+              <w:rPr>
+                <w:rFonts w:ascii="Times New Roman" w:cs="Times New Roman" w:eastAsia="Times New Roman" w:hAnsi="Times New Roman"/>
+                <w:b w:val="false"/>
+                <w:bCs w:val="false"/>
+                <w:sz w:val="24"/>
+                <w:szCs w:val="24"/>
+              </w:rPr>
+              <w:t xml:space="preserve">1.13</w:t>
+            </w:r>
+          </w:p>
+        </w:tc>
+        <w:tc>
+          <w:tcPr>
+            <w:tcW w:type="dxa" w:w="1526"/>
+            <w:tcBorders>
+              <w:top w:val="single" w:color="000000" w:sz="4"/>
+              <w:left w:val="single" w:color="000000" w:sz="4"/>
+              <w:bottom w:val="single" w:color="000000" w:sz="4"/>
+              <w:right w:val="single" w:color="000000" w:sz="4"/>
+            </w:tcBorders>
+            <w:tcMar>
+              <w:top w:type="dxa" w:w="60"/>
+              <w:left w:type="dxa" w:w="100"/>
+              <w:bottom w:type="dxa" w:w="60"/>
+              <w:right w:type="dxa" w:w="100"/>
+            </w:tcMar>
+          </w:tcPr>
+          <w:p>
+            <w:pPr>
+              <w:spacing w:line="276"/>
+              <w:jc w:val="left"/>
+            </w:pPr>
+            <w:r>
+              <w:rPr>
+                <w:rFonts w:ascii="Times New Roman" w:cs="Times New Roman" w:eastAsia="Times New Roman" w:hAnsi="Times New Roman"/>
+                <w:b w:val="false"/>
+                <w:bCs w:val="false"/>
+                <w:sz w:val="24"/>
+                <w:szCs w:val="24"/>
+              </w:rPr>
+              <w:t xml:space="preserve">0.80</w:t>
+            </w:r>
+          </w:p>
+        </w:tc>
+      </w:tr>
+      <w:tr>
+        <w:trPr>
+          <w:cantSplit/>
+          <w:tblHeader w:val="false"/>
+        </w:trPr>
+        <w:tc>
+          <w:tcPr>
+            <w:tcW w:type="dxa" w:w="1500"/>
+            <w:tcBorders>
+              <w:top w:val="single" w:color="000000" w:sz="4"/>
+              <w:left w:val="single" w:color="000000" w:sz="4"/>
+              <w:bottom w:val="single" w:color="000000" w:sz="4"/>
+              <w:right w:val="single" w:color="000000" w:sz="4"/>
+            </w:tcBorders>
+            <w:tcMar>
+              <w:top w:type="dxa" w:w="60"/>
+              <w:left w:type="dxa" w:w="100"/>
+              <w:bottom w:type="dxa" w:w="60"/>
+              <w:right w:type="dxa" w:w="100"/>
+            </w:tcMar>
+          </w:tcPr>
+          <w:p>
+            <w:pPr>
+              <w:spacing w:line="276"/>
+              <w:jc w:val="left"/>
+            </w:pPr>
+            <w:r>
+              <w:rPr>
+                <w:rFonts w:ascii="Times New Roman" w:cs="Times New Roman" w:eastAsia="Times New Roman" w:hAnsi="Times New Roman"/>
+                <w:b w:val="false"/>
+                <w:bCs w:val="false"/>
+                <w:sz w:val="24"/>
+                <w:szCs w:val="24"/>
+              </w:rPr>
+              <w:t xml:space="preserve">100 ms</w:t>
+            </w:r>
+          </w:p>
+        </w:tc>
+        <w:tc>
+          <w:tcPr>
+            <w:tcW w:type="dxa" w:w="1500"/>
+            <w:tcBorders>
+              <w:top w:val="single" w:color="000000" w:sz="4"/>
+              <w:left w:val="single" w:color="000000" w:sz="4"/>
+              <w:bottom w:val="single" w:color="000000" w:sz="4"/>
+              <w:right w:val="single" w:color="000000" w:sz="4"/>
+            </w:tcBorders>
+            <w:tcMar>
+              <w:top w:type="dxa" w:w="60"/>
+              <w:left w:type="dxa" w:w="100"/>
+              <w:bottom w:type="dxa" w:w="60"/>
+              <w:right w:type="dxa" w:w="100"/>
+            </w:tcMar>
+          </w:tcPr>
+          <w:p>
+            <w:pPr>
+              <w:spacing w:line="276"/>
+              <w:jc w:val="left"/>
+            </w:pPr>
+            <w:r>
+              <w:rPr>
+                <w:rFonts w:ascii="Times New Roman" w:cs="Times New Roman" w:eastAsia="Times New Roman" w:hAnsi="Times New Roman"/>
+                <w:b w:val="false"/>
+                <w:bCs w:val="false"/>
+                <w:sz w:val="24"/>
+                <w:szCs w:val="24"/>
+              </w:rPr>
+              <w:t xml:space="preserve">8.16</w:t>
+            </w:r>
+          </w:p>
+        </w:tc>
+        <w:tc>
+          <w:tcPr>
+            <w:tcW w:type="dxa" w:w="1500"/>
+            <w:tcBorders>
+              <w:top w:val="single" w:color="000000" w:sz="4"/>
+              <w:left w:val="single" w:color="000000" w:sz="4"/>
+              <w:bottom w:val="single" w:color="000000" w:sz="4"/>
+              <w:right w:val="single" w:color="000000" w:sz="4"/>
+            </w:tcBorders>
+            <w:tcMar>
+              <w:top w:type="dxa" w:w="60"/>
+              <w:left w:type="dxa" w:w="100"/>
+              <w:bottom w:type="dxa" w:w="60"/>
+              <w:right w:type="dxa" w:w="100"/>
+            </w:tcMar>
+          </w:tcPr>
+          <w:p>
+            <w:pPr>
+              <w:spacing w:line="276"/>
+              <w:jc w:val="left"/>
+            </w:pPr>
+            <w:r>
+              <w:rPr>
+                <w:rFonts w:ascii="Times New Roman" w:cs="Times New Roman" w:eastAsia="Times New Roman" w:hAnsi="Times New Roman"/>
+                <w:b w:val="false"/>
+                <w:bCs w:val="false"/>
+                <w:sz w:val="24"/>
+                <w:szCs w:val="24"/>
+              </w:rPr>
+              <w:t xml:space="preserve">2.61</w:t>
+            </w:r>
+          </w:p>
+        </w:tc>
+        <w:tc>
+          <w:tcPr>
+            <w:tcW w:type="dxa" w:w="1500"/>
+            <w:tcBorders>
+              <w:top w:val="single" w:color="000000" w:sz="4"/>
+              <w:left w:val="single" w:color="000000" w:sz="4"/>
+              <w:bottom w:val="single" w:color="000000" w:sz="4"/>
+              <w:right w:val="single" w:color="000000" w:sz="4"/>
+            </w:tcBorders>
+            <w:tcMar>
+              <w:top w:type="dxa" w:w="60"/>
+              <w:left w:type="dxa" w:w="100"/>
+              <w:bottom w:type="dxa" w:w="60"/>
+              <w:right w:type="dxa" w:w="100"/>
+            </w:tcMar>
+          </w:tcPr>
+          <w:p>
+            <w:pPr>
+              <w:spacing w:line="276"/>
+              <w:jc w:val="left"/>
+            </w:pPr>
+            <w:r>
+              <w:rPr>
+                <w:rFonts w:ascii="Times New Roman" w:cs="Times New Roman" w:eastAsia="Times New Roman" w:hAnsi="Times New Roman"/>
+                <w:b w:val="false"/>
+                <w:bCs w:val="false"/>
+                <w:sz w:val="24"/>
+                <w:szCs w:val="24"/>
+              </w:rPr>
+              <w:t xml:space="preserve">2.77</w:t>
+            </w:r>
+          </w:p>
+        </w:tc>
+        <w:tc>
+          <w:tcPr>
+            <w:tcW w:type="dxa" w:w="1500"/>
+            <w:tcBorders>
+              <w:top w:val="single" w:color="000000" w:sz="4"/>
+              <w:left w:val="single" w:color="000000" w:sz="4"/>
+              <w:bottom w:val="single" w:color="000000" w:sz="4"/>
+              <w:right w:val="single" w:color="000000" w:sz="4"/>
+            </w:tcBorders>
+            <w:tcMar>
+              <w:top w:type="dxa" w:w="60"/>
+              <w:left w:type="dxa" w:w="100"/>
+              <w:bottom w:type="dxa" w:w="60"/>
+              <w:right w:type="dxa" w:w="100"/>
+            </w:tcMar>
+          </w:tcPr>
+          <w:p>
+            <w:pPr>
+              <w:spacing w:line="276"/>
+              <w:jc w:val="left"/>
+            </w:pPr>
+            <w:r>
+              <w:rPr>
+                <w:rFonts w:ascii="Times New Roman" w:cs="Times New Roman" w:eastAsia="Times New Roman" w:hAnsi="Times New Roman"/>
+                <w:b w:val="false"/>
+                <w:bCs w:val="false"/>
+                <w:sz w:val="24"/>
+                <w:szCs w:val="24"/>
+              </w:rPr>
+              <w:t xml:space="preserve">1.63</w:t>
+            </w:r>
+          </w:p>
+        </w:tc>
+        <w:tc>
+          <w:tcPr>
+            <w:tcW w:type="dxa" w:w="1526"/>
+            <w:tcBorders>
+              <w:top w:val="single" w:color="000000" w:sz="4"/>
+              <w:left w:val="single" w:color="000000" w:sz="4"/>
+              <w:bottom w:val="single" w:color="000000" w:sz="4"/>
+              <w:right w:val="single" w:color="000000" w:sz="4"/>
+            </w:tcBorders>
+            <w:tcMar>
+              <w:top w:type="dxa" w:w="60"/>
+              <w:left w:type="dxa" w:w="100"/>
+              <w:bottom w:type="dxa" w:w="60"/>
+              <w:right w:type="dxa" w:w="100"/>
+            </w:tcMar>
+          </w:tcPr>
+          <w:p>
+            <w:pPr>
+              <w:spacing w:line="276"/>
+              <w:jc w:val="left"/>
+            </w:pPr>
+            <w:r>
+              <w:rPr>
+                <w:rFonts w:ascii="Times New Roman" w:cs="Times New Roman" w:eastAsia="Times New Roman" w:hAnsi="Times New Roman"/>
+                <w:b w:val="false"/>
+                <w:bCs w:val="false"/>
+                <w:sz w:val="24"/>
+                <w:szCs w:val="24"/>
+              </w:rPr>
+              <w:t xml:space="preserve">1.11</w:t>
+            </w:r>
+          </w:p>
+        </w:tc>
+      </w:tr>
+      <w:tr>
+        <w:trPr>
+          <w:cantSplit/>
+          <w:tblHeader w:val="false"/>
+        </w:trPr>
+        <w:tc>
+          <w:tcPr>
+            <w:tcW w:type="dxa" w:w="1500"/>
+            <w:tcBorders>
+              <w:top w:val="single" w:color="000000" w:sz="4"/>
+              <w:left w:val="single" w:color="000000" w:sz="4"/>
+              <w:bottom w:val="single" w:color="000000" w:sz="4"/>
+              <w:right w:val="single" w:color="000000" w:sz="4"/>
+            </w:tcBorders>
+            <w:tcMar>
+              <w:top w:type="dxa" w:w="60"/>
+              <w:left w:type="dxa" w:w="100"/>
+              <w:bottom w:type="dxa" w:w="60"/>
+              <w:right w:type="dxa" w:w="100"/>
+            </w:tcMar>
+          </w:tcPr>
+          <w:p>
+            <w:pPr>
+              <w:spacing w:line="276"/>
+              <w:jc w:val="left"/>
+            </w:pPr>
+            <w:r>
+              <w:rPr>
+                <w:rFonts w:ascii="Times New Roman" w:cs="Times New Roman" w:eastAsia="Times New Roman" w:hAnsi="Times New Roman"/>
+                <w:b w:val="false"/>
+                <w:bCs w:val="false"/>
+                <w:sz w:val="24"/>
+                <w:szCs w:val="24"/>
+              </w:rPr>
+              <w:t xml:space="preserve">200 ms</w:t>
+            </w:r>
+          </w:p>
+        </w:tc>
+        <w:tc>
+          <w:tcPr>
+            <w:tcW w:type="dxa" w:w="1500"/>
+            <w:tcBorders>
+              <w:top w:val="single" w:color="000000" w:sz="4"/>
+              <w:left w:val="single" w:color="000000" w:sz="4"/>
+              <w:bottom w:val="single" w:color="000000" w:sz="4"/>
+              <w:right w:val="single" w:color="000000" w:sz="4"/>
+            </w:tcBorders>
+            <w:tcMar>
+              <w:top w:type="dxa" w:w="60"/>
+              <w:left w:type="dxa" w:w="100"/>
+              <w:bottom w:type="dxa" w:w="60"/>
+              <w:right w:type="dxa" w:w="100"/>
+            </w:tcMar>
+          </w:tcPr>
+          <w:p>
+            <w:pPr>
+              <w:spacing w:line="276"/>
+              <w:jc w:val="left"/>
+            </w:pPr>
+            <w:r>
+              <w:rPr>
+                <w:rFonts w:ascii="Times New Roman" w:cs="Times New Roman" w:eastAsia="Times New Roman" w:hAnsi="Times New Roman"/>
+                <w:b w:val="false"/>
+                <w:bCs w:val="false"/>
+                <w:sz w:val="24"/>
+                <w:szCs w:val="24"/>
+              </w:rPr>
+              <w:t xml:space="preserve">10.06</w:t>
+            </w:r>
+          </w:p>
+        </w:tc>
+        <w:tc>
+          <w:tcPr>
+            <w:tcW w:type="dxa" w:w="1500"/>
+            <w:tcBorders>
+              <w:top w:val="single" w:color="000000" w:sz="4"/>
+              <w:left w:val="single" w:color="000000" w:sz="4"/>
+              <w:bottom w:val="single" w:color="000000" w:sz="4"/>
+              <w:right w:val="single" w:color="000000" w:sz="4"/>
+            </w:tcBorders>
+            <w:tcMar>
+              <w:top w:type="dxa" w:w="60"/>
+              <w:left w:type="dxa" w:w="100"/>
+              <w:bottom w:type="dxa" w:w="60"/>
+              <w:right w:type="dxa" w:w="100"/>
+            </w:tcMar>
+          </w:tcPr>
+          <w:p>
+            <w:pPr>
+              <w:spacing w:line="276"/>
+              <w:jc w:val="left"/>
+            </w:pPr>
+            <w:r>
+              <w:rPr>
+                <w:rFonts w:ascii="Times New Roman" w:cs="Times New Roman" w:eastAsia="Times New Roman" w:hAnsi="Times New Roman"/>
+                <w:b w:val="false"/>
+                <w:bCs w:val="false"/>
+                <w:sz w:val="24"/>
+                <w:szCs w:val="24"/>
+              </w:rPr>
+              <w:t xml:space="preserve">6.34</w:t>
+            </w:r>
+          </w:p>
+        </w:tc>
+        <w:tc>
+          <w:tcPr>
+            <w:tcW w:type="dxa" w:w="1500"/>
+            <w:tcBorders>
+              <w:top w:val="single" w:color="000000" w:sz="4"/>
+              <w:left w:val="single" w:color="000000" w:sz="4"/>
+              <w:bottom w:val="single" w:color="000000" w:sz="4"/>
+              <w:right w:val="single" w:color="000000" w:sz="4"/>
+            </w:tcBorders>
+            <w:tcMar>
+              <w:top w:type="dxa" w:w="60"/>
+              <w:left w:type="dxa" w:w="100"/>
+              <w:bottom w:type="dxa" w:w="60"/>
+              <w:right w:type="dxa" w:w="100"/>
+            </w:tcMar>
+          </w:tcPr>
+          <w:p>
+            <w:pPr>
+              <w:spacing w:line="276"/>
+              <w:jc w:val="left"/>
+            </w:pPr>
+            <w:r>
+              <w:rPr>
+                <w:rFonts w:ascii="Times New Roman" w:cs="Times New Roman" w:eastAsia="Times New Roman" w:hAnsi="Times New Roman"/>
+                <w:b w:val="false"/>
+                <w:bCs w:val="false"/>
+                <w:sz w:val="24"/>
+                <w:szCs w:val="24"/>
+              </w:rPr>
+              <w:t xml:space="preserve">4.23</w:t>
+            </w:r>
+          </w:p>
+        </w:tc>
+        <w:tc>
+          <w:tcPr>
+            <w:tcW w:type="dxa" w:w="1500"/>
+            <w:tcBorders>
+              <w:top w:val="single" w:color="000000" w:sz="4"/>
+              <w:left w:val="single" w:color="000000" w:sz="4"/>
+              <w:bottom w:val="single" w:color="000000" w:sz="4"/>
+              <w:right w:val="single" w:color="000000" w:sz="4"/>
+            </w:tcBorders>
+            <w:tcMar>
+              <w:top w:type="dxa" w:w="60"/>
+              <w:left w:type="dxa" w:w="100"/>
+              <w:bottom w:type="dxa" w:w="60"/>
+              <w:right w:type="dxa" w:w="100"/>
+            </w:tcMar>
+          </w:tcPr>
+          <w:p>
+            <w:pPr>
+              <w:spacing w:line="276"/>
+              <w:jc w:val="left"/>
+            </w:pPr>
+            <w:r>
+              <w:rPr>
+                <w:rFonts w:ascii="Times New Roman" w:cs="Times New Roman" w:eastAsia="Times New Roman" w:hAnsi="Times New Roman"/>
+                <w:b w:val="false"/>
+                <w:bCs w:val="false"/>
+                <w:sz w:val="24"/>
+                <w:szCs w:val="24"/>
+              </w:rPr>
+              <w:t xml:space="preserve">2.54</w:t>
+            </w:r>
+          </w:p>
+        </w:tc>
+        <w:tc>
+          <w:tcPr>
+            <w:tcW w:type="dxa" w:w="1526"/>
+            <w:tcBorders>
+              <w:top w:val="single" w:color="000000" w:sz="4"/>
+              <w:left w:val="single" w:color="000000" w:sz="4"/>
+              <w:bottom w:val="single" w:color="000000" w:sz="4"/>
+              <w:right w:val="single" w:color="000000" w:sz="4"/>
+            </w:tcBorders>
+            <w:tcMar>
+              <w:top w:type="dxa" w:w="60"/>
+              <w:left w:type="dxa" w:w="100"/>
+              <w:bottom w:type="dxa" w:w="60"/>
+              <w:right w:type="dxa" w:w="100"/>
+            </w:tcMar>
+          </w:tcPr>
+          <w:p>
+            <w:pPr>
+              <w:spacing w:line="276"/>
+              <w:jc w:val="left"/>
+            </w:pPr>
+            <w:r>
+              <w:rPr>
+                <w:rFonts w:ascii="Times New Roman" w:cs="Times New Roman" w:eastAsia="Times New Roman" w:hAnsi="Times New Roman"/>
+                <w:b w:val="false"/>
+                <w:bCs w:val="false"/>
+                <w:sz w:val="24"/>
+                <w:szCs w:val="24"/>
+              </w:rPr>
+              <w:t xml:space="preserve">1.55</w:t>
+            </w:r>
+          </w:p>
+        </w:tc>
+      </w:tr>
+    </w:tbl>
+    <w:p>
+      <w:pPr>
+        <w:spacing w:after="160"/>
+      </w:pPr>
+    </w:p>
+    <w:p>
+      <w:pPr>
+        <w:spacing w:after="120" w:line="360"/>
+        <w:jc w:val="both"/>
+      </w:pPr>
+      <w:r>
+        <w:rPr>
+          <w:rFonts w:ascii="Times New Roman" w:cs="Times New Roman" w:eastAsia="Times New Roman" w:hAnsi="Times New Roman"/>
+          <w:sz w:val="24"/>
+          <w:szCs w:val="24"/>
+        </w:rPr>
         <w:t xml:space="preserve">Smart-RUDP was faster than AIMD on five of the six paths and equal on the sixth, and faster than the fixed window on five paths. The reason is specific: AIMD resets its window to one packet after every timeout, which is expensive when loss is random and not caused by congestion, while the agent learned to hold its window in that case. The advantage is therefore largest on high-loss paths and absent on a clean bottleneck, where there is nothing to learn. These are simulated paths. A real-time check of the gateway with two copies on one machine (four runs per controller) gave a mean of 1.2 s for Smart-RUDP against 2.6 s for AIMD at 10% loss and 40 ms, and 2.3 s against 3.0 s at 2% loss and 100 ms, with the fixed window at 0.8 s and 1.8 s; the run-to-run spread there is large, so those numbers support the direction and not the size of the effect. Section 8 stands as reported: on the 5G-like, lossy and satellite-like paths of that experiment the learned controller did not beat AIMD. </w:t>
       </w:r>
     </w:p>
@@ -14856,7 +17873,7 @@
           <w:sz w:val="24"/>
           <w:szCs w:val="24"/>
         </w:rPr>
-        <w:t xml:space="preserve">Selective Repeat or selective acknowledgments, so only lost packets are resent.</w:t>
+        <w:t xml:space="preserve">Selective Repeat or selective acknowledgments in the C transport, so only lost packets are resent; the simulation in Section 11 shows the largest gain of any change tried.</w:t>
       </w:r>
     </w:p>
     <w:p>
@@ -14913,7 +17930,7 @@
           <w:sz w:val="24"/>
           <w:szCs w:val="24"/>
         </w:rPr>
-        <w:t xml:space="preserve">Repeating the Smart-RUDP scenarios with kernel tc/netem and on a real multi-machine path, with reordering, and running the TCP and plain-UDP baselines.</w:t>
+        <w:t xml:space="preserve">Running the provided netem_baselines.sh on a Linux machine to measure kernel TCP, plain UDP and RUDP on the same impaired path, and repeating the Smart-RUDP scenarios on a real multi-machine path.</w:t>
       </w:r>
     </w:p>
     <w:p>
@@ -14932,7 +17949,7 @@
           <w:sz w:val="24"/>
           <w:szCs w:val="24"/>
         </w:rPr>
-        <w:t xml:space="preserve">Repeated runs per loss level with averages and confidence intervals.</w:t>
+        <w:t xml:space="preserve">Repeated runs per loss level for the base protocol, with averages and confidence intervals; this was done for the Smart-RUDP scenarios (Table 8b).</w:t>
       </w:r>
     </w:p>
     <w:p>

</xml_diff>

<commit_message>
Neural agent and selective ACK in the C transport, test suite, CI evaluations, docs updated
Co-Authored-By: Claude Sonnet 5.5 <noreply@anthropic.com>
Claude-Session: https://claude.ai/code/session_01NX2zRNpdVAnzFNKmqomzKu
</commit_message>
<xml_diff>
--- a/docs/RUDP_Final_Project_Report.docx
+++ b/docs/RUDP_Final_Project_Report.docx
@@ -227,7 +227,7 @@
           <w:sz w:val="24"/>
           <w:szCs w:val="24"/>
         </w:rPr>
-        <w:t xml:space="preserve">The project is extended in two directions. First, Smart-RUDP replaces the fixed AIMD rule with a tabular Q-learning congestion controller and compares it with AIMD on three emulated paths (5G-like, lossy wireless and satellite-like); it matched but did not beat the rule-based controller on completion time. Second, the protocol is placed in a multi-site network of four OSPF routers, two VLANs, a server LAN and a branch LAN built in Cisco Packet Tracer, and its traffic is analysed in Wireshark with a custom dissector.</w:t>
+        <w:t xml:space="preserve">The project is extended in two directions. First, Smart-RUDP replaces the fixed AIMD rule with a tabular Q-learning congestion controller and compares it with AIMD on three emulated paths (5G-like, lossy wireless and satellite-like); the tabular agent matched but did not beat the rule-based controller on completion time, while a neural (deep Q-network) agent added later beat it on all three paths in the C transport (Section 8.5). Second, the protocol is placed in a multi-site network of four OSPF routers, two VLANs, a server LAN and a branch LAN built in Cisco Packet Tracer, and its traffic is analysed in Wireshark with a custom dissector.</w:t>
       </w:r>
     </w:p>
     <w:p>
@@ -9959,7 +9959,7 @@
           <w:sz w:val="24"/>
           <w:szCs w:val="24"/>
         </w:rPr>
-        <w:t xml:space="preserve">Smart-RUDP did not beat the baseline on completion time. With six runs it was slower on the 5G-like and satellite-like paths (by about 63% and 10%) and equal within noise on the lossy path; a repeat with 20 runs per mode (Table 8b) gave tighter intervals and confirms the same pattern, with a larger satellite gap. It sent fewer retransmissions on the 5G-like and satellite-like paths and had a slightly lower mean RTT, but the retransmission differences are within one standard deviation across runs and should not be treated as significant. The result is reported as obtained: with a tabular agent, 40 training episodes per scenario and six evaluation runs, learning-based control matched but did not outperform a well-tuned rule on these paths.</w:t>
+        <w:t xml:space="preserve">Smart-RUDP did not beat the baseline on completion time. With six runs it was slower on the 5G-like and satellite-like paths (by about 63% and 10%) and equal within noise on the lossy path; a repeat with 20 runs per mode (Table 8b) gave tighter intervals and confirms the same pattern, with a larger satellite gap. It sent fewer retransmissions on the 5G-like and satellite-like paths and had a slightly lower mean RTT, but the retransmission differences are within one standard deviation across runs and should not be treated as significant. The result is reported as obtained: with a tabular agent, 40 training episodes per scenario and six evaluation runs, learning-based control matched but did not outperform a well-tuned rule on these paths. Section 8.5 reports a neural agent that does outperform it.</w:t>
       </w:r>
     </w:p>
     <w:p>
@@ -10924,7 +10924,7 @@
           <w:sz w:val="24"/>
           <w:szCs w:val="24"/>
         </w:rPr>
-        <w:t xml:space="preserve">The emulated path in the C program keeps packets in order, so reordering was tested only in the Python simulator (Section 11). A TCP model and plain UDP were compared in simulation; real kernel TCP over an impaired path was not run because the build environment has no tc/netem (a script, netem_baselines.sh, is provided for a Linux machine).</w:t>
+        <w:t xml:space="preserve">The emulated path in the C program keeps packets in order unless the option --reorder 1 is given; reordering was tested in the Python simulator (Section 11) and in one C scenario (Table 8d). A TCP model and plain UDP were compared in simulation; real kernel TCP over an impaired path was not run because the build environment has no tc/netem (a script, netem_baselines.sh, is provided for a Linux machine).</w:t>
       </w:r>
     </w:p>
     <w:p>
@@ -10945,6 +10945,1999 @@
         </w:rPr>
         <w:t xml:space="preserve">A tc/netem script (netem_scenarios.sh) is supplied for repeating the scenarios with kernel emulation on Linux. It was not run for this report.</w:t>
       </w:r>
+    </w:p>
+    <w:p>
+      <w:pPr>
+        <w:pStyle w:val="Heading2"/>
+        <w:keepNext/>
+        <w:spacing w:after="120" w:before="120" w:line="360"/>
+      </w:pPr>
+      <w:r>
+        <w:rPr>
+          <w:rFonts w:ascii="Times New Roman" w:cs="Times New Roman" w:eastAsia="Times New Roman" w:hAnsi="Times New Roman"/>
+          <w:b/>
+          <w:bCs/>
+          <w:sz w:val="24"/>
+          <w:szCs w:val="24"/>
+        </w:rPr>
+        <w:t xml:space="preserve">8.5 Neural agent, chat-style table agent and selective acknowledgments in the C transport</w:t>
+      </w:r>
+    </w:p>
+    <w:p>
+      <w:pPr>
+        <w:spacing w:after="120" w:line="360"/>
+        <w:jc w:val="both"/>
+      </w:pPr>
+      <w:r>
+        <w:rPr>
+          <w:rFonts w:ascii="Times New Roman" w:cs="Times New Roman" w:eastAsia="Times New Roman" w:hAnsi="Times New Roman"/>
+          <w:sz w:val="24"/>
+          <w:szCs w:val="24"/>
+        </w:rPr>
+        <w:t xml:space="preserve">After Section 11 produced a neural agent and a retrained table in the Python simulator, both were added to the C transport so they could be tested on the same three emulated paths. The C client now has the modes rl2 (the retrained table, with the rule that the window may not shrink without a loss or delay signal, window cap 32 and a decision every 100 to 500 ms) and deep (the neural network of Section 11, a forward pass in src/deep_cc.h with weights exported by web/export_dqn.py). AIMD and the new modes all start from a window of 10 for a fair comparison. The agents were trained only in the Python simulator, on paths that are different from these three, so the C scenarios are unseen. Table 8c gives 15 runs per mode for the 5G-like and lossy paths and 8 runs for the satellite-like path, with 95% confidence intervals.</w:t>
+      </w:r>
+    </w:p>
+    <w:p>
+      <w:pPr>
+        <w:keepNext/>
+        <w:spacing w:after="80" w:before="120"/>
+        <w:jc w:val="center"/>
+      </w:pPr>
+      <w:r>
+        <w:rPr>
+          <w:rFonts w:ascii="Times New Roman" w:cs="Times New Roman" w:eastAsia="Times New Roman" w:hAnsi="Times New Roman"/>
+          <w:b/>
+          <w:bCs/>
+          <w:sz w:val="24"/>
+          <w:szCs w:val="24"/>
+        </w:rPr>
+        <w:t xml:space="preserve">Table 8c: Completion time of 1,200 packets in the C transport (mean +/- 95% confidence interval; the last two columns are paired differences; all differences shown are significant)</w:t>
+      </w:r>
+    </w:p>
+    <w:tbl>
+      <w:tblPr>
+        <w:tblW w:type="dxa" w:w="9026"/>
+        <w:tblBorders>
+          <w:top w:val="single" w:color="auto" w:sz="4"/>
+          <w:left w:val="single" w:color="auto" w:sz="4"/>
+          <w:bottom w:val="single" w:color="auto" w:sz="4"/>
+          <w:right w:val="single" w:color="auto" w:sz="4"/>
+          <w:insideH w:val="single" w:color="auto" w:sz="4"/>
+          <w:insideV w:val="single" w:color="auto" w:sz="4"/>
+        </w:tblBorders>
+      </w:tblPr>
+      <w:tblGrid>
+        <w:gridCol w:w="1700"/>
+        <w:gridCol w:w="1400"/>
+        <w:gridCol w:w="1400"/>
+        <w:gridCol w:w="1400"/>
+        <w:gridCol w:w="1700"/>
+        <w:gridCol w:w="1426"/>
+      </w:tblGrid>
+      <w:tr>
+        <w:trPr>
+          <w:cantSplit/>
+          <w:tblHeader/>
+        </w:trPr>
+        <w:tc>
+          <w:tcPr>
+            <w:tcW w:type="dxa" w:w="1700"/>
+            <w:tcBorders>
+              <w:top w:val="single" w:color="000000" w:sz="4"/>
+              <w:left w:val="single" w:color="000000" w:sz="4"/>
+              <w:bottom w:val="single" w:color="000000" w:sz="4"/>
+              <w:right w:val="single" w:color="000000" w:sz="4"/>
+            </w:tcBorders>
+            <w:shd w:fill="D9D9D9" w:color="auto" w:val="clear"/>
+            <w:tcMar>
+              <w:top w:type="dxa" w:w="60"/>
+              <w:left w:type="dxa" w:w="100"/>
+              <w:bottom w:type="dxa" w:w="60"/>
+              <w:right w:type="dxa" w:w="100"/>
+            </w:tcMar>
+          </w:tcPr>
+          <w:p>
+            <w:pPr>
+              <w:spacing w:line="276"/>
+              <w:jc w:val="left"/>
+            </w:pPr>
+            <w:r>
+              <w:rPr>
+                <w:rFonts w:ascii="Times New Roman" w:cs="Times New Roman" w:eastAsia="Times New Roman" w:hAnsi="Times New Roman"/>
+                <w:b/>
+                <w:bCs/>
+                <w:sz w:val="24"/>
+                <w:szCs w:val="24"/>
+              </w:rPr>
+              <w:t xml:space="preserve">Scenario</w:t>
+            </w:r>
+          </w:p>
+        </w:tc>
+        <w:tc>
+          <w:tcPr>
+            <w:tcW w:type="dxa" w:w="1400"/>
+            <w:tcBorders>
+              <w:top w:val="single" w:color="000000" w:sz="4"/>
+              <w:left w:val="single" w:color="000000" w:sz="4"/>
+              <w:bottom w:val="single" w:color="000000" w:sz="4"/>
+              <w:right w:val="single" w:color="000000" w:sz="4"/>
+            </w:tcBorders>
+            <w:shd w:fill="D9D9D9" w:color="auto" w:val="clear"/>
+            <w:tcMar>
+              <w:top w:type="dxa" w:w="60"/>
+              <w:left w:type="dxa" w:w="100"/>
+              <w:bottom w:type="dxa" w:w="60"/>
+              <w:right w:type="dxa" w:w="100"/>
+            </w:tcMar>
+          </w:tcPr>
+          <w:p>
+            <w:pPr>
+              <w:spacing w:line="276"/>
+              <w:jc w:val="left"/>
+            </w:pPr>
+            <w:r>
+              <w:rPr>
+                <w:rFonts w:ascii="Times New Roman" w:cs="Times New Roman" w:eastAsia="Times New Roman" w:hAnsi="Times New Roman"/>
+                <w:b/>
+                <w:bCs/>
+                <w:sz w:val="24"/>
+                <w:szCs w:val="24"/>
+              </w:rPr>
+              <w:t xml:space="preserve">AIMD time (s)</w:t>
+            </w:r>
+          </w:p>
+        </w:tc>
+        <w:tc>
+          <w:tcPr>
+            <w:tcW w:type="dxa" w:w="1400"/>
+            <w:tcBorders>
+              <w:top w:val="single" w:color="000000" w:sz="4"/>
+              <w:left w:val="single" w:color="000000" w:sz="4"/>
+              <w:bottom w:val="single" w:color="000000" w:sz="4"/>
+              <w:right w:val="single" w:color="000000" w:sz="4"/>
+            </w:tcBorders>
+            <w:shd w:fill="D9D9D9" w:color="auto" w:val="clear"/>
+            <w:tcMar>
+              <w:top w:type="dxa" w:w="60"/>
+              <w:left w:type="dxa" w:w="100"/>
+              <w:bottom w:type="dxa" w:w="60"/>
+              <w:right w:type="dxa" w:w="100"/>
+            </w:tcMar>
+          </w:tcPr>
+          <w:p>
+            <w:pPr>
+              <w:spacing w:line="276"/>
+              <w:jc w:val="left"/>
+            </w:pPr>
+            <w:r>
+              <w:rPr>
+                <w:rFonts w:ascii="Times New Roman" w:cs="Times New Roman" w:eastAsia="Times New Roman" w:hAnsi="Times New Roman"/>
+                <w:b/>
+                <w:bCs/>
+                <w:sz w:val="24"/>
+                <w:szCs w:val="24"/>
+              </w:rPr>
+              <w:t xml:space="preserve">rl2 time (s)</w:t>
+            </w:r>
+          </w:p>
+        </w:tc>
+        <w:tc>
+          <w:tcPr>
+            <w:tcW w:type="dxa" w:w="1400"/>
+            <w:tcBorders>
+              <w:top w:val="single" w:color="000000" w:sz="4"/>
+              <w:left w:val="single" w:color="000000" w:sz="4"/>
+              <w:bottom w:val="single" w:color="000000" w:sz="4"/>
+              <w:right w:val="single" w:color="000000" w:sz="4"/>
+            </w:tcBorders>
+            <w:shd w:fill="D9D9D9" w:color="auto" w:val="clear"/>
+            <w:tcMar>
+              <w:top w:type="dxa" w:w="60"/>
+              <w:left w:type="dxa" w:w="100"/>
+              <w:bottom w:type="dxa" w:w="60"/>
+              <w:right w:type="dxa" w:w="100"/>
+            </w:tcMar>
+          </w:tcPr>
+          <w:p>
+            <w:pPr>
+              <w:spacing w:line="276"/>
+              <w:jc w:val="left"/>
+            </w:pPr>
+            <w:r>
+              <w:rPr>
+                <w:rFonts w:ascii="Times New Roman" w:cs="Times New Roman" w:eastAsia="Times New Roman" w:hAnsi="Times New Roman"/>
+                <w:b/>
+                <w:bCs/>
+                <w:sz w:val="24"/>
+                <w:szCs w:val="24"/>
+              </w:rPr>
+              <w:t xml:space="preserve">Deep time (s)</w:t>
+            </w:r>
+          </w:p>
+        </w:tc>
+        <w:tc>
+          <w:tcPr>
+            <w:tcW w:type="dxa" w:w="1700"/>
+            <w:tcBorders>
+              <w:top w:val="single" w:color="000000" w:sz="4"/>
+              <w:left w:val="single" w:color="000000" w:sz="4"/>
+              <w:bottom w:val="single" w:color="000000" w:sz="4"/>
+              <w:right w:val="single" w:color="000000" w:sz="4"/>
+            </w:tcBorders>
+            <w:shd w:fill="D9D9D9" w:color="auto" w:val="clear"/>
+            <w:tcMar>
+              <w:top w:type="dxa" w:w="60"/>
+              <w:left w:type="dxa" w:w="100"/>
+              <w:bottom w:type="dxa" w:w="60"/>
+              <w:right w:type="dxa" w:w="100"/>
+            </w:tcMar>
+          </w:tcPr>
+          <w:p>
+            <w:pPr>
+              <w:spacing w:line="276"/>
+              <w:jc w:val="left"/>
+            </w:pPr>
+            <w:r>
+              <w:rPr>
+                <w:rFonts w:ascii="Times New Roman" w:cs="Times New Roman" w:eastAsia="Times New Roman" w:hAnsi="Times New Roman"/>
+                <w:b/>
+                <w:bCs/>
+                <w:sz w:val="24"/>
+                <w:szCs w:val="24"/>
+              </w:rPr>
+              <w:t xml:space="preserve">Deep - AIMD (s)</w:t>
+            </w:r>
+          </w:p>
+        </w:tc>
+        <w:tc>
+          <w:tcPr>
+            <w:tcW w:type="dxa" w:w="1426"/>
+            <w:tcBorders>
+              <w:top w:val="single" w:color="000000" w:sz="4"/>
+              <w:left w:val="single" w:color="000000" w:sz="4"/>
+              <w:bottom w:val="single" w:color="000000" w:sz="4"/>
+              <w:right w:val="single" w:color="000000" w:sz="4"/>
+            </w:tcBorders>
+            <w:shd w:fill="D9D9D9" w:color="auto" w:val="clear"/>
+            <w:tcMar>
+              <w:top w:type="dxa" w:w="60"/>
+              <w:left w:type="dxa" w:w="100"/>
+              <w:bottom w:type="dxa" w:w="60"/>
+              <w:right w:type="dxa" w:w="100"/>
+            </w:tcMar>
+          </w:tcPr>
+          <w:p>
+            <w:pPr>
+              <w:spacing w:line="276"/>
+              <w:jc w:val="left"/>
+            </w:pPr>
+            <w:r>
+              <w:rPr>
+                <w:rFonts w:ascii="Times New Roman" w:cs="Times New Roman" w:eastAsia="Times New Roman" w:hAnsi="Times New Roman"/>
+                <w:b/>
+                <w:bCs/>
+                <w:sz w:val="24"/>
+                <w:szCs w:val="24"/>
+              </w:rPr>
+              <w:t xml:space="preserve">rl2 - AIMD (s)</w:t>
+            </w:r>
+          </w:p>
+        </w:tc>
+      </w:tr>
+      <w:tr>
+        <w:trPr>
+          <w:cantSplit/>
+          <w:tblHeader w:val="false"/>
+        </w:trPr>
+        <w:tc>
+          <w:tcPr>
+            <w:tcW w:type="dxa" w:w="1700"/>
+            <w:tcBorders>
+              <w:top w:val="single" w:color="000000" w:sz="4"/>
+              <w:left w:val="single" w:color="000000" w:sz="4"/>
+              <w:bottom w:val="single" w:color="000000" w:sz="4"/>
+              <w:right w:val="single" w:color="000000" w:sz="4"/>
+            </w:tcBorders>
+            <w:tcMar>
+              <w:top w:type="dxa" w:w="60"/>
+              <w:left w:type="dxa" w:w="100"/>
+              <w:bottom w:type="dxa" w:w="60"/>
+              <w:right w:type="dxa" w:w="100"/>
+            </w:tcMar>
+          </w:tcPr>
+          <w:p>
+            <w:pPr>
+              <w:spacing w:line="276"/>
+              <w:jc w:val="left"/>
+            </w:pPr>
+            <w:r>
+              <w:rPr>
+                <w:rFonts w:ascii="Times New Roman" w:cs="Times New Roman" w:eastAsia="Times New Roman" w:hAnsi="Times New Roman"/>
+                <w:b w:val="false"/>
+                <w:bCs w:val="false"/>
+                <w:sz w:val="24"/>
+                <w:szCs w:val="24"/>
+              </w:rPr>
+              <w:t xml:space="preserve">5G-like</w:t>
+            </w:r>
+          </w:p>
+        </w:tc>
+        <w:tc>
+          <w:tcPr>
+            <w:tcW w:type="dxa" w:w="1400"/>
+            <w:tcBorders>
+              <w:top w:val="single" w:color="000000" w:sz="4"/>
+              <w:left w:val="single" w:color="000000" w:sz="4"/>
+              <w:bottom w:val="single" w:color="000000" w:sz="4"/>
+              <w:right w:val="single" w:color="000000" w:sz="4"/>
+            </w:tcBorders>
+            <w:tcMar>
+              <w:top w:type="dxa" w:w="60"/>
+              <w:left w:type="dxa" w:w="100"/>
+              <w:bottom w:type="dxa" w:w="60"/>
+              <w:right w:type="dxa" w:w="100"/>
+            </w:tcMar>
+          </w:tcPr>
+          <w:p>
+            <w:pPr>
+              <w:spacing w:line="276"/>
+              <w:jc w:val="left"/>
+            </w:pPr>
+            <w:r>
+              <w:rPr>
+                <w:rFonts w:ascii="Times New Roman" w:cs="Times New Roman" w:eastAsia="Times New Roman" w:hAnsi="Times New Roman"/>
+                <w:b w:val="false"/>
+                <w:bCs w:val="false"/>
+                <w:sz w:val="24"/>
+                <w:szCs w:val="24"/>
+              </w:rPr>
+              <w:t xml:space="preserve">1.38 +/- 0.16</w:t>
+            </w:r>
+          </w:p>
+        </w:tc>
+        <w:tc>
+          <w:tcPr>
+            <w:tcW w:type="dxa" w:w="1400"/>
+            <w:tcBorders>
+              <w:top w:val="single" w:color="000000" w:sz="4"/>
+              <w:left w:val="single" w:color="000000" w:sz="4"/>
+              <w:bottom w:val="single" w:color="000000" w:sz="4"/>
+              <w:right w:val="single" w:color="000000" w:sz="4"/>
+            </w:tcBorders>
+            <w:tcMar>
+              <w:top w:type="dxa" w:w="60"/>
+              <w:left w:type="dxa" w:w="100"/>
+              <w:bottom w:type="dxa" w:w="60"/>
+              <w:right w:type="dxa" w:w="100"/>
+            </w:tcMar>
+          </w:tcPr>
+          <w:p>
+            <w:pPr>
+              <w:spacing w:line="276"/>
+              <w:jc w:val="left"/>
+            </w:pPr>
+            <w:r>
+              <w:rPr>
+                <w:rFonts w:ascii="Times New Roman" w:cs="Times New Roman" w:eastAsia="Times New Roman" w:hAnsi="Times New Roman"/>
+                <w:b w:val="false"/>
+                <w:bCs w:val="false"/>
+                <w:sz w:val="24"/>
+                <w:szCs w:val="24"/>
+              </w:rPr>
+              <w:t xml:space="preserve">2.64 +/- 0.50</w:t>
+            </w:r>
+          </w:p>
+        </w:tc>
+        <w:tc>
+          <w:tcPr>
+            <w:tcW w:type="dxa" w:w="1400"/>
+            <w:tcBorders>
+              <w:top w:val="single" w:color="000000" w:sz="4"/>
+              <w:left w:val="single" w:color="000000" w:sz="4"/>
+              <w:bottom w:val="single" w:color="000000" w:sz="4"/>
+              <w:right w:val="single" w:color="000000" w:sz="4"/>
+            </w:tcBorders>
+            <w:tcMar>
+              <w:top w:type="dxa" w:w="60"/>
+              <w:left w:type="dxa" w:w="100"/>
+              <w:bottom w:type="dxa" w:w="60"/>
+              <w:right w:type="dxa" w:w="100"/>
+            </w:tcMar>
+          </w:tcPr>
+          <w:p>
+            <w:pPr>
+              <w:spacing w:line="276"/>
+              <w:jc w:val="left"/>
+            </w:pPr>
+            <w:r>
+              <w:rPr>
+                <w:rFonts w:ascii="Times New Roman" w:cs="Times New Roman" w:eastAsia="Times New Roman" w:hAnsi="Times New Roman"/>
+                <w:b w:val="false"/>
+                <w:bCs w:val="false"/>
+                <w:sz w:val="24"/>
+                <w:szCs w:val="24"/>
+              </w:rPr>
+              <w:t xml:space="preserve">1.18 +/- 0.03</w:t>
+            </w:r>
+          </w:p>
+        </w:tc>
+        <w:tc>
+          <w:tcPr>
+            <w:tcW w:type="dxa" w:w="1700"/>
+            <w:tcBorders>
+              <w:top w:val="single" w:color="000000" w:sz="4"/>
+              <w:left w:val="single" w:color="000000" w:sz="4"/>
+              <w:bottom w:val="single" w:color="000000" w:sz="4"/>
+              <w:right w:val="single" w:color="000000" w:sz="4"/>
+            </w:tcBorders>
+            <w:tcMar>
+              <w:top w:type="dxa" w:w="60"/>
+              <w:left w:type="dxa" w:w="100"/>
+              <w:bottom w:type="dxa" w:w="60"/>
+              <w:right w:type="dxa" w:w="100"/>
+            </w:tcMar>
+          </w:tcPr>
+          <w:p>
+            <w:pPr>
+              <w:spacing w:line="276"/>
+              <w:jc w:val="left"/>
+            </w:pPr>
+            <w:r>
+              <w:rPr>
+                <w:rFonts w:ascii="Times New Roman" w:cs="Times New Roman" w:eastAsia="Times New Roman" w:hAnsi="Times New Roman"/>
+                <w:b w:val="false"/>
+                <w:bCs w:val="false"/>
+                <w:sz w:val="24"/>
+                <w:szCs w:val="24"/>
+              </w:rPr>
+              <w:t xml:space="preserve">-0.20 +/- 0.15</w:t>
+            </w:r>
+          </w:p>
+        </w:tc>
+        <w:tc>
+          <w:tcPr>
+            <w:tcW w:type="dxa" w:w="1426"/>
+            <w:tcBorders>
+              <w:top w:val="single" w:color="000000" w:sz="4"/>
+              <w:left w:val="single" w:color="000000" w:sz="4"/>
+              <w:bottom w:val="single" w:color="000000" w:sz="4"/>
+              <w:right w:val="single" w:color="000000" w:sz="4"/>
+            </w:tcBorders>
+            <w:tcMar>
+              <w:top w:type="dxa" w:w="60"/>
+              <w:left w:type="dxa" w:w="100"/>
+              <w:bottom w:type="dxa" w:w="60"/>
+              <w:right w:type="dxa" w:w="100"/>
+            </w:tcMar>
+          </w:tcPr>
+          <w:p>
+            <w:pPr>
+              <w:spacing w:line="276"/>
+              <w:jc w:val="left"/>
+            </w:pPr>
+            <w:r>
+              <w:rPr>
+                <w:rFonts w:ascii="Times New Roman" w:cs="Times New Roman" w:eastAsia="Times New Roman" w:hAnsi="Times New Roman"/>
+                <w:b w:val="false"/>
+                <w:bCs w:val="false"/>
+                <w:sz w:val="24"/>
+                <w:szCs w:val="24"/>
+              </w:rPr>
+              <w:t xml:space="preserve">+1.25 +/- 0.56</w:t>
+            </w:r>
+          </w:p>
+        </w:tc>
+      </w:tr>
+      <w:tr>
+        <w:trPr>
+          <w:cantSplit/>
+          <w:tblHeader w:val="false"/>
+        </w:trPr>
+        <w:tc>
+          <w:tcPr>
+            <w:tcW w:type="dxa" w:w="1700"/>
+            <w:tcBorders>
+              <w:top w:val="single" w:color="000000" w:sz="4"/>
+              <w:left w:val="single" w:color="000000" w:sz="4"/>
+              <w:bottom w:val="single" w:color="000000" w:sz="4"/>
+              <w:right w:val="single" w:color="000000" w:sz="4"/>
+            </w:tcBorders>
+            <w:tcMar>
+              <w:top w:type="dxa" w:w="60"/>
+              <w:left w:type="dxa" w:w="100"/>
+              <w:bottom w:type="dxa" w:w="60"/>
+              <w:right w:type="dxa" w:w="100"/>
+            </w:tcMar>
+          </w:tcPr>
+          <w:p>
+            <w:pPr>
+              <w:spacing w:line="276"/>
+              <w:jc w:val="left"/>
+            </w:pPr>
+            <w:r>
+              <w:rPr>
+                <w:rFonts w:ascii="Times New Roman" w:cs="Times New Roman" w:eastAsia="Times New Roman" w:hAnsi="Times New Roman"/>
+                <w:b w:val="false"/>
+                <w:bCs w:val="false"/>
+                <w:sz w:val="24"/>
+                <w:szCs w:val="24"/>
+              </w:rPr>
+              <w:t xml:space="preserve">Lossy wireless</w:t>
+            </w:r>
+          </w:p>
+        </w:tc>
+        <w:tc>
+          <w:tcPr>
+            <w:tcW w:type="dxa" w:w="1400"/>
+            <w:tcBorders>
+              <w:top w:val="single" w:color="000000" w:sz="4"/>
+              <w:left w:val="single" w:color="000000" w:sz="4"/>
+              <w:bottom w:val="single" w:color="000000" w:sz="4"/>
+              <w:right w:val="single" w:color="000000" w:sz="4"/>
+            </w:tcBorders>
+            <w:tcMar>
+              <w:top w:type="dxa" w:w="60"/>
+              <w:left w:type="dxa" w:w="100"/>
+              <w:bottom w:type="dxa" w:w="60"/>
+              <w:right w:type="dxa" w:w="100"/>
+            </w:tcMar>
+          </w:tcPr>
+          <w:p>
+            <w:pPr>
+              <w:spacing w:line="276"/>
+              <w:jc w:val="left"/>
+            </w:pPr>
+            <w:r>
+              <w:rPr>
+                <w:rFonts w:ascii="Times New Roman" w:cs="Times New Roman" w:eastAsia="Times New Roman" w:hAnsi="Times New Roman"/>
+                <w:b w:val="false"/>
+                <w:bCs w:val="false"/>
+                <w:sz w:val="24"/>
+                <w:szCs w:val="24"/>
+              </w:rPr>
+              <w:t xml:space="preserve">9.13 +/- 0.49</w:t>
+            </w:r>
+          </w:p>
+        </w:tc>
+        <w:tc>
+          <w:tcPr>
+            <w:tcW w:type="dxa" w:w="1400"/>
+            <w:tcBorders>
+              <w:top w:val="single" w:color="000000" w:sz="4"/>
+              <w:left w:val="single" w:color="000000" w:sz="4"/>
+              <w:bottom w:val="single" w:color="000000" w:sz="4"/>
+              <w:right w:val="single" w:color="000000" w:sz="4"/>
+            </w:tcBorders>
+            <w:tcMar>
+              <w:top w:type="dxa" w:w="60"/>
+              <w:left w:type="dxa" w:w="100"/>
+              <w:bottom w:type="dxa" w:w="60"/>
+              <w:right w:type="dxa" w:w="100"/>
+            </w:tcMar>
+          </w:tcPr>
+          <w:p>
+            <w:pPr>
+              <w:spacing w:line="276"/>
+              <w:jc w:val="left"/>
+            </w:pPr>
+            <w:r>
+              <w:rPr>
+                <w:rFonts w:ascii="Times New Roman" w:cs="Times New Roman" w:eastAsia="Times New Roman" w:hAnsi="Times New Roman"/>
+                <w:b w:val="false"/>
+                <w:bCs w:val="false"/>
+                <w:sz w:val="24"/>
+                <w:szCs w:val="24"/>
+              </w:rPr>
+              <w:t xml:space="preserve">7.54 +/- 1.26</w:t>
+            </w:r>
+          </w:p>
+        </w:tc>
+        <w:tc>
+          <w:tcPr>
+            <w:tcW w:type="dxa" w:w="1400"/>
+            <w:tcBorders>
+              <w:top w:val="single" w:color="000000" w:sz="4"/>
+              <w:left w:val="single" w:color="000000" w:sz="4"/>
+              <w:bottom w:val="single" w:color="000000" w:sz="4"/>
+              <w:right w:val="single" w:color="000000" w:sz="4"/>
+            </w:tcBorders>
+            <w:tcMar>
+              <w:top w:type="dxa" w:w="60"/>
+              <w:left w:type="dxa" w:w="100"/>
+              <w:bottom w:type="dxa" w:w="60"/>
+              <w:right w:type="dxa" w:w="100"/>
+            </w:tcMar>
+          </w:tcPr>
+          <w:p>
+            <w:pPr>
+              <w:spacing w:line="276"/>
+              <w:jc w:val="left"/>
+            </w:pPr>
+            <w:r>
+              <w:rPr>
+                <w:rFonts w:ascii="Times New Roman" w:cs="Times New Roman" w:eastAsia="Times New Roman" w:hAnsi="Times New Roman"/>
+                <w:b w:val="false"/>
+                <w:bCs w:val="false"/>
+                <w:sz w:val="24"/>
+                <w:szCs w:val="24"/>
+              </w:rPr>
+              <w:t xml:space="preserve">6.63 +/- 1.45</w:t>
+            </w:r>
+          </w:p>
+        </w:tc>
+        <w:tc>
+          <w:tcPr>
+            <w:tcW w:type="dxa" w:w="1700"/>
+            <w:tcBorders>
+              <w:top w:val="single" w:color="000000" w:sz="4"/>
+              <w:left w:val="single" w:color="000000" w:sz="4"/>
+              <w:bottom w:val="single" w:color="000000" w:sz="4"/>
+              <w:right w:val="single" w:color="000000" w:sz="4"/>
+            </w:tcBorders>
+            <w:tcMar>
+              <w:top w:type="dxa" w:w="60"/>
+              <w:left w:type="dxa" w:w="100"/>
+              <w:bottom w:type="dxa" w:w="60"/>
+              <w:right w:type="dxa" w:w="100"/>
+            </w:tcMar>
+          </w:tcPr>
+          <w:p>
+            <w:pPr>
+              <w:spacing w:line="276"/>
+              <w:jc w:val="left"/>
+            </w:pPr>
+            <w:r>
+              <w:rPr>
+                <w:rFonts w:ascii="Times New Roman" w:cs="Times New Roman" w:eastAsia="Times New Roman" w:hAnsi="Times New Roman"/>
+                <w:b w:val="false"/>
+                <w:bCs w:val="false"/>
+                <w:sz w:val="24"/>
+                <w:szCs w:val="24"/>
+              </w:rPr>
+              <w:t xml:space="preserve">-2.49 +/- 1.42</w:t>
+            </w:r>
+          </w:p>
+        </w:tc>
+        <w:tc>
+          <w:tcPr>
+            <w:tcW w:type="dxa" w:w="1426"/>
+            <w:tcBorders>
+              <w:top w:val="single" w:color="000000" w:sz="4"/>
+              <w:left w:val="single" w:color="000000" w:sz="4"/>
+              <w:bottom w:val="single" w:color="000000" w:sz="4"/>
+              <w:right w:val="single" w:color="000000" w:sz="4"/>
+            </w:tcBorders>
+            <w:tcMar>
+              <w:top w:type="dxa" w:w="60"/>
+              <w:left w:type="dxa" w:w="100"/>
+              <w:bottom w:type="dxa" w:w="60"/>
+              <w:right w:type="dxa" w:w="100"/>
+            </w:tcMar>
+          </w:tcPr>
+          <w:p>
+            <w:pPr>
+              <w:spacing w:line="276"/>
+              <w:jc w:val="left"/>
+            </w:pPr>
+            <w:r>
+              <w:rPr>
+                <w:rFonts w:ascii="Times New Roman" w:cs="Times New Roman" w:eastAsia="Times New Roman" w:hAnsi="Times New Roman"/>
+                <w:b w:val="false"/>
+                <w:bCs w:val="false"/>
+                <w:sz w:val="24"/>
+                <w:szCs w:val="24"/>
+              </w:rPr>
+              <w:t xml:space="preserve">-1.58 +/- 1.30</w:t>
+            </w:r>
+          </w:p>
+        </w:tc>
+      </w:tr>
+      <w:tr>
+        <w:trPr>
+          <w:cantSplit/>
+          <w:tblHeader w:val="false"/>
+        </w:trPr>
+        <w:tc>
+          <w:tcPr>
+            <w:tcW w:type="dxa" w:w="1700"/>
+            <w:tcBorders>
+              <w:top w:val="single" w:color="000000" w:sz="4"/>
+              <w:left w:val="single" w:color="000000" w:sz="4"/>
+              <w:bottom w:val="single" w:color="000000" w:sz="4"/>
+              <w:right w:val="single" w:color="000000" w:sz="4"/>
+            </w:tcBorders>
+            <w:tcMar>
+              <w:top w:type="dxa" w:w="60"/>
+              <w:left w:type="dxa" w:w="100"/>
+              <w:bottom w:type="dxa" w:w="60"/>
+              <w:right w:type="dxa" w:w="100"/>
+            </w:tcMar>
+          </w:tcPr>
+          <w:p>
+            <w:pPr>
+              <w:spacing w:line="276"/>
+              <w:jc w:val="left"/>
+            </w:pPr>
+            <w:r>
+              <w:rPr>
+                <w:rFonts w:ascii="Times New Roman" w:cs="Times New Roman" w:eastAsia="Times New Roman" w:hAnsi="Times New Roman"/>
+                <w:b w:val="false"/>
+                <w:bCs w:val="false"/>
+                <w:sz w:val="24"/>
+                <w:szCs w:val="24"/>
+              </w:rPr>
+              <w:t xml:space="preserve">Satellite-like</w:t>
+            </w:r>
+          </w:p>
+        </w:tc>
+        <w:tc>
+          <w:tcPr>
+            <w:tcW w:type="dxa" w:w="1400"/>
+            <w:tcBorders>
+              <w:top w:val="single" w:color="000000" w:sz="4"/>
+              <w:left w:val="single" w:color="000000" w:sz="4"/>
+              <w:bottom w:val="single" w:color="000000" w:sz="4"/>
+              <w:right w:val="single" w:color="000000" w:sz="4"/>
+            </w:tcBorders>
+            <w:tcMar>
+              <w:top w:type="dxa" w:w="60"/>
+              <w:left w:type="dxa" w:w="100"/>
+              <w:bottom w:type="dxa" w:w="60"/>
+              <w:right w:type="dxa" w:w="100"/>
+            </w:tcMar>
+          </w:tcPr>
+          <w:p>
+            <w:pPr>
+              <w:spacing w:line="276"/>
+              <w:jc w:val="left"/>
+            </w:pPr>
+            <w:r>
+              <w:rPr>
+                <w:rFonts w:ascii="Times New Roman" w:cs="Times New Roman" w:eastAsia="Times New Roman" w:hAnsi="Times New Roman"/>
+                <w:b w:val="false"/>
+                <w:bCs w:val="false"/>
+                <w:sz w:val="24"/>
+                <w:szCs w:val="24"/>
+              </w:rPr>
+              <w:t xml:space="preserve">17.93 +/- 2.68</w:t>
+            </w:r>
+          </w:p>
+        </w:tc>
+        <w:tc>
+          <w:tcPr>
+            <w:tcW w:type="dxa" w:w="1400"/>
+            <w:tcBorders>
+              <w:top w:val="single" w:color="000000" w:sz="4"/>
+              <w:left w:val="single" w:color="000000" w:sz="4"/>
+              <w:bottom w:val="single" w:color="000000" w:sz="4"/>
+              <w:right w:val="single" w:color="000000" w:sz="4"/>
+            </w:tcBorders>
+            <w:tcMar>
+              <w:top w:type="dxa" w:w="60"/>
+              <w:left w:type="dxa" w:w="100"/>
+              <w:bottom w:type="dxa" w:w="60"/>
+              <w:right w:type="dxa" w:w="100"/>
+            </w:tcMar>
+          </w:tcPr>
+          <w:p>
+            <w:pPr>
+              <w:spacing w:line="276"/>
+              <w:jc w:val="left"/>
+            </w:pPr>
+            <w:r>
+              <w:rPr>
+                <w:rFonts w:ascii="Times New Roman" w:cs="Times New Roman" w:eastAsia="Times New Roman" w:hAnsi="Times New Roman"/>
+                <w:b w:val="false"/>
+                <w:bCs w:val="false"/>
+                <w:sz w:val="24"/>
+                <w:szCs w:val="24"/>
+              </w:rPr>
+              <w:t xml:space="preserve">38.07 +/- 0.33</w:t>
+            </w:r>
+          </w:p>
+        </w:tc>
+        <w:tc>
+          <w:tcPr>
+            <w:tcW w:type="dxa" w:w="1400"/>
+            <w:tcBorders>
+              <w:top w:val="single" w:color="000000" w:sz="4"/>
+              <w:left w:val="single" w:color="000000" w:sz="4"/>
+              <w:bottom w:val="single" w:color="000000" w:sz="4"/>
+              <w:right w:val="single" w:color="000000" w:sz="4"/>
+            </w:tcBorders>
+            <w:tcMar>
+              <w:top w:type="dxa" w:w="60"/>
+              <w:left w:type="dxa" w:w="100"/>
+              <w:bottom w:type="dxa" w:w="60"/>
+              <w:right w:type="dxa" w:w="100"/>
+            </w:tcMar>
+          </w:tcPr>
+          <w:p>
+            <w:pPr>
+              <w:spacing w:line="276"/>
+              <w:jc w:val="left"/>
+            </w:pPr>
+            <w:r>
+              <w:rPr>
+                <w:rFonts w:ascii="Times New Roman" w:cs="Times New Roman" w:eastAsia="Times New Roman" w:hAnsi="Times New Roman"/>
+                <w:b w:val="false"/>
+                <w:bCs w:val="false"/>
+                <w:sz w:val="24"/>
+                <w:szCs w:val="24"/>
+              </w:rPr>
+              <w:t xml:space="preserve">13.12 +/- 0.45</w:t>
+            </w:r>
+          </w:p>
+        </w:tc>
+        <w:tc>
+          <w:tcPr>
+            <w:tcW w:type="dxa" w:w="1700"/>
+            <w:tcBorders>
+              <w:top w:val="single" w:color="000000" w:sz="4"/>
+              <w:left w:val="single" w:color="000000" w:sz="4"/>
+              <w:bottom w:val="single" w:color="000000" w:sz="4"/>
+              <w:right w:val="single" w:color="000000" w:sz="4"/>
+            </w:tcBorders>
+            <w:tcMar>
+              <w:top w:type="dxa" w:w="60"/>
+              <w:left w:type="dxa" w:w="100"/>
+              <w:bottom w:type="dxa" w:w="60"/>
+              <w:right w:type="dxa" w:w="100"/>
+            </w:tcMar>
+          </w:tcPr>
+          <w:p>
+            <w:pPr>
+              <w:spacing w:line="276"/>
+              <w:jc w:val="left"/>
+            </w:pPr>
+            <w:r>
+              <w:rPr>
+                <w:rFonts w:ascii="Times New Roman" w:cs="Times New Roman" w:eastAsia="Times New Roman" w:hAnsi="Times New Roman"/>
+                <w:b w:val="false"/>
+                <w:bCs w:val="false"/>
+                <w:sz w:val="24"/>
+                <w:szCs w:val="24"/>
+              </w:rPr>
+              <w:t xml:space="preserve">-4.30 +/- 2.51</w:t>
+            </w:r>
+          </w:p>
+        </w:tc>
+        <w:tc>
+          <w:tcPr>
+            <w:tcW w:type="dxa" w:w="1426"/>
+            <w:tcBorders>
+              <w:top w:val="single" w:color="000000" w:sz="4"/>
+              <w:left w:val="single" w:color="000000" w:sz="4"/>
+              <w:bottom w:val="single" w:color="000000" w:sz="4"/>
+              <w:right w:val="single" w:color="000000" w:sz="4"/>
+            </w:tcBorders>
+            <w:tcMar>
+              <w:top w:type="dxa" w:w="60"/>
+              <w:left w:type="dxa" w:w="100"/>
+              <w:bottom w:type="dxa" w:w="60"/>
+              <w:right w:type="dxa" w:w="100"/>
+            </w:tcMar>
+          </w:tcPr>
+          <w:p>
+            <w:pPr>
+              <w:spacing w:line="276"/>
+              <w:jc w:val="left"/>
+            </w:pPr>
+            <w:r>
+              <w:rPr>
+                <w:rFonts w:ascii="Times New Roman" w:cs="Times New Roman" w:eastAsia="Times New Roman" w:hAnsi="Times New Roman"/>
+                <w:b w:val="false"/>
+                <w:bCs w:val="false"/>
+                <w:sz w:val="24"/>
+                <w:szCs w:val="24"/>
+              </w:rPr>
+              <w:t xml:space="preserve">+20.65 +/- 2.56</w:t>
+            </w:r>
+          </w:p>
+        </w:tc>
+      </w:tr>
+    </w:tbl>
+    <w:p>
+      <w:pPr>
+        <w:spacing w:after="160"/>
+      </w:pPr>
+    </w:p>
+    <w:p>
+      <w:pPr>
+        <w:spacing w:after="120" w:line="360"/>
+        <w:jc w:val="both"/>
+      </w:pPr>
+      <w:r>
+        <w:rPr>
+          <w:rFonts w:ascii="Times New Roman" w:cs="Times New Roman" w:eastAsia="Times New Roman" w:hAnsi="Times New Roman"/>
+          <w:sz w:val="24"/>
+          <w:szCs w:val="24"/>
+        </w:rPr>
+        <w:t xml:space="preserve">The neural agent finished faster than AIMD on all three paths, by 0.20 s (15%) on the 5G-like path, 2.49 s (27%) on the lossy path and 4.30 s (24%) on the satellite-like path. This is the first controller in this project that beats AIMD in the C experiments. The retrained table did not carry over: it was faster on the lossy path but 91% slower on the 5G-like path and more than twice as slow on the satellite-like path, where its window stayed small. The neural network, trained on the same paths with the same reward, generalised to these unseen paths and the table did not, which is the argument for a function approximator over a table. The caveats are the same as before: the agents were chosen on simulated validation paths, the paths here are emulated inside the client, AIMD keeps its original cap of 128 while the agents are capped at 32, and the neural agent retransmitted more packets than AIMD on the lossy path (about 600 against 250), so it wins by sending more aggressively into a path whose loss is random.</w:t>
+      </w:r>
+    </w:p>
+    <w:p>
+      <w:pPr>
+        <w:spacing w:after="120" w:line="360"/>
+        <w:jc w:val="both"/>
+      </w:pPr>
+      <w:r>
+        <w:rPr>
+          <w:rFonts w:ascii="Times New Roman" w:cs="Times New Roman" w:eastAsia="Times New Roman" w:hAnsi="Times New Roman"/>
+          <w:sz w:val="24"/>
+          <w:szCs w:val="24"/>
+        </w:rPr>
+        <w:t xml:space="preserve">Selective acknowledgments were also added to the C transport (a server built with -DRUDP_SACK buffers out-of-order packets and returns an 8-byte bitmap in every ACK; the client option --sack 1 then resends only the holes), together with a --reorder option that lets jitter reorder packets on the emulated path. Table 8d compares the Go-Back-N client on the plain server with the selective client on the selective server, 8 runs per cell. Selective acknowledgment cut retransmissions by about ten times in every scenario (for AIMD from 232 to 23 on the lossy path and from 245 to 22 with reordering). It did not change completion time significantly in these emulated scenarios, where the bottleneck rate limits throughput and extra retransmissions cost little; the large time gains seen in the simulator (Section 11) did not carry over. One interaction is worth knowing: a Go-Back-N client talking to the selective server was slower than on the plain server (13.2 s against 8.1 s on the lossy path), because the cumulative ACK jumps when a hole is filled, so the two sides should be used as a pair.</w:t>
+      </w:r>
+    </w:p>
+    <w:p>
+      <w:pPr>
+        <w:keepNext/>
+        <w:spacing w:after="80" w:before="120"/>
+        <w:jc w:val="center"/>
+      </w:pPr>
+      <w:r>
+        <w:rPr>
+          <w:rFonts w:ascii="Times New Roman" w:cs="Times New Roman" w:eastAsia="Times New Roman" w:hAnsi="Times New Roman"/>
+          <w:b/>
+          <w:bCs/>
+          <w:sz w:val="24"/>
+          <w:szCs w:val="24"/>
+        </w:rPr>
+        <w:t xml:space="preserve">Table 8d: Mean completion time (s) of 1,200 packets with Go-Back-N and selective acknowledgment in the C transport (8 runs each, seeds 4001 to 4008; only the 5G-like and satellite-like differences are very small; none of the time differences is significant at 95%)</w:t>
+      </w:r>
+    </w:p>
+    <w:tbl>
+      <w:tblPr>
+        <w:tblW w:type="dxa" w:w="8026"/>
+        <w:tblBorders>
+          <w:top w:val="single" w:color="auto" w:sz="4"/>
+          <w:left w:val="single" w:color="auto" w:sz="4"/>
+          <w:bottom w:val="single" w:color="auto" w:sz="4"/>
+          <w:right w:val="single" w:color="auto" w:sz="4"/>
+          <w:insideH w:val="single" w:color="auto" w:sz="4"/>
+          <w:insideV w:val="single" w:color="auto" w:sz="4"/>
+        </w:tblBorders>
+      </w:tblPr>
+      <w:tblGrid>
+        <w:gridCol w:w="1900"/>
+        <w:gridCol w:w="1250"/>
+        <w:gridCol w:w="1250"/>
+        <w:gridCol w:w="1250"/>
+        <w:gridCol w:w="1250"/>
+        <w:gridCol w:w="1126"/>
+      </w:tblGrid>
+      <w:tr>
+        <w:trPr>
+          <w:cantSplit/>
+          <w:tblHeader/>
+        </w:trPr>
+        <w:tc>
+          <w:tcPr>
+            <w:tcW w:type="dxa" w:w="1900"/>
+            <w:tcBorders>
+              <w:top w:val="single" w:color="000000" w:sz="4"/>
+              <w:left w:val="single" w:color="000000" w:sz="4"/>
+              <w:bottom w:val="single" w:color="000000" w:sz="4"/>
+              <w:right w:val="single" w:color="000000" w:sz="4"/>
+            </w:tcBorders>
+            <w:shd w:fill="D9D9D9" w:color="auto" w:val="clear"/>
+            <w:tcMar>
+              <w:top w:type="dxa" w:w="60"/>
+              <w:left w:type="dxa" w:w="100"/>
+              <w:bottom w:type="dxa" w:w="60"/>
+              <w:right w:type="dxa" w:w="100"/>
+            </w:tcMar>
+          </w:tcPr>
+          <w:p>
+            <w:pPr>
+              <w:spacing w:line="276"/>
+              <w:jc w:val="left"/>
+            </w:pPr>
+            <w:r>
+              <w:rPr>
+                <w:rFonts w:ascii="Times New Roman" w:cs="Times New Roman" w:eastAsia="Times New Roman" w:hAnsi="Times New Roman"/>
+                <w:b/>
+                <w:bCs/>
+                <w:sz w:val="24"/>
+                <w:szCs w:val="24"/>
+              </w:rPr>
+              <w:t xml:space="preserve">Scenario</w:t>
+            </w:r>
+          </w:p>
+        </w:tc>
+        <w:tc>
+          <w:tcPr>
+            <w:tcW w:type="dxa" w:w="1250"/>
+            <w:tcBorders>
+              <w:top w:val="single" w:color="000000" w:sz="4"/>
+              <w:left w:val="single" w:color="000000" w:sz="4"/>
+              <w:bottom w:val="single" w:color="000000" w:sz="4"/>
+              <w:right w:val="single" w:color="000000" w:sz="4"/>
+            </w:tcBorders>
+            <w:shd w:fill="D9D9D9" w:color="auto" w:val="clear"/>
+            <w:tcMar>
+              <w:top w:type="dxa" w:w="60"/>
+              <w:left w:type="dxa" w:w="100"/>
+              <w:bottom w:type="dxa" w:w="60"/>
+              <w:right w:type="dxa" w:w="100"/>
+            </w:tcMar>
+          </w:tcPr>
+          <w:p>
+            <w:pPr>
+              <w:spacing w:line="276"/>
+              <w:jc w:val="left"/>
+            </w:pPr>
+            <w:r>
+              <w:rPr>
+                <w:rFonts w:ascii="Times New Roman" w:cs="Times New Roman" w:eastAsia="Times New Roman" w:hAnsi="Times New Roman"/>
+                <w:b/>
+                <w:bCs/>
+                <w:sz w:val="24"/>
+                <w:szCs w:val="24"/>
+              </w:rPr>
+              <w:t xml:space="preserve">AIMD GBN time</w:t>
+            </w:r>
+          </w:p>
+        </w:tc>
+        <w:tc>
+          <w:tcPr>
+            <w:tcW w:type="dxa" w:w="1250"/>
+            <w:tcBorders>
+              <w:top w:val="single" w:color="000000" w:sz="4"/>
+              <w:left w:val="single" w:color="000000" w:sz="4"/>
+              <w:bottom w:val="single" w:color="000000" w:sz="4"/>
+              <w:right w:val="single" w:color="000000" w:sz="4"/>
+            </w:tcBorders>
+            <w:shd w:fill="D9D9D9" w:color="auto" w:val="clear"/>
+            <w:tcMar>
+              <w:top w:type="dxa" w:w="60"/>
+              <w:left w:type="dxa" w:w="100"/>
+              <w:bottom w:type="dxa" w:w="60"/>
+              <w:right w:type="dxa" w:w="100"/>
+            </w:tcMar>
+          </w:tcPr>
+          <w:p>
+            <w:pPr>
+              <w:spacing w:line="276"/>
+              <w:jc w:val="left"/>
+            </w:pPr>
+            <w:r>
+              <w:rPr>
+                <w:rFonts w:ascii="Times New Roman" w:cs="Times New Roman" w:eastAsia="Times New Roman" w:hAnsi="Times New Roman"/>
+                <w:b/>
+                <w:bCs/>
+                <w:sz w:val="24"/>
+                <w:szCs w:val="24"/>
+              </w:rPr>
+              <w:t xml:space="preserve">AIMD SACK time</w:t>
+            </w:r>
+          </w:p>
+        </w:tc>
+        <w:tc>
+          <w:tcPr>
+            <w:tcW w:type="dxa" w:w="1250"/>
+            <w:tcBorders>
+              <w:top w:val="single" w:color="000000" w:sz="4"/>
+              <w:left w:val="single" w:color="000000" w:sz="4"/>
+              <w:bottom w:val="single" w:color="000000" w:sz="4"/>
+              <w:right w:val="single" w:color="000000" w:sz="4"/>
+            </w:tcBorders>
+            <w:shd w:fill="D9D9D9" w:color="auto" w:val="clear"/>
+            <w:tcMar>
+              <w:top w:type="dxa" w:w="60"/>
+              <w:left w:type="dxa" w:w="100"/>
+              <w:bottom w:type="dxa" w:w="60"/>
+              <w:right w:type="dxa" w:w="100"/>
+            </w:tcMar>
+          </w:tcPr>
+          <w:p>
+            <w:pPr>
+              <w:spacing w:line="276"/>
+              <w:jc w:val="left"/>
+            </w:pPr>
+            <w:r>
+              <w:rPr>
+                <w:rFonts w:ascii="Times New Roman" w:cs="Times New Roman" w:eastAsia="Times New Roman" w:hAnsi="Times New Roman"/>
+                <w:b/>
+                <w:bCs/>
+                <w:sz w:val="24"/>
+                <w:szCs w:val="24"/>
+              </w:rPr>
+              <w:t xml:space="preserve">Deep GBN time</w:t>
+            </w:r>
+          </w:p>
+        </w:tc>
+        <w:tc>
+          <w:tcPr>
+            <w:tcW w:type="dxa" w:w="1250"/>
+            <w:tcBorders>
+              <w:top w:val="single" w:color="000000" w:sz="4"/>
+              <w:left w:val="single" w:color="000000" w:sz="4"/>
+              <w:bottom w:val="single" w:color="000000" w:sz="4"/>
+              <w:right w:val="single" w:color="000000" w:sz="4"/>
+            </w:tcBorders>
+            <w:shd w:fill="D9D9D9" w:color="auto" w:val="clear"/>
+            <w:tcMar>
+              <w:top w:type="dxa" w:w="60"/>
+              <w:left w:type="dxa" w:w="100"/>
+              <w:bottom w:type="dxa" w:w="60"/>
+              <w:right w:type="dxa" w:w="100"/>
+            </w:tcMar>
+          </w:tcPr>
+          <w:p>
+            <w:pPr>
+              <w:spacing w:line="276"/>
+              <w:jc w:val="left"/>
+            </w:pPr>
+            <w:r>
+              <w:rPr>
+                <w:rFonts w:ascii="Times New Roman" w:cs="Times New Roman" w:eastAsia="Times New Roman" w:hAnsi="Times New Roman"/>
+                <w:b/>
+                <w:bCs/>
+                <w:sz w:val="24"/>
+                <w:szCs w:val="24"/>
+              </w:rPr>
+              <w:t xml:space="preserve">Deep SACK time</w:t>
+            </w:r>
+          </w:p>
+        </w:tc>
+        <w:tc>
+          <w:tcPr>
+            <w:tcW w:type="dxa" w:w="1126"/>
+            <w:tcBorders>
+              <w:top w:val="single" w:color="000000" w:sz="4"/>
+              <w:left w:val="single" w:color="000000" w:sz="4"/>
+              <w:bottom w:val="single" w:color="000000" w:sz="4"/>
+              <w:right w:val="single" w:color="000000" w:sz="4"/>
+            </w:tcBorders>
+            <w:shd w:fill="D9D9D9" w:color="auto" w:val="clear"/>
+            <w:tcMar>
+              <w:top w:type="dxa" w:w="60"/>
+              <w:left w:type="dxa" w:w="100"/>
+              <w:bottom w:type="dxa" w:w="60"/>
+              <w:right w:type="dxa" w:w="100"/>
+            </w:tcMar>
+          </w:tcPr>
+          <w:p>
+            <w:pPr>
+              <w:spacing w:line="276"/>
+              <w:jc w:val="left"/>
+            </w:pPr>
+            <w:r>
+              <w:rPr>
+                <w:rFonts w:ascii="Times New Roman" w:cs="Times New Roman" w:eastAsia="Times New Roman" w:hAnsi="Times New Roman"/>
+                <w:b/>
+                <w:bCs/>
+                <w:sz w:val="24"/>
+                <w:szCs w:val="24"/>
+              </w:rPr>
+              <w:t xml:space="preserve">Retx AIMD GBN / SACK</w:t>
+            </w:r>
+          </w:p>
+        </w:tc>
+      </w:tr>
+      <w:tr>
+        <w:trPr>
+          <w:cantSplit/>
+          <w:tblHeader w:val="false"/>
+        </w:trPr>
+        <w:tc>
+          <w:tcPr>
+            <w:tcW w:type="dxa" w:w="1900"/>
+            <w:tcBorders>
+              <w:top w:val="single" w:color="000000" w:sz="4"/>
+              <w:left w:val="single" w:color="000000" w:sz="4"/>
+              <w:bottom w:val="single" w:color="000000" w:sz="4"/>
+              <w:right w:val="single" w:color="000000" w:sz="4"/>
+            </w:tcBorders>
+            <w:tcMar>
+              <w:top w:type="dxa" w:w="60"/>
+              <w:left w:type="dxa" w:w="100"/>
+              <w:bottom w:type="dxa" w:w="60"/>
+              <w:right w:type="dxa" w:w="100"/>
+            </w:tcMar>
+          </w:tcPr>
+          <w:p>
+            <w:pPr>
+              <w:spacing w:line="276"/>
+              <w:jc w:val="left"/>
+            </w:pPr>
+            <w:r>
+              <w:rPr>
+                <w:rFonts w:ascii="Times New Roman" w:cs="Times New Roman" w:eastAsia="Times New Roman" w:hAnsi="Times New Roman"/>
+                <w:b w:val="false"/>
+                <w:bCs w:val="false"/>
+                <w:sz w:val="24"/>
+                <w:szCs w:val="24"/>
+              </w:rPr>
+              <w:t xml:space="preserve">5G-like</w:t>
+            </w:r>
+          </w:p>
+        </w:tc>
+        <w:tc>
+          <w:tcPr>
+            <w:tcW w:type="dxa" w:w="1250"/>
+            <w:tcBorders>
+              <w:top w:val="single" w:color="000000" w:sz="4"/>
+              <w:left w:val="single" w:color="000000" w:sz="4"/>
+              <w:bottom w:val="single" w:color="000000" w:sz="4"/>
+              <w:right w:val="single" w:color="000000" w:sz="4"/>
+            </w:tcBorders>
+            <w:tcMar>
+              <w:top w:type="dxa" w:w="60"/>
+              <w:left w:type="dxa" w:w="100"/>
+              <w:bottom w:type="dxa" w:w="60"/>
+              <w:right w:type="dxa" w:w="100"/>
+            </w:tcMar>
+          </w:tcPr>
+          <w:p>
+            <w:pPr>
+              <w:spacing w:line="276"/>
+              <w:jc w:val="left"/>
+            </w:pPr>
+            <w:r>
+              <w:rPr>
+                <w:rFonts w:ascii="Times New Roman" w:cs="Times New Roman" w:eastAsia="Times New Roman" w:hAnsi="Times New Roman"/>
+                <w:b w:val="false"/>
+                <w:bCs w:val="false"/>
+                <w:sz w:val="24"/>
+                <w:szCs w:val="24"/>
+              </w:rPr>
+              <w:t xml:space="preserve">1.26</w:t>
+            </w:r>
+          </w:p>
+        </w:tc>
+        <w:tc>
+          <w:tcPr>
+            <w:tcW w:type="dxa" w:w="1250"/>
+            <w:tcBorders>
+              <w:top w:val="single" w:color="000000" w:sz="4"/>
+              <w:left w:val="single" w:color="000000" w:sz="4"/>
+              <w:bottom w:val="single" w:color="000000" w:sz="4"/>
+              <w:right w:val="single" w:color="000000" w:sz="4"/>
+            </w:tcBorders>
+            <w:tcMar>
+              <w:top w:type="dxa" w:w="60"/>
+              <w:left w:type="dxa" w:w="100"/>
+              <w:bottom w:type="dxa" w:w="60"/>
+              <w:right w:type="dxa" w:w="100"/>
+            </w:tcMar>
+          </w:tcPr>
+          <w:p>
+            <w:pPr>
+              <w:spacing w:line="276"/>
+              <w:jc w:val="left"/>
+            </w:pPr>
+            <w:r>
+              <w:rPr>
+                <w:rFonts w:ascii="Times New Roman" w:cs="Times New Roman" w:eastAsia="Times New Roman" w:hAnsi="Times New Roman"/>
+                <w:b w:val="false"/>
+                <w:bCs w:val="false"/>
+                <w:sz w:val="24"/>
+                <w:szCs w:val="24"/>
+              </w:rPr>
+              <w:t xml:space="preserve">1.26</w:t>
+            </w:r>
+          </w:p>
+        </w:tc>
+        <w:tc>
+          <w:tcPr>
+            <w:tcW w:type="dxa" w:w="1250"/>
+            <w:tcBorders>
+              <w:top w:val="single" w:color="000000" w:sz="4"/>
+              <w:left w:val="single" w:color="000000" w:sz="4"/>
+              <w:bottom w:val="single" w:color="000000" w:sz="4"/>
+              <w:right w:val="single" w:color="000000" w:sz="4"/>
+            </w:tcBorders>
+            <w:tcMar>
+              <w:top w:type="dxa" w:w="60"/>
+              <w:left w:type="dxa" w:w="100"/>
+              <w:bottom w:type="dxa" w:w="60"/>
+              <w:right w:type="dxa" w:w="100"/>
+            </w:tcMar>
+          </w:tcPr>
+          <w:p>
+            <w:pPr>
+              <w:spacing w:line="276"/>
+              <w:jc w:val="left"/>
+            </w:pPr>
+            <w:r>
+              <w:rPr>
+                <w:rFonts w:ascii="Times New Roman" w:cs="Times New Roman" w:eastAsia="Times New Roman" w:hAnsi="Times New Roman"/>
+                <w:b w:val="false"/>
+                <w:bCs w:val="false"/>
+                <w:sz w:val="24"/>
+                <w:szCs w:val="24"/>
+              </w:rPr>
+              <w:t xml:space="preserve">1.17</w:t>
+            </w:r>
+          </w:p>
+        </w:tc>
+        <w:tc>
+          <w:tcPr>
+            <w:tcW w:type="dxa" w:w="1250"/>
+            <w:tcBorders>
+              <w:top w:val="single" w:color="000000" w:sz="4"/>
+              <w:left w:val="single" w:color="000000" w:sz="4"/>
+              <w:bottom w:val="single" w:color="000000" w:sz="4"/>
+              <w:right w:val="single" w:color="000000" w:sz="4"/>
+            </w:tcBorders>
+            <w:tcMar>
+              <w:top w:type="dxa" w:w="60"/>
+              <w:left w:type="dxa" w:w="100"/>
+              <w:bottom w:type="dxa" w:w="60"/>
+              <w:right w:type="dxa" w:w="100"/>
+            </w:tcMar>
+          </w:tcPr>
+          <w:p>
+            <w:pPr>
+              <w:spacing w:line="276"/>
+              <w:jc w:val="left"/>
+            </w:pPr>
+            <w:r>
+              <w:rPr>
+                <w:rFonts w:ascii="Times New Roman" w:cs="Times New Roman" w:eastAsia="Times New Roman" w:hAnsi="Times New Roman"/>
+                <w:b w:val="false"/>
+                <w:bCs w:val="false"/>
+                <w:sz w:val="24"/>
+                <w:szCs w:val="24"/>
+              </w:rPr>
+              <w:t xml:space="preserve">1.18</w:t>
+            </w:r>
+          </w:p>
+        </w:tc>
+        <w:tc>
+          <w:tcPr>
+            <w:tcW w:type="dxa" w:w="1126"/>
+            <w:tcBorders>
+              <w:top w:val="single" w:color="000000" w:sz="4"/>
+              <w:left w:val="single" w:color="000000" w:sz="4"/>
+              <w:bottom w:val="single" w:color="000000" w:sz="4"/>
+              <w:right w:val="single" w:color="000000" w:sz="4"/>
+            </w:tcBorders>
+            <w:tcMar>
+              <w:top w:type="dxa" w:w="60"/>
+              <w:left w:type="dxa" w:w="100"/>
+              <w:bottom w:type="dxa" w:w="60"/>
+              <w:right w:type="dxa" w:w="100"/>
+            </w:tcMar>
+          </w:tcPr>
+          <w:p>
+            <w:pPr>
+              <w:spacing w:line="276"/>
+              <w:jc w:val="left"/>
+            </w:pPr>
+            <w:r>
+              <w:rPr>
+                <w:rFonts w:ascii="Times New Roman" w:cs="Times New Roman" w:eastAsia="Times New Roman" w:hAnsi="Times New Roman"/>
+                <w:b w:val="false"/>
+                <w:bCs w:val="false"/>
+                <w:sz w:val="24"/>
+                <w:szCs w:val="24"/>
+              </w:rPr>
+              <w:t xml:space="preserve">55 / 2</w:t>
+            </w:r>
+          </w:p>
+        </w:tc>
+      </w:tr>
+      <w:tr>
+        <w:trPr>
+          <w:cantSplit/>
+          <w:tblHeader w:val="false"/>
+        </w:trPr>
+        <w:tc>
+          <w:tcPr>
+            <w:tcW w:type="dxa" w:w="1900"/>
+            <w:tcBorders>
+              <w:top w:val="single" w:color="000000" w:sz="4"/>
+              <w:left w:val="single" w:color="000000" w:sz="4"/>
+              <w:bottom w:val="single" w:color="000000" w:sz="4"/>
+              <w:right w:val="single" w:color="000000" w:sz="4"/>
+            </w:tcBorders>
+            <w:tcMar>
+              <w:top w:type="dxa" w:w="60"/>
+              <w:left w:type="dxa" w:w="100"/>
+              <w:bottom w:type="dxa" w:w="60"/>
+              <w:right w:type="dxa" w:w="100"/>
+            </w:tcMar>
+          </w:tcPr>
+          <w:p>
+            <w:pPr>
+              <w:spacing w:line="276"/>
+              <w:jc w:val="left"/>
+            </w:pPr>
+            <w:r>
+              <w:rPr>
+                <w:rFonts w:ascii="Times New Roman" w:cs="Times New Roman" w:eastAsia="Times New Roman" w:hAnsi="Times New Roman"/>
+                <w:b w:val="false"/>
+                <w:bCs w:val="false"/>
+                <w:sz w:val="24"/>
+                <w:szCs w:val="24"/>
+              </w:rPr>
+              <w:t xml:space="preserve">Lossy wireless</w:t>
+            </w:r>
+          </w:p>
+        </w:tc>
+        <w:tc>
+          <w:tcPr>
+            <w:tcW w:type="dxa" w:w="1250"/>
+            <w:tcBorders>
+              <w:top w:val="single" w:color="000000" w:sz="4"/>
+              <w:left w:val="single" w:color="000000" w:sz="4"/>
+              <w:bottom w:val="single" w:color="000000" w:sz="4"/>
+              <w:right w:val="single" w:color="000000" w:sz="4"/>
+            </w:tcBorders>
+            <w:tcMar>
+              <w:top w:type="dxa" w:w="60"/>
+              <w:left w:type="dxa" w:w="100"/>
+              <w:bottom w:type="dxa" w:w="60"/>
+              <w:right w:type="dxa" w:w="100"/>
+            </w:tcMar>
+          </w:tcPr>
+          <w:p>
+            <w:pPr>
+              <w:spacing w:line="276"/>
+              <w:jc w:val="left"/>
+            </w:pPr>
+            <w:r>
+              <w:rPr>
+                <w:rFonts w:ascii="Times New Roman" w:cs="Times New Roman" w:eastAsia="Times New Roman" w:hAnsi="Times New Roman"/>
+                <w:b w:val="false"/>
+                <w:bCs w:val="false"/>
+                <w:sz w:val="24"/>
+                <w:szCs w:val="24"/>
+              </w:rPr>
+              <w:t xml:space="preserve">8.07</w:t>
+            </w:r>
+          </w:p>
+        </w:tc>
+        <w:tc>
+          <w:tcPr>
+            <w:tcW w:type="dxa" w:w="1250"/>
+            <w:tcBorders>
+              <w:top w:val="single" w:color="000000" w:sz="4"/>
+              <w:left w:val="single" w:color="000000" w:sz="4"/>
+              <w:bottom w:val="single" w:color="000000" w:sz="4"/>
+              <w:right w:val="single" w:color="000000" w:sz="4"/>
+            </w:tcBorders>
+            <w:tcMar>
+              <w:top w:type="dxa" w:w="60"/>
+              <w:left w:type="dxa" w:w="100"/>
+              <w:bottom w:type="dxa" w:w="60"/>
+              <w:right w:type="dxa" w:w="100"/>
+            </w:tcMar>
+          </w:tcPr>
+          <w:p>
+            <w:pPr>
+              <w:spacing w:line="276"/>
+              <w:jc w:val="left"/>
+            </w:pPr>
+            <w:r>
+              <w:rPr>
+                <w:rFonts w:ascii="Times New Roman" w:cs="Times New Roman" w:eastAsia="Times New Roman" w:hAnsi="Times New Roman"/>
+                <w:b w:val="false"/>
+                <w:bCs w:val="false"/>
+                <w:sz w:val="24"/>
+                <w:szCs w:val="24"/>
+              </w:rPr>
+              <w:t xml:space="preserve">8.50</w:t>
+            </w:r>
+          </w:p>
+        </w:tc>
+        <w:tc>
+          <w:tcPr>
+            <w:tcW w:type="dxa" w:w="1250"/>
+            <w:tcBorders>
+              <w:top w:val="single" w:color="000000" w:sz="4"/>
+              <w:left w:val="single" w:color="000000" w:sz="4"/>
+              <w:bottom w:val="single" w:color="000000" w:sz="4"/>
+              <w:right w:val="single" w:color="000000" w:sz="4"/>
+            </w:tcBorders>
+            <w:tcMar>
+              <w:top w:type="dxa" w:w="60"/>
+              <w:left w:type="dxa" w:w="100"/>
+              <w:bottom w:type="dxa" w:w="60"/>
+              <w:right w:type="dxa" w:w="100"/>
+            </w:tcMar>
+          </w:tcPr>
+          <w:p>
+            <w:pPr>
+              <w:spacing w:line="276"/>
+              <w:jc w:val="left"/>
+            </w:pPr>
+            <w:r>
+              <w:rPr>
+                <w:rFonts w:ascii="Times New Roman" w:cs="Times New Roman" w:eastAsia="Times New Roman" w:hAnsi="Times New Roman"/>
+                <w:b w:val="false"/>
+                <w:bCs w:val="false"/>
+                <w:sz w:val="24"/>
+                <w:szCs w:val="24"/>
+              </w:rPr>
+              <w:t xml:space="preserve">8.72</w:t>
+            </w:r>
+          </w:p>
+        </w:tc>
+        <w:tc>
+          <w:tcPr>
+            <w:tcW w:type="dxa" w:w="1250"/>
+            <w:tcBorders>
+              <w:top w:val="single" w:color="000000" w:sz="4"/>
+              <w:left w:val="single" w:color="000000" w:sz="4"/>
+              <w:bottom w:val="single" w:color="000000" w:sz="4"/>
+              <w:right w:val="single" w:color="000000" w:sz="4"/>
+            </w:tcBorders>
+            <w:tcMar>
+              <w:top w:type="dxa" w:w="60"/>
+              <w:left w:type="dxa" w:w="100"/>
+              <w:bottom w:type="dxa" w:w="60"/>
+              <w:right w:type="dxa" w:w="100"/>
+            </w:tcMar>
+          </w:tcPr>
+          <w:p>
+            <w:pPr>
+              <w:spacing w:line="276"/>
+              <w:jc w:val="left"/>
+            </w:pPr>
+            <w:r>
+              <w:rPr>
+                <w:rFonts w:ascii="Times New Roman" w:cs="Times New Roman" w:eastAsia="Times New Roman" w:hAnsi="Times New Roman"/>
+                <w:b w:val="false"/>
+                <w:bCs w:val="false"/>
+                <w:sz w:val="24"/>
+                <w:szCs w:val="24"/>
+              </w:rPr>
+              <w:t xml:space="preserve">4.56</w:t>
+            </w:r>
+          </w:p>
+        </w:tc>
+        <w:tc>
+          <w:tcPr>
+            <w:tcW w:type="dxa" w:w="1126"/>
+            <w:tcBorders>
+              <w:top w:val="single" w:color="000000" w:sz="4"/>
+              <w:left w:val="single" w:color="000000" w:sz="4"/>
+              <w:bottom w:val="single" w:color="000000" w:sz="4"/>
+              <w:right w:val="single" w:color="000000" w:sz="4"/>
+            </w:tcBorders>
+            <w:tcMar>
+              <w:top w:type="dxa" w:w="60"/>
+              <w:left w:type="dxa" w:w="100"/>
+              <w:bottom w:type="dxa" w:w="60"/>
+              <w:right w:type="dxa" w:w="100"/>
+            </w:tcMar>
+          </w:tcPr>
+          <w:p>
+            <w:pPr>
+              <w:spacing w:line="276"/>
+              <w:jc w:val="left"/>
+            </w:pPr>
+            <w:r>
+              <w:rPr>
+                <w:rFonts w:ascii="Times New Roman" w:cs="Times New Roman" w:eastAsia="Times New Roman" w:hAnsi="Times New Roman"/>
+                <w:b w:val="false"/>
+                <w:bCs w:val="false"/>
+                <w:sz w:val="24"/>
+                <w:szCs w:val="24"/>
+              </w:rPr>
+              <w:t xml:space="preserve">232 / 23</w:t>
+            </w:r>
+          </w:p>
+        </w:tc>
+      </w:tr>
+      <w:tr>
+        <w:trPr>
+          <w:cantSplit/>
+          <w:tblHeader w:val="false"/>
+        </w:trPr>
+        <w:tc>
+          <w:tcPr>
+            <w:tcW w:type="dxa" w:w="1900"/>
+            <w:tcBorders>
+              <w:top w:val="single" w:color="000000" w:sz="4"/>
+              <w:left w:val="single" w:color="000000" w:sz="4"/>
+              <w:bottom w:val="single" w:color="000000" w:sz="4"/>
+              <w:right w:val="single" w:color="000000" w:sz="4"/>
+            </w:tcBorders>
+            <w:tcMar>
+              <w:top w:type="dxa" w:w="60"/>
+              <w:left w:type="dxa" w:w="100"/>
+              <w:bottom w:type="dxa" w:w="60"/>
+              <w:right w:type="dxa" w:w="100"/>
+            </w:tcMar>
+          </w:tcPr>
+          <w:p>
+            <w:pPr>
+              <w:spacing w:line="276"/>
+              <w:jc w:val="left"/>
+            </w:pPr>
+            <w:r>
+              <w:rPr>
+                <w:rFonts w:ascii="Times New Roman" w:cs="Times New Roman" w:eastAsia="Times New Roman" w:hAnsi="Times New Roman"/>
+                <w:b w:val="false"/>
+                <w:bCs w:val="false"/>
+                <w:sz w:val="24"/>
+                <w:szCs w:val="24"/>
+              </w:rPr>
+              <w:t xml:space="preserve">Lossy, reordering</w:t>
+            </w:r>
+          </w:p>
+        </w:tc>
+        <w:tc>
+          <w:tcPr>
+            <w:tcW w:type="dxa" w:w="1250"/>
+            <w:tcBorders>
+              <w:top w:val="single" w:color="000000" w:sz="4"/>
+              <w:left w:val="single" w:color="000000" w:sz="4"/>
+              <w:bottom w:val="single" w:color="000000" w:sz="4"/>
+              <w:right w:val="single" w:color="000000" w:sz="4"/>
+            </w:tcBorders>
+            <w:tcMar>
+              <w:top w:type="dxa" w:w="60"/>
+              <w:left w:type="dxa" w:w="100"/>
+              <w:bottom w:type="dxa" w:w="60"/>
+              <w:right w:type="dxa" w:w="100"/>
+            </w:tcMar>
+          </w:tcPr>
+          <w:p>
+            <w:pPr>
+              <w:spacing w:line="276"/>
+              <w:jc w:val="left"/>
+            </w:pPr>
+            <w:r>
+              <w:rPr>
+                <w:rFonts w:ascii="Times New Roman" w:cs="Times New Roman" w:eastAsia="Times New Roman" w:hAnsi="Times New Roman"/>
+                <w:b w:val="false"/>
+                <w:bCs w:val="false"/>
+                <w:sz w:val="24"/>
+                <w:szCs w:val="24"/>
+              </w:rPr>
+              <w:t xml:space="preserve">10.22</w:t>
+            </w:r>
+          </w:p>
+        </w:tc>
+        <w:tc>
+          <w:tcPr>
+            <w:tcW w:type="dxa" w:w="1250"/>
+            <w:tcBorders>
+              <w:top w:val="single" w:color="000000" w:sz="4"/>
+              <w:left w:val="single" w:color="000000" w:sz="4"/>
+              <w:bottom w:val="single" w:color="000000" w:sz="4"/>
+              <w:right w:val="single" w:color="000000" w:sz="4"/>
+            </w:tcBorders>
+            <w:tcMar>
+              <w:top w:type="dxa" w:w="60"/>
+              <w:left w:type="dxa" w:w="100"/>
+              <w:bottom w:type="dxa" w:w="60"/>
+              <w:right w:type="dxa" w:w="100"/>
+            </w:tcMar>
+          </w:tcPr>
+          <w:p>
+            <w:pPr>
+              <w:spacing w:line="276"/>
+              <w:jc w:val="left"/>
+            </w:pPr>
+            <w:r>
+              <w:rPr>
+                <w:rFonts w:ascii="Times New Roman" w:cs="Times New Roman" w:eastAsia="Times New Roman" w:hAnsi="Times New Roman"/>
+                <w:b w:val="false"/>
+                <w:bCs w:val="false"/>
+                <w:sz w:val="24"/>
+                <w:szCs w:val="24"/>
+              </w:rPr>
+              <w:t xml:space="preserve">9.24</w:t>
+            </w:r>
+          </w:p>
+        </w:tc>
+        <w:tc>
+          <w:tcPr>
+            <w:tcW w:type="dxa" w:w="1250"/>
+            <w:tcBorders>
+              <w:top w:val="single" w:color="000000" w:sz="4"/>
+              <w:left w:val="single" w:color="000000" w:sz="4"/>
+              <w:bottom w:val="single" w:color="000000" w:sz="4"/>
+              <w:right w:val="single" w:color="000000" w:sz="4"/>
+            </w:tcBorders>
+            <w:tcMar>
+              <w:top w:type="dxa" w:w="60"/>
+              <w:left w:type="dxa" w:w="100"/>
+              <w:bottom w:type="dxa" w:w="60"/>
+              <w:right w:type="dxa" w:w="100"/>
+            </w:tcMar>
+          </w:tcPr>
+          <w:p>
+            <w:pPr>
+              <w:spacing w:line="276"/>
+              <w:jc w:val="left"/>
+            </w:pPr>
+            <w:r>
+              <w:rPr>
+                <w:rFonts w:ascii="Times New Roman" w:cs="Times New Roman" w:eastAsia="Times New Roman" w:hAnsi="Times New Roman"/>
+                <w:b w:val="false"/>
+                <w:bCs w:val="false"/>
+                <w:sz w:val="24"/>
+                <w:szCs w:val="24"/>
+              </w:rPr>
+              <w:t xml:space="preserve">6.99</w:t>
+            </w:r>
+          </w:p>
+        </w:tc>
+        <w:tc>
+          <w:tcPr>
+            <w:tcW w:type="dxa" w:w="1250"/>
+            <w:tcBorders>
+              <w:top w:val="single" w:color="000000" w:sz="4"/>
+              <w:left w:val="single" w:color="000000" w:sz="4"/>
+              <w:bottom w:val="single" w:color="000000" w:sz="4"/>
+              <w:right w:val="single" w:color="000000" w:sz="4"/>
+            </w:tcBorders>
+            <w:tcMar>
+              <w:top w:type="dxa" w:w="60"/>
+              <w:left w:type="dxa" w:w="100"/>
+              <w:bottom w:type="dxa" w:w="60"/>
+              <w:right w:type="dxa" w:w="100"/>
+            </w:tcMar>
+          </w:tcPr>
+          <w:p>
+            <w:pPr>
+              <w:spacing w:line="276"/>
+              <w:jc w:val="left"/>
+            </w:pPr>
+            <w:r>
+              <w:rPr>
+                <w:rFonts w:ascii="Times New Roman" w:cs="Times New Roman" w:eastAsia="Times New Roman" w:hAnsi="Times New Roman"/>
+                <w:b w:val="false"/>
+                <w:bCs w:val="false"/>
+                <w:sz w:val="24"/>
+                <w:szCs w:val="24"/>
+              </w:rPr>
+              <w:t xml:space="preserve">5.09</w:t>
+            </w:r>
+          </w:p>
+        </w:tc>
+        <w:tc>
+          <w:tcPr>
+            <w:tcW w:type="dxa" w:w="1126"/>
+            <w:tcBorders>
+              <w:top w:val="single" w:color="000000" w:sz="4"/>
+              <w:left w:val="single" w:color="000000" w:sz="4"/>
+              <w:bottom w:val="single" w:color="000000" w:sz="4"/>
+              <w:right w:val="single" w:color="000000" w:sz="4"/>
+            </w:tcBorders>
+            <w:tcMar>
+              <w:top w:type="dxa" w:w="60"/>
+              <w:left w:type="dxa" w:w="100"/>
+              <w:bottom w:type="dxa" w:w="60"/>
+              <w:right w:type="dxa" w:w="100"/>
+            </w:tcMar>
+          </w:tcPr>
+          <w:p>
+            <w:pPr>
+              <w:spacing w:line="276"/>
+              <w:jc w:val="left"/>
+            </w:pPr>
+            <w:r>
+              <w:rPr>
+                <w:rFonts w:ascii="Times New Roman" w:cs="Times New Roman" w:eastAsia="Times New Roman" w:hAnsi="Times New Roman"/>
+                <w:b w:val="false"/>
+                <w:bCs w:val="false"/>
+                <w:sz w:val="24"/>
+                <w:szCs w:val="24"/>
+              </w:rPr>
+              <w:t xml:space="preserve">245 / 22</w:t>
+            </w:r>
+          </w:p>
+        </w:tc>
+      </w:tr>
+      <w:tr>
+        <w:trPr>
+          <w:cantSplit/>
+          <w:tblHeader w:val="false"/>
+        </w:trPr>
+        <w:tc>
+          <w:tcPr>
+            <w:tcW w:type="dxa" w:w="1900"/>
+            <w:tcBorders>
+              <w:top w:val="single" w:color="000000" w:sz="4"/>
+              <w:left w:val="single" w:color="000000" w:sz="4"/>
+              <w:bottom w:val="single" w:color="000000" w:sz="4"/>
+              <w:right w:val="single" w:color="000000" w:sz="4"/>
+            </w:tcBorders>
+            <w:tcMar>
+              <w:top w:type="dxa" w:w="60"/>
+              <w:left w:type="dxa" w:w="100"/>
+              <w:bottom w:type="dxa" w:w="60"/>
+              <w:right w:type="dxa" w:w="100"/>
+            </w:tcMar>
+          </w:tcPr>
+          <w:p>
+            <w:pPr>
+              <w:spacing w:line="276"/>
+              <w:jc w:val="left"/>
+            </w:pPr>
+            <w:r>
+              <w:rPr>
+                <w:rFonts w:ascii="Times New Roman" w:cs="Times New Roman" w:eastAsia="Times New Roman" w:hAnsi="Times New Roman"/>
+                <w:b w:val="false"/>
+                <w:bCs w:val="false"/>
+                <w:sz w:val="24"/>
+                <w:szCs w:val="24"/>
+              </w:rPr>
+              <w:t xml:space="preserve">Satellite-like</w:t>
+            </w:r>
+          </w:p>
+        </w:tc>
+        <w:tc>
+          <w:tcPr>
+            <w:tcW w:type="dxa" w:w="1250"/>
+            <w:tcBorders>
+              <w:top w:val="single" w:color="000000" w:sz="4"/>
+              <w:left w:val="single" w:color="000000" w:sz="4"/>
+              <w:bottom w:val="single" w:color="000000" w:sz="4"/>
+              <w:right w:val="single" w:color="000000" w:sz="4"/>
+            </w:tcBorders>
+            <w:tcMar>
+              <w:top w:type="dxa" w:w="60"/>
+              <w:left w:type="dxa" w:w="100"/>
+              <w:bottom w:type="dxa" w:w="60"/>
+              <w:right w:type="dxa" w:w="100"/>
+            </w:tcMar>
+          </w:tcPr>
+          <w:p>
+            <w:pPr>
+              <w:spacing w:line="276"/>
+              <w:jc w:val="left"/>
+            </w:pPr>
+            <w:r>
+              <w:rPr>
+                <w:rFonts w:ascii="Times New Roman" w:cs="Times New Roman" w:eastAsia="Times New Roman" w:hAnsi="Times New Roman"/>
+                <w:b w:val="false"/>
+                <w:bCs w:val="false"/>
+                <w:sz w:val="24"/>
+                <w:szCs w:val="24"/>
+              </w:rPr>
+              <w:t xml:space="preserve">18.88</w:t>
+            </w:r>
+          </w:p>
+        </w:tc>
+        <w:tc>
+          <w:tcPr>
+            <w:tcW w:type="dxa" w:w="1250"/>
+            <w:tcBorders>
+              <w:top w:val="single" w:color="000000" w:sz="4"/>
+              <w:left w:val="single" w:color="000000" w:sz="4"/>
+              <w:bottom w:val="single" w:color="000000" w:sz="4"/>
+              <w:right w:val="single" w:color="000000" w:sz="4"/>
+            </w:tcBorders>
+            <w:tcMar>
+              <w:top w:type="dxa" w:w="60"/>
+              <w:left w:type="dxa" w:w="100"/>
+              <w:bottom w:type="dxa" w:w="60"/>
+              <w:right w:type="dxa" w:w="100"/>
+            </w:tcMar>
+          </w:tcPr>
+          <w:p>
+            <w:pPr>
+              <w:spacing w:line="276"/>
+              <w:jc w:val="left"/>
+            </w:pPr>
+            <w:r>
+              <w:rPr>
+                <w:rFonts w:ascii="Times New Roman" w:cs="Times New Roman" w:eastAsia="Times New Roman" w:hAnsi="Times New Roman"/>
+                <w:b w:val="false"/>
+                <w:bCs w:val="false"/>
+                <w:sz w:val="24"/>
+                <w:szCs w:val="24"/>
+              </w:rPr>
+              <w:t xml:space="preserve">18.11</w:t>
+            </w:r>
+          </w:p>
+        </w:tc>
+        <w:tc>
+          <w:tcPr>
+            <w:tcW w:type="dxa" w:w="1250"/>
+            <w:tcBorders>
+              <w:top w:val="single" w:color="000000" w:sz="4"/>
+              <w:left w:val="single" w:color="000000" w:sz="4"/>
+              <w:bottom w:val="single" w:color="000000" w:sz="4"/>
+              <w:right w:val="single" w:color="000000" w:sz="4"/>
+            </w:tcBorders>
+            <w:tcMar>
+              <w:top w:type="dxa" w:w="60"/>
+              <w:left w:type="dxa" w:w="100"/>
+              <w:bottom w:type="dxa" w:w="60"/>
+              <w:right w:type="dxa" w:w="100"/>
+            </w:tcMar>
+          </w:tcPr>
+          <w:p>
+            <w:pPr>
+              <w:spacing w:line="276"/>
+              <w:jc w:val="left"/>
+            </w:pPr>
+            <w:r>
+              <w:rPr>
+                <w:rFonts w:ascii="Times New Roman" w:cs="Times New Roman" w:eastAsia="Times New Roman" w:hAnsi="Times New Roman"/>
+                <w:b w:val="false"/>
+                <w:bCs w:val="false"/>
+                <w:sz w:val="24"/>
+                <w:szCs w:val="24"/>
+              </w:rPr>
+              <w:t xml:space="preserve">13.28</w:t>
+            </w:r>
+          </w:p>
+        </w:tc>
+        <w:tc>
+          <w:tcPr>
+            <w:tcW w:type="dxa" w:w="1250"/>
+            <w:tcBorders>
+              <w:top w:val="single" w:color="000000" w:sz="4"/>
+              <w:left w:val="single" w:color="000000" w:sz="4"/>
+              <w:bottom w:val="single" w:color="000000" w:sz="4"/>
+              <w:right w:val="single" w:color="000000" w:sz="4"/>
+            </w:tcBorders>
+            <w:tcMar>
+              <w:top w:type="dxa" w:w="60"/>
+              <w:left w:type="dxa" w:w="100"/>
+              <w:bottom w:type="dxa" w:w="60"/>
+              <w:right w:type="dxa" w:w="100"/>
+            </w:tcMar>
+          </w:tcPr>
+          <w:p>
+            <w:pPr>
+              <w:spacing w:line="276"/>
+              <w:jc w:val="left"/>
+            </w:pPr>
+            <w:r>
+              <w:rPr>
+                <w:rFonts w:ascii="Times New Roman" w:cs="Times New Roman" w:eastAsia="Times New Roman" w:hAnsi="Times New Roman"/>
+                <w:b w:val="false"/>
+                <w:bCs w:val="false"/>
+                <w:sz w:val="24"/>
+                <w:szCs w:val="24"/>
+              </w:rPr>
+              <w:t xml:space="preserve">13.32</w:t>
+            </w:r>
+          </w:p>
+        </w:tc>
+        <w:tc>
+          <w:tcPr>
+            <w:tcW w:type="dxa" w:w="1126"/>
+            <w:tcBorders>
+              <w:top w:val="single" w:color="000000" w:sz="4"/>
+              <w:left w:val="single" w:color="000000" w:sz="4"/>
+              <w:bottom w:val="single" w:color="000000" w:sz="4"/>
+              <w:right w:val="single" w:color="000000" w:sz="4"/>
+            </w:tcBorders>
+            <w:tcMar>
+              <w:top w:type="dxa" w:w="60"/>
+              <w:left w:type="dxa" w:w="100"/>
+              <w:bottom w:type="dxa" w:w="60"/>
+              <w:right w:type="dxa" w:w="100"/>
+            </w:tcMar>
+          </w:tcPr>
+          <w:p>
+            <w:pPr>
+              <w:spacing w:line="276"/>
+              <w:jc w:val="left"/>
+            </w:pPr>
+            <w:r>
+              <w:rPr>
+                <w:rFonts w:ascii="Times New Roman" w:cs="Times New Roman" w:eastAsia="Times New Roman" w:hAnsi="Times New Roman"/>
+                <w:b w:val="false"/>
+                <w:bCs w:val="false"/>
+                <w:sz w:val="24"/>
+                <w:szCs w:val="24"/>
+              </w:rPr>
+              <w:t xml:space="preserve">87 / 4</w:t>
+            </w:r>
+          </w:p>
+        </w:tc>
+      </w:tr>
+    </w:tbl>
+    <w:p>
+      <w:pPr>
+        <w:spacing w:after="160"/>
+      </w:pPr>
     </w:p>
     <w:p>
       <w:pPr>
@@ -17826,7 +19819,7 @@
           <w:sz w:val="24"/>
           <w:szCs w:val="24"/>
         </w:rPr>
-        <w:t xml:space="preserve">Smart-RUDP then tested whether a learned window policy could improve on the rule. A tabular Q-learning agent matched AIMD on the lossy path and was slower on the 5G-like and satellite-like paths, with somewhat fewer retransmissions; the honest finding is that this simple agent does not beat a well-tuned rule. The network design adds a four-router OSPF network with VLANs, DHCP, an access list and a tested link failover in Cisco Packet Tracer, and the Wireshark work adds a dissector and traces that make the protocol behaviour visible packet by packet.</w:t>
+        <w:t xml:space="preserve">Smart-RUDP then tested whether a learned window policy could improve on the rule. A tabular Q-learning agent matched AIMD on the lossy path and was slower on the 5G-like and satellite-like paths, with somewhat fewer retransmissions; the honest finding is that this simple agent does not beat a well-tuned rule. A neural agent trained in simulation did beat AIMD on all three paths in the C transport (by 15%, 27% and 24%), and selective acknowledgments cut retransmissions about tenfold without changing completion time significantly (Section 8.5). The network design adds a four-router OSPF network with VLANs, DHCP, an access list and a tested link failover in Cisco Packet Tracer, and the Wireshark work adds a dissector and traces that make the protocol behaviour visible packet by packet.</w:t>
       </w:r>
     </w:p>
     <w:p>
@@ -17968,7 +19961,7 @@
           <w:sz w:val="24"/>
           <w:szCs w:val="24"/>
         </w:rPr>
-        <w:t xml:space="preserve">Porting the deep agent to the C transport and testing it on the Section 8 scenarios, where the tabular agent only matched AIMD, and combining it with selective acknowledgments.</w:t>
+        <w:t xml:space="preserve">Training the neural agent directly in the C transport and on real netem paths, since it has so far been trained only in a simulator, and testing selective acknowledgment on a path where throughput, not the bottleneck rate, limits the transfer.</w:t>
       </w:r>
     </w:p>
     <w:p>

</xml_diff>

<commit_message>
Docs: fairness, ablation, dashboard, adaptive RTO; deck slide 23; report section 8.6
Co-Authored-By: Claude Sonnet 5.5 <noreply@anthropic.com>
Claude-Session: https://claude.ai/code/session_01NX2zRNpdVAnzFNKmqomzKu
</commit_message>
<xml_diff>
--- a/docs/RUDP_Final_Project_Report.docx
+++ b/docs/RUDP_Final_Project_Report.docx
@@ -12941,6 +12941,1767 @@
     </w:p>
     <w:p>
       <w:pPr>
+        <w:pStyle w:val="Heading2"/>
+        <w:keepNext/>
+        <w:spacing w:after="120" w:before="120" w:line="360"/>
+      </w:pPr>
+      <w:r>
+        <w:rPr>
+          <w:rFonts w:ascii="Times New Roman" w:cs="Times New Roman" w:eastAsia="Times New Roman" w:hAnsi="Times New Roman"/>
+          <w:b/>
+          <w:bCs/>
+          <w:sz w:val="24"/>
+          <w:szCs w:val="24"/>
+        </w:rPr>
+        <w:t xml:space="preserve">8.6 Fairness, ablation study and chat gateway upgrades</w:t>
+      </w:r>
+    </w:p>
+    <w:p>
+      <w:pPr>
+        <w:spacing w:after="120" w:line="360"/>
+        <w:jc w:val="both"/>
+      </w:pPr>
+      <w:r>
+        <w:rPr>
+          <w:rFonts w:ascii="Times New Roman" w:cs="Times New Roman" w:eastAsia="Times New Roman" w:hAnsi="Times New Roman"/>
+          <w:b/>
+          <w:bCs/>
+          <w:sz w:val="24"/>
+          <w:szCs w:val="24"/>
+        </w:rPr>
+        <w:t xml:space="preserve">Fairness.</w:t>
+      </w:r>
+      <w:r>
+        <w:rPr>
+          <w:rFonts w:ascii="Times New Roman" w:cs="Times New Roman" w:eastAsia="Times New Roman" w:hAnsi="Times New Roman"/>
+          <w:sz w:val="24"/>
+          <w:szCs w:val="24"/>
+        </w:rPr>
+        <w:t xml:space="preserve"> Two flows were run through one shared bottleneck in a multi-flow version of the simulator (300 packets per flow, 20 seeds). Table 8e reports flow A's share of the packets delivered when the first flow finished and the Jain fairness index (1.0 is a perfectly equal split; 0.5 is the worst case for two flows). The neural agent shares fairly with another neural agent (index 0.92 to 0.98) and with AIMD on the short paths (0.95 to 0.99). On the long 120 ms path it takes 74% of the bottleneck against an AIMD flow (index 0.82), which is about as unfair as a fixed window of 8 (72%, index 0.84). It is not a starvation case, since the AIMD flow still finishes, but the agent is not a polite sender on that path. A second finding is that two neural flows on a congestion-only path each finish more slowly (18.9 s) than two AIMD flows (12.2 s), so the single-flow gain does not simply scale to shared links. Fairness was not tested in the C transport.</w:t>
+      </w:r>
+    </w:p>
+    <w:p>
+      <w:pPr>
+        <w:keepNext/>
+        <w:spacing w:after="80" w:before="120"/>
+        <w:jc w:val="center"/>
+      </w:pPr>
+      <w:r>
+        <w:rPr>
+          <w:rFonts w:ascii="Times New Roman" w:cs="Times New Roman" w:eastAsia="Times New Roman" w:hAnsi="Times New Roman"/>
+          <w:b/>
+          <w:bCs/>
+          <w:sz w:val="24"/>
+          <w:szCs w:val="24"/>
+        </w:rPr>
+        <w:t xml:space="preserve">Table 8e: Share of flow A (first-named controller) and Jain index for two flows on a shared bottleneck (simulator, 20 seeds)</w:t>
+      </w:r>
+    </w:p>
+    <w:tbl>
+      <w:tblPr>
+        <w:tblW w:type="dxa" w:w="9026"/>
+        <w:tblBorders>
+          <w:top w:val="single" w:color="auto" w:sz="4"/>
+          <w:left w:val="single" w:color="auto" w:sz="4"/>
+          <w:bottom w:val="single" w:color="auto" w:sz="4"/>
+          <w:right w:val="single" w:color="auto" w:sz="4"/>
+          <w:insideH w:val="single" w:color="auto" w:sz="4"/>
+          <w:insideV w:val="single" w:color="auto" w:sz="4"/>
+        </w:tblBorders>
+      </w:tblPr>
+      <w:tblGrid>
+        <w:gridCol w:w="2000"/>
+        <w:gridCol w:w="1150"/>
+        <w:gridCol w:w="1150"/>
+        <w:gridCol w:w="1150"/>
+        <w:gridCol w:w="1150"/>
+        <w:gridCol w:w="1150"/>
+        <w:gridCol w:w="1276"/>
+      </w:tblGrid>
+      <w:tr>
+        <w:trPr>
+          <w:cantSplit/>
+          <w:tblHeader/>
+        </w:trPr>
+        <w:tc>
+          <w:tcPr>
+            <w:tcW w:type="dxa" w:w="2000"/>
+            <w:tcBorders>
+              <w:top w:val="single" w:color="000000" w:sz="4"/>
+              <w:left w:val="single" w:color="000000" w:sz="4"/>
+              <w:bottom w:val="single" w:color="000000" w:sz="4"/>
+              <w:right w:val="single" w:color="000000" w:sz="4"/>
+            </w:tcBorders>
+            <w:shd w:fill="D9D9D9" w:color="auto" w:val="clear"/>
+            <w:tcMar>
+              <w:top w:type="dxa" w:w="60"/>
+              <w:left w:type="dxa" w:w="100"/>
+              <w:bottom w:type="dxa" w:w="60"/>
+              <w:right w:type="dxa" w:w="100"/>
+            </w:tcMar>
+          </w:tcPr>
+          <w:p>
+            <w:pPr>
+              <w:spacing w:line="276"/>
+              <w:jc w:val="left"/>
+            </w:pPr>
+            <w:r>
+              <w:rPr>
+                <w:rFonts w:ascii="Times New Roman" w:cs="Times New Roman" w:eastAsia="Times New Roman" w:hAnsi="Times New Roman"/>
+                <w:b/>
+                <w:bCs/>
+                <w:sz w:val="24"/>
+                <w:szCs w:val="24"/>
+              </w:rPr>
+              <w:t xml:space="preserve">Path</w:t>
+            </w:r>
+          </w:p>
+        </w:tc>
+        <w:tc>
+          <w:tcPr>
+            <w:tcW w:type="dxa" w:w="1150"/>
+            <w:tcBorders>
+              <w:top w:val="single" w:color="000000" w:sz="4"/>
+              <w:left w:val="single" w:color="000000" w:sz="4"/>
+              <w:bottom w:val="single" w:color="000000" w:sz="4"/>
+              <w:right w:val="single" w:color="000000" w:sz="4"/>
+            </w:tcBorders>
+            <w:shd w:fill="D9D9D9" w:color="auto" w:val="clear"/>
+            <w:tcMar>
+              <w:top w:type="dxa" w:w="60"/>
+              <w:left w:type="dxa" w:w="100"/>
+              <w:bottom w:type="dxa" w:w="60"/>
+              <w:right w:type="dxa" w:w="100"/>
+            </w:tcMar>
+          </w:tcPr>
+          <w:p>
+            <w:pPr>
+              <w:spacing w:line="276"/>
+              <w:jc w:val="left"/>
+            </w:pPr>
+            <w:r>
+              <w:rPr>
+                <w:rFonts w:ascii="Times New Roman" w:cs="Times New Roman" w:eastAsia="Times New Roman" w:hAnsi="Times New Roman"/>
+                <w:b/>
+                <w:bCs/>
+                <w:sz w:val="24"/>
+                <w:szCs w:val="24"/>
+              </w:rPr>
+              <w:t xml:space="preserve">aimd/aimd</w:t>
+            </w:r>
+          </w:p>
+        </w:tc>
+        <w:tc>
+          <w:tcPr>
+            <w:tcW w:type="dxa" w:w="1150"/>
+            <w:tcBorders>
+              <w:top w:val="single" w:color="000000" w:sz="4"/>
+              <w:left w:val="single" w:color="000000" w:sz="4"/>
+              <w:bottom w:val="single" w:color="000000" w:sz="4"/>
+              <w:right w:val="single" w:color="000000" w:sz="4"/>
+            </w:tcBorders>
+            <w:shd w:fill="D9D9D9" w:color="auto" w:val="clear"/>
+            <w:tcMar>
+              <w:top w:type="dxa" w:w="60"/>
+              <w:left w:type="dxa" w:w="100"/>
+              <w:bottom w:type="dxa" w:w="60"/>
+              <w:right w:type="dxa" w:w="100"/>
+            </w:tcMar>
+          </w:tcPr>
+          <w:p>
+            <w:pPr>
+              <w:spacing w:line="276"/>
+              <w:jc w:val="left"/>
+            </w:pPr>
+            <w:r>
+              <w:rPr>
+                <w:rFonts w:ascii="Times New Roman" w:cs="Times New Roman" w:eastAsia="Times New Roman" w:hAnsi="Times New Roman"/>
+                <w:b/>
+                <w:bCs/>
+                <w:sz w:val="24"/>
+                <w:szCs w:val="24"/>
+              </w:rPr>
+              <w:t xml:space="preserve">deep/deep</w:t>
+            </w:r>
+          </w:p>
+        </w:tc>
+        <w:tc>
+          <w:tcPr>
+            <w:tcW w:type="dxa" w:w="1150"/>
+            <w:tcBorders>
+              <w:top w:val="single" w:color="000000" w:sz="4"/>
+              <w:left w:val="single" w:color="000000" w:sz="4"/>
+              <w:bottom w:val="single" w:color="000000" w:sz="4"/>
+              <w:right w:val="single" w:color="000000" w:sz="4"/>
+            </w:tcBorders>
+            <w:shd w:fill="D9D9D9" w:color="auto" w:val="clear"/>
+            <w:tcMar>
+              <w:top w:type="dxa" w:w="60"/>
+              <w:left w:type="dxa" w:w="100"/>
+              <w:bottom w:type="dxa" w:w="60"/>
+              <w:right w:type="dxa" w:w="100"/>
+            </w:tcMar>
+          </w:tcPr>
+          <w:p>
+            <w:pPr>
+              <w:spacing w:line="276"/>
+              <w:jc w:val="left"/>
+            </w:pPr>
+            <w:r>
+              <w:rPr>
+                <w:rFonts w:ascii="Times New Roman" w:cs="Times New Roman" w:eastAsia="Times New Roman" w:hAnsi="Times New Roman"/>
+                <w:b/>
+                <w:bCs/>
+                <w:sz w:val="24"/>
+                <w:szCs w:val="24"/>
+              </w:rPr>
+              <w:t xml:space="preserve">deep/aimd</w:t>
+            </w:r>
+          </w:p>
+        </w:tc>
+        <w:tc>
+          <w:tcPr>
+            <w:tcW w:type="dxa" w:w="1150"/>
+            <w:tcBorders>
+              <w:top w:val="single" w:color="000000" w:sz="4"/>
+              <w:left w:val="single" w:color="000000" w:sz="4"/>
+              <w:bottom w:val="single" w:color="000000" w:sz="4"/>
+              <w:right w:val="single" w:color="000000" w:sz="4"/>
+            </w:tcBorders>
+            <w:shd w:fill="D9D9D9" w:color="auto" w:val="clear"/>
+            <w:tcMar>
+              <w:top w:type="dxa" w:w="60"/>
+              <w:left w:type="dxa" w:w="100"/>
+              <w:bottom w:type="dxa" w:w="60"/>
+              <w:right w:type="dxa" w:w="100"/>
+            </w:tcMar>
+          </w:tcPr>
+          <w:p>
+            <w:pPr>
+              <w:spacing w:line="276"/>
+              <w:jc w:val="left"/>
+            </w:pPr>
+            <w:r>
+              <w:rPr>
+                <w:rFonts w:ascii="Times New Roman" w:cs="Times New Roman" w:eastAsia="Times New Roman" w:hAnsi="Times New Roman"/>
+                <w:b/>
+                <w:bCs/>
+                <w:sz w:val="24"/>
+                <w:szCs w:val="24"/>
+              </w:rPr>
+              <w:t xml:space="preserve">smart/aimd</w:t>
+            </w:r>
+          </w:p>
+        </w:tc>
+        <w:tc>
+          <w:tcPr>
+            <w:tcW w:type="dxa" w:w="1150"/>
+            <w:tcBorders>
+              <w:top w:val="single" w:color="000000" w:sz="4"/>
+              <w:left w:val="single" w:color="000000" w:sz="4"/>
+              <w:bottom w:val="single" w:color="000000" w:sz="4"/>
+              <w:right w:val="single" w:color="000000" w:sz="4"/>
+            </w:tcBorders>
+            <w:shd w:fill="D9D9D9" w:color="auto" w:val="clear"/>
+            <w:tcMar>
+              <w:top w:type="dxa" w:w="60"/>
+              <w:left w:type="dxa" w:w="100"/>
+              <w:bottom w:type="dxa" w:w="60"/>
+              <w:right w:type="dxa" w:w="100"/>
+            </w:tcMar>
+          </w:tcPr>
+          <w:p>
+            <w:pPr>
+              <w:spacing w:line="276"/>
+              <w:jc w:val="left"/>
+            </w:pPr>
+            <w:r>
+              <w:rPr>
+                <w:rFonts w:ascii="Times New Roman" w:cs="Times New Roman" w:eastAsia="Times New Roman" w:hAnsi="Times New Roman"/>
+                <w:b/>
+                <w:bCs/>
+                <w:sz w:val="24"/>
+                <w:szCs w:val="24"/>
+              </w:rPr>
+              <w:t xml:space="preserve">fixed/aimd</w:t>
+            </w:r>
+          </w:p>
+        </w:tc>
+        <w:tc>
+          <w:tcPr>
+            <w:tcW w:type="dxa" w:w="1276"/>
+            <w:tcBorders>
+              <w:top w:val="single" w:color="000000" w:sz="4"/>
+              <w:left w:val="single" w:color="000000" w:sz="4"/>
+              <w:bottom w:val="single" w:color="000000" w:sz="4"/>
+              <w:right w:val="single" w:color="000000" w:sz="4"/>
+            </w:tcBorders>
+            <w:shd w:fill="D9D9D9" w:color="auto" w:val="clear"/>
+            <w:tcMar>
+              <w:top w:type="dxa" w:w="60"/>
+              <w:left w:type="dxa" w:w="100"/>
+              <w:bottom w:type="dxa" w:w="60"/>
+              <w:right w:type="dxa" w:w="100"/>
+            </w:tcMar>
+          </w:tcPr>
+          <w:p>
+            <w:pPr>
+              <w:spacing w:line="276"/>
+              <w:jc w:val="left"/>
+            </w:pPr>
+            <w:r>
+              <w:rPr>
+                <w:rFonts w:ascii="Times New Roman" w:cs="Times New Roman" w:eastAsia="Times New Roman" w:hAnsi="Times New Roman"/>
+                <w:b/>
+                <w:bCs/>
+                <w:sz w:val="24"/>
+                <w:szCs w:val="24"/>
+              </w:rPr>
+              <w:t xml:space="preserve">Metric</w:t>
+            </w:r>
+          </w:p>
+        </w:tc>
+      </w:tr>
+      <w:tr>
+        <w:trPr>
+          <w:cantSplit/>
+          <w:tblHeader w:val="false"/>
+        </w:trPr>
+        <w:tc>
+          <w:tcPr>
+            <w:tcW w:type="dxa" w:w="2000"/>
+            <w:tcBorders>
+              <w:top w:val="single" w:color="000000" w:sz="4"/>
+              <w:left w:val="single" w:color="000000" w:sz="4"/>
+              <w:bottom w:val="single" w:color="000000" w:sz="4"/>
+              <w:right w:val="single" w:color="000000" w:sz="4"/>
+            </w:tcBorders>
+            <w:tcMar>
+              <w:top w:type="dxa" w:w="60"/>
+              <w:left w:type="dxa" w:w="100"/>
+              <w:bottom w:type="dxa" w:w="60"/>
+              <w:right w:type="dxa" w:w="100"/>
+            </w:tcMar>
+          </w:tcPr>
+          <w:p>
+            <w:pPr>
+              <w:spacing w:line="276"/>
+              <w:jc w:val="left"/>
+            </w:pPr>
+            <w:r>
+              <w:rPr>
+                <w:rFonts w:ascii="Times New Roman" w:cs="Times New Roman" w:eastAsia="Times New Roman" w:hAnsi="Times New Roman"/>
+                <w:b w:val="false"/>
+                <w:bCs w:val="false"/>
+                <w:sz w:val="24"/>
+                <w:szCs w:val="24"/>
+              </w:rPr>
+              <w:t xml:space="preserve">Congestion only</w:t>
+            </w:r>
+          </w:p>
+        </w:tc>
+        <w:tc>
+          <w:tcPr>
+            <w:tcW w:type="dxa" w:w="1150"/>
+            <w:tcBorders>
+              <w:top w:val="single" w:color="000000" w:sz="4"/>
+              <w:left w:val="single" w:color="000000" w:sz="4"/>
+              <w:bottom w:val="single" w:color="000000" w:sz="4"/>
+              <w:right w:val="single" w:color="000000" w:sz="4"/>
+            </w:tcBorders>
+            <w:tcMar>
+              <w:top w:type="dxa" w:w="60"/>
+              <w:left w:type="dxa" w:w="100"/>
+              <w:bottom w:type="dxa" w:w="60"/>
+              <w:right w:type="dxa" w:w="100"/>
+            </w:tcMar>
+          </w:tcPr>
+          <w:p>
+            <w:pPr>
+              <w:spacing w:line="276"/>
+              <w:jc w:val="left"/>
+            </w:pPr>
+            <w:r>
+              <w:rPr>
+                <w:rFonts w:ascii="Times New Roman" w:cs="Times New Roman" w:eastAsia="Times New Roman" w:hAnsi="Times New Roman"/>
+                <w:b w:val="false"/>
+                <w:bCs w:val="false"/>
+                <w:sz w:val="24"/>
+                <w:szCs w:val="24"/>
+              </w:rPr>
+              <w:t xml:space="preserve">52 / 0.998</w:t>
+            </w:r>
+          </w:p>
+        </w:tc>
+        <w:tc>
+          <w:tcPr>
+            <w:tcW w:type="dxa" w:w="1150"/>
+            <w:tcBorders>
+              <w:top w:val="single" w:color="000000" w:sz="4"/>
+              <w:left w:val="single" w:color="000000" w:sz="4"/>
+              <w:bottom w:val="single" w:color="000000" w:sz="4"/>
+              <w:right w:val="single" w:color="000000" w:sz="4"/>
+            </w:tcBorders>
+            <w:tcMar>
+              <w:top w:type="dxa" w:w="60"/>
+              <w:left w:type="dxa" w:w="100"/>
+              <w:bottom w:type="dxa" w:w="60"/>
+              <w:right w:type="dxa" w:w="100"/>
+            </w:tcMar>
+          </w:tcPr>
+          <w:p>
+            <w:pPr>
+              <w:spacing w:line="276"/>
+              <w:jc w:val="left"/>
+            </w:pPr>
+            <w:r>
+              <w:rPr>
+                <w:rFonts w:ascii="Times New Roman" w:cs="Times New Roman" w:eastAsia="Times New Roman" w:hAnsi="Times New Roman"/>
+                <w:b w:val="false"/>
+                <w:bCs w:val="false"/>
+                <w:sz w:val="24"/>
+                <w:szCs w:val="24"/>
+              </w:rPr>
+              <w:t xml:space="preserve">56 / 0.984</w:t>
+            </w:r>
+          </w:p>
+        </w:tc>
+        <w:tc>
+          <w:tcPr>
+            <w:tcW w:type="dxa" w:w="1150"/>
+            <w:tcBorders>
+              <w:top w:val="single" w:color="000000" w:sz="4"/>
+              <w:left w:val="single" w:color="000000" w:sz="4"/>
+              <w:bottom w:val="single" w:color="000000" w:sz="4"/>
+              <w:right w:val="single" w:color="000000" w:sz="4"/>
+            </w:tcBorders>
+            <w:tcMar>
+              <w:top w:type="dxa" w:w="60"/>
+              <w:left w:type="dxa" w:w="100"/>
+              <w:bottom w:type="dxa" w:w="60"/>
+              <w:right w:type="dxa" w:w="100"/>
+            </w:tcMar>
+          </w:tcPr>
+          <w:p>
+            <w:pPr>
+              <w:spacing w:line="276"/>
+              <w:jc w:val="left"/>
+            </w:pPr>
+            <w:r>
+              <w:rPr>
+                <w:rFonts w:ascii="Times New Roman" w:cs="Times New Roman" w:eastAsia="Times New Roman" w:hAnsi="Times New Roman"/>
+                <w:b w:val="false"/>
+                <w:bCs w:val="false"/>
+                <w:sz w:val="24"/>
+                <w:szCs w:val="24"/>
+              </w:rPr>
+              <w:t xml:space="preserve">44 / 0.987</w:t>
+            </w:r>
+          </w:p>
+        </w:tc>
+        <w:tc>
+          <w:tcPr>
+            <w:tcW w:type="dxa" w:w="1150"/>
+            <w:tcBorders>
+              <w:top w:val="single" w:color="000000" w:sz="4"/>
+              <w:left w:val="single" w:color="000000" w:sz="4"/>
+              <w:bottom w:val="single" w:color="000000" w:sz="4"/>
+              <w:right w:val="single" w:color="000000" w:sz="4"/>
+            </w:tcBorders>
+            <w:tcMar>
+              <w:top w:type="dxa" w:w="60"/>
+              <w:left w:type="dxa" w:w="100"/>
+              <w:bottom w:type="dxa" w:w="60"/>
+              <w:right w:type="dxa" w:w="100"/>
+            </w:tcMar>
+          </w:tcPr>
+          <w:p>
+            <w:pPr>
+              <w:spacing w:line="276"/>
+              <w:jc w:val="left"/>
+            </w:pPr>
+            <w:r>
+              <w:rPr>
+                <w:rFonts w:ascii="Times New Roman" w:cs="Times New Roman" w:eastAsia="Times New Roman" w:hAnsi="Times New Roman"/>
+                <w:b w:val="false"/>
+                <w:bCs w:val="false"/>
+                <w:sz w:val="24"/>
+                <w:szCs w:val="24"/>
+              </w:rPr>
+              <w:t xml:space="preserve">38 / 0.948</w:t>
+            </w:r>
+          </w:p>
+        </w:tc>
+        <w:tc>
+          <w:tcPr>
+            <w:tcW w:type="dxa" w:w="1150"/>
+            <w:tcBorders>
+              <w:top w:val="single" w:color="000000" w:sz="4"/>
+              <w:left w:val="single" w:color="000000" w:sz="4"/>
+              <w:bottom w:val="single" w:color="000000" w:sz="4"/>
+              <w:right w:val="single" w:color="000000" w:sz="4"/>
+            </w:tcBorders>
+            <w:tcMar>
+              <w:top w:type="dxa" w:w="60"/>
+              <w:left w:type="dxa" w:w="100"/>
+              <w:bottom w:type="dxa" w:w="60"/>
+              <w:right w:type="dxa" w:w="100"/>
+            </w:tcMar>
+          </w:tcPr>
+          <w:p>
+            <w:pPr>
+              <w:spacing w:line="276"/>
+              <w:jc w:val="left"/>
+            </w:pPr>
+            <w:r>
+              <w:rPr>
+                <w:rFonts w:ascii="Times New Roman" w:cs="Times New Roman" w:eastAsia="Times New Roman" w:hAnsi="Times New Roman"/>
+                <w:b w:val="false"/>
+                <w:bCs w:val="false"/>
+                <w:sz w:val="24"/>
+                <w:szCs w:val="24"/>
+              </w:rPr>
+              <w:t xml:space="preserve">29 / 0.845</w:t>
+            </w:r>
+          </w:p>
+        </w:tc>
+        <w:tc>
+          <w:tcPr>
+            <w:tcW w:type="dxa" w:w="1276"/>
+            <w:tcBorders>
+              <w:top w:val="single" w:color="000000" w:sz="4"/>
+              <w:left w:val="single" w:color="000000" w:sz="4"/>
+              <w:bottom w:val="single" w:color="000000" w:sz="4"/>
+              <w:right w:val="single" w:color="000000" w:sz="4"/>
+            </w:tcBorders>
+            <w:tcMar>
+              <w:top w:type="dxa" w:w="60"/>
+              <w:left w:type="dxa" w:w="100"/>
+              <w:bottom w:type="dxa" w:w="60"/>
+              <w:right w:type="dxa" w:w="100"/>
+            </w:tcMar>
+          </w:tcPr>
+          <w:p>
+            <w:pPr>
+              <w:spacing w:line="276"/>
+              <w:jc w:val="left"/>
+            </w:pPr>
+            <w:r>
+              <w:rPr>
+                <w:rFonts w:ascii="Times New Roman" w:cs="Times New Roman" w:eastAsia="Times New Roman" w:hAnsi="Times New Roman"/>
+                <w:b w:val="false"/>
+                <w:bCs w:val="false"/>
+                <w:sz w:val="24"/>
+                <w:szCs w:val="24"/>
+              </w:rPr>
+              <w:t xml:space="preserve">share % / Jain</w:t>
+            </w:r>
+          </w:p>
+        </w:tc>
+      </w:tr>
+      <w:tr>
+        <w:trPr>
+          <w:cantSplit/>
+          <w:tblHeader w:val="false"/>
+        </w:trPr>
+        <w:tc>
+          <w:tcPr>
+            <w:tcW w:type="dxa" w:w="2000"/>
+            <w:tcBorders>
+              <w:top w:val="single" w:color="000000" w:sz="4"/>
+              <w:left w:val="single" w:color="000000" w:sz="4"/>
+              <w:bottom w:val="single" w:color="000000" w:sz="4"/>
+              <w:right w:val="single" w:color="000000" w:sz="4"/>
+            </w:tcBorders>
+            <w:tcMar>
+              <w:top w:type="dxa" w:w="60"/>
+              <w:left w:type="dxa" w:w="100"/>
+              <w:bottom w:type="dxa" w:w="60"/>
+              <w:right w:type="dxa" w:w="100"/>
+            </w:tcMar>
+          </w:tcPr>
+          <w:p>
+            <w:pPr>
+              <w:spacing w:line="276"/>
+              <w:jc w:val="left"/>
+            </w:pPr>
+            <w:r>
+              <w:rPr>
+                <w:rFonts w:ascii="Times New Roman" w:cs="Times New Roman" w:eastAsia="Times New Roman" w:hAnsi="Times New Roman"/>
+                <w:b w:val="false"/>
+                <w:bCs w:val="false"/>
+                <w:sz w:val="24"/>
+                <w:szCs w:val="24"/>
+              </w:rPr>
+              <w:t xml:space="preserve">Congestion + 2% loss</w:t>
+            </w:r>
+          </w:p>
+        </w:tc>
+        <w:tc>
+          <w:tcPr>
+            <w:tcW w:type="dxa" w:w="1150"/>
+            <w:tcBorders>
+              <w:top w:val="single" w:color="000000" w:sz="4"/>
+              <w:left w:val="single" w:color="000000" w:sz="4"/>
+              <w:bottom w:val="single" w:color="000000" w:sz="4"/>
+              <w:right w:val="single" w:color="000000" w:sz="4"/>
+            </w:tcBorders>
+            <w:tcMar>
+              <w:top w:type="dxa" w:w="60"/>
+              <w:left w:type="dxa" w:w="100"/>
+              <w:bottom w:type="dxa" w:w="60"/>
+              <w:right w:type="dxa" w:w="100"/>
+            </w:tcMar>
+          </w:tcPr>
+          <w:p>
+            <w:pPr>
+              <w:spacing w:line="276"/>
+              <w:jc w:val="left"/>
+            </w:pPr>
+            <w:r>
+              <w:rPr>
+                <w:rFonts w:ascii="Times New Roman" w:cs="Times New Roman" w:eastAsia="Times New Roman" w:hAnsi="Times New Roman"/>
+                <w:b w:val="false"/>
+                <w:bCs w:val="false"/>
+                <w:sz w:val="24"/>
+                <w:szCs w:val="24"/>
+              </w:rPr>
+              <w:t xml:space="preserve">50 / 0.990</w:t>
+            </w:r>
+          </w:p>
+        </w:tc>
+        <w:tc>
+          <w:tcPr>
+            <w:tcW w:type="dxa" w:w="1150"/>
+            <w:tcBorders>
+              <w:top w:val="single" w:color="000000" w:sz="4"/>
+              <w:left w:val="single" w:color="000000" w:sz="4"/>
+              <w:bottom w:val="single" w:color="000000" w:sz="4"/>
+              <w:right w:val="single" w:color="000000" w:sz="4"/>
+            </w:tcBorders>
+            <w:tcMar>
+              <w:top w:type="dxa" w:w="60"/>
+              <w:left w:type="dxa" w:w="100"/>
+              <w:bottom w:type="dxa" w:w="60"/>
+              <w:right w:type="dxa" w:w="100"/>
+            </w:tcMar>
+          </w:tcPr>
+          <w:p>
+            <w:pPr>
+              <w:spacing w:line="276"/>
+              <w:jc w:val="left"/>
+            </w:pPr>
+            <w:r>
+              <w:rPr>
+                <w:rFonts w:ascii="Times New Roman" w:cs="Times New Roman" w:eastAsia="Times New Roman" w:hAnsi="Times New Roman"/>
+                <w:b w:val="false"/>
+                <w:bCs w:val="false"/>
+                <w:sz w:val="24"/>
+                <w:szCs w:val="24"/>
+              </w:rPr>
+              <w:t xml:space="preserve">55 / 0.921</w:t>
+            </w:r>
+          </w:p>
+        </w:tc>
+        <w:tc>
+          <w:tcPr>
+            <w:tcW w:type="dxa" w:w="1150"/>
+            <w:tcBorders>
+              <w:top w:val="single" w:color="000000" w:sz="4"/>
+              <w:left w:val="single" w:color="000000" w:sz="4"/>
+              <w:bottom w:val="single" w:color="000000" w:sz="4"/>
+              <w:right w:val="single" w:color="000000" w:sz="4"/>
+            </w:tcBorders>
+            <w:tcMar>
+              <w:top w:type="dxa" w:w="60"/>
+              <w:left w:type="dxa" w:w="100"/>
+              <w:bottom w:type="dxa" w:w="60"/>
+              <w:right w:type="dxa" w:w="100"/>
+            </w:tcMar>
+          </w:tcPr>
+          <w:p>
+            <w:pPr>
+              <w:spacing w:line="276"/>
+              <w:jc w:val="left"/>
+            </w:pPr>
+            <w:r>
+              <w:rPr>
+                <w:rFonts w:ascii="Times New Roman" w:cs="Times New Roman" w:eastAsia="Times New Roman" w:hAnsi="Times New Roman"/>
+                <w:b w:val="false"/>
+                <w:bCs w:val="false"/>
+                <w:sz w:val="24"/>
+                <w:szCs w:val="24"/>
+              </w:rPr>
+              <w:t xml:space="preserve">60 / 0.952</w:t>
+            </w:r>
+          </w:p>
+        </w:tc>
+        <w:tc>
+          <w:tcPr>
+            <w:tcW w:type="dxa" w:w="1150"/>
+            <w:tcBorders>
+              <w:top w:val="single" w:color="000000" w:sz="4"/>
+              <w:left w:val="single" w:color="000000" w:sz="4"/>
+              <w:bottom w:val="single" w:color="000000" w:sz="4"/>
+              <w:right w:val="single" w:color="000000" w:sz="4"/>
+            </w:tcBorders>
+            <w:tcMar>
+              <w:top w:type="dxa" w:w="60"/>
+              <w:left w:type="dxa" w:w="100"/>
+              <w:bottom w:type="dxa" w:w="60"/>
+              <w:right w:type="dxa" w:w="100"/>
+            </w:tcMar>
+          </w:tcPr>
+          <w:p>
+            <w:pPr>
+              <w:spacing w:line="276"/>
+              <w:jc w:val="left"/>
+            </w:pPr>
+            <w:r>
+              <w:rPr>
+                <w:rFonts w:ascii="Times New Roman" w:cs="Times New Roman" w:eastAsia="Times New Roman" w:hAnsi="Times New Roman"/>
+                <w:b w:val="false"/>
+                <w:bCs w:val="false"/>
+                <w:sz w:val="24"/>
+                <w:szCs w:val="24"/>
+              </w:rPr>
+              <w:t xml:space="preserve">54 / 0.965</w:t>
+            </w:r>
+          </w:p>
+        </w:tc>
+        <w:tc>
+          <w:tcPr>
+            <w:tcW w:type="dxa" w:w="1150"/>
+            <w:tcBorders>
+              <w:top w:val="single" w:color="000000" w:sz="4"/>
+              <w:left w:val="single" w:color="000000" w:sz="4"/>
+              <w:bottom w:val="single" w:color="000000" w:sz="4"/>
+              <w:right w:val="single" w:color="000000" w:sz="4"/>
+            </w:tcBorders>
+            <w:tcMar>
+              <w:top w:type="dxa" w:w="60"/>
+              <w:left w:type="dxa" w:w="100"/>
+              <w:bottom w:type="dxa" w:w="60"/>
+              <w:right w:type="dxa" w:w="100"/>
+            </w:tcMar>
+          </w:tcPr>
+          <w:p>
+            <w:pPr>
+              <w:spacing w:line="276"/>
+              <w:jc w:val="left"/>
+            </w:pPr>
+            <w:r>
+              <w:rPr>
+                <w:rFonts w:ascii="Times New Roman" w:cs="Times New Roman" w:eastAsia="Times New Roman" w:hAnsi="Times New Roman"/>
+                <w:b w:val="false"/>
+                <w:bCs w:val="false"/>
+                <w:sz w:val="24"/>
+                <w:szCs w:val="24"/>
+              </w:rPr>
+              <w:t xml:space="preserve">62 / 0.944</w:t>
+            </w:r>
+          </w:p>
+        </w:tc>
+        <w:tc>
+          <w:tcPr>
+            <w:tcW w:type="dxa" w:w="1276"/>
+            <w:tcBorders>
+              <w:top w:val="single" w:color="000000" w:sz="4"/>
+              <w:left w:val="single" w:color="000000" w:sz="4"/>
+              <w:bottom w:val="single" w:color="000000" w:sz="4"/>
+              <w:right w:val="single" w:color="000000" w:sz="4"/>
+            </w:tcBorders>
+            <w:tcMar>
+              <w:top w:type="dxa" w:w="60"/>
+              <w:left w:type="dxa" w:w="100"/>
+              <w:bottom w:type="dxa" w:w="60"/>
+              <w:right w:type="dxa" w:w="100"/>
+            </w:tcMar>
+          </w:tcPr>
+          <w:p>
+            <w:pPr>
+              <w:spacing w:line="276"/>
+              <w:jc w:val="left"/>
+            </w:pPr>
+            <w:r>
+              <w:rPr>
+                <w:rFonts w:ascii="Times New Roman" w:cs="Times New Roman" w:eastAsia="Times New Roman" w:hAnsi="Times New Roman"/>
+                <w:b w:val="false"/>
+                <w:bCs w:val="false"/>
+                <w:sz w:val="24"/>
+                <w:szCs w:val="24"/>
+              </w:rPr>
+              <w:t xml:space="preserve">share % / Jain</w:t>
+            </w:r>
+          </w:p>
+        </w:tc>
+      </w:tr>
+      <w:tr>
+        <w:trPr>
+          <w:cantSplit/>
+          <w:tblHeader w:val="false"/>
+        </w:trPr>
+        <w:tc>
+          <w:tcPr>
+            <w:tcW w:type="dxa" w:w="2000"/>
+            <w:tcBorders>
+              <w:top w:val="single" w:color="000000" w:sz="4"/>
+              <w:left w:val="single" w:color="000000" w:sz="4"/>
+              <w:bottom w:val="single" w:color="000000" w:sz="4"/>
+              <w:right w:val="single" w:color="000000" w:sz="4"/>
+            </w:tcBorders>
+            <w:tcMar>
+              <w:top w:type="dxa" w:w="60"/>
+              <w:left w:type="dxa" w:w="100"/>
+              <w:bottom w:type="dxa" w:w="60"/>
+              <w:right w:type="dxa" w:w="100"/>
+            </w:tcMar>
+          </w:tcPr>
+          <w:p>
+            <w:pPr>
+              <w:spacing w:line="276"/>
+              <w:jc w:val="left"/>
+            </w:pPr>
+            <w:r>
+              <w:rPr>
+                <w:rFonts w:ascii="Times New Roman" w:cs="Times New Roman" w:eastAsia="Times New Roman" w:hAnsi="Times New Roman"/>
+                <w:b w:val="false"/>
+                <w:bCs w:val="false"/>
+                <w:sz w:val="24"/>
+                <w:szCs w:val="24"/>
+              </w:rPr>
+              <w:t xml:space="preserve">Long path (120 ms)</w:t>
+            </w:r>
+          </w:p>
+        </w:tc>
+        <w:tc>
+          <w:tcPr>
+            <w:tcW w:type="dxa" w:w="1150"/>
+            <w:tcBorders>
+              <w:top w:val="single" w:color="000000" w:sz="4"/>
+              <w:left w:val="single" w:color="000000" w:sz="4"/>
+              <w:bottom w:val="single" w:color="000000" w:sz="4"/>
+              <w:right w:val="single" w:color="000000" w:sz="4"/>
+            </w:tcBorders>
+            <w:tcMar>
+              <w:top w:type="dxa" w:w="60"/>
+              <w:left w:type="dxa" w:w="100"/>
+              <w:bottom w:type="dxa" w:w="60"/>
+              <w:right w:type="dxa" w:w="100"/>
+            </w:tcMar>
+          </w:tcPr>
+          <w:p>
+            <w:pPr>
+              <w:spacing w:line="276"/>
+              <w:jc w:val="left"/>
+            </w:pPr>
+            <w:r>
+              <w:rPr>
+                <w:rFonts w:ascii="Times New Roman" w:cs="Times New Roman" w:eastAsia="Times New Roman" w:hAnsi="Times New Roman"/>
+                <w:b w:val="false"/>
+                <w:bCs w:val="false"/>
+                <w:sz w:val="24"/>
+                <w:szCs w:val="24"/>
+              </w:rPr>
+              <w:t xml:space="preserve">51 / 0.999</w:t>
+            </w:r>
+          </w:p>
+        </w:tc>
+        <w:tc>
+          <w:tcPr>
+            <w:tcW w:type="dxa" w:w="1150"/>
+            <w:tcBorders>
+              <w:top w:val="single" w:color="000000" w:sz="4"/>
+              <w:left w:val="single" w:color="000000" w:sz="4"/>
+              <w:bottom w:val="single" w:color="000000" w:sz="4"/>
+              <w:right w:val="single" w:color="000000" w:sz="4"/>
+            </w:tcBorders>
+            <w:tcMar>
+              <w:top w:type="dxa" w:w="60"/>
+              <w:left w:type="dxa" w:w="100"/>
+              <w:bottom w:type="dxa" w:w="60"/>
+              <w:right w:type="dxa" w:w="100"/>
+            </w:tcMar>
+          </w:tcPr>
+          <w:p>
+            <w:pPr>
+              <w:spacing w:line="276"/>
+              <w:jc w:val="left"/>
+            </w:pPr>
+            <w:r>
+              <w:rPr>
+                <w:rFonts w:ascii="Times New Roman" w:cs="Times New Roman" w:eastAsia="Times New Roman" w:hAnsi="Times New Roman"/>
+                <w:b w:val="false"/>
+                <w:bCs w:val="false"/>
+                <w:sz w:val="24"/>
+                <w:szCs w:val="24"/>
+              </w:rPr>
+              <w:t xml:space="preserve">59 / 0.969</w:t>
+            </w:r>
+          </w:p>
+        </w:tc>
+        <w:tc>
+          <w:tcPr>
+            <w:tcW w:type="dxa" w:w="1150"/>
+            <w:tcBorders>
+              <w:top w:val="single" w:color="000000" w:sz="4"/>
+              <w:left w:val="single" w:color="000000" w:sz="4"/>
+              <w:bottom w:val="single" w:color="000000" w:sz="4"/>
+              <w:right w:val="single" w:color="000000" w:sz="4"/>
+            </w:tcBorders>
+            <w:tcMar>
+              <w:top w:type="dxa" w:w="60"/>
+              <w:left w:type="dxa" w:w="100"/>
+              <w:bottom w:type="dxa" w:w="60"/>
+              <w:right w:type="dxa" w:w="100"/>
+            </w:tcMar>
+          </w:tcPr>
+          <w:p>
+            <w:pPr>
+              <w:spacing w:line="276"/>
+              <w:jc w:val="left"/>
+            </w:pPr>
+            <w:r>
+              <w:rPr>
+                <w:rFonts w:ascii="Times New Roman" w:cs="Times New Roman" w:eastAsia="Times New Roman" w:hAnsi="Times New Roman"/>
+                <w:b w:val="false"/>
+                <w:bCs w:val="false"/>
+                <w:sz w:val="24"/>
+                <w:szCs w:val="24"/>
+              </w:rPr>
+              <w:t xml:space="preserve">74 / 0.819</w:t>
+            </w:r>
+          </w:p>
+        </w:tc>
+        <w:tc>
+          <w:tcPr>
+            <w:tcW w:type="dxa" w:w="1150"/>
+            <w:tcBorders>
+              <w:top w:val="single" w:color="000000" w:sz="4"/>
+              <w:left w:val="single" w:color="000000" w:sz="4"/>
+              <w:bottom w:val="single" w:color="000000" w:sz="4"/>
+              <w:right w:val="single" w:color="000000" w:sz="4"/>
+            </w:tcBorders>
+            <w:tcMar>
+              <w:top w:type="dxa" w:w="60"/>
+              <w:left w:type="dxa" w:w="100"/>
+              <w:bottom w:type="dxa" w:w="60"/>
+              <w:right w:type="dxa" w:w="100"/>
+            </w:tcMar>
+          </w:tcPr>
+          <w:p>
+            <w:pPr>
+              <w:spacing w:line="276"/>
+              <w:jc w:val="left"/>
+            </w:pPr>
+            <w:r>
+              <w:rPr>
+                <w:rFonts w:ascii="Times New Roman" w:cs="Times New Roman" w:eastAsia="Times New Roman" w:hAnsi="Times New Roman"/>
+                <w:b w:val="false"/>
+                <w:bCs w:val="false"/>
+                <w:sz w:val="24"/>
+                <w:szCs w:val="24"/>
+              </w:rPr>
+              <w:t xml:space="preserve">61 / 0.953</w:t>
+            </w:r>
+          </w:p>
+        </w:tc>
+        <w:tc>
+          <w:tcPr>
+            <w:tcW w:type="dxa" w:w="1150"/>
+            <w:tcBorders>
+              <w:top w:val="single" w:color="000000" w:sz="4"/>
+              <w:left w:val="single" w:color="000000" w:sz="4"/>
+              <w:bottom w:val="single" w:color="000000" w:sz="4"/>
+              <w:right w:val="single" w:color="000000" w:sz="4"/>
+            </w:tcBorders>
+            <w:tcMar>
+              <w:top w:type="dxa" w:w="60"/>
+              <w:left w:type="dxa" w:w="100"/>
+              <w:bottom w:type="dxa" w:w="60"/>
+              <w:right w:type="dxa" w:w="100"/>
+            </w:tcMar>
+          </w:tcPr>
+          <w:p>
+            <w:pPr>
+              <w:spacing w:line="276"/>
+              <w:jc w:val="left"/>
+            </w:pPr>
+            <w:r>
+              <w:rPr>
+                <w:rFonts w:ascii="Times New Roman" w:cs="Times New Roman" w:eastAsia="Times New Roman" w:hAnsi="Times New Roman"/>
+                <w:b w:val="false"/>
+                <w:bCs w:val="false"/>
+                <w:sz w:val="24"/>
+                <w:szCs w:val="24"/>
+              </w:rPr>
+              <w:t xml:space="preserve">72 / 0.843</w:t>
+            </w:r>
+          </w:p>
+        </w:tc>
+        <w:tc>
+          <w:tcPr>
+            <w:tcW w:type="dxa" w:w="1276"/>
+            <w:tcBorders>
+              <w:top w:val="single" w:color="000000" w:sz="4"/>
+              <w:left w:val="single" w:color="000000" w:sz="4"/>
+              <w:bottom w:val="single" w:color="000000" w:sz="4"/>
+              <w:right w:val="single" w:color="000000" w:sz="4"/>
+            </w:tcBorders>
+            <w:tcMar>
+              <w:top w:type="dxa" w:w="60"/>
+              <w:left w:type="dxa" w:w="100"/>
+              <w:bottom w:type="dxa" w:w="60"/>
+              <w:right w:type="dxa" w:w="100"/>
+            </w:tcMar>
+          </w:tcPr>
+          <w:p>
+            <w:pPr>
+              <w:spacing w:line="276"/>
+              <w:jc w:val="left"/>
+            </w:pPr>
+            <w:r>
+              <w:rPr>
+                <w:rFonts w:ascii="Times New Roman" w:cs="Times New Roman" w:eastAsia="Times New Roman" w:hAnsi="Times New Roman"/>
+                <w:b w:val="false"/>
+                <w:bCs w:val="false"/>
+                <w:sz w:val="24"/>
+                <w:szCs w:val="24"/>
+              </w:rPr>
+              <w:t xml:space="preserve">share % / Jain</w:t>
+            </w:r>
+          </w:p>
+        </w:tc>
+      </w:tr>
+    </w:tbl>
+    <w:p>
+      <w:pPr>
+        <w:spacing w:after="160"/>
+      </w:pPr>
+    </w:p>
+    <w:p>
+      <w:pPr>
+        <w:spacing w:after="120" w:line="360"/>
+        <w:jc w:val="both"/>
+      </w:pPr>
+      <w:r>
+        <w:rPr>
+          <w:rFonts w:ascii="Times New Roman" w:cs="Times New Roman" w:eastAsia="Times New Roman" w:hAnsi="Times New Roman"/>
+          <w:b/>
+          <w:bCs/>
+          <w:sz w:val="24"/>
+          <w:szCs w:val="24"/>
+        </w:rPr>
+        <w:t xml:space="preserve">Ablation study.</w:t>
+      </w:r>
+      <w:r>
+        <w:rPr>
+          <w:rFonts w:ascii="Times New Roman" w:cs="Times New Roman" w:eastAsia="Times New Roman" w:hAnsi="Times New Roman"/>
+          <w:sz w:val="24"/>
+          <w:szCs w:val="24"/>
+        </w:rPr>
+        <w:t xml:space="preserve"> To find out which parts of the neural agent matter, it was retrained with one design choice removed (4,000 episodes, four seeds each, best seed chosen on the validation paths, scored on the 48 stress paths; Table 8f). The only component whose removal clearly hurts is the no-shrink mask: without it the best network averaged 6.54 s, close to AIMD (7.16 s), against 3.2 to 3.6 s with it. Removing the RTT-delay penalty, the last-action input or the throughput input did not hurt in the best seed (3.2 to 3.4 s); with the shorter 4,000-episode training the full agent was not better than those variants (3.59 s). The larger effect is the seed: the same recipe gave between 3.2 s and 7.4 s depending on the random seed, which is why the final agent was chosen on validation paths. The study therefore supports the no-shrink mask as the key ingredient and does not show a measurable value for the other three, and the seed sensitivity is a real weakness of the method.</w:t>
+      </w:r>
+    </w:p>
+    <w:p>
+      <w:pPr>
+        <w:keepNext/>
+        <w:spacing w:after="80" w:before="120"/>
+        <w:jc w:val="center"/>
+      </w:pPr>
+      <w:r>
+        <w:rPr>
+          <w:rFonts w:ascii="Times New Roman" w:cs="Times New Roman" w:eastAsia="Times New Roman" w:hAnsi="Times New Roman"/>
+          <w:b/>
+          <w:bCs/>
+          <w:sz w:val="24"/>
+          <w:szCs w:val="24"/>
+        </w:rPr>
+        <w:t xml:space="preserve">Table 8f: Mean completion time on 48 unseen stress paths for each ablation (simulator; AIMD 7.16 s on the same paths)</w:t>
+      </w:r>
+    </w:p>
+    <w:tbl>
+      <w:tblPr>
+        <w:tblW w:type="dxa" w:w="7226"/>
+        <w:tblBorders>
+          <w:top w:val="single" w:color="auto" w:sz="4"/>
+          <w:left w:val="single" w:color="auto" w:sz="4"/>
+          <w:bottom w:val="single" w:color="auto" w:sz="4"/>
+          <w:right w:val="single" w:color="auto" w:sz="4"/>
+          <w:insideH w:val="single" w:color="auto" w:sz="4"/>
+          <w:insideV w:val="single" w:color="auto" w:sz="4"/>
+        </w:tblBorders>
+      </w:tblPr>
+      <w:tblGrid>
+        <w:gridCol w:w="2800"/>
+        <w:gridCol w:w="1300"/>
+        <w:gridCol w:w="3126"/>
+      </w:tblGrid>
+      <w:tr>
+        <w:trPr>
+          <w:cantSplit/>
+          <w:tblHeader/>
+        </w:trPr>
+        <w:tc>
+          <w:tcPr>
+            <w:tcW w:type="dxa" w:w="2800"/>
+            <w:tcBorders>
+              <w:top w:val="single" w:color="000000" w:sz="4"/>
+              <w:left w:val="single" w:color="000000" w:sz="4"/>
+              <w:bottom w:val="single" w:color="000000" w:sz="4"/>
+              <w:right w:val="single" w:color="000000" w:sz="4"/>
+            </w:tcBorders>
+            <w:shd w:fill="D9D9D9" w:color="auto" w:val="clear"/>
+            <w:tcMar>
+              <w:top w:type="dxa" w:w="60"/>
+              <w:left w:type="dxa" w:w="100"/>
+              <w:bottom w:type="dxa" w:w="60"/>
+              <w:right w:type="dxa" w:w="100"/>
+            </w:tcMar>
+          </w:tcPr>
+          <w:p>
+            <w:pPr>
+              <w:spacing w:line="276"/>
+              <w:jc w:val="left"/>
+            </w:pPr>
+            <w:r>
+              <w:rPr>
+                <w:rFonts w:ascii="Times New Roman" w:cs="Times New Roman" w:eastAsia="Times New Roman" w:hAnsi="Times New Roman"/>
+                <w:b/>
+                <w:bCs/>
+                <w:sz w:val="24"/>
+                <w:szCs w:val="24"/>
+              </w:rPr>
+              <w:t xml:space="preserve">Variant</w:t>
+            </w:r>
+          </w:p>
+        </w:tc>
+        <w:tc>
+          <w:tcPr>
+            <w:tcW w:type="dxa" w:w="1300"/>
+            <w:tcBorders>
+              <w:top w:val="single" w:color="000000" w:sz="4"/>
+              <w:left w:val="single" w:color="000000" w:sz="4"/>
+              <w:bottom w:val="single" w:color="000000" w:sz="4"/>
+              <w:right w:val="single" w:color="000000" w:sz="4"/>
+            </w:tcBorders>
+            <w:shd w:fill="D9D9D9" w:color="auto" w:val="clear"/>
+            <w:tcMar>
+              <w:top w:type="dxa" w:w="60"/>
+              <w:left w:type="dxa" w:w="100"/>
+              <w:bottom w:type="dxa" w:w="60"/>
+              <w:right w:type="dxa" w:w="100"/>
+            </w:tcMar>
+          </w:tcPr>
+          <w:p>
+            <w:pPr>
+              <w:spacing w:line="276"/>
+              <w:jc w:val="left"/>
+            </w:pPr>
+            <w:r>
+              <w:rPr>
+                <w:rFonts w:ascii="Times New Roman" w:cs="Times New Roman" w:eastAsia="Times New Roman" w:hAnsi="Times New Roman"/>
+                <w:b/>
+                <w:bCs/>
+                <w:sz w:val="24"/>
+                <w:szCs w:val="24"/>
+              </w:rPr>
+              <w:t xml:space="preserve">Best seed (s)</w:t>
+            </w:r>
+          </w:p>
+        </w:tc>
+        <w:tc>
+          <w:tcPr>
+            <w:tcW w:type="dxa" w:w="3126"/>
+            <w:tcBorders>
+              <w:top w:val="single" w:color="000000" w:sz="4"/>
+              <w:left w:val="single" w:color="000000" w:sz="4"/>
+              <w:bottom w:val="single" w:color="000000" w:sz="4"/>
+              <w:right w:val="single" w:color="000000" w:sz="4"/>
+            </w:tcBorders>
+            <w:shd w:fill="D9D9D9" w:color="auto" w:val="clear"/>
+            <w:tcMar>
+              <w:top w:type="dxa" w:w="60"/>
+              <w:left w:type="dxa" w:w="100"/>
+              <w:bottom w:type="dxa" w:w="60"/>
+              <w:right w:type="dxa" w:w="100"/>
+            </w:tcMar>
+          </w:tcPr>
+          <w:p>
+            <w:pPr>
+              <w:spacing w:line="276"/>
+              <w:jc w:val="left"/>
+            </w:pPr>
+            <w:r>
+              <w:rPr>
+                <w:rFonts w:ascii="Times New Roman" w:cs="Times New Roman" w:eastAsia="Times New Roman" w:hAnsi="Times New Roman"/>
+                <w:b/>
+                <w:bCs/>
+                <w:sz w:val="24"/>
+                <w:szCs w:val="24"/>
+              </w:rPr>
+              <w:t xml:space="preserve">All four seeds (s)</w:t>
+            </w:r>
+          </w:p>
+        </w:tc>
+      </w:tr>
+      <w:tr>
+        <w:trPr>
+          <w:cantSplit/>
+          <w:tblHeader w:val="false"/>
+        </w:trPr>
+        <w:tc>
+          <w:tcPr>
+            <w:tcW w:type="dxa" w:w="2800"/>
+            <w:tcBorders>
+              <w:top w:val="single" w:color="000000" w:sz="4"/>
+              <w:left w:val="single" w:color="000000" w:sz="4"/>
+              <w:bottom w:val="single" w:color="000000" w:sz="4"/>
+              <w:right w:val="single" w:color="000000" w:sz="4"/>
+            </w:tcBorders>
+            <w:tcMar>
+              <w:top w:type="dxa" w:w="60"/>
+              <w:left w:type="dxa" w:w="100"/>
+              <w:bottom w:type="dxa" w:w="60"/>
+              <w:right w:type="dxa" w:w="100"/>
+            </w:tcMar>
+          </w:tcPr>
+          <w:p>
+            <w:pPr>
+              <w:spacing w:line="276"/>
+              <w:jc w:val="left"/>
+            </w:pPr>
+            <w:r>
+              <w:rPr>
+                <w:rFonts w:ascii="Times New Roman" w:cs="Times New Roman" w:eastAsia="Times New Roman" w:hAnsi="Times New Roman"/>
+                <w:b w:val="false"/>
+                <w:bCs w:val="false"/>
+                <w:sz w:val="24"/>
+                <w:szCs w:val="24"/>
+              </w:rPr>
+              <w:t xml:space="preserve">Full agent</w:t>
+            </w:r>
+          </w:p>
+        </w:tc>
+        <w:tc>
+          <w:tcPr>
+            <w:tcW w:type="dxa" w:w="1300"/>
+            <w:tcBorders>
+              <w:top w:val="single" w:color="000000" w:sz="4"/>
+              <w:left w:val="single" w:color="000000" w:sz="4"/>
+              <w:bottom w:val="single" w:color="000000" w:sz="4"/>
+              <w:right w:val="single" w:color="000000" w:sz="4"/>
+            </w:tcBorders>
+            <w:tcMar>
+              <w:top w:type="dxa" w:w="60"/>
+              <w:left w:type="dxa" w:w="100"/>
+              <w:bottom w:type="dxa" w:w="60"/>
+              <w:right w:type="dxa" w:w="100"/>
+            </w:tcMar>
+          </w:tcPr>
+          <w:p>
+            <w:pPr>
+              <w:spacing w:line="276"/>
+              <w:jc w:val="left"/>
+            </w:pPr>
+            <w:r>
+              <w:rPr>
+                <w:rFonts w:ascii="Times New Roman" w:cs="Times New Roman" w:eastAsia="Times New Roman" w:hAnsi="Times New Roman"/>
+                <w:b w:val="false"/>
+                <w:bCs w:val="false"/>
+                <w:sz w:val="24"/>
+                <w:szCs w:val="24"/>
+              </w:rPr>
+              <w:t xml:space="preserve">3.59</w:t>
+            </w:r>
+          </w:p>
+        </w:tc>
+        <w:tc>
+          <w:tcPr>
+            <w:tcW w:type="dxa" w:w="3126"/>
+            <w:tcBorders>
+              <w:top w:val="single" w:color="000000" w:sz="4"/>
+              <w:left w:val="single" w:color="000000" w:sz="4"/>
+              <w:bottom w:val="single" w:color="000000" w:sz="4"/>
+              <w:right w:val="single" w:color="000000" w:sz="4"/>
+            </w:tcBorders>
+            <w:tcMar>
+              <w:top w:type="dxa" w:w="60"/>
+              <w:left w:type="dxa" w:w="100"/>
+              <w:bottom w:type="dxa" w:w="60"/>
+              <w:right w:type="dxa" w:w="100"/>
+            </w:tcMar>
+          </w:tcPr>
+          <w:p>
+            <w:pPr>
+              <w:spacing w:line="276"/>
+              <w:jc w:val="left"/>
+            </w:pPr>
+            <w:r>
+              <w:rPr>
+                <w:rFonts w:ascii="Times New Roman" w:cs="Times New Roman" w:eastAsia="Times New Roman" w:hAnsi="Times New Roman"/>
+                <w:b w:val="false"/>
+                <w:bCs w:val="false"/>
+                <w:sz w:val="24"/>
+                <w:szCs w:val="24"/>
+              </w:rPr>
+              <w:t xml:space="preserve">5.21, 7.10, 3.59, 7.31</w:t>
+            </w:r>
+          </w:p>
+        </w:tc>
+      </w:tr>
+      <w:tr>
+        <w:trPr>
+          <w:cantSplit/>
+          <w:tblHeader w:val="false"/>
+        </w:trPr>
+        <w:tc>
+          <w:tcPr>
+            <w:tcW w:type="dxa" w:w="2800"/>
+            <w:tcBorders>
+              <w:top w:val="single" w:color="000000" w:sz="4"/>
+              <w:left w:val="single" w:color="000000" w:sz="4"/>
+              <w:bottom w:val="single" w:color="000000" w:sz="4"/>
+              <w:right w:val="single" w:color="000000" w:sz="4"/>
+            </w:tcBorders>
+            <w:tcMar>
+              <w:top w:type="dxa" w:w="60"/>
+              <w:left w:type="dxa" w:w="100"/>
+              <w:bottom w:type="dxa" w:w="60"/>
+              <w:right w:type="dxa" w:w="100"/>
+            </w:tcMar>
+          </w:tcPr>
+          <w:p>
+            <w:pPr>
+              <w:spacing w:line="276"/>
+              <w:jc w:val="left"/>
+            </w:pPr>
+            <w:r>
+              <w:rPr>
+                <w:rFonts w:ascii="Times New Roman" w:cs="Times New Roman" w:eastAsia="Times New Roman" w:hAnsi="Times New Roman"/>
+                <w:b w:val="false"/>
+                <w:bCs w:val="false"/>
+                <w:sz w:val="24"/>
+                <w:szCs w:val="24"/>
+              </w:rPr>
+              <w:t xml:space="preserve">No no-shrink mask</w:t>
+            </w:r>
+          </w:p>
+        </w:tc>
+        <w:tc>
+          <w:tcPr>
+            <w:tcW w:type="dxa" w:w="1300"/>
+            <w:tcBorders>
+              <w:top w:val="single" w:color="000000" w:sz="4"/>
+              <w:left w:val="single" w:color="000000" w:sz="4"/>
+              <w:bottom w:val="single" w:color="000000" w:sz="4"/>
+              <w:right w:val="single" w:color="000000" w:sz="4"/>
+            </w:tcBorders>
+            <w:tcMar>
+              <w:top w:type="dxa" w:w="60"/>
+              <w:left w:type="dxa" w:w="100"/>
+              <w:bottom w:type="dxa" w:w="60"/>
+              <w:right w:type="dxa" w:w="100"/>
+            </w:tcMar>
+          </w:tcPr>
+          <w:p>
+            <w:pPr>
+              <w:spacing w:line="276"/>
+              <w:jc w:val="left"/>
+            </w:pPr>
+            <w:r>
+              <w:rPr>
+                <w:rFonts w:ascii="Times New Roman" w:cs="Times New Roman" w:eastAsia="Times New Roman" w:hAnsi="Times New Roman"/>
+                <w:b w:val="false"/>
+                <w:bCs w:val="false"/>
+                <w:sz w:val="24"/>
+                <w:szCs w:val="24"/>
+              </w:rPr>
+              <w:t xml:space="preserve">6.54</w:t>
+            </w:r>
+          </w:p>
+        </w:tc>
+        <w:tc>
+          <w:tcPr>
+            <w:tcW w:type="dxa" w:w="3126"/>
+            <w:tcBorders>
+              <w:top w:val="single" w:color="000000" w:sz="4"/>
+              <w:left w:val="single" w:color="000000" w:sz="4"/>
+              <w:bottom w:val="single" w:color="000000" w:sz="4"/>
+              <w:right w:val="single" w:color="000000" w:sz="4"/>
+            </w:tcBorders>
+            <w:tcMar>
+              <w:top w:type="dxa" w:w="60"/>
+              <w:left w:type="dxa" w:w="100"/>
+              <w:bottom w:type="dxa" w:w="60"/>
+              <w:right w:type="dxa" w:w="100"/>
+            </w:tcMar>
+          </w:tcPr>
+          <w:p>
+            <w:pPr>
+              <w:spacing w:line="276"/>
+              <w:jc w:val="left"/>
+            </w:pPr>
+            <w:r>
+              <w:rPr>
+                <w:rFonts w:ascii="Times New Roman" w:cs="Times New Roman" w:eastAsia="Times New Roman" w:hAnsi="Times New Roman"/>
+                <w:b w:val="false"/>
+                <w:bCs w:val="false"/>
+                <w:sz w:val="24"/>
+                <w:szCs w:val="24"/>
+              </w:rPr>
+              <w:t xml:space="preserve">6.60, 7.44, 7.24, 6.54</w:t>
+            </w:r>
+          </w:p>
+        </w:tc>
+      </w:tr>
+      <w:tr>
+        <w:trPr>
+          <w:cantSplit/>
+          <w:tblHeader w:val="false"/>
+        </w:trPr>
+        <w:tc>
+          <w:tcPr>
+            <w:tcW w:type="dxa" w:w="2800"/>
+            <w:tcBorders>
+              <w:top w:val="single" w:color="000000" w:sz="4"/>
+              <w:left w:val="single" w:color="000000" w:sz="4"/>
+              <w:bottom w:val="single" w:color="000000" w:sz="4"/>
+              <w:right w:val="single" w:color="000000" w:sz="4"/>
+            </w:tcBorders>
+            <w:tcMar>
+              <w:top w:type="dxa" w:w="60"/>
+              <w:left w:type="dxa" w:w="100"/>
+              <w:bottom w:type="dxa" w:w="60"/>
+              <w:right w:type="dxa" w:w="100"/>
+            </w:tcMar>
+          </w:tcPr>
+          <w:p>
+            <w:pPr>
+              <w:spacing w:line="276"/>
+              <w:jc w:val="left"/>
+            </w:pPr>
+            <w:r>
+              <w:rPr>
+                <w:rFonts w:ascii="Times New Roman" w:cs="Times New Roman" w:eastAsia="Times New Roman" w:hAnsi="Times New Roman"/>
+                <w:b w:val="false"/>
+                <w:bCs w:val="false"/>
+                <w:sz w:val="24"/>
+                <w:szCs w:val="24"/>
+              </w:rPr>
+              <w:t xml:space="preserve">No RTT-delay penalty</w:t>
+            </w:r>
+          </w:p>
+        </w:tc>
+        <w:tc>
+          <w:tcPr>
+            <w:tcW w:type="dxa" w:w="1300"/>
+            <w:tcBorders>
+              <w:top w:val="single" w:color="000000" w:sz="4"/>
+              <w:left w:val="single" w:color="000000" w:sz="4"/>
+              <w:bottom w:val="single" w:color="000000" w:sz="4"/>
+              <w:right w:val="single" w:color="000000" w:sz="4"/>
+            </w:tcBorders>
+            <w:tcMar>
+              <w:top w:type="dxa" w:w="60"/>
+              <w:left w:type="dxa" w:w="100"/>
+              <w:bottom w:type="dxa" w:w="60"/>
+              <w:right w:type="dxa" w:w="100"/>
+            </w:tcMar>
+          </w:tcPr>
+          <w:p>
+            <w:pPr>
+              <w:spacing w:line="276"/>
+              <w:jc w:val="left"/>
+            </w:pPr>
+            <w:r>
+              <w:rPr>
+                <w:rFonts w:ascii="Times New Roman" w:cs="Times New Roman" w:eastAsia="Times New Roman" w:hAnsi="Times New Roman"/>
+                <w:b w:val="false"/>
+                <w:bCs w:val="false"/>
+                <w:sz w:val="24"/>
+                <w:szCs w:val="24"/>
+              </w:rPr>
+              <w:t xml:space="preserve">3.35</w:t>
+            </w:r>
+          </w:p>
+        </w:tc>
+        <w:tc>
+          <w:tcPr>
+            <w:tcW w:type="dxa" w:w="3126"/>
+            <w:tcBorders>
+              <w:top w:val="single" w:color="000000" w:sz="4"/>
+              <w:left w:val="single" w:color="000000" w:sz="4"/>
+              <w:bottom w:val="single" w:color="000000" w:sz="4"/>
+              <w:right w:val="single" w:color="000000" w:sz="4"/>
+            </w:tcBorders>
+            <w:tcMar>
+              <w:top w:type="dxa" w:w="60"/>
+              <w:left w:type="dxa" w:w="100"/>
+              <w:bottom w:type="dxa" w:w="60"/>
+              <w:right w:type="dxa" w:w="100"/>
+            </w:tcMar>
+          </w:tcPr>
+          <w:p>
+            <w:pPr>
+              <w:spacing w:line="276"/>
+              <w:jc w:val="left"/>
+            </w:pPr>
+            <w:r>
+              <w:rPr>
+                <w:rFonts w:ascii="Times New Roman" w:cs="Times New Roman" w:eastAsia="Times New Roman" w:hAnsi="Times New Roman"/>
+                <w:b w:val="false"/>
+                <w:bCs w:val="false"/>
+                <w:sz w:val="24"/>
+                <w:szCs w:val="24"/>
+              </w:rPr>
+              <w:t xml:space="preserve">3.33, 3.24, 7.33, 3.35</w:t>
+            </w:r>
+          </w:p>
+        </w:tc>
+      </w:tr>
+      <w:tr>
+        <w:trPr>
+          <w:cantSplit/>
+          <w:tblHeader w:val="false"/>
+        </w:trPr>
+        <w:tc>
+          <w:tcPr>
+            <w:tcW w:type="dxa" w:w="2800"/>
+            <w:tcBorders>
+              <w:top w:val="single" w:color="000000" w:sz="4"/>
+              <w:left w:val="single" w:color="000000" w:sz="4"/>
+              <w:bottom w:val="single" w:color="000000" w:sz="4"/>
+              <w:right w:val="single" w:color="000000" w:sz="4"/>
+            </w:tcBorders>
+            <w:tcMar>
+              <w:top w:type="dxa" w:w="60"/>
+              <w:left w:type="dxa" w:w="100"/>
+              <w:bottom w:type="dxa" w:w="60"/>
+              <w:right w:type="dxa" w:w="100"/>
+            </w:tcMar>
+          </w:tcPr>
+          <w:p>
+            <w:pPr>
+              <w:spacing w:line="276"/>
+              <w:jc w:val="left"/>
+            </w:pPr>
+            <w:r>
+              <w:rPr>
+                <w:rFonts w:ascii="Times New Roman" w:cs="Times New Roman" w:eastAsia="Times New Roman" w:hAnsi="Times New Roman"/>
+                <w:b w:val="false"/>
+                <w:bCs w:val="false"/>
+                <w:sz w:val="24"/>
+                <w:szCs w:val="24"/>
+              </w:rPr>
+              <w:t xml:space="preserve">No last-action input</w:t>
+            </w:r>
+          </w:p>
+        </w:tc>
+        <w:tc>
+          <w:tcPr>
+            <w:tcW w:type="dxa" w:w="1300"/>
+            <w:tcBorders>
+              <w:top w:val="single" w:color="000000" w:sz="4"/>
+              <w:left w:val="single" w:color="000000" w:sz="4"/>
+              <w:bottom w:val="single" w:color="000000" w:sz="4"/>
+              <w:right w:val="single" w:color="000000" w:sz="4"/>
+            </w:tcBorders>
+            <w:tcMar>
+              <w:top w:type="dxa" w:w="60"/>
+              <w:left w:type="dxa" w:w="100"/>
+              <w:bottom w:type="dxa" w:w="60"/>
+              <w:right w:type="dxa" w:w="100"/>
+            </w:tcMar>
+          </w:tcPr>
+          <w:p>
+            <w:pPr>
+              <w:spacing w:line="276"/>
+              <w:jc w:val="left"/>
+            </w:pPr>
+            <w:r>
+              <w:rPr>
+                <w:rFonts w:ascii="Times New Roman" w:cs="Times New Roman" w:eastAsia="Times New Roman" w:hAnsi="Times New Roman"/>
+                <w:b w:val="false"/>
+                <w:bCs w:val="false"/>
+                <w:sz w:val="24"/>
+                <w:szCs w:val="24"/>
+              </w:rPr>
+              <w:t xml:space="preserve">3.23</w:t>
+            </w:r>
+          </w:p>
+        </w:tc>
+        <w:tc>
+          <w:tcPr>
+            <w:tcW w:type="dxa" w:w="3126"/>
+            <w:tcBorders>
+              <w:top w:val="single" w:color="000000" w:sz="4"/>
+              <w:left w:val="single" w:color="000000" w:sz="4"/>
+              <w:bottom w:val="single" w:color="000000" w:sz="4"/>
+              <w:right w:val="single" w:color="000000" w:sz="4"/>
+            </w:tcBorders>
+            <w:tcMar>
+              <w:top w:type="dxa" w:w="60"/>
+              <w:left w:type="dxa" w:w="100"/>
+              <w:bottom w:type="dxa" w:w="60"/>
+              <w:right w:type="dxa" w:w="100"/>
+            </w:tcMar>
+          </w:tcPr>
+          <w:p>
+            <w:pPr>
+              <w:spacing w:line="276"/>
+              <w:jc w:val="left"/>
+            </w:pPr>
+            <w:r>
+              <w:rPr>
+                <w:rFonts w:ascii="Times New Roman" w:cs="Times New Roman" w:eastAsia="Times New Roman" w:hAnsi="Times New Roman"/>
+                <w:b w:val="false"/>
+                <w:bCs w:val="false"/>
+                <w:sz w:val="24"/>
+                <w:szCs w:val="24"/>
+              </w:rPr>
+              <w:t xml:space="preserve">6.68, 7.45, 7.15, 3.23</w:t>
+            </w:r>
+          </w:p>
+        </w:tc>
+      </w:tr>
+      <w:tr>
+        <w:trPr>
+          <w:cantSplit/>
+          <w:tblHeader w:val="false"/>
+        </w:trPr>
+        <w:tc>
+          <w:tcPr>
+            <w:tcW w:type="dxa" w:w="2800"/>
+            <w:tcBorders>
+              <w:top w:val="single" w:color="000000" w:sz="4"/>
+              <w:left w:val="single" w:color="000000" w:sz="4"/>
+              <w:bottom w:val="single" w:color="000000" w:sz="4"/>
+              <w:right w:val="single" w:color="000000" w:sz="4"/>
+            </w:tcBorders>
+            <w:tcMar>
+              <w:top w:type="dxa" w:w="60"/>
+              <w:left w:type="dxa" w:w="100"/>
+              <w:bottom w:type="dxa" w:w="60"/>
+              <w:right w:type="dxa" w:w="100"/>
+            </w:tcMar>
+          </w:tcPr>
+          <w:p>
+            <w:pPr>
+              <w:spacing w:line="276"/>
+              <w:jc w:val="left"/>
+            </w:pPr>
+            <w:r>
+              <w:rPr>
+                <w:rFonts w:ascii="Times New Roman" w:cs="Times New Roman" w:eastAsia="Times New Roman" w:hAnsi="Times New Roman"/>
+                <w:b w:val="false"/>
+                <w:bCs w:val="false"/>
+                <w:sz w:val="24"/>
+                <w:szCs w:val="24"/>
+              </w:rPr>
+              <w:t xml:space="preserve">No throughput input</w:t>
+            </w:r>
+          </w:p>
+        </w:tc>
+        <w:tc>
+          <w:tcPr>
+            <w:tcW w:type="dxa" w:w="1300"/>
+            <w:tcBorders>
+              <w:top w:val="single" w:color="000000" w:sz="4"/>
+              <w:left w:val="single" w:color="000000" w:sz="4"/>
+              <w:bottom w:val="single" w:color="000000" w:sz="4"/>
+              <w:right w:val="single" w:color="000000" w:sz="4"/>
+            </w:tcBorders>
+            <w:tcMar>
+              <w:top w:type="dxa" w:w="60"/>
+              <w:left w:type="dxa" w:w="100"/>
+              <w:bottom w:type="dxa" w:w="60"/>
+              <w:right w:type="dxa" w:w="100"/>
+            </w:tcMar>
+          </w:tcPr>
+          <w:p>
+            <w:pPr>
+              <w:spacing w:line="276"/>
+              <w:jc w:val="left"/>
+            </w:pPr>
+            <w:r>
+              <w:rPr>
+                <w:rFonts w:ascii="Times New Roman" w:cs="Times New Roman" w:eastAsia="Times New Roman" w:hAnsi="Times New Roman"/>
+                <w:b w:val="false"/>
+                <w:bCs w:val="false"/>
+                <w:sz w:val="24"/>
+                <w:szCs w:val="24"/>
+              </w:rPr>
+              <w:t xml:space="preserve">3.41</w:t>
+            </w:r>
+          </w:p>
+        </w:tc>
+        <w:tc>
+          <w:tcPr>
+            <w:tcW w:type="dxa" w:w="3126"/>
+            <w:tcBorders>
+              <w:top w:val="single" w:color="000000" w:sz="4"/>
+              <w:left w:val="single" w:color="000000" w:sz="4"/>
+              <w:bottom w:val="single" w:color="000000" w:sz="4"/>
+              <w:right w:val="single" w:color="000000" w:sz="4"/>
+            </w:tcBorders>
+            <w:tcMar>
+              <w:top w:type="dxa" w:w="60"/>
+              <w:left w:type="dxa" w:w="100"/>
+              <w:bottom w:type="dxa" w:w="60"/>
+              <w:right w:type="dxa" w:w="100"/>
+            </w:tcMar>
+          </w:tcPr>
+          <w:p>
+            <w:pPr>
+              <w:spacing w:line="276"/>
+              <w:jc w:val="left"/>
+            </w:pPr>
+            <w:r>
+              <w:rPr>
+                <w:rFonts w:ascii="Times New Roman" w:cs="Times New Roman" w:eastAsia="Times New Roman" w:hAnsi="Times New Roman"/>
+                <w:b w:val="false"/>
+                <w:bCs w:val="false"/>
+                <w:sz w:val="24"/>
+                <w:szCs w:val="24"/>
+              </w:rPr>
+              <w:t xml:space="preserve">3.31, 3.41, 3.36, 3.24</w:t>
+            </w:r>
+          </w:p>
+        </w:tc>
+      </w:tr>
+    </w:tbl>
+    <w:p>
+      <w:pPr>
+        <w:spacing w:after="160"/>
+      </w:pPr>
+    </w:p>
+    <w:p>
+      <w:pPr>
+        <w:spacing w:after="120" w:line="360"/>
+        <w:jc w:val="both"/>
+      </w:pPr>
+      <w:r>
+        <w:rPr>
+          <w:rFonts w:ascii="Times New Roman" w:cs="Times New Roman" w:eastAsia="Times New Roman" w:hAnsi="Times New Roman"/>
+          <w:b/>
+          <w:bCs/>
+          <w:sz w:val="24"/>
+          <w:szCs w:val="24"/>
+        </w:rPr>
+        <w:t xml:space="preserve">Chat gateway upgrades.</w:t>
+      </w:r>
+      <w:r>
+        <w:rPr>
+          <w:rFonts w:ascii="Times New Roman" w:cs="Times New Roman" w:eastAsia="Times New Roman" w:hAnsi="Times New Roman"/>
+          <w:sz w:val="24"/>
+          <w:szCs w:val="24"/>
+        </w:rPr>
+        <w:t xml:space="preserve"> The web chat gateway gained a live dashboard (window, packets in flight, RTT and loss over the last 60 seconds, drawn from the gateway's own samples), an optional RFC 6298 adaptive retransmission timer with exponential backoff (--rto adaptive), and a fix for a retransmission storm. The storm was found while testing the dashboard: with delayed links, duplicate ACKs from an earlier fast retransmit kept arriving after the window had been resent, and each batch of three triggered another full resend, giving about 200,000 retransmissions in one 400-message run at 10% loss. The gateway and the terminal chat now allow a new fast retransmit only after the data outstanding at the last one has been acknowledged, as the C smart client already did. With the fix, a 200-message run sent 385 to 1,352 packets depending on the controller. On a 600 ms round-trip path with 5% loss, the adaptive timer finished 100 messages in 17.8 s with 54 retransmissions, against 29.0 s and 201 retransmissions for the fixed 300 ms timer, which is shorter than the round trip and times out spuriously (one run each, so illustrative only).</w:t>
+      </w:r>
+    </w:p>
+    <w:p>
+      <w:pPr>
         <w:pStyle w:val="Heading1"/>
         <w:keepNext/>
         <w:spacing w:after="120" w:before="240" w:line="360"/>
@@ -19866,7 +21627,7 @@
           <w:sz w:val="24"/>
           <w:szCs w:val="24"/>
         </w:rPr>
-        <w:t xml:space="preserve">Selective Repeat or selective acknowledgments in the C transport, so only lost packets are resent; the simulation in Section 11 shows the largest gain of any change tried.</w:t>
+        <w:t xml:space="preserve">Making selective acknowledgment the default and testing it on a real path where throughput, not the bottleneck rate, limits the transfer (the option exists in Section 8.5).</w:t>
       </w:r>
     </w:p>
     <w:p>
@@ -19885,7 +21646,26 @@
           <w:sz w:val="24"/>
           <w:szCs w:val="24"/>
         </w:rPr>
-        <w:t xml:space="preserve">An adaptive retransmission timer based on measured round-trip time, with exponential backoff.</w:t>
+        <w:t xml:space="preserve">Multi-flow fairness in the C transport and a less aggressive agent for long paths (Section 8.6 shows 74% share against AIMD on the 120 ms path).</w:t>
+      </w:r>
+    </w:p>
+    <w:p>
+      <w:pPr>
+        <w:pStyle w:val="ListParagraph"/>
+        <w:numPr>
+          <w:ilvl w:val="0"/>
+          <w:numId w:val="2"/>
+        </w:numPr>
+        <w:spacing w:after="60" w:line="360"/>
+        <w:jc w:val="both"/>
+      </w:pPr>
+      <w:r>
+        <w:rPr>
+          <w:rFonts w:ascii="Times New Roman" w:cs="Times New Roman" w:eastAsia="Times New Roman" w:hAnsi="Times New Roman"/>
+          <w:sz w:val="24"/>
+          <w:szCs w:val="24"/>
+        </w:rPr>
+        <w:t xml:space="preserve">An adaptive retransmission timer in the C transport (it exists in the web chat gateway, Section 8.6).</w:t>
       </w:r>
     </w:p>
     <w:p>

</xml_diff>

<commit_message>
Validity check: equal window caps in C, realistic-recovery simulator, retrained agent; docs updated
Co-Authored-By: Claude Sonnet 5.5 <noreply@anthropic.com>
Claude-Session: https://claude.ai/code/session_01NX2zRNpdVAnzFNKmqomzKu
</commit_message>
<xml_diff>
--- a/docs/RUDP_Final_Project_Report.docx
+++ b/docs/RUDP_Final_Project_Report.docx
@@ -11853,7 +11853,7 @@
           <w:sz w:val="24"/>
           <w:szCs w:val="24"/>
         </w:rPr>
-        <w:t xml:space="preserve">The neural agent finished faster than AIMD on all three paths, by 0.20 s (15%) on the 5G-like path, 2.49 s (27%) on the lossy path and 4.30 s (24%) on the satellite-like path. This is the first controller in this project that beats AIMD in the C experiments. The retrained table did not carry over: it was faster on the lossy path but 91% slower on the 5G-like path and more than twice as slow on the satellite-like path, where its window stayed small. The neural network, trained on the same paths with the same reward, generalised to these unseen paths and the table did not, which is the argument for a function approximator over a table. The caveats are the same as before: the agents were chosen on simulated validation paths, the paths here are emulated inside the client, AIMD keeps its original cap of 128 while the agents are capped at 32, and the neural agent retransmitted more packets than AIMD on the lossy path (about 600 against 250), so it wins by sending more aggressively into a path whose loss is random.</w:t>
+        <w:t xml:space="preserve">The neural agent finished faster than AIMD on all three paths, by 0.20 s (15%) on the 5G-like path, 2.49 s (27%) on the lossy path and 4.30 s (24%) on the satellite-like path. This is the first controller in this project that beats AIMD in the C experiments. The retrained table did not carry over: it was faster on the lossy path but 91% slower on the 5G-like path and more than twice as slow on the satellite-like path, where its window stayed small. The neural network, trained on the same paths with the same reward, generalised to these unseen paths and the table did not, which is the argument for a function approximator over a table. The caveats are the same as before: the agents were chosen on simulated validation paths, the paths here are emulated inside the client, AIMD keeps its original cap of 128 while the agents are capped at 32 (Section 8.7 repeats the comparison with equal caps and the conclusion holds), and the neural agent retransmitted more packets than AIMD on the lossy path (about 600 against 250), so it wins by sending more aggressively into a path whose loss is random.</w:t>
       </w:r>
     </w:p>
     <w:p>
@@ -14698,6 +14698,958 @@
           <w:szCs w:val="24"/>
         </w:rPr>
         <w:t xml:space="preserve"> The web chat gateway gained a live dashboard (window, packets in flight, RTT and loss over the last 60 seconds, drawn from the gateway's own samples), an optional RFC 6298 adaptive retransmission timer with exponential backoff (--rto adaptive), and a fix for a retransmission storm. The storm was found while testing the dashboard: with delayed links, duplicate ACKs from an earlier fast retransmit kept arriving after the window had been resent, and each batch of three triggered another full resend, giving about 200,000 retransmissions in one 400-message run at 10% loss. The gateway and the terminal chat now allow a new fast retransmit only after the data outstanding at the last one has been acknowledged, as the C smart client already did. With the fix, a 200-message run sent 385 to 1,352 packets depending on the controller. On a 600 ms round-trip path with 5% loss, the adaptive timer finished 100 messages in 17.8 s with 54 retransmissions, against 29.0 s and 201 retransmissions for the fixed 300 ms timer, which is shorter than the round trip and times out spuriously (one run each, so illustrative only).</w:t>
+      </w:r>
+    </w:p>
+    <w:p>
+      <w:pPr>
+        <w:pStyle w:val="Heading2"/>
+        <w:keepNext/>
+        <w:spacing w:after="120" w:before="120" w:line="360"/>
+      </w:pPr>
+      <w:r>
+        <w:rPr>
+          <w:rFonts w:ascii="Times New Roman" w:cs="Times New Roman" w:eastAsia="Times New Roman" w:hAnsi="Times New Roman"/>
+          <w:b/>
+          <w:bCs/>
+          <w:sz w:val="24"/>
+          <w:szCs w:val="24"/>
+        </w:rPr>
+        <w:t xml:space="preserve">8.7 Validity check: equal window caps and a more realistic simulator</w:t>
+      </w:r>
+    </w:p>
+    <w:p>
+      <w:pPr>
+        <w:spacing w:after="120" w:line="360"/>
+        <w:jc w:val="both"/>
+      </w:pPr>
+      <w:r>
+        <w:rPr>
+          <w:rFonts w:ascii="Times New Roman" w:cs="Times New Roman" w:eastAsia="Times New Roman" w:hAnsi="Times New Roman"/>
+          <w:sz w:val="24"/>
+          <w:szCs w:val="24"/>
+        </w:rPr>
+        <w:t xml:space="preserve">Two weaknesses in the comparison were found and tested. </w:t>
+      </w:r>
+      <w:r>
+        <w:rPr>
+          <w:rFonts w:ascii="Times New Roman" w:cs="Times New Roman" w:eastAsia="Times New Roman" w:hAnsi="Times New Roman"/>
+          <w:b/>
+          <w:bCs/>
+          <w:sz w:val="24"/>
+          <w:szCs w:val="24"/>
+        </w:rPr>
+        <w:t xml:space="preserve">First, the window cap.</w:t>
+      </w:r>
+      <w:r>
+        <w:rPr>
+          <w:rFonts w:ascii="Times New Roman" w:cs="Times New Roman" w:eastAsia="Times New Roman" w:hAnsi="Times New Roman"/>
+          <w:sz w:val="24"/>
+          <w:szCs w:val="24"/>
+        </w:rPr>
+        <w:t xml:space="preserve"> AIMD in the C transport was capped at 128 packets and the agents at 32. Table 8g repeats the C experiment with AIMD capped at 32 as well (10 runs per cell, 95% intervals, paired by seed). The original neural agent still beats AIMD at the equal cap on all three paths: by 0.28 s (19%) on the 5G-like path, 2.61 s (29%) on the lossy path and 5.37 s (28%) on the satellite-like path, all significant. Against the old cap of 128 the 5G-like difference is not significant, and the other two are. The cap therefore does not explain the result.</w:t>
+      </w:r>
+    </w:p>
+    <w:p>
+      <w:pPr>
+        <w:keepNext/>
+        <w:spacing w:after="80" w:before="120"/>
+        <w:jc w:val="center"/>
+      </w:pPr>
+      <w:r>
+        <w:rPr>
+          <w:rFonts w:ascii="Times New Roman" w:cs="Times New Roman" w:eastAsia="Times New Roman" w:hAnsi="Times New Roman"/>
+          <w:b/>
+          <w:bCs/>
+          <w:sz w:val="24"/>
+          <w:szCs w:val="24"/>
+        </w:rPr>
+        <w:t xml:space="preserve">Table 8g: Mean completion time (s) of 1,200 packets in the C transport with equal window caps (seeds 5001 to 5010; the retrained agent is the one described below)</w:t>
+      </w:r>
+    </w:p>
+    <w:tbl>
+      <w:tblPr>
+        <w:tblW w:type="dxa" w:w="9026"/>
+        <w:tblBorders>
+          <w:top w:val="single" w:color="auto" w:sz="4"/>
+          <w:left w:val="single" w:color="auto" w:sz="4"/>
+          <w:bottom w:val="single" w:color="auto" w:sz="4"/>
+          <w:right w:val="single" w:color="auto" w:sz="4"/>
+          <w:insideH w:val="single" w:color="auto" w:sz="4"/>
+          <w:insideV w:val="single" w:color="auto" w:sz="4"/>
+        </w:tblBorders>
+      </w:tblPr>
+      <w:tblGrid>
+        <w:gridCol w:w="2100"/>
+        <w:gridCol w:w="1500"/>
+        <w:gridCol w:w="1500"/>
+        <w:gridCol w:w="1500"/>
+        <w:gridCol w:w="1500"/>
+        <w:gridCol w:w="926"/>
+      </w:tblGrid>
+      <w:tr>
+        <w:trPr>
+          <w:cantSplit/>
+          <w:tblHeader/>
+        </w:trPr>
+        <w:tc>
+          <w:tcPr>
+            <w:tcW w:type="dxa" w:w="2100"/>
+            <w:tcBorders>
+              <w:top w:val="single" w:color="000000" w:sz="4"/>
+              <w:left w:val="single" w:color="000000" w:sz="4"/>
+              <w:bottom w:val="single" w:color="000000" w:sz="4"/>
+              <w:right w:val="single" w:color="000000" w:sz="4"/>
+            </w:tcBorders>
+            <w:shd w:fill="D9D9D9" w:color="auto" w:val="clear"/>
+            <w:tcMar>
+              <w:top w:type="dxa" w:w="60"/>
+              <w:left w:type="dxa" w:w="100"/>
+              <w:bottom w:type="dxa" w:w="60"/>
+              <w:right w:type="dxa" w:w="100"/>
+            </w:tcMar>
+          </w:tcPr>
+          <w:p>
+            <w:pPr>
+              <w:spacing w:line="276"/>
+              <w:jc w:val="left"/>
+            </w:pPr>
+            <w:r>
+              <w:rPr>
+                <w:rFonts w:ascii="Times New Roman" w:cs="Times New Roman" w:eastAsia="Times New Roman" w:hAnsi="Times New Roman"/>
+                <w:b/>
+                <w:bCs/>
+                <w:sz w:val="24"/>
+                <w:szCs w:val="24"/>
+              </w:rPr>
+              <w:t xml:space="preserve">Scenario</w:t>
+            </w:r>
+          </w:p>
+        </w:tc>
+        <w:tc>
+          <w:tcPr>
+            <w:tcW w:type="dxa" w:w="1500"/>
+            <w:tcBorders>
+              <w:top w:val="single" w:color="000000" w:sz="4"/>
+              <w:left w:val="single" w:color="000000" w:sz="4"/>
+              <w:bottom w:val="single" w:color="000000" w:sz="4"/>
+              <w:right w:val="single" w:color="000000" w:sz="4"/>
+            </w:tcBorders>
+            <w:shd w:fill="D9D9D9" w:color="auto" w:val="clear"/>
+            <w:tcMar>
+              <w:top w:type="dxa" w:w="60"/>
+              <w:left w:type="dxa" w:w="100"/>
+              <w:bottom w:type="dxa" w:w="60"/>
+              <w:right w:type="dxa" w:w="100"/>
+            </w:tcMar>
+          </w:tcPr>
+          <w:p>
+            <w:pPr>
+              <w:spacing w:line="276"/>
+              <w:jc w:val="left"/>
+            </w:pPr>
+            <w:r>
+              <w:rPr>
+                <w:rFonts w:ascii="Times New Roman" w:cs="Times New Roman" w:eastAsia="Times New Roman" w:hAnsi="Times New Roman"/>
+                <w:b/>
+                <w:bCs/>
+                <w:sz w:val="24"/>
+                <w:szCs w:val="24"/>
+              </w:rPr>
+              <w:t xml:space="preserve">AIMD cap 128</w:t>
+            </w:r>
+          </w:p>
+        </w:tc>
+        <w:tc>
+          <w:tcPr>
+            <w:tcW w:type="dxa" w:w="1500"/>
+            <w:tcBorders>
+              <w:top w:val="single" w:color="000000" w:sz="4"/>
+              <w:left w:val="single" w:color="000000" w:sz="4"/>
+              <w:bottom w:val="single" w:color="000000" w:sz="4"/>
+              <w:right w:val="single" w:color="000000" w:sz="4"/>
+            </w:tcBorders>
+            <w:shd w:fill="D9D9D9" w:color="auto" w:val="clear"/>
+            <w:tcMar>
+              <w:top w:type="dxa" w:w="60"/>
+              <w:left w:type="dxa" w:w="100"/>
+              <w:bottom w:type="dxa" w:w="60"/>
+              <w:right w:type="dxa" w:w="100"/>
+            </w:tcMar>
+          </w:tcPr>
+          <w:p>
+            <w:pPr>
+              <w:spacing w:line="276"/>
+              <w:jc w:val="left"/>
+            </w:pPr>
+            <w:r>
+              <w:rPr>
+                <w:rFonts w:ascii="Times New Roman" w:cs="Times New Roman" w:eastAsia="Times New Roman" w:hAnsi="Times New Roman"/>
+                <w:b/>
+                <w:bCs/>
+                <w:sz w:val="24"/>
+                <w:szCs w:val="24"/>
+              </w:rPr>
+              <w:t xml:space="preserve">AIMD cap 32</w:t>
+            </w:r>
+          </w:p>
+        </w:tc>
+        <w:tc>
+          <w:tcPr>
+            <w:tcW w:type="dxa" w:w="1500"/>
+            <w:tcBorders>
+              <w:top w:val="single" w:color="000000" w:sz="4"/>
+              <w:left w:val="single" w:color="000000" w:sz="4"/>
+              <w:bottom w:val="single" w:color="000000" w:sz="4"/>
+              <w:right w:val="single" w:color="000000" w:sz="4"/>
+            </w:tcBorders>
+            <w:shd w:fill="D9D9D9" w:color="auto" w:val="clear"/>
+            <w:tcMar>
+              <w:top w:type="dxa" w:w="60"/>
+              <w:left w:type="dxa" w:w="100"/>
+              <w:bottom w:type="dxa" w:w="60"/>
+              <w:right w:type="dxa" w:w="100"/>
+            </w:tcMar>
+          </w:tcPr>
+          <w:p>
+            <w:pPr>
+              <w:spacing w:line="276"/>
+              <w:jc w:val="left"/>
+            </w:pPr>
+            <w:r>
+              <w:rPr>
+                <w:rFonts w:ascii="Times New Roman" w:cs="Times New Roman" w:eastAsia="Times New Roman" w:hAnsi="Times New Roman"/>
+                <w:b/>
+                <w:bCs/>
+                <w:sz w:val="24"/>
+                <w:szCs w:val="24"/>
+              </w:rPr>
+              <w:t xml:space="preserve">Neural (original)</w:t>
+            </w:r>
+          </w:p>
+        </w:tc>
+        <w:tc>
+          <w:tcPr>
+            <w:tcW w:type="dxa" w:w="1500"/>
+            <w:tcBorders>
+              <w:top w:val="single" w:color="000000" w:sz="4"/>
+              <w:left w:val="single" w:color="000000" w:sz="4"/>
+              <w:bottom w:val="single" w:color="000000" w:sz="4"/>
+              <w:right w:val="single" w:color="000000" w:sz="4"/>
+            </w:tcBorders>
+            <w:shd w:fill="D9D9D9" w:color="auto" w:val="clear"/>
+            <w:tcMar>
+              <w:top w:type="dxa" w:w="60"/>
+              <w:left w:type="dxa" w:w="100"/>
+              <w:bottom w:type="dxa" w:w="60"/>
+              <w:right w:type="dxa" w:w="100"/>
+            </w:tcMar>
+          </w:tcPr>
+          <w:p>
+            <w:pPr>
+              <w:spacing w:line="276"/>
+              <w:jc w:val="left"/>
+            </w:pPr>
+            <w:r>
+              <w:rPr>
+                <w:rFonts w:ascii="Times New Roman" w:cs="Times New Roman" w:eastAsia="Times New Roman" w:hAnsi="Times New Roman"/>
+                <w:b/>
+                <w:bCs/>
+                <w:sz w:val="24"/>
+                <w:szCs w:val="24"/>
+              </w:rPr>
+              <w:t xml:space="preserve">Neural (retrained)</w:t>
+            </w:r>
+          </w:p>
+        </w:tc>
+        <w:tc>
+          <w:tcPr>
+            <w:tcW w:type="dxa" w:w="926"/>
+            <w:tcBorders>
+              <w:top w:val="single" w:color="000000" w:sz="4"/>
+              <w:left w:val="single" w:color="000000" w:sz="4"/>
+              <w:bottom w:val="single" w:color="000000" w:sz="4"/>
+              <w:right w:val="single" w:color="000000" w:sz="4"/>
+            </w:tcBorders>
+            <w:shd w:fill="D9D9D9" w:color="auto" w:val="clear"/>
+            <w:tcMar>
+              <w:top w:type="dxa" w:w="60"/>
+              <w:left w:type="dxa" w:w="100"/>
+              <w:bottom w:type="dxa" w:w="60"/>
+              <w:right w:type="dxa" w:w="100"/>
+            </w:tcMar>
+          </w:tcPr>
+          <w:p>
+            <w:pPr>
+              <w:spacing w:line="276"/>
+              <w:jc w:val="left"/>
+            </w:pPr>
+            <w:r>
+              <w:rPr>
+                <w:rFonts w:ascii="Times New Roman" w:cs="Times New Roman" w:eastAsia="Times New Roman" w:hAnsi="Times New Roman"/>
+                <w:b/>
+                <w:bCs/>
+                <w:sz w:val="24"/>
+                <w:szCs w:val="24"/>
+              </w:rPr>
+              <w:t xml:space="preserve">Runs</w:t>
+            </w:r>
+          </w:p>
+        </w:tc>
+      </w:tr>
+      <w:tr>
+        <w:trPr>
+          <w:cantSplit/>
+          <w:tblHeader w:val="false"/>
+        </w:trPr>
+        <w:tc>
+          <w:tcPr>
+            <w:tcW w:type="dxa" w:w="2100"/>
+            <w:tcBorders>
+              <w:top w:val="single" w:color="000000" w:sz="4"/>
+              <w:left w:val="single" w:color="000000" w:sz="4"/>
+              <w:bottom w:val="single" w:color="000000" w:sz="4"/>
+              <w:right w:val="single" w:color="000000" w:sz="4"/>
+            </w:tcBorders>
+            <w:tcMar>
+              <w:top w:type="dxa" w:w="60"/>
+              <w:left w:type="dxa" w:w="100"/>
+              <w:bottom w:type="dxa" w:w="60"/>
+              <w:right w:type="dxa" w:w="100"/>
+            </w:tcMar>
+          </w:tcPr>
+          <w:p>
+            <w:pPr>
+              <w:spacing w:line="276"/>
+              <w:jc w:val="left"/>
+            </w:pPr>
+            <w:r>
+              <w:rPr>
+                <w:rFonts w:ascii="Times New Roman" w:cs="Times New Roman" w:eastAsia="Times New Roman" w:hAnsi="Times New Roman"/>
+                <w:b w:val="false"/>
+                <w:bCs w:val="false"/>
+                <w:sz w:val="24"/>
+                <w:szCs w:val="24"/>
+              </w:rPr>
+              <w:t xml:space="preserve">5G-like</w:t>
+            </w:r>
+          </w:p>
+        </w:tc>
+        <w:tc>
+          <w:tcPr>
+            <w:tcW w:type="dxa" w:w="1500"/>
+            <w:tcBorders>
+              <w:top w:val="single" w:color="000000" w:sz="4"/>
+              <w:left w:val="single" w:color="000000" w:sz="4"/>
+              <w:bottom w:val="single" w:color="000000" w:sz="4"/>
+              <w:right w:val="single" w:color="000000" w:sz="4"/>
+            </w:tcBorders>
+            <w:tcMar>
+              <w:top w:type="dxa" w:w="60"/>
+              <w:left w:type="dxa" w:w="100"/>
+              <w:bottom w:type="dxa" w:w="60"/>
+              <w:right w:type="dxa" w:w="100"/>
+            </w:tcMar>
+          </w:tcPr>
+          <w:p>
+            <w:pPr>
+              <w:spacing w:line="276"/>
+              <w:jc w:val="left"/>
+            </w:pPr>
+            <w:r>
+              <w:rPr>
+                <w:rFonts w:ascii="Times New Roman" w:cs="Times New Roman" w:eastAsia="Times New Roman" w:hAnsi="Times New Roman"/>
+                <w:b w:val="false"/>
+                <w:bCs w:val="false"/>
+                <w:sz w:val="24"/>
+                <w:szCs w:val="24"/>
+              </w:rPr>
+              <w:t xml:space="preserve">1.31 +/- 0.19</w:t>
+            </w:r>
+          </w:p>
+        </w:tc>
+        <w:tc>
+          <w:tcPr>
+            <w:tcW w:type="dxa" w:w="1500"/>
+            <w:tcBorders>
+              <w:top w:val="single" w:color="000000" w:sz="4"/>
+              <w:left w:val="single" w:color="000000" w:sz="4"/>
+              <w:bottom w:val="single" w:color="000000" w:sz="4"/>
+              <w:right w:val="single" w:color="000000" w:sz="4"/>
+            </w:tcBorders>
+            <w:tcMar>
+              <w:top w:type="dxa" w:w="60"/>
+              <w:left w:type="dxa" w:w="100"/>
+              <w:bottom w:type="dxa" w:w="60"/>
+              <w:right w:type="dxa" w:w="100"/>
+            </w:tcMar>
+          </w:tcPr>
+          <w:p>
+            <w:pPr>
+              <w:spacing w:line="276"/>
+              <w:jc w:val="left"/>
+            </w:pPr>
+            <w:r>
+              <w:rPr>
+                <w:rFonts w:ascii="Times New Roman" w:cs="Times New Roman" w:eastAsia="Times New Roman" w:hAnsi="Times New Roman"/>
+                <w:b w:val="false"/>
+                <w:bCs w:val="false"/>
+                <w:sz w:val="24"/>
+                <w:szCs w:val="24"/>
+              </w:rPr>
+              <w:t xml:space="preserve">1.48 +/- 0.17</w:t>
+            </w:r>
+          </w:p>
+        </w:tc>
+        <w:tc>
+          <w:tcPr>
+            <w:tcW w:type="dxa" w:w="1500"/>
+            <w:tcBorders>
+              <w:top w:val="single" w:color="000000" w:sz="4"/>
+              <w:left w:val="single" w:color="000000" w:sz="4"/>
+              <w:bottom w:val="single" w:color="000000" w:sz="4"/>
+              <w:right w:val="single" w:color="000000" w:sz="4"/>
+            </w:tcBorders>
+            <w:tcMar>
+              <w:top w:type="dxa" w:w="60"/>
+              <w:left w:type="dxa" w:w="100"/>
+              <w:bottom w:type="dxa" w:w="60"/>
+              <w:right w:type="dxa" w:w="100"/>
+            </w:tcMar>
+          </w:tcPr>
+          <w:p>
+            <w:pPr>
+              <w:spacing w:line="276"/>
+              <w:jc w:val="left"/>
+            </w:pPr>
+            <w:r>
+              <w:rPr>
+                <w:rFonts w:ascii="Times New Roman" w:cs="Times New Roman" w:eastAsia="Times New Roman" w:hAnsi="Times New Roman"/>
+                <w:b w:val="false"/>
+                <w:bCs w:val="false"/>
+                <w:sz w:val="24"/>
+                <w:szCs w:val="24"/>
+              </w:rPr>
+              <w:t xml:space="preserve">1.20 +/- 0.04</w:t>
+            </w:r>
+          </w:p>
+        </w:tc>
+        <w:tc>
+          <w:tcPr>
+            <w:tcW w:type="dxa" w:w="1500"/>
+            <w:tcBorders>
+              <w:top w:val="single" w:color="000000" w:sz="4"/>
+              <w:left w:val="single" w:color="000000" w:sz="4"/>
+              <w:bottom w:val="single" w:color="000000" w:sz="4"/>
+              <w:right w:val="single" w:color="000000" w:sz="4"/>
+            </w:tcBorders>
+            <w:tcMar>
+              <w:top w:type="dxa" w:w="60"/>
+              <w:left w:type="dxa" w:w="100"/>
+              <w:bottom w:type="dxa" w:w="60"/>
+              <w:right w:type="dxa" w:w="100"/>
+            </w:tcMar>
+          </w:tcPr>
+          <w:p>
+            <w:pPr>
+              <w:spacing w:line="276"/>
+              <w:jc w:val="left"/>
+            </w:pPr>
+            <w:r>
+              <w:rPr>
+                <w:rFonts w:ascii="Times New Roman" w:cs="Times New Roman" w:eastAsia="Times New Roman" w:hAnsi="Times New Roman"/>
+                <w:b w:val="false"/>
+                <w:bCs w:val="false"/>
+                <w:sz w:val="24"/>
+                <w:szCs w:val="24"/>
+              </w:rPr>
+              <w:t xml:space="preserve">2.88 +/- 0.03</w:t>
+            </w:r>
+          </w:p>
+        </w:tc>
+        <w:tc>
+          <w:tcPr>
+            <w:tcW w:type="dxa" w:w="926"/>
+            <w:tcBorders>
+              <w:top w:val="single" w:color="000000" w:sz="4"/>
+              <w:left w:val="single" w:color="000000" w:sz="4"/>
+              <w:bottom w:val="single" w:color="000000" w:sz="4"/>
+              <w:right w:val="single" w:color="000000" w:sz="4"/>
+            </w:tcBorders>
+            <w:tcMar>
+              <w:top w:type="dxa" w:w="60"/>
+              <w:left w:type="dxa" w:w="100"/>
+              <w:bottom w:type="dxa" w:w="60"/>
+              <w:right w:type="dxa" w:w="100"/>
+            </w:tcMar>
+          </w:tcPr>
+          <w:p>
+            <w:pPr>
+              <w:spacing w:line="276"/>
+              <w:jc w:val="left"/>
+            </w:pPr>
+            <w:r>
+              <w:rPr>
+                <w:rFonts w:ascii="Times New Roman" w:cs="Times New Roman" w:eastAsia="Times New Roman" w:hAnsi="Times New Roman"/>
+                <w:b w:val="false"/>
+                <w:bCs w:val="false"/>
+                <w:sz w:val="24"/>
+                <w:szCs w:val="24"/>
+              </w:rPr>
+              <w:t xml:space="preserve">10</w:t>
+            </w:r>
+          </w:p>
+        </w:tc>
+      </w:tr>
+      <w:tr>
+        <w:trPr>
+          <w:cantSplit/>
+          <w:tblHeader w:val="false"/>
+        </w:trPr>
+        <w:tc>
+          <w:tcPr>
+            <w:tcW w:type="dxa" w:w="2100"/>
+            <w:tcBorders>
+              <w:top w:val="single" w:color="000000" w:sz="4"/>
+              <w:left w:val="single" w:color="000000" w:sz="4"/>
+              <w:bottom w:val="single" w:color="000000" w:sz="4"/>
+              <w:right w:val="single" w:color="000000" w:sz="4"/>
+            </w:tcBorders>
+            <w:tcMar>
+              <w:top w:type="dxa" w:w="60"/>
+              <w:left w:type="dxa" w:w="100"/>
+              <w:bottom w:type="dxa" w:w="60"/>
+              <w:right w:type="dxa" w:w="100"/>
+            </w:tcMar>
+          </w:tcPr>
+          <w:p>
+            <w:pPr>
+              <w:spacing w:line="276"/>
+              <w:jc w:val="left"/>
+            </w:pPr>
+            <w:r>
+              <w:rPr>
+                <w:rFonts w:ascii="Times New Roman" w:cs="Times New Roman" w:eastAsia="Times New Roman" w:hAnsi="Times New Roman"/>
+                <w:b w:val="false"/>
+                <w:bCs w:val="false"/>
+                <w:sz w:val="24"/>
+                <w:szCs w:val="24"/>
+              </w:rPr>
+              <w:t xml:space="preserve">Lossy wireless</w:t>
+            </w:r>
+          </w:p>
+        </w:tc>
+        <w:tc>
+          <w:tcPr>
+            <w:tcW w:type="dxa" w:w="1500"/>
+            <w:tcBorders>
+              <w:top w:val="single" w:color="000000" w:sz="4"/>
+              <w:left w:val="single" w:color="000000" w:sz="4"/>
+              <w:bottom w:val="single" w:color="000000" w:sz="4"/>
+              <w:right w:val="single" w:color="000000" w:sz="4"/>
+            </w:tcBorders>
+            <w:tcMar>
+              <w:top w:type="dxa" w:w="60"/>
+              <w:left w:type="dxa" w:w="100"/>
+              <w:bottom w:type="dxa" w:w="60"/>
+              <w:right w:type="dxa" w:w="100"/>
+            </w:tcMar>
+          </w:tcPr>
+          <w:p>
+            <w:pPr>
+              <w:spacing w:line="276"/>
+              <w:jc w:val="left"/>
+            </w:pPr>
+            <w:r>
+              <w:rPr>
+                <w:rFonts w:ascii="Times New Roman" w:cs="Times New Roman" w:eastAsia="Times New Roman" w:hAnsi="Times New Roman"/>
+                <w:b w:val="false"/>
+                <w:bCs w:val="false"/>
+                <w:sz w:val="24"/>
+                <w:szCs w:val="24"/>
+              </w:rPr>
+              <w:t xml:space="preserve">8.89 +/- 0.58</w:t>
+            </w:r>
+          </w:p>
+        </w:tc>
+        <w:tc>
+          <w:tcPr>
+            <w:tcW w:type="dxa" w:w="1500"/>
+            <w:tcBorders>
+              <w:top w:val="single" w:color="000000" w:sz="4"/>
+              <w:left w:val="single" w:color="000000" w:sz="4"/>
+              <w:bottom w:val="single" w:color="000000" w:sz="4"/>
+              <w:right w:val="single" w:color="000000" w:sz="4"/>
+            </w:tcBorders>
+            <w:tcMar>
+              <w:top w:type="dxa" w:w="60"/>
+              <w:left w:type="dxa" w:w="100"/>
+              <w:bottom w:type="dxa" w:w="60"/>
+              <w:right w:type="dxa" w:w="100"/>
+            </w:tcMar>
+          </w:tcPr>
+          <w:p>
+            <w:pPr>
+              <w:spacing w:line="276"/>
+              <w:jc w:val="left"/>
+            </w:pPr>
+            <w:r>
+              <w:rPr>
+                <w:rFonts w:ascii="Times New Roman" w:cs="Times New Roman" w:eastAsia="Times New Roman" w:hAnsi="Times New Roman"/>
+                <w:b w:val="false"/>
+                <w:bCs w:val="false"/>
+                <w:sz w:val="24"/>
+                <w:szCs w:val="24"/>
+              </w:rPr>
+              <w:t xml:space="preserve">9.12 +/- 1.18</w:t>
+            </w:r>
+          </w:p>
+        </w:tc>
+        <w:tc>
+          <w:tcPr>
+            <w:tcW w:type="dxa" w:w="1500"/>
+            <w:tcBorders>
+              <w:top w:val="single" w:color="000000" w:sz="4"/>
+              <w:left w:val="single" w:color="000000" w:sz="4"/>
+              <w:bottom w:val="single" w:color="000000" w:sz="4"/>
+              <w:right w:val="single" w:color="000000" w:sz="4"/>
+            </w:tcBorders>
+            <w:tcMar>
+              <w:top w:type="dxa" w:w="60"/>
+              <w:left w:type="dxa" w:w="100"/>
+              <w:bottom w:type="dxa" w:w="60"/>
+              <w:right w:type="dxa" w:w="100"/>
+            </w:tcMar>
+          </w:tcPr>
+          <w:p>
+            <w:pPr>
+              <w:spacing w:line="276"/>
+              <w:jc w:val="left"/>
+            </w:pPr>
+            <w:r>
+              <w:rPr>
+                <w:rFonts w:ascii="Times New Roman" w:cs="Times New Roman" w:eastAsia="Times New Roman" w:hAnsi="Times New Roman"/>
+                <w:b w:val="false"/>
+                <w:bCs w:val="false"/>
+                <w:sz w:val="24"/>
+                <w:szCs w:val="24"/>
+              </w:rPr>
+              <w:t xml:space="preserve">6.51 +/- 0.93</w:t>
+            </w:r>
+          </w:p>
+        </w:tc>
+        <w:tc>
+          <w:tcPr>
+            <w:tcW w:type="dxa" w:w="1500"/>
+            <w:tcBorders>
+              <w:top w:val="single" w:color="000000" w:sz="4"/>
+              <w:left w:val="single" w:color="000000" w:sz="4"/>
+              <w:bottom w:val="single" w:color="000000" w:sz="4"/>
+              <w:right w:val="single" w:color="000000" w:sz="4"/>
+            </w:tcBorders>
+            <w:tcMar>
+              <w:top w:type="dxa" w:w="60"/>
+              <w:left w:type="dxa" w:w="100"/>
+              <w:bottom w:type="dxa" w:w="60"/>
+              <w:right w:type="dxa" w:w="100"/>
+            </w:tcMar>
+          </w:tcPr>
+          <w:p>
+            <w:pPr>
+              <w:spacing w:line="276"/>
+              <w:jc w:val="left"/>
+            </w:pPr>
+            <w:r>
+              <w:rPr>
+                <w:rFonts w:ascii="Times New Roman" w:cs="Times New Roman" w:eastAsia="Times New Roman" w:hAnsi="Times New Roman"/>
+                <w:b w:val="false"/>
+                <w:bCs w:val="false"/>
+                <w:sz w:val="24"/>
+                <w:szCs w:val="24"/>
+              </w:rPr>
+              <w:t xml:space="preserve">9.53 +/- 0.49</w:t>
+            </w:r>
+          </w:p>
+        </w:tc>
+        <w:tc>
+          <w:tcPr>
+            <w:tcW w:type="dxa" w:w="926"/>
+            <w:tcBorders>
+              <w:top w:val="single" w:color="000000" w:sz="4"/>
+              <w:left w:val="single" w:color="000000" w:sz="4"/>
+              <w:bottom w:val="single" w:color="000000" w:sz="4"/>
+              <w:right w:val="single" w:color="000000" w:sz="4"/>
+            </w:tcBorders>
+            <w:tcMar>
+              <w:top w:type="dxa" w:w="60"/>
+              <w:left w:type="dxa" w:w="100"/>
+              <w:bottom w:type="dxa" w:w="60"/>
+              <w:right w:type="dxa" w:w="100"/>
+            </w:tcMar>
+          </w:tcPr>
+          <w:p>
+            <w:pPr>
+              <w:spacing w:line="276"/>
+              <w:jc w:val="left"/>
+            </w:pPr>
+            <w:r>
+              <w:rPr>
+                <w:rFonts w:ascii="Times New Roman" w:cs="Times New Roman" w:eastAsia="Times New Roman" w:hAnsi="Times New Roman"/>
+                <w:b w:val="false"/>
+                <w:bCs w:val="false"/>
+                <w:sz w:val="24"/>
+                <w:szCs w:val="24"/>
+              </w:rPr>
+              <w:t xml:space="preserve">10</w:t>
+            </w:r>
+          </w:p>
+        </w:tc>
+      </w:tr>
+      <w:tr>
+        <w:trPr>
+          <w:cantSplit/>
+          <w:tblHeader w:val="false"/>
+        </w:trPr>
+        <w:tc>
+          <w:tcPr>
+            <w:tcW w:type="dxa" w:w="2100"/>
+            <w:tcBorders>
+              <w:top w:val="single" w:color="000000" w:sz="4"/>
+              <w:left w:val="single" w:color="000000" w:sz="4"/>
+              <w:bottom w:val="single" w:color="000000" w:sz="4"/>
+              <w:right w:val="single" w:color="000000" w:sz="4"/>
+            </w:tcBorders>
+            <w:tcMar>
+              <w:top w:type="dxa" w:w="60"/>
+              <w:left w:type="dxa" w:w="100"/>
+              <w:bottom w:type="dxa" w:w="60"/>
+              <w:right w:type="dxa" w:w="100"/>
+            </w:tcMar>
+          </w:tcPr>
+          <w:p>
+            <w:pPr>
+              <w:spacing w:line="276"/>
+              <w:jc w:val="left"/>
+            </w:pPr>
+            <w:r>
+              <w:rPr>
+                <w:rFonts w:ascii="Times New Roman" w:cs="Times New Roman" w:eastAsia="Times New Roman" w:hAnsi="Times New Roman"/>
+                <w:b w:val="false"/>
+                <w:bCs w:val="false"/>
+                <w:sz w:val="24"/>
+                <w:szCs w:val="24"/>
+              </w:rPr>
+              <w:t xml:space="preserve">Satellite-like</w:t>
+            </w:r>
+          </w:p>
+        </w:tc>
+        <w:tc>
+          <w:tcPr>
+            <w:tcW w:type="dxa" w:w="1500"/>
+            <w:tcBorders>
+              <w:top w:val="single" w:color="000000" w:sz="4"/>
+              <w:left w:val="single" w:color="000000" w:sz="4"/>
+              <w:bottom w:val="single" w:color="000000" w:sz="4"/>
+              <w:right w:val="single" w:color="000000" w:sz="4"/>
+            </w:tcBorders>
+            <w:tcMar>
+              <w:top w:type="dxa" w:w="60"/>
+              <w:left w:type="dxa" w:w="100"/>
+              <w:bottom w:type="dxa" w:w="60"/>
+              <w:right w:type="dxa" w:w="100"/>
+            </w:tcMar>
+          </w:tcPr>
+          <w:p>
+            <w:pPr>
+              <w:spacing w:line="276"/>
+              <w:jc w:val="left"/>
+            </w:pPr>
+            <w:r>
+              <w:rPr>
+                <w:rFonts w:ascii="Times New Roman" w:cs="Times New Roman" w:eastAsia="Times New Roman" w:hAnsi="Times New Roman"/>
+                <w:b w:val="false"/>
+                <w:bCs w:val="false"/>
+                <w:sz w:val="24"/>
+                <w:szCs w:val="24"/>
+              </w:rPr>
+              <w:t xml:space="preserve">18.66 +/- 2.73</w:t>
+            </w:r>
+          </w:p>
+        </w:tc>
+        <w:tc>
+          <w:tcPr>
+            <w:tcW w:type="dxa" w:w="1500"/>
+            <w:tcBorders>
+              <w:top w:val="single" w:color="000000" w:sz="4"/>
+              <w:left w:val="single" w:color="000000" w:sz="4"/>
+              <w:bottom w:val="single" w:color="000000" w:sz="4"/>
+              <w:right w:val="single" w:color="000000" w:sz="4"/>
+            </w:tcBorders>
+            <w:tcMar>
+              <w:top w:type="dxa" w:w="60"/>
+              <w:left w:type="dxa" w:w="100"/>
+              <w:bottom w:type="dxa" w:w="60"/>
+              <w:right w:type="dxa" w:w="100"/>
+            </w:tcMar>
+          </w:tcPr>
+          <w:p>
+            <w:pPr>
+              <w:spacing w:line="276"/>
+              <w:jc w:val="left"/>
+            </w:pPr>
+            <w:r>
+              <w:rPr>
+                <w:rFonts w:ascii="Times New Roman" w:cs="Times New Roman" w:eastAsia="Times New Roman" w:hAnsi="Times New Roman"/>
+                <w:b w:val="false"/>
+                <w:bCs w:val="false"/>
+                <w:sz w:val="24"/>
+                <w:szCs w:val="24"/>
+              </w:rPr>
+              <w:t xml:space="preserve">18.85 +/- 1.92</w:t>
+            </w:r>
+          </w:p>
+        </w:tc>
+        <w:tc>
+          <w:tcPr>
+            <w:tcW w:type="dxa" w:w="1500"/>
+            <w:tcBorders>
+              <w:top w:val="single" w:color="000000" w:sz="4"/>
+              <w:left w:val="single" w:color="000000" w:sz="4"/>
+              <w:bottom w:val="single" w:color="000000" w:sz="4"/>
+              <w:right w:val="single" w:color="000000" w:sz="4"/>
+            </w:tcBorders>
+            <w:tcMar>
+              <w:top w:type="dxa" w:w="60"/>
+              <w:left w:type="dxa" w:w="100"/>
+              <w:bottom w:type="dxa" w:w="60"/>
+              <w:right w:type="dxa" w:w="100"/>
+            </w:tcMar>
+          </w:tcPr>
+          <w:p>
+            <w:pPr>
+              <w:spacing w:line="276"/>
+              <w:jc w:val="left"/>
+            </w:pPr>
+            <w:r>
+              <w:rPr>
+                <w:rFonts w:ascii="Times New Roman" w:cs="Times New Roman" w:eastAsia="Times New Roman" w:hAnsi="Times New Roman"/>
+                <w:b w:val="false"/>
+                <w:bCs w:val="false"/>
+                <w:sz w:val="24"/>
+                <w:szCs w:val="24"/>
+              </w:rPr>
+              <w:t xml:space="preserve">13.48 +/- 0.40</w:t>
+            </w:r>
+          </w:p>
+        </w:tc>
+        <w:tc>
+          <w:tcPr>
+            <w:tcW w:type="dxa" w:w="1500"/>
+            <w:tcBorders>
+              <w:top w:val="single" w:color="000000" w:sz="4"/>
+              <w:left w:val="single" w:color="000000" w:sz="4"/>
+              <w:bottom w:val="single" w:color="000000" w:sz="4"/>
+              <w:right w:val="single" w:color="000000" w:sz="4"/>
+            </w:tcBorders>
+            <w:tcMar>
+              <w:top w:type="dxa" w:w="60"/>
+              <w:left w:type="dxa" w:w="100"/>
+              <w:bottom w:type="dxa" w:w="60"/>
+              <w:right w:type="dxa" w:w="100"/>
+            </w:tcMar>
+          </w:tcPr>
+          <w:p>
+            <w:pPr>
+              <w:spacing w:line="276"/>
+              <w:jc w:val="left"/>
+            </w:pPr>
+            <w:r>
+              <w:rPr>
+                <w:rFonts w:ascii="Times New Roman" w:cs="Times New Roman" w:eastAsia="Times New Roman" w:hAnsi="Times New Roman"/>
+                <w:b w:val="false"/>
+                <w:bCs w:val="false"/>
+                <w:sz w:val="24"/>
+                <w:szCs w:val="24"/>
+              </w:rPr>
+              <w:t xml:space="preserve">30.02 +/- 6.42</w:t>
+            </w:r>
+          </w:p>
+        </w:tc>
+        <w:tc>
+          <w:tcPr>
+            <w:tcW w:type="dxa" w:w="926"/>
+            <w:tcBorders>
+              <w:top w:val="single" w:color="000000" w:sz="4"/>
+              <w:left w:val="single" w:color="000000" w:sz="4"/>
+              <w:bottom w:val="single" w:color="000000" w:sz="4"/>
+              <w:right w:val="single" w:color="000000" w:sz="4"/>
+            </w:tcBorders>
+            <w:tcMar>
+              <w:top w:type="dxa" w:w="60"/>
+              <w:left w:type="dxa" w:w="100"/>
+              <w:bottom w:type="dxa" w:w="60"/>
+              <w:right w:type="dxa" w:w="100"/>
+            </w:tcMar>
+          </w:tcPr>
+          <w:p>
+            <w:pPr>
+              <w:spacing w:line="276"/>
+              <w:jc w:val="left"/>
+            </w:pPr>
+            <w:r>
+              <w:rPr>
+                <w:rFonts w:ascii="Times New Roman" w:cs="Times New Roman" w:eastAsia="Times New Roman" w:hAnsi="Times New Roman"/>
+                <w:b w:val="false"/>
+                <w:bCs w:val="false"/>
+                <w:sz w:val="24"/>
+                <w:szCs w:val="24"/>
+              </w:rPr>
+              <w:t xml:space="preserve">10</w:t>
+            </w:r>
+          </w:p>
+        </w:tc>
+      </w:tr>
+    </w:tbl>
+    <w:p>
+      <w:pPr>
+        <w:spacing w:after="160"/>
+      </w:pPr>
+    </w:p>
+    <w:p>
+      <w:pPr>
+        <w:spacing w:after="120" w:line="360"/>
+        <w:jc w:val="both"/>
+      </w:pPr>
+      <w:r>
+        <w:rPr>
+          <w:rFonts w:ascii="Times New Roman" w:cs="Times New Roman" w:eastAsia="Times New Roman" w:hAnsi="Times New Roman"/>
+          <w:b/>
+          <w:bCs/>
+          <w:sz w:val="24"/>
+          <w:szCs w:val="24"/>
+        </w:rPr>
+        <w:t xml:space="preserve">Second, the simulator.</w:t>
+      </w:r>
+      <w:r>
+        <w:rPr>
+          <w:rFonts w:ascii="Times New Roman" w:cs="Times New Roman" w:eastAsia="Times New Roman" w:hAnsi="Times New Roman"/>
+          <w:sz w:val="24"/>
+          <w:szCs w:val="24"/>
+        </w:rPr>
+        <w:t xml:space="preserve"> The Python simulator that trained the agent and produced the stress results allowed a duplicate-ACK retransmission storm, the same flaw fixed in the chat gateway (Section 8.6): every duplicate ACK batch could trigger another full resend. At high loss this acts as aggressive redundancy and flatters aggressive controllers. With the realistic rule switched on (RUDP_RG=1: no new fast retransmit until the data outstanding at the last one is acknowledged, as in the C smart client), the stress result changes a great deal. Mean delivery time on the 48 stress paths was 7.27 s for the original neural agent, 7.10 s for the table agent, 7.16 s for the fixed window and 7.75 s for AIMD; the neural agent was faster than AIMD on 12 paths, slower on 15 and within 5% on 21. Training a new neural agent in the realistic simulator gave a stable result (all four seeds within 4.84 to 4.93 s on validation, against the earlier spread of 3.2 to 7.4 s) and a stress mean of 7.03 s, which is again about level with AIMD (faster on 13, slower on 13). That agent was much worse in the C transport (Table 8g), so it was not adopted. The honest conclusion is that the large simulated gains reported in Section 11 (3.20 s against 7.16 s) came partly from the storm effect and should not be quoted as general; the defensible evidence for the neural agent is the C measurement in Table 8g, which uses the realistic rule, an equal cap and paired runs, and it is limited to three emulated paths.</w:t>
+      </w:r>
+    </w:p>
+    <w:p>
+      <w:pPr>
+        <w:spacing w:after="120" w:line="360"/>
+        <w:jc w:val="both"/>
+      </w:pPr>
+      <w:r>
+        <w:rPr>
+          <w:rFonts w:ascii="Times New Roman" w:cs="Times New Roman" w:eastAsia="Times New Roman" w:hAnsi="Times New Roman"/>
+          <w:sz w:val="24"/>
+          <w:szCs w:val="24"/>
+        </w:rPr>
+        <w:t xml:space="preserve">One more idea was tested and dropped: treating loss without RTT growth as random and refusing to shrink the window (a guard in web/cc.py, RANDOM_LOSS_RATIO). On 60 validation paths it changed the mean time from 3.83 s to between 3.87 s and 3.88 s, so it gave no gain and is off by default.</w:t>
       </w:r>
     </w:p>
     <w:p>
@@ -19016,7 +19968,7 @@
           <w:sz w:val="24"/>
           <w:szCs w:val="24"/>
         </w:rPr>
-        <w:t xml:space="preserve">Stress test. To check that Table 11 was not a lucky choice of paths, web/stress.py draws 48 random paths the agent never trained on (loss 0 to 30%, delay 10 to 300 ms, jitter up to 80 ms, optional bottleneck of 60 to 400 packets per second with a queue of 5 to 40, 10 to 120 messages) and runs each with 3 seeds. Mean delivery time was 3.73 s for Smart-RUDP, 3.88 s for the fixed window and 7.16 s for AIMD. Smart-RUDP was faster than AIMD on 27 paths, slower on 5 and within 5% on 16. Against the fixed window it was faster on 26, slower on 13 and within 5% on 9. Its weak spots are tight bottleneck queues and very high loss, where the fixed window of eight is hard to beat. A second agent trained on a broader range of paths did worse (mean 5.84 s) and was discarded. These results are from simulation. In a live test, 200 messages sent at 30% loss in both directions arrived complete and in order in 4.3 s, and the gateway kept responding when the peer disappeared.</w:t>
+        <w:t xml:space="preserve">Stress test. To check that Table 11 was not a lucky choice of paths, web/stress.py draws 48 random paths the agent never trained on (loss 0 to 30%, delay 10 to 300 ms, jitter up to 80 ms, optional bottleneck of 60 to 400 packets per second with a queue of 5 to 40, 10 to 120 messages) and runs each with 3 seeds. Mean delivery time was 3.73 s for Smart-RUDP, 3.88 s for the fixed window and 7.16 s for AIMD. Smart-RUDP was faster than AIMD on 27 paths, slower on 5 and within 5% on 16. Against the fixed window it was faster on 26, slower on 13 and within 5% on 9. Its weak spots are tight bottleneck queues and very high loss, where the fixed window of eight is hard to beat. A second agent trained on a broader range of paths did worse (mean 5.84 s) and was discarded. These results are from simulation, and Section 8.7 shows that this simulator flattered the learned agents at high loss. In a live test, 200 messages sent at 30% loss in both directions arrived complete and in order in 4.3 s, and the gateway kept responding when the peer disappeared.</w:t>
       </w:r>
     </w:p>
     <w:p>
@@ -19030,7 +19982,7 @@
           <w:sz w:val="24"/>
           <w:szCs w:val="24"/>
         </w:rPr>
-        <w:t xml:space="preserve">Deep reinforcement learning. The abstract proposed a deep agent, so a neural version was added (web/dqn.py, web/train_deep.py). It is a Deep Q-Network written in numpy: a network with two hidden layers of 32 units reads five continuous inputs (RTT growth, loss fraction, window size, throughput share and the last action) and outputs a value for each of the same five window actions. It learns from a replay buffer with a separate target network, using the same reward, the same no-shrink rule and the same 6,000 simulated training paths as the table agent. Training is not stable: of four random seeds, three produced a good agent and one (seed 12) was slower than AIMD. The agent used here was therefore chosen by its score on 16 separate validation paths, which are not the held-out paths and not the stress paths. On the six held-out paths of Table 11 it was faster than the table on five and equal on one (40 seeds each). On the 48 unseen stress paths its mean delivery time was 3.20 s, against 3.73 s for the table, 3.88 s for the fixed window and 7.16 s for AIMD; it was faster than the table on 19 paths and slower on 6, and faster than AIMD on 27 and slower on 5. The gain over the table is modest, which fits a small state space, and the deep agent is weak on the same tight bottleneck queues as the table agent. It runs only in the Python chat gateway and the simulator; the C implementation (Section 8) still uses the table. All results are from simulation.</w:t>
+        <w:t xml:space="preserve">Deep reinforcement learning. The abstract proposed a deep agent, so a neural version was added (web/dqn.py, web/train_deep.py). It is a Deep Q-Network written in numpy: a network with two hidden layers of 32 units reads five continuous inputs (RTT growth, loss fraction, window size, throughput share and the last action) and outputs a value for each of the same five window actions. It learns from a replay buffer with a separate target network, using the same reward, the same no-shrink rule and the same 6,000 simulated training paths as the table agent. Training is not stable: of four random seeds, three produced a good agent and one (seed 12) was slower than AIMD. The agent used here was therefore chosen by its score on 16 separate validation paths, which are not the held-out paths and not the stress paths. On the six held-out paths of Table 11 it was faster than the table on five and equal on one (40 seeds each). On the 48 unseen stress paths its mean delivery time was 3.20 s, against 3.73 s for the table, 3.88 s for the fixed window and 7.16 s for AIMD; it was faster than the table on 19 paths and slower on 6, and faster than AIMD on 27 and slower on 5. The gain over the table is modest, which fits a small state space, and the deep agent is weak on the same tight bottleneck queues as the table agent. It runs in the Python chat gateway and the simulator, and was later added to the C transport (Section 8.5). The simulated figures in this paragraph come from a simulator that allowed a retransmission storm; Section 8.7 repeats them with the realistic rule, where the agent is about level with AIMD, and tests the agent in C with equal caps, where it still wins.</w:t>
       </w:r>
     </w:p>
     <w:p>

</xml_diff>

<commit_message>
Hybrid AIMD hand-over, timeout-cut experiment, calibrated simulator options; report 8.8, deck slide 24, docs
Co-Authored-By: Claude Sonnet 5.5 <noreply@anthropic.com>
Claude-Session: https://claude.ai/code/session_01NX2zRNpdVAnzFNKmqomzKu
</commit_message>
<xml_diff>
--- a/docs/RUDP_Final_Project_Report.docx
+++ b/docs/RUDP_Final_Project_Report.docx
@@ -15654,6 +15654,1120 @@
     </w:p>
     <w:p>
       <w:pPr>
+        <w:pStyle w:val="Heading2"/>
+        <w:keepNext/>
+        <w:spacing w:after="120" w:before="120" w:line="360"/>
+      </w:pPr>
+      <w:r>
+        <w:rPr>
+          <w:rFonts w:ascii="Times New Roman" w:cs="Times New Roman" w:eastAsia="Times New Roman" w:hAnsi="Times New Roman"/>
+          <w:b/>
+          <w:bCs/>
+          <w:sz w:val="24"/>
+          <w:szCs w:val="24"/>
+        </w:rPr>
+        <w:t xml:space="preserve">8.8 Hand-over to AIMD under heavy loss (hybrid agent)</w:t>
+      </w:r>
+    </w:p>
+    <w:p>
+      <w:pPr>
+        <w:spacing w:after="120" w:line="360"/>
+        <w:jc w:val="both"/>
+      </w:pPr>
+      <w:r>
+        <w:rPr>
+          <w:rFonts w:ascii="Times New Roman" w:cs="Times New Roman" w:eastAsia="Times New Roman" w:hAnsi="Times New Roman"/>
+          <w:sz w:val="24"/>
+          <w:szCs w:val="24"/>
+        </w:rPr>
+        <w:t xml:space="preserve">The validity check exposed a serious weakness: at high random loss the neural agent is far worse than AIMD. A new C scenario with 10% loss (40 ms delay, 600 packets per second, queue 40, 300 packets) took the neural agent 85 s on average against 11 s for AIMD capped at 32, with about 1,300 packets sent for 300 delivered. The agent was trained mostly on mild loss and keeps its window large when the path is lossy. Two repairs were tried in the C transport. Cutting the window to a quarter on every retransmission timeout (--tcut 0.25) helped the 10% scenario (19 s) but made the 2% loss path much worse (24 s against 9 s), so it was dropped. A hand-over rule (--hybrid) works better: while the fraction of lost packets in the last decision interval is at least a threshold (5% or 10%), AIMD controls the window (reset to 1 on a timeout, halve on duplicate ACKs, additive growth), and after three clean intervals the agent takes over again.</w:t>
+      </w:r>
+    </w:p>
+    <w:p>
+      <w:pPr>
+        <w:keepNext/>
+        <w:spacing w:after="80" w:before="120"/>
+        <w:jc w:val="center"/>
+      </w:pPr>
+      <w:r>
+        <w:rPr>
+          <w:rFonts w:ascii="Times New Roman" w:cs="Times New Roman" w:eastAsia="Times New Roman" w:hAnsi="Times New Roman"/>
+          <w:b/>
+          <w:bCs/>
+          <w:sz w:val="24"/>
+          <w:szCs w:val="24"/>
+        </w:rPr>
+        <w:t xml:space="preserve">Table 8h: Mean completion time (s) in the C transport, 95% intervals (seeds 7001 onward; the 10% loss scenario sends 300 packets, the others 1,200)</w:t>
+      </w:r>
+    </w:p>
+    <w:tbl>
+      <w:tblPr>
+        <w:tblW w:type="dxa" w:w="9026"/>
+        <w:tblBorders>
+          <w:top w:val="single" w:color="auto" w:sz="4"/>
+          <w:left w:val="single" w:color="auto" w:sz="4"/>
+          <w:bottom w:val="single" w:color="auto" w:sz="4"/>
+          <w:right w:val="single" w:color="auto" w:sz="4"/>
+          <w:insideH w:val="single" w:color="auto" w:sz="4"/>
+          <w:insideV w:val="single" w:color="auto" w:sz="4"/>
+        </w:tblBorders>
+      </w:tblPr>
+      <w:tblGrid>
+        <w:gridCol w:w="1800"/>
+        <w:gridCol w:w="1300"/>
+        <w:gridCol w:w="1500"/>
+        <w:gridCol w:w="1500"/>
+        <w:gridCol w:w="1500"/>
+        <w:gridCol w:w="1426"/>
+      </w:tblGrid>
+      <w:tr>
+        <w:trPr>
+          <w:cantSplit/>
+          <w:tblHeader/>
+        </w:trPr>
+        <w:tc>
+          <w:tcPr>
+            <w:tcW w:type="dxa" w:w="1800"/>
+            <w:tcBorders>
+              <w:top w:val="single" w:color="000000" w:sz="4"/>
+              <w:left w:val="single" w:color="000000" w:sz="4"/>
+              <w:bottom w:val="single" w:color="000000" w:sz="4"/>
+              <w:right w:val="single" w:color="000000" w:sz="4"/>
+            </w:tcBorders>
+            <w:shd w:fill="D9D9D9" w:color="auto" w:val="clear"/>
+            <w:tcMar>
+              <w:top w:type="dxa" w:w="60"/>
+              <w:left w:type="dxa" w:w="100"/>
+              <w:bottom w:type="dxa" w:w="60"/>
+              <w:right w:type="dxa" w:w="100"/>
+            </w:tcMar>
+          </w:tcPr>
+          <w:p>
+            <w:pPr>
+              <w:spacing w:line="276"/>
+              <w:jc w:val="left"/>
+            </w:pPr>
+            <w:r>
+              <w:rPr>
+                <w:rFonts w:ascii="Times New Roman" w:cs="Times New Roman" w:eastAsia="Times New Roman" w:hAnsi="Times New Roman"/>
+                <w:b/>
+                <w:bCs/>
+                <w:sz w:val="24"/>
+                <w:szCs w:val="24"/>
+              </w:rPr>
+              <w:t xml:space="preserve">Scenario</w:t>
+            </w:r>
+          </w:p>
+        </w:tc>
+        <w:tc>
+          <w:tcPr>
+            <w:tcW w:type="dxa" w:w="1300"/>
+            <w:tcBorders>
+              <w:top w:val="single" w:color="000000" w:sz="4"/>
+              <w:left w:val="single" w:color="000000" w:sz="4"/>
+              <w:bottom w:val="single" w:color="000000" w:sz="4"/>
+              <w:right w:val="single" w:color="000000" w:sz="4"/>
+            </w:tcBorders>
+            <w:shd w:fill="D9D9D9" w:color="auto" w:val="clear"/>
+            <w:tcMar>
+              <w:top w:type="dxa" w:w="60"/>
+              <w:left w:type="dxa" w:w="100"/>
+              <w:bottom w:type="dxa" w:w="60"/>
+              <w:right w:type="dxa" w:w="100"/>
+            </w:tcMar>
+          </w:tcPr>
+          <w:p>
+            <w:pPr>
+              <w:spacing w:line="276"/>
+              <w:jc w:val="left"/>
+            </w:pPr>
+            <w:r>
+              <w:rPr>
+                <w:rFonts w:ascii="Times New Roman" w:cs="Times New Roman" w:eastAsia="Times New Roman" w:hAnsi="Times New Roman"/>
+                <w:b/>
+                <w:bCs/>
+                <w:sz w:val="24"/>
+                <w:szCs w:val="24"/>
+              </w:rPr>
+              <w:t xml:space="preserve">AIMD cap 32</w:t>
+            </w:r>
+          </w:p>
+        </w:tc>
+        <w:tc>
+          <w:tcPr>
+            <w:tcW w:type="dxa" w:w="1500"/>
+            <w:tcBorders>
+              <w:top w:val="single" w:color="000000" w:sz="4"/>
+              <w:left w:val="single" w:color="000000" w:sz="4"/>
+              <w:bottom w:val="single" w:color="000000" w:sz="4"/>
+              <w:right w:val="single" w:color="000000" w:sz="4"/>
+            </w:tcBorders>
+            <w:shd w:fill="D9D9D9" w:color="auto" w:val="clear"/>
+            <w:tcMar>
+              <w:top w:type="dxa" w:w="60"/>
+              <w:left w:type="dxa" w:w="100"/>
+              <w:bottom w:type="dxa" w:w="60"/>
+              <w:right w:type="dxa" w:w="100"/>
+            </w:tcMar>
+          </w:tcPr>
+          <w:p>
+            <w:pPr>
+              <w:spacing w:line="276"/>
+              <w:jc w:val="left"/>
+            </w:pPr>
+            <w:r>
+              <w:rPr>
+                <w:rFonts w:ascii="Times New Roman" w:cs="Times New Roman" w:eastAsia="Times New Roman" w:hAnsi="Times New Roman"/>
+                <w:b/>
+                <w:bCs/>
+                <w:sz w:val="24"/>
+                <w:szCs w:val="24"/>
+              </w:rPr>
+              <w:t xml:space="preserve">Neural</w:t>
+            </w:r>
+          </w:p>
+        </w:tc>
+        <w:tc>
+          <w:tcPr>
+            <w:tcW w:type="dxa" w:w="1500"/>
+            <w:tcBorders>
+              <w:top w:val="single" w:color="000000" w:sz="4"/>
+              <w:left w:val="single" w:color="000000" w:sz="4"/>
+              <w:bottom w:val="single" w:color="000000" w:sz="4"/>
+              <w:right w:val="single" w:color="000000" w:sz="4"/>
+            </w:tcBorders>
+            <w:shd w:fill="D9D9D9" w:color="auto" w:val="clear"/>
+            <w:tcMar>
+              <w:top w:type="dxa" w:w="60"/>
+              <w:left w:type="dxa" w:w="100"/>
+              <w:bottom w:type="dxa" w:w="60"/>
+              <w:right w:type="dxa" w:w="100"/>
+            </w:tcMar>
+          </w:tcPr>
+          <w:p>
+            <w:pPr>
+              <w:spacing w:line="276"/>
+              <w:jc w:val="left"/>
+            </w:pPr>
+            <w:r>
+              <w:rPr>
+                <w:rFonts w:ascii="Times New Roman" w:cs="Times New Roman" w:eastAsia="Times New Roman" w:hAnsi="Times New Roman"/>
+                <w:b/>
+                <w:bCs/>
+                <w:sz w:val="24"/>
+                <w:szCs w:val="24"/>
+              </w:rPr>
+              <w:t xml:space="preserve">Hybrid 5%</w:t>
+            </w:r>
+          </w:p>
+        </w:tc>
+        <w:tc>
+          <w:tcPr>
+            <w:tcW w:type="dxa" w:w="1500"/>
+            <w:tcBorders>
+              <w:top w:val="single" w:color="000000" w:sz="4"/>
+              <w:left w:val="single" w:color="000000" w:sz="4"/>
+              <w:bottom w:val="single" w:color="000000" w:sz="4"/>
+              <w:right w:val="single" w:color="000000" w:sz="4"/>
+            </w:tcBorders>
+            <w:shd w:fill="D9D9D9" w:color="auto" w:val="clear"/>
+            <w:tcMar>
+              <w:top w:type="dxa" w:w="60"/>
+              <w:left w:type="dxa" w:w="100"/>
+              <w:bottom w:type="dxa" w:w="60"/>
+              <w:right w:type="dxa" w:w="100"/>
+            </w:tcMar>
+          </w:tcPr>
+          <w:p>
+            <w:pPr>
+              <w:spacing w:line="276"/>
+              <w:jc w:val="left"/>
+            </w:pPr>
+            <w:r>
+              <w:rPr>
+                <w:rFonts w:ascii="Times New Roman" w:cs="Times New Roman" w:eastAsia="Times New Roman" w:hAnsi="Times New Roman"/>
+                <w:b/>
+                <w:bCs/>
+                <w:sz w:val="24"/>
+                <w:szCs w:val="24"/>
+              </w:rPr>
+              <w:t xml:space="preserve">Hybrid 10%</w:t>
+            </w:r>
+          </w:p>
+        </w:tc>
+        <w:tc>
+          <w:tcPr>
+            <w:tcW w:type="dxa" w:w="1426"/>
+            <w:tcBorders>
+              <w:top w:val="single" w:color="000000" w:sz="4"/>
+              <w:left w:val="single" w:color="000000" w:sz="4"/>
+              <w:bottom w:val="single" w:color="000000" w:sz="4"/>
+              <w:right w:val="single" w:color="000000" w:sz="4"/>
+            </w:tcBorders>
+            <w:shd w:fill="D9D9D9" w:color="auto" w:val="clear"/>
+            <w:tcMar>
+              <w:top w:type="dxa" w:w="60"/>
+              <w:left w:type="dxa" w:w="100"/>
+              <w:bottom w:type="dxa" w:w="60"/>
+              <w:right w:type="dxa" w:w="100"/>
+            </w:tcMar>
+          </w:tcPr>
+          <w:p>
+            <w:pPr>
+              <w:spacing w:line="276"/>
+              <w:jc w:val="left"/>
+            </w:pPr>
+            <w:r>
+              <w:rPr>
+                <w:rFonts w:ascii="Times New Roman" w:cs="Times New Roman" w:eastAsia="Times New Roman" w:hAnsi="Times New Roman"/>
+                <w:b/>
+                <w:bCs/>
+                <w:sz w:val="24"/>
+                <w:szCs w:val="24"/>
+              </w:rPr>
+              <w:t xml:space="preserve">Runs</w:t>
+            </w:r>
+          </w:p>
+        </w:tc>
+      </w:tr>
+      <w:tr>
+        <w:trPr>
+          <w:cantSplit/>
+          <w:tblHeader w:val="false"/>
+        </w:trPr>
+        <w:tc>
+          <w:tcPr>
+            <w:tcW w:type="dxa" w:w="1800"/>
+            <w:tcBorders>
+              <w:top w:val="single" w:color="000000" w:sz="4"/>
+              <w:left w:val="single" w:color="000000" w:sz="4"/>
+              <w:bottom w:val="single" w:color="000000" w:sz="4"/>
+              <w:right w:val="single" w:color="000000" w:sz="4"/>
+            </w:tcBorders>
+            <w:tcMar>
+              <w:top w:type="dxa" w:w="60"/>
+              <w:left w:type="dxa" w:w="100"/>
+              <w:bottom w:type="dxa" w:w="60"/>
+              <w:right w:type="dxa" w:w="100"/>
+            </w:tcMar>
+          </w:tcPr>
+          <w:p>
+            <w:pPr>
+              <w:spacing w:line="276"/>
+              <w:jc w:val="left"/>
+            </w:pPr>
+            <w:r>
+              <w:rPr>
+                <w:rFonts w:ascii="Times New Roman" w:cs="Times New Roman" w:eastAsia="Times New Roman" w:hAnsi="Times New Roman"/>
+                <w:b w:val="false"/>
+                <w:bCs w:val="false"/>
+                <w:sz w:val="24"/>
+                <w:szCs w:val="24"/>
+              </w:rPr>
+              <w:t xml:space="preserve">5G-like</w:t>
+            </w:r>
+          </w:p>
+        </w:tc>
+        <w:tc>
+          <w:tcPr>
+            <w:tcW w:type="dxa" w:w="1300"/>
+            <w:tcBorders>
+              <w:top w:val="single" w:color="000000" w:sz="4"/>
+              <w:left w:val="single" w:color="000000" w:sz="4"/>
+              <w:bottom w:val="single" w:color="000000" w:sz="4"/>
+              <w:right w:val="single" w:color="000000" w:sz="4"/>
+            </w:tcBorders>
+            <w:tcMar>
+              <w:top w:type="dxa" w:w="60"/>
+              <w:left w:type="dxa" w:w="100"/>
+              <w:bottom w:type="dxa" w:w="60"/>
+              <w:right w:type="dxa" w:w="100"/>
+            </w:tcMar>
+          </w:tcPr>
+          <w:p>
+            <w:pPr>
+              <w:spacing w:line="276"/>
+              <w:jc w:val="left"/>
+            </w:pPr>
+            <w:r>
+              <w:rPr>
+                <w:rFonts w:ascii="Times New Roman" w:cs="Times New Roman" w:eastAsia="Times New Roman" w:hAnsi="Times New Roman"/>
+                <w:b w:val="false"/>
+                <w:bCs w:val="false"/>
+                <w:sz w:val="24"/>
+                <w:szCs w:val="24"/>
+              </w:rPr>
+              <w:t xml:space="preserve">1.48 +/- 0.21</w:t>
+            </w:r>
+          </w:p>
+        </w:tc>
+        <w:tc>
+          <w:tcPr>
+            <w:tcW w:type="dxa" w:w="1500"/>
+            <w:tcBorders>
+              <w:top w:val="single" w:color="000000" w:sz="4"/>
+              <w:left w:val="single" w:color="000000" w:sz="4"/>
+              <w:bottom w:val="single" w:color="000000" w:sz="4"/>
+              <w:right w:val="single" w:color="000000" w:sz="4"/>
+            </w:tcBorders>
+            <w:tcMar>
+              <w:top w:type="dxa" w:w="60"/>
+              <w:left w:type="dxa" w:w="100"/>
+              <w:bottom w:type="dxa" w:w="60"/>
+              <w:right w:type="dxa" w:w="100"/>
+            </w:tcMar>
+          </w:tcPr>
+          <w:p>
+            <w:pPr>
+              <w:spacing w:line="276"/>
+              <w:jc w:val="left"/>
+            </w:pPr>
+            <w:r>
+              <w:rPr>
+                <w:rFonts w:ascii="Times New Roman" w:cs="Times New Roman" w:eastAsia="Times New Roman" w:hAnsi="Times New Roman"/>
+                <w:b w:val="false"/>
+                <w:bCs w:val="false"/>
+                <w:sz w:val="24"/>
+                <w:szCs w:val="24"/>
+              </w:rPr>
+              <w:t xml:space="preserve">1.17 +/- 0.03</w:t>
+            </w:r>
+          </w:p>
+        </w:tc>
+        <w:tc>
+          <w:tcPr>
+            <w:tcW w:type="dxa" w:w="1500"/>
+            <w:tcBorders>
+              <w:top w:val="single" w:color="000000" w:sz="4"/>
+              <w:left w:val="single" w:color="000000" w:sz="4"/>
+              <w:bottom w:val="single" w:color="000000" w:sz="4"/>
+              <w:right w:val="single" w:color="000000" w:sz="4"/>
+            </w:tcBorders>
+            <w:tcMar>
+              <w:top w:type="dxa" w:w="60"/>
+              <w:left w:type="dxa" w:w="100"/>
+              <w:bottom w:type="dxa" w:w="60"/>
+              <w:right w:type="dxa" w:w="100"/>
+            </w:tcMar>
+          </w:tcPr>
+          <w:p>
+            <w:pPr>
+              <w:spacing w:line="276"/>
+              <w:jc w:val="left"/>
+            </w:pPr>
+            <w:r>
+              <w:rPr>
+                <w:rFonts w:ascii="Times New Roman" w:cs="Times New Roman" w:eastAsia="Times New Roman" w:hAnsi="Times New Roman"/>
+                <w:b w:val="false"/>
+                <w:bCs w:val="false"/>
+                <w:sz w:val="24"/>
+                <w:szCs w:val="24"/>
+              </w:rPr>
+              <w:t xml:space="preserve">1.19 +/- 0.04</w:t>
+            </w:r>
+          </w:p>
+        </w:tc>
+        <w:tc>
+          <w:tcPr>
+            <w:tcW w:type="dxa" w:w="1500"/>
+            <w:tcBorders>
+              <w:top w:val="single" w:color="000000" w:sz="4"/>
+              <w:left w:val="single" w:color="000000" w:sz="4"/>
+              <w:bottom w:val="single" w:color="000000" w:sz="4"/>
+              <w:right w:val="single" w:color="000000" w:sz="4"/>
+            </w:tcBorders>
+            <w:tcMar>
+              <w:top w:type="dxa" w:w="60"/>
+              <w:left w:type="dxa" w:w="100"/>
+              <w:bottom w:type="dxa" w:w="60"/>
+              <w:right w:type="dxa" w:w="100"/>
+            </w:tcMar>
+          </w:tcPr>
+          <w:p>
+            <w:pPr>
+              <w:spacing w:line="276"/>
+              <w:jc w:val="left"/>
+            </w:pPr>
+            <w:r>
+              <w:rPr>
+                <w:rFonts w:ascii="Times New Roman" w:cs="Times New Roman" w:eastAsia="Times New Roman" w:hAnsi="Times New Roman"/>
+                <w:b w:val="false"/>
+                <w:bCs w:val="false"/>
+                <w:sz w:val="24"/>
+                <w:szCs w:val="24"/>
+              </w:rPr>
+              <w:t xml:space="preserve">1.23 +/- 0.07</w:t>
+            </w:r>
+          </w:p>
+        </w:tc>
+        <w:tc>
+          <w:tcPr>
+            <w:tcW w:type="dxa" w:w="1426"/>
+            <w:tcBorders>
+              <w:top w:val="single" w:color="000000" w:sz="4"/>
+              <w:left w:val="single" w:color="000000" w:sz="4"/>
+              <w:bottom w:val="single" w:color="000000" w:sz="4"/>
+              <w:right w:val="single" w:color="000000" w:sz="4"/>
+            </w:tcBorders>
+            <w:tcMar>
+              <w:top w:type="dxa" w:w="60"/>
+              <w:left w:type="dxa" w:w="100"/>
+              <w:bottom w:type="dxa" w:w="60"/>
+              <w:right w:type="dxa" w:w="100"/>
+            </w:tcMar>
+          </w:tcPr>
+          <w:p>
+            <w:pPr>
+              <w:spacing w:line="276"/>
+              <w:jc w:val="left"/>
+            </w:pPr>
+            <w:r>
+              <w:rPr>
+                <w:rFonts w:ascii="Times New Roman" w:cs="Times New Roman" w:eastAsia="Times New Roman" w:hAnsi="Times New Roman"/>
+                <w:b w:val="false"/>
+                <w:bCs w:val="false"/>
+                <w:sz w:val="24"/>
+                <w:szCs w:val="24"/>
+              </w:rPr>
+              <w:t xml:space="preserve">10</w:t>
+            </w:r>
+          </w:p>
+        </w:tc>
+      </w:tr>
+      <w:tr>
+        <w:trPr>
+          <w:cantSplit/>
+          <w:tblHeader w:val="false"/>
+        </w:trPr>
+        <w:tc>
+          <w:tcPr>
+            <w:tcW w:type="dxa" w:w="1800"/>
+            <w:tcBorders>
+              <w:top w:val="single" w:color="000000" w:sz="4"/>
+              <w:left w:val="single" w:color="000000" w:sz="4"/>
+              <w:bottom w:val="single" w:color="000000" w:sz="4"/>
+              <w:right w:val="single" w:color="000000" w:sz="4"/>
+            </w:tcBorders>
+            <w:tcMar>
+              <w:top w:type="dxa" w:w="60"/>
+              <w:left w:type="dxa" w:w="100"/>
+              <w:bottom w:type="dxa" w:w="60"/>
+              <w:right w:type="dxa" w:w="100"/>
+            </w:tcMar>
+          </w:tcPr>
+          <w:p>
+            <w:pPr>
+              <w:spacing w:line="276"/>
+              <w:jc w:val="left"/>
+            </w:pPr>
+            <w:r>
+              <w:rPr>
+                <w:rFonts w:ascii="Times New Roman" w:cs="Times New Roman" w:eastAsia="Times New Roman" w:hAnsi="Times New Roman"/>
+                <w:b w:val="false"/>
+                <w:bCs w:val="false"/>
+                <w:sz w:val="24"/>
+                <w:szCs w:val="24"/>
+              </w:rPr>
+              <w:t xml:space="preserve">Lossy wireless (2%)</w:t>
+            </w:r>
+          </w:p>
+        </w:tc>
+        <w:tc>
+          <w:tcPr>
+            <w:tcW w:type="dxa" w:w="1300"/>
+            <w:tcBorders>
+              <w:top w:val="single" w:color="000000" w:sz="4"/>
+              <w:left w:val="single" w:color="000000" w:sz="4"/>
+              <w:bottom w:val="single" w:color="000000" w:sz="4"/>
+              <w:right w:val="single" w:color="000000" w:sz="4"/>
+            </w:tcBorders>
+            <w:tcMar>
+              <w:top w:type="dxa" w:w="60"/>
+              <w:left w:type="dxa" w:w="100"/>
+              <w:bottom w:type="dxa" w:w="60"/>
+              <w:right w:type="dxa" w:w="100"/>
+            </w:tcMar>
+          </w:tcPr>
+          <w:p>
+            <w:pPr>
+              <w:spacing w:line="276"/>
+              <w:jc w:val="left"/>
+            </w:pPr>
+            <w:r>
+              <w:rPr>
+                <w:rFonts w:ascii="Times New Roman" w:cs="Times New Roman" w:eastAsia="Times New Roman" w:hAnsi="Times New Roman"/>
+                <w:b w:val="false"/>
+                <w:bCs w:val="false"/>
+                <w:sz w:val="24"/>
+                <w:szCs w:val="24"/>
+              </w:rPr>
+              <w:t xml:space="preserve">9.04 +/- 0.79</w:t>
+            </w:r>
+          </w:p>
+        </w:tc>
+        <w:tc>
+          <w:tcPr>
+            <w:tcW w:type="dxa" w:w="1500"/>
+            <w:tcBorders>
+              <w:top w:val="single" w:color="000000" w:sz="4"/>
+              <w:left w:val="single" w:color="000000" w:sz="4"/>
+              <w:bottom w:val="single" w:color="000000" w:sz="4"/>
+              <w:right w:val="single" w:color="000000" w:sz="4"/>
+            </w:tcBorders>
+            <w:tcMar>
+              <w:top w:type="dxa" w:w="60"/>
+              <w:left w:type="dxa" w:w="100"/>
+              <w:bottom w:type="dxa" w:w="60"/>
+              <w:right w:type="dxa" w:w="100"/>
+            </w:tcMar>
+          </w:tcPr>
+          <w:p>
+            <w:pPr>
+              <w:spacing w:line="276"/>
+              <w:jc w:val="left"/>
+            </w:pPr>
+            <w:r>
+              <w:rPr>
+                <w:rFonts w:ascii="Times New Roman" w:cs="Times New Roman" w:eastAsia="Times New Roman" w:hAnsi="Times New Roman"/>
+                <w:b w:val="false"/>
+                <w:bCs w:val="false"/>
+                <w:sz w:val="24"/>
+                <w:szCs w:val="24"/>
+              </w:rPr>
+              <w:t xml:space="preserve">7.53 +/- 1.91</w:t>
+            </w:r>
+          </w:p>
+        </w:tc>
+        <w:tc>
+          <w:tcPr>
+            <w:tcW w:type="dxa" w:w="1500"/>
+            <w:tcBorders>
+              <w:top w:val="single" w:color="000000" w:sz="4"/>
+              <w:left w:val="single" w:color="000000" w:sz="4"/>
+              <w:bottom w:val="single" w:color="000000" w:sz="4"/>
+              <w:right w:val="single" w:color="000000" w:sz="4"/>
+            </w:tcBorders>
+            <w:tcMar>
+              <w:top w:type="dxa" w:w="60"/>
+              <w:left w:type="dxa" w:w="100"/>
+              <w:bottom w:type="dxa" w:w="60"/>
+              <w:right w:type="dxa" w:w="100"/>
+            </w:tcMar>
+          </w:tcPr>
+          <w:p>
+            <w:pPr>
+              <w:spacing w:line="276"/>
+              <w:jc w:val="left"/>
+            </w:pPr>
+            <w:r>
+              <w:rPr>
+                <w:rFonts w:ascii="Times New Roman" w:cs="Times New Roman" w:eastAsia="Times New Roman" w:hAnsi="Times New Roman"/>
+                <w:b w:val="false"/>
+                <w:bCs w:val="false"/>
+                <w:sz w:val="24"/>
+                <w:szCs w:val="24"/>
+              </w:rPr>
+              <w:t xml:space="preserve">7.21 +/- 1.41</w:t>
+            </w:r>
+          </w:p>
+        </w:tc>
+        <w:tc>
+          <w:tcPr>
+            <w:tcW w:type="dxa" w:w="1500"/>
+            <w:tcBorders>
+              <w:top w:val="single" w:color="000000" w:sz="4"/>
+              <w:left w:val="single" w:color="000000" w:sz="4"/>
+              <w:bottom w:val="single" w:color="000000" w:sz="4"/>
+              <w:right w:val="single" w:color="000000" w:sz="4"/>
+            </w:tcBorders>
+            <w:tcMar>
+              <w:top w:type="dxa" w:w="60"/>
+              <w:left w:type="dxa" w:w="100"/>
+              <w:bottom w:type="dxa" w:w="60"/>
+              <w:right w:type="dxa" w:w="100"/>
+            </w:tcMar>
+          </w:tcPr>
+          <w:p>
+            <w:pPr>
+              <w:spacing w:line="276"/>
+              <w:jc w:val="left"/>
+            </w:pPr>
+            <w:r>
+              <w:rPr>
+                <w:rFonts w:ascii="Times New Roman" w:cs="Times New Roman" w:eastAsia="Times New Roman" w:hAnsi="Times New Roman"/>
+                <w:b w:val="false"/>
+                <w:bCs w:val="false"/>
+                <w:sz w:val="24"/>
+                <w:szCs w:val="24"/>
+              </w:rPr>
+              <w:t xml:space="preserve">7.57 +/- 0.80</w:t>
+            </w:r>
+          </w:p>
+        </w:tc>
+        <w:tc>
+          <w:tcPr>
+            <w:tcW w:type="dxa" w:w="1426"/>
+            <w:tcBorders>
+              <w:top w:val="single" w:color="000000" w:sz="4"/>
+              <w:left w:val="single" w:color="000000" w:sz="4"/>
+              <w:bottom w:val="single" w:color="000000" w:sz="4"/>
+              <w:right w:val="single" w:color="000000" w:sz="4"/>
+            </w:tcBorders>
+            <w:tcMar>
+              <w:top w:type="dxa" w:w="60"/>
+              <w:left w:type="dxa" w:w="100"/>
+              <w:bottom w:type="dxa" w:w="60"/>
+              <w:right w:type="dxa" w:w="100"/>
+            </w:tcMar>
+          </w:tcPr>
+          <w:p>
+            <w:pPr>
+              <w:spacing w:line="276"/>
+              <w:jc w:val="left"/>
+            </w:pPr>
+            <w:r>
+              <w:rPr>
+                <w:rFonts w:ascii="Times New Roman" w:cs="Times New Roman" w:eastAsia="Times New Roman" w:hAnsi="Times New Roman"/>
+                <w:b w:val="false"/>
+                <w:bCs w:val="false"/>
+                <w:sz w:val="24"/>
+                <w:szCs w:val="24"/>
+              </w:rPr>
+              <w:t xml:space="preserve">10</w:t>
+            </w:r>
+          </w:p>
+        </w:tc>
+      </w:tr>
+      <w:tr>
+        <w:trPr>
+          <w:cantSplit/>
+          <w:tblHeader w:val="false"/>
+        </w:trPr>
+        <w:tc>
+          <w:tcPr>
+            <w:tcW w:type="dxa" w:w="1800"/>
+            <w:tcBorders>
+              <w:top w:val="single" w:color="000000" w:sz="4"/>
+              <w:left w:val="single" w:color="000000" w:sz="4"/>
+              <w:bottom w:val="single" w:color="000000" w:sz="4"/>
+              <w:right w:val="single" w:color="000000" w:sz="4"/>
+            </w:tcBorders>
+            <w:tcMar>
+              <w:top w:type="dxa" w:w="60"/>
+              <w:left w:type="dxa" w:w="100"/>
+              <w:bottom w:type="dxa" w:w="60"/>
+              <w:right w:type="dxa" w:w="100"/>
+            </w:tcMar>
+          </w:tcPr>
+          <w:p>
+            <w:pPr>
+              <w:spacing w:line="276"/>
+              <w:jc w:val="left"/>
+            </w:pPr>
+            <w:r>
+              <w:rPr>
+                <w:rFonts w:ascii="Times New Roman" w:cs="Times New Roman" w:eastAsia="Times New Roman" w:hAnsi="Times New Roman"/>
+                <w:b w:val="false"/>
+                <w:bCs w:val="false"/>
+                <w:sz w:val="24"/>
+                <w:szCs w:val="24"/>
+              </w:rPr>
+              <w:t xml:space="preserve">Satellite-like</w:t>
+            </w:r>
+          </w:p>
+        </w:tc>
+        <w:tc>
+          <w:tcPr>
+            <w:tcW w:type="dxa" w:w="1300"/>
+            <w:tcBorders>
+              <w:top w:val="single" w:color="000000" w:sz="4"/>
+              <w:left w:val="single" w:color="000000" w:sz="4"/>
+              <w:bottom w:val="single" w:color="000000" w:sz="4"/>
+              <w:right w:val="single" w:color="000000" w:sz="4"/>
+            </w:tcBorders>
+            <w:tcMar>
+              <w:top w:type="dxa" w:w="60"/>
+              <w:left w:type="dxa" w:w="100"/>
+              <w:bottom w:type="dxa" w:w="60"/>
+              <w:right w:type="dxa" w:w="100"/>
+            </w:tcMar>
+          </w:tcPr>
+          <w:p>
+            <w:pPr>
+              <w:spacing w:line="276"/>
+              <w:jc w:val="left"/>
+            </w:pPr>
+            <w:r>
+              <w:rPr>
+                <w:rFonts w:ascii="Times New Roman" w:cs="Times New Roman" w:eastAsia="Times New Roman" w:hAnsi="Times New Roman"/>
+                <w:b w:val="false"/>
+                <w:bCs w:val="false"/>
+                <w:sz w:val="24"/>
+                <w:szCs w:val="24"/>
+              </w:rPr>
+              <w:t xml:space="preserve">19.68 +/- 2.99</w:t>
+            </w:r>
+          </w:p>
+        </w:tc>
+        <w:tc>
+          <w:tcPr>
+            <w:tcW w:type="dxa" w:w="1500"/>
+            <w:tcBorders>
+              <w:top w:val="single" w:color="000000" w:sz="4"/>
+              <w:left w:val="single" w:color="000000" w:sz="4"/>
+              <w:bottom w:val="single" w:color="000000" w:sz="4"/>
+              <w:right w:val="single" w:color="000000" w:sz="4"/>
+            </w:tcBorders>
+            <w:tcMar>
+              <w:top w:type="dxa" w:w="60"/>
+              <w:left w:type="dxa" w:w="100"/>
+              <w:bottom w:type="dxa" w:w="60"/>
+              <w:right w:type="dxa" w:w="100"/>
+            </w:tcMar>
+          </w:tcPr>
+          <w:p>
+            <w:pPr>
+              <w:spacing w:line="276"/>
+              <w:jc w:val="left"/>
+            </w:pPr>
+            <w:r>
+              <w:rPr>
+                <w:rFonts w:ascii="Times New Roman" w:cs="Times New Roman" w:eastAsia="Times New Roman" w:hAnsi="Times New Roman"/>
+                <w:b w:val="false"/>
+                <w:bCs w:val="false"/>
+                <w:sz w:val="24"/>
+                <w:szCs w:val="24"/>
+              </w:rPr>
+              <w:t xml:space="preserve">13.39 +/- 0.29</w:t>
+            </w:r>
+          </w:p>
+        </w:tc>
+        <w:tc>
+          <w:tcPr>
+            <w:tcW w:type="dxa" w:w="1500"/>
+            <w:tcBorders>
+              <w:top w:val="single" w:color="000000" w:sz="4"/>
+              <w:left w:val="single" w:color="000000" w:sz="4"/>
+              <w:bottom w:val="single" w:color="000000" w:sz="4"/>
+              <w:right w:val="single" w:color="000000" w:sz="4"/>
+            </w:tcBorders>
+            <w:tcMar>
+              <w:top w:type="dxa" w:w="60"/>
+              <w:left w:type="dxa" w:w="100"/>
+              <w:bottom w:type="dxa" w:w="60"/>
+              <w:right w:type="dxa" w:w="100"/>
+            </w:tcMar>
+          </w:tcPr>
+          <w:p>
+            <w:pPr>
+              <w:spacing w:line="276"/>
+              <w:jc w:val="left"/>
+            </w:pPr>
+            <w:r>
+              <w:rPr>
+                <w:rFonts w:ascii="Times New Roman" w:cs="Times New Roman" w:eastAsia="Times New Roman" w:hAnsi="Times New Roman"/>
+                <w:b w:val="false"/>
+                <w:bCs w:val="false"/>
+                <w:sz w:val="24"/>
+                <w:szCs w:val="24"/>
+              </w:rPr>
+              <w:t xml:space="preserve">13.70 +/- 0.45</w:t>
+            </w:r>
+          </w:p>
+        </w:tc>
+        <w:tc>
+          <w:tcPr>
+            <w:tcW w:type="dxa" w:w="1500"/>
+            <w:tcBorders>
+              <w:top w:val="single" w:color="000000" w:sz="4"/>
+              <w:left w:val="single" w:color="000000" w:sz="4"/>
+              <w:bottom w:val="single" w:color="000000" w:sz="4"/>
+              <w:right w:val="single" w:color="000000" w:sz="4"/>
+            </w:tcBorders>
+            <w:tcMar>
+              <w:top w:type="dxa" w:w="60"/>
+              <w:left w:type="dxa" w:w="100"/>
+              <w:bottom w:type="dxa" w:w="60"/>
+              <w:right w:type="dxa" w:w="100"/>
+            </w:tcMar>
+          </w:tcPr>
+          <w:p>
+            <w:pPr>
+              <w:spacing w:line="276"/>
+              <w:jc w:val="left"/>
+            </w:pPr>
+            <w:r>
+              <w:rPr>
+                <w:rFonts w:ascii="Times New Roman" w:cs="Times New Roman" w:eastAsia="Times New Roman" w:hAnsi="Times New Roman"/>
+                <w:b w:val="false"/>
+                <w:bCs w:val="false"/>
+                <w:sz w:val="24"/>
+                <w:szCs w:val="24"/>
+              </w:rPr>
+              <w:t xml:space="preserve">13.70 +/- 0.32</w:t>
+            </w:r>
+          </w:p>
+        </w:tc>
+        <w:tc>
+          <w:tcPr>
+            <w:tcW w:type="dxa" w:w="1426"/>
+            <w:tcBorders>
+              <w:top w:val="single" w:color="000000" w:sz="4"/>
+              <w:left w:val="single" w:color="000000" w:sz="4"/>
+              <w:bottom w:val="single" w:color="000000" w:sz="4"/>
+              <w:right w:val="single" w:color="000000" w:sz="4"/>
+            </w:tcBorders>
+            <w:tcMar>
+              <w:top w:type="dxa" w:w="60"/>
+              <w:left w:type="dxa" w:w="100"/>
+              <w:bottom w:type="dxa" w:w="60"/>
+              <w:right w:type="dxa" w:w="100"/>
+            </w:tcMar>
+          </w:tcPr>
+          <w:p>
+            <w:pPr>
+              <w:spacing w:line="276"/>
+              <w:jc w:val="left"/>
+            </w:pPr>
+            <w:r>
+              <w:rPr>
+                <w:rFonts w:ascii="Times New Roman" w:cs="Times New Roman" w:eastAsia="Times New Roman" w:hAnsi="Times New Roman"/>
+                <w:b w:val="false"/>
+                <w:bCs w:val="false"/>
+                <w:sz w:val="24"/>
+                <w:szCs w:val="24"/>
+              </w:rPr>
+              <w:t xml:space="preserve">10</w:t>
+            </w:r>
+          </w:p>
+        </w:tc>
+      </w:tr>
+      <w:tr>
+        <w:trPr>
+          <w:cantSplit/>
+          <w:tblHeader w:val="false"/>
+        </w:trPr>
+        <w:tc>
+          <w:tcPr>
+            <w:tcW w:type="dxa" w:w="1800"/>
+            <w:tcBorders>
+              <w:top w:val="single" w:color="000000" w:sz="4"/>
+              <w:left w:val="single" w:color="000000" w:sz="4"/>
+              <w:bottom w:val="single" w:color="000000" w:sz="4"/>
+              <w:right w:val="single" w:color="000000" w:sz="4"/>
+            </w:tcBorders>
+            <w:tcMar>
+              <w:top w:type="dxa" w:w="60"/>
+              <w:left w:type="dxa" w:w="100"/>
+              <w:bottom w:type="dxa" w:w="60"/>
+              <w:right w:type="dxa" w:w="100"/>
+            </w:tcMar>
+          </w:tcPr>
+          <w:p>
+            <w:pPr>
+              <w:spacing w:line="276"/>
+              <w:jc w:val="left"/>
+            </w:pPr>
+            <w:r>
+              <w:rPr>
+                <w:rFonts w:ascii="Times New Roman" w:cs="Times New Roman" w:eastAsia="Times New Roman" w:hAnsi="Times New Roman"/>
+                <w:b w:val="false"/>
+                <w:bCs w:val="false"/>
+                <w:sz w:val="24"/>
+                <w:szCs w:val="24"/>
+              </w:rPr>
+              <w:t xml:space="preserve">Hostile, 10% loss (300 packets)</w:t>
+            </w:r>
+          </w:p>
+        </w:tc>
+        <w:tc>
+          <w:tcPr>
+            <w:tcW w:type="dxa" w:w="1300"/>
+            <w:tcBorders>
+              <w:top w:val="single" w:color="000000" w:sz="4"/>
+              <w:left w:val="single" w:color="000000" w:sz="4"/>
+              <w:bottom w:val="single" w:color="000000" w:sz="4"/>
+              <w:right w:val="single" w:color="000000" w:sz="4"/>
+            </w:tcBorders>
+            <w:tcMar>
+              <w:top w:type="dxa" w:w="60"/>
+              <w:left w:type="dxa" w:w="100"/>
+              <w:bottom w:type="dxa" w:w="60"/>
+              <w:right w:type="dxa" w:w="100"/>
+            </w:tcMar>
+          </w:tcPr>
+          <w:p>
+            <w:pPr>
+              <w:spacing w:line="276"/>
+              <w:jc w:val="left"/>
+            </w:pPr>
+            <w:r>
+              <w:rPr>
+                <w:rFonts w:ascii="Times New Roman" w:cs="Times New Roman" w:eastAsia="Times New Roman" w:hAnsi="Times New Roman"/>
+                <w:b w:val="false"/>
+                <w:bCs w:val="false"/>
+                <w:sz w:val="24"/>
+                <w:szCs w:val="24"/>
+              </w:rPr>
+              <w:t xml:space="preserve">11.08 +/- 2.78</w:t>
+            </w:r>
+          </w:p>
+        </w:tc>
+        <w:tc>
+          <w:tcPr>
+            <w:tcW w:type="dxa" w:w="1500"/>
+            <w:tcBorders>
+              <w:top w:val="single" w:color="000000" w:sz="4"/>
+              <w:left w:val="single" w:color="000000" w:sz="4"/>
+              <w:bottom w:val="single" w:color="000000" w:sz="4"/>
+              <w:right w:val="single" w:color="000000" w:sz="4"/>
+            </w:tcBorders>
+            <w:tcMar>
+              <w:top w:type="dxa" w:w="60"/>
+              <w:left w:type="dxa" w:w="100"/>
+              <w:bottom w:type="dxa" w:w="60"/>
+              <w:right w:type="dxa" w:w="100"/>
+            </w:tcMar>
+          </w:tcPr>
+          <w:p>
+            <w:pPr>
+              <w:spacing w:line="276"/>
+              <w:jc w:val="left"/>
+            </w:pPr>
+            <w:r>
+              <w:rPr>
+                <w:rFonts w:ascii="Times New Roman" w:cs="Times New Roman" w:eastAsia="Times New Roman" w:hAnsi="Times New Roman"/>
+                <w:b w:val="false"/>
+                <w:bCs w:val="false"/>
+                <w:sz w:val="24"/>
+                <w:szCs w:val="24"/>
+              </w:rPr>
+              <w:t xml:space="preserve">84.85 +/- 32.00</w:t>
+            </w:r>
+          </w:p>
+        </w:tc>
+        <w:tc>
+          <w:tcPr>
+            <w:tcW w:type="dxa" w:w="1500"/>
+            <w:tcBorders>
+              <w:top w:val="single" w:color="000000" w:sz="4"/>
+              <w:left w:val="single" w:color="000000" w:sz="4"/>
+              <w:bottom w:val="single" w:color="000000" w:sz="4"/>
+              <w:right w:val="single" w:color="000000" w:sz="4"/>
+            </w:tcBorders>
+            <w:tcMar>
+              <w:top w:type="dxa" w:w="60"/>
+              <w:left w:type="dxa" w:w="100"/>
+              <w:bottom w:type="dxa" w:w="60"/>
+              <w:right w:type="dxa" w:w="100"/>
+            </w:tcMar>
+          </w:tcPr>
+          <w:p>
+            <w:pPr>
+              <w:spacing w:line="276"/>
+              <w:jc w:val="left"/>
+            </w:pPr>
+            <w:r>
+              <w:rPr>
+                <w:rFonts w:ascii="Times New Roman" w:cs="Times New Roman" w:eastAsia="Times New Roman" w:hAnsi="Times New Roman"/>
+                <w:b w:val="false"/>
+                <w:bCs w:val="false"/>
+                <w:sz w:val="24"/>
+                <w:szCs w:val="24"/>
+              </w:rPr>
+              <w:t xml:space="preserve">17.57 +/- 10.58</w:t>
+            </w:r>
+          </w:p>
+        </w:tc>
+        <w:tc>
+          <w:tcPr>
+            <w:tcW w:type="dxa" w:w="1500"/>
+            <w:tcBorders>
+              <w:top w:val="single" w:color="000000" w:sz="4"/>
+              <w:left w:val="single" w:color="000000" w:sz="4"/>
+              <w:bottom w:val="single" w:color="000000" w:sz="4"/>
+              <w:right w:val="single" w:color="000000" w:sz="4"/>
+            </w:tcBorders>
+            <w:tcMar>
+              <w:top w:type="dxa" w:w="60"/>
+              <w:left w:type="dxa" w:w="100"/>
+              <w:bottom w:type="dxa" w:w="60"/>
+              <w:right w:type="dxa" w:w="100"/>
+            </w:tcMar>
+          </w:tcPr>
+          <w:p>
+            <w:pPr>
+              <w:spacing w:line="276"/>
+              <w:jc w:val="left"/>
+            </w:pPr>
+            <w:r>
+              <w:rPr>
+                <w:rFonts w:ascii="Times New Roman" w:cs="Times New Roman" w:eastAsia="Times New Roman" w:hAnsi="Times New Roman"/>
+                <w:b w:val="false"/>
+                <w:bCs w:val="false"/>
+                <w:sz w:val="24"/>
+                <w:szCs w:val="24"/>
+              </w:rPr>
+              <w:t xml:space="preserve">13.91 +/- 6.50</w:t>
+            </w:r>
+          </w:p>
+        </w:tc>
+        <w:tc>
+          <w:tcPr>
+            <w:tcW w:type="dxa" w:w="1426"/>
+            <w:tcBorders>
+              <w:top w:val="single" w:color="000000" w:sz="4"/>
+              <w:left w:val="single" w:color="000000" w:sz="4"/>
+              <w:bottom w:val="single" w:color="000000" w:sz="4"/>
+              <w:right w:val="single" w:color="000000" w:sz="4"/>
+            </w:tcBorders>
+            <w:tcMar>
+              <w:top w:type="dxa" w:w="60"/>
+              <w:left w:type="dxa" w:w="100"/>
+              <w:bottom w:type="dxa" w:w="60"/>
+              <w:right w:type="dxa" w:w="100"/>
+            </w:tcMar>
+          </w:tcPr>
+          <w:p>
+            <w:pPr>
+              <w:spacing w:line="276"/>
+              <w:jc w:val="left"/>
+            </w:pPr>
+            <w:r>
+              <w:rPr>
+                <w:rFonts w:ascii="Times New Roman" w:cs="Times New Roman" w:eastAsia="Times New Roman" w:hAnsi="Times New Roman"/>
+                <w:b w:val="false"/>
+                <w:bCs w:val="false"/>
+                <w:sz w:val="24"/>
+                <w:szCs w:val="24"/>
+              </w:rPr>
+              <w:t xml:space="preserve">5</w:t>
+            </w:r>
+          </w:p>
+        </w:tc>
+      </w:tr>
+    </w:tbl>
+    <w:p>
+      <w:pPr>
+        <w:spacing w:after="160"/>
+      </w:pPr>
+    </w:p>
+    <w:p>
+      <w:pPr>
+        <w:spacing w:after="120" w:line="360"/>
+        <w:jc w:val="both"/>
+      </w:pPr>
+      <w:r>
+        <w:rPr>
+          <w:rFonts w:ascii="Times New Roman" w:cs="Times New Roman" w:eastAsia="Times New Roman" w:hAnsi="Times New Roman"/>
+          <w:sz w:val="24"/>
+          <w:szCs w:val="24"/>
+        </w:rPr>
+        <w:t xml:space="preserve">With the hand-over, the three benign paths keep the neural agent's advantage over AIMD (significant for all three with either threshold; for the lossy path the plain agent's difference of 1.5 s was not significant in this run, while the hybrid's was), and the hostile path drops from 85 s to 14 to 18 s, which is not significantly different from AIMD (paired difference +2.8 s with an interval of 8.3 s for the 10% threshold). The hybrid agent is therefore the recommended configuration (--hybrid 0.10). In the calibrated simulator (Section 8.7, in-order jitter, realistic recovery and adaptive timeout; 70 random paths of 300 packets) the plain agent averaged 73.3 s against 49.3 s for AIMD, and the hybrid 53.0 s (faster than AIMD on 25 paths, slower on 31): it removes most of the damage and gains only on paths with 1 to 8% loss (28.4 s against 31.0 s). The honest summary is that the learned controller helps on clean-to-moderate paths and needs a classical controller as a safety net everywhere else. The chat gateway has the same options (--hybrid, --tcut), and the test suite covers the hand-over.</w:t>
+      </w:r>
+    </w:p>
+    <w:p>
+      <w:pPr>
         <w:pStyle w:val="Heading1"/>
         <w:keepNext/>
         <w:spacing w:after="120" w:before="240" w:line="360"/>
@@ -22580,6 +23694,25 @@
           <w:szCs w:val="24"/>
         </w:rPr>
         <w:t xml:space="preserve">Making selective acknowledgment the default and testing it on a real path where throughput, not the bottleneck rate, limits the transfer (the option exists in Section 8.5).</w:t>
+      </w:r>
+    </w:p>
+    <w:p>
+      <w:pPr>
+        <w:pStyle w:val="ListParagraph"/>
+        <w:numPr>
+          <w:ilvl w:val="0"/>
+          <w:numId w:val="2"/>
+        </w:numPr>
+        <w:spacing w:after="60" w:line="360"/>
+        <w:jc w:val="both"/>
+      </w:pPr>
+      <w:r>
+        <w:rPr>
+          <w:rFonts w:ascii="Times New Roman" w:cs="Times New Roman" w:eastAsia="Times New Roman" w:hAnsi="Times New Roman"/>
+          <w:sz w:val="24"/>
+          <w:szCs w:val="24"/>
+        </w:rPr>
+        <w:t xml:space="preserve">Training the agent against the hand-over (so it learns when not to act), and a lower-loss-aware reward; the hybrid of Section 8.8 is a rule, not a learned policy.</w:t>
       </w:r>
     </w:p>
     <w:p>

</xml_diff>

<commit_message>
Selective Repeat replaces Go-Back-N as the default (C client/server, smart_client, chat, gateway); --gbn / RUDP_GBN for comparison; eval_ci7; docs
Co-Authored-By: Claude Sonnet 5.5 <noreply@anthropic.com>
Claude-Session: https://claude.ai/code/session_01NX2zRNpdVAnzFNKmqomzKu
</commit_message>
<xml_diff>
--- a/docs/RUDP_Final_Project_Report.docx
+++ b/docs/RUDP_Final_Project_Report.docx
@@ -1766,7 +1766,7 @@
           <w:sz w:val="24"/>
           <w:szCs w:val="24"/>
         </w:rPr>
-        <w:t xml:space="preserve">The client numbers its data packets consecutively. The server accepts only the packet it expects next; it then advances its expected number and returns a cumulative ACK meaning that everything before that number has arrived. An out-of-order or duplicate packet is discarded and the server repeats its last ACK. This is the Go-Back-N strategy.</w:t>
+        <w:t xml:space="preserve">The client numbers its data packets consecutively. The server accepts only the packet it expects next; it then advances its expected number and returns a cumulative ACK meaning that everything before that number has arrived. An out-of-order or duplicate packet is discarded and the server repeats its last ACK. This is the Go-Back-N strategy. It was the first design and was later replaced as the default by Selective Repeat (Section 8.9): the server now buffers out-of-order packets and reports them in every ACK, and the sender resends only what is missing. Go-Back-N remains available (--gbn, RUDP_GBN, server built with -DRUDP_GBN) for comparison.</w:t>
       </w:r>
     </w:p>
     <w:p>
@@ -7946,7 +7946,7 @@
           <w:sz w:val="24"/>
           <w:szCs w:val="24"/>
         </w:rPr>
-        <w:t xml:space="preserve">Both modes share the same reliability code: Go-Back-N, an adaptive retransmission timeout from the smoothed RTT and its deviation (clamped between 60 and 3,000 ms, doubled after a timeout), and fast retransmit on three duplicate ACKs that resends the whole in-flight window. Only the window policy differs. The baseline therefore differs from the original RUDP client of Section 3 in using the adaptive timeout and in a 128-packet window cap; it keeps slow start to a threshold of 16 followed by additive increase.</w:t>
+        <w:t xml:space="preserve">Both modes share the same reliability code (Go-Back-N when the experiments of Sections 8.1 to 8.8 were run; Selective Repeat is now the default, Section 8.9): an adaptive retransmission timeout from the smoothed RTT and its deviation (clamped between 60 and 3,000 ms, doubled after a timeout), and fast retransmit on three duplicate ACKs that resends the whole in-flight window. Only the window policy differs. The baseline therefore differs from the original RUDP client of Section 3 in using the adaptive timeout and in a 128-packet window cap; it keeps slow start to a threshold of 16 followed by additive increase.</w:t>
       </w:r>
     </w:p>
     <w:p>
@@ -10905,7 +10905,7 @@
           <w:sz w:val="24"/>
           <w:szCs w:val="24"/>
         </w:rPr>
-        <w:t xml:space="preserve">Go-Back-N limits what any window policy can achieve: with loss of a few percent, most windows contain a loss and the receiver discards everything after it. Selective acknowledgments would help both modes.</w:t>
+        <w:t xml:space="preserve">Go-Back-N limits what any window policy can achieve: with loss of a few percent, most windows contain a loss and the receiver discards everything after it. Selective acknowledgments would help both modes, and Selective Repeat is now the default (Section 8.9).</w:t>
       </w:r>
     </w:p>
     <w:p>
@@ -16764,6 +16764,1134 @@
           <w:szCs w:val="24"/>
         </w:rPr>
         <w:t xml:space="preserve">With the hand-over, the three benign paths keep the neural agent's advantage over AIMD (significant for all three with either threshold; for the lossy path the plain agent's difference of 1.5 s was not significant in this run, while the hybrid's was), and the hostile path drops from 85 s to 14 to 18 s, which is not significantly different from AIMD (paired difference +2.8 s with an interval of 8.3 s for the 10% threshold). The hybrid agent is therefore the recommended configuration (--hybrid 0.10). In the calibrated simulator (Section 8.7, in-order jitter, realistic recovery and adaptive timeout; 70 random paths of 300 packets) the plain agent averaged 73.3 s against 49.3 s for AIMD, and the hybrid 53.0 s (faster than AIMD on 25 paths, slower on 31): it removes most of the damage and gains only on paths with 1 to 8% loss (28.4 s against 31.0 s). The honest summary is that the learned controller helps on clean-to-moderate paths and needs a classical controller as a safety net everywhere else. The chat gateway has the same options (--hybrid, --tcut), and the test suite covers the hand-over.</w:t>
+      </w:r>
+    </w:p>
+    <w:p>
+      <w:pPr>
+        <w:pStyle w:val="Heading2"/>
+        <w:keepNext/>
+        <w:spacing w:after="120" w:before="120" w:line="360"/>
+      </w:pPr>
+      <w:r>
+        <w:rPr>
+          <w:rFonts w:ascii="Times New Roman" w:cs="Times New Roman" w:eastAsia="Times New Roman" w:hAnsi="Times New Roman"/>
+          <w:b/>
+          <w:bCs/>
+          <w:sz w:val="24"/>
+          <w:szCs w:val="24"/>
+        </w:rPr>
+        <w:t xml:space="preserve">8.9 Selective Repeat replaces Go-Back-N as the default</w:t>
+      </w:r>
+    </w:p>
+    <w:p>
+      <w:pPr>
+        <w:spacing w:after="120" w:line="360"/>
+        <w:jc w:val="both"/>
+      </w:pPr>
+      <w:r>
+        <w:rPr>
+          <w:rFonts w:ascii="Times New Roman" w:cs="Times New Roman" w:eastAsia="Times New Roman" w:hAnsi="Times New Roman"/>
+          <w:sz w:val="24"/>
+          <w:szCs w:val="24"/>
+        </w:rPr>
+        <w:t xml:space="preserve">Go-Back-N was the weakest part of the design, so it has been replaced as the default in the C transport, the terminal chat and the web chat gateway. The receiver (server.c, chat.c, rudp_web.py) buffers out-of-order packets within a 64-packet window instead of discarding them and returns, in every ACK, the cumulative number plus an 8-byte bitmap of the packets it already holds. The sender (client.c, smart_client.c, the chat programs) keeps one timer per packet and resends only the packets that have expired and are not reported, and a fast retransmit resends only the holes below the highest reported packet. The window is capped at 60 so it fits the receiver's buffer. This is Selective Repeat with a cumulative ACK and a bitmap rather than one ACK per packet. Go-Back-N is still available for comparison (--gbn for smart_client, RUDP_GBN=1 for the original client and the terminal chat, --gbn for the gateway, and a server built with -DRUDP_GBN), and all tables in Sections 8.1 to 8.8 were measured with Go-Back-N and are labelled as such. The test suite now covers both modes (end to end at 20% loss for the original client in both modes, and all transport modes against both receivers).</w:t>
+      </w:r>
+    </w:p>
+    <w:p>
+      <w:pPr>
+        <w:spacing w:after="120" w:line="360"/>
+        <w:jc w:val="both"/>
+      </w:pPr>
+      <w:r>
+        <w:rPr>
+          <w:rFonts w:ascii="Times New Roman" w:cs="Times New Roman" w:eastAsia="Times New Roman" w:hAnsi="Times New Roman"/>
+          <w:sz w:val="24"/>
+          <w:szCs w:val="24"/>
+        </w:rPr>
+        <w:t xml:space="preserve">Table 8i repeats the main C comparison with Selective Repeat on both sides (10 runs per cell, 95% intervals, paired by seed, AIMD capped at 32). The neural agent now beats AIMD by 9% on the 5G-like path (0.11 s), 46% on the lossy path (3.7 s) and 50% on the satellite-like path (12.8 s), all significant, a larger margin than with Go-Back-N. The hostile 10% loss path, where the plain neural agent took 85 s with Go-Back-N, now takes 8.1 s against 7.3 s for AIMD, which is not significantly different, with 329 packets sent for 300 delivered; the hand-over of Section 8.8 neither helps nor hurts (6.9 s). The large failure of Section 8.8 was therefore mainly a Go-Back-N effect, since a lost packet no longer causes the whole window to be resent. One result goes the other way: AIMD itself was slower on the satellite-like path with Selective Repeat (25.7 s) than with Go-Back-N (19.7 s in Table 8h); the cause was not investigated, and the neural agent is faster than AIMD under both.</w:t>
+      </w:r>
+    </w:p>
+    <w:p>
+      <w:pPr>
+        <w:keepNext/>
+        <w:spacing w:after="80" w:before="120"/>
+        <w:jc w:val="center"/>
+      </w:pPr>
+      <w:r>
+        <w:rPr>
+          <w:rFonts w:ascii="Times New Roman" w:cs="Times New Roman" w:eastAsia="Times New Roman" w:hAnsi="Times New Roman"/>
+          <w:b/>
+          <w:bCs/>
+          <w:sz w:val="24"/>
+          <w:szCs w:val="24"/>
+        </w:rPr>
+        <w:t xml:space="preserve">Table 8i: Mean completion time (s) with Selective Repeat in the C transport (seeds 8001 onward)</w:t>
+      </w:r>
+    </w:p>
+    <w:tbl>
+      <w:tblPr>
+        <w:tblW w:type="dxa" w:w="9026"/>
+        <w:tblBorders>
+          <w:top w:val="single" w:color="auto" w:sz="4"/>
+          <w:left w:val="single" w:color="auto" w:sz="4"/>
+          <w:bottom w:val="single" w:color="auto" w:sz="4"/>
+          <w:right w:val="single" w:color="auto" w:sz="4"/>
+          <w:insideH w:val="single" w:color="auto" w:sz="4"/>
+          <w:insideV w:val="single" w:color="auto" w:sz="4"/>
+        </w:tblBorders>
+      </w:tblPr>
+      <w:tblGrid>
+        <w:gridCol w:w="2000"/>
+        <w:gridCol w:w="1500"/>
+        <w:gridCol w:w="1500"/>
+        <w:gridCol w:w="1500"/>
+        <w:gridCol w:w="1400"/>
+        <w:gridCol w:w="1126"/>
+      </w:tblGrid>
+      <w:tr>
+        <w:trPr>
+          <w:cantSplit/>
+          <w:tblHeader/>
+        </w:trPr>
+        <w:tc>
+          <w:tcPr>
+            <w:tcW w:type="dxa" w:w="2000"/>
+            <w:tcBorders>
+              <w:top w:val="single" w:color="000000" w:sz="4"/>
+              <w:left w:val="single" w:color="000000" w:sz="4"/>
+              <w:bottom w:val="single" w:color="000000" w:sz="4"/>
+              <w:right w:val="single" w:color="000000" w:sz="4"/>
+            </w:tcBorders>
+            <w:shd w:fill="D9D9D9" w:color="auto" w:val="clear"/>
+            <w:tcMar>
+              <w:top w:type="dxa" w:w="60"/>
+              <w:left w:type="dxa" w:w="100"/>
+              <w:bottom w:type="dxa" w:w="60"/>
+              <w:right w:type="dxa" w:w="100"/>
+            </w:tcMar>
+          </w:tcPr>
+          <w:p>
+            <w:pPr>
+              <w:spacing w:line="276"/>
+              <w:jc w:val="left"/>
+            </w:pPr>
+            <w:r>
+              <w:rPr>
+                <w:rFonts w:ascii="Times New Roman" w:cs="Times New Roman" w:eastAsia="Times New Roman" w:hAnsi="Times New Roman"/>
+                <w:b/>
+                <w:bCs/>
+                <w:sz w:val="24"/>
+                <w:szCs w:val="24"/>
+              </w:rPr>
+              <w:t xml:space="preserve">Scenario</w:t>
+            </w:r>
+          </w:p>
+        </w:tc>
+        <w:tc>
+          <w:tcPr>
+            <w:tcW w:type="dxa" w:w="1500"/>
+            <w:tcBorders>
+              <w:top w:val="single" w:color="000000" w:sz="4"/>
+              <w:left w:val="single" w:color="000000" w:sz="4"/>
+              <w:bottom w:val="single" w:color="000000" w:sz="4"/>
+              <w:right w:val="single" w:color="000000" w:sz="4"/>
+            </w:tcBorders>
+            <w:shd w:fill="D9D9D9" w:color="auto" w:val="clear"/>
+            <w:tcMar>
+              <w:top w:type="dxa" w:w="60"/>
+              <w:left w:type="dxa" w:w="100"/>
+              <w:bottom w:type="dxa" w:w="60"/>
+              <w:right w:type="dxa" w:w="100"/>
+            </w:tcMar>
+          </w:tcPr>
+          <w:p>
+            <w:pPr>
+              <w:spacing w:line="276"/>
+              <w:jc w:val="left"/>
+            </w:pPr>
+            <w:r>
+              <w:rPr>
+                <w:rFonts w:ascii="Times New Roman" w:cs="Times New Roman" w:eastAsia="Times New Roman" w:hAnsi="Times New Roman"/>
+                <w:b/>
+                <w:bCs/>
+                <w:sz w:val="24"/>
+                <w:szCs w:val="24"/>
+              </w:rPr>
+              <w:t xml:space="preserve">AIMD cap 32</w:t>
+            </w:r>
+          </w:p>
+        </w:tc>
+        <w:tc>
+          <w:tcPr>
+            <w:tcW w:type="dxa" w:w="1500"/>
+            <w:tcBorders>
+              <w:top w:val="single" w:color="000000" w:sz="4"/>
+              <w:left w:val="single" w:color="000000" w:sz="4"/>
+              <w:bottom w:val="single" w:color="000000" w:sz="4"/>
+              <w:right w:val="single" w:color="000000" w:sz="4"/>
+            </w:tcBorders>
+            <w:shd w:fill="D9D9D9" w:color="auto" w:val="clear"/>
+            <w:tcMar>
+              <w:top w:type="dxa" w:w="60"/>
+              <w:left w:type="dxa" w:w="100"/>
+              <w:bottom w:type="dxa" w:w="60"/>
+              <w:right w:type="dxa" w:w="100"/>
+            </w:tcMar>
+          </w:tcPr>
+          <w:p>
+            <w:pPr>
+              <w:spacing w:line="276"/>
+              <w:jc w:val="left"/>
+            </w:pPr>
+            <w:r>
+              <w:rPr>
+                <w:rFonts w:ascii="Times New Roman" w:cs="Times New Roman" w:eastAsia="Times New Roman" w:hAnsi="Times New Roman"/>
+                <w:b/>
+                <w:bCs/>
+                <w:sz w:val="24"/>
+                <w:szCs w:val="24"/>
+              </w:rPr>
+              <w:t xml:space="preserve">Neural</w:t>
+            </w:r>
+          </w:p>
+        </w:tc>
+        <w:tc>
+          <w:tcPr>
+            <w:tcW w:type="dxa" w:w="1500"/>
+            <w:tcBorders>
+              <w:top w:val="single" w:color="000000" w:sz="4"/>
+              <w:left w:val="single" w:color="000000" w:sz="4"/>
+              <w:bottom w:val="single" w:color="000000" w:sz="4"/>
+              <w:right w:val="single" w:color="000000" w:sz="4"/>
+            </w:tcBorders>
+            <w:shd w:fill="D9D9D9" w:color="auto" w:val="clear"/>
+            <w:tcMar>
+              <w:top w:type="dxa" w:w="60"/>
+              <w:left w:type="dxa" w:w="100"/>
+              <w:bottom w:type="dxa" w:w="60"/>
+              <w:right w:type="dxa" w:w="100"/>
+            </w:tcMar>
+          </w:tcPr>
+          <w:p>
+            <w:pPr>
+              <w:spacing w:line="276"/>
+              <w:jc w:val="left"/>
+            </w:pPr>
+            <w:r>
+              <w:rPr>
+                <w:rFonts w:ascii="Times New Roman" w:cs="Times New Roman" w:eastAsia="Times New Roman" w:hAnsi="Times New Roman"/>
+                <w:b/>
+                <w:bCs/>
+                <w:sz w:val="24"/>
+                <w:szCs w:val="24"/>
+              </w:rPr>
+              <w:t xml:space="preserve">Hybrid 10%</w:t>
+            </w:r>
+          </w:p>
+        </w:tc>
+        <w:tc>
+          <w:tcPr>
+            <w:tcW w:type="dxa" w:w="1400"/>
+            <w:tcBorders>
+              <w:top w:val="single" w:color="000000" w:sz="4"/>
+              <w:left w:val="single" w:color="000000" w:sz="4"/>
+              <w:bottom w:val="single" w:color="000000" w:sz="4"/>
+              <w:right w:val="single" w:color="000000" w:sz="4"/>
+            </w:tcBorders>
+            <w:shd w:fill="D9D9D9" w:color="auto" w:val="clear"/>
+            <w:tcMar>
+              <w:top w:type="dxa" w:w="60"/>
+              <w:left w:type="dxa" w:w="100"/>
+              <w:bottom w:type="dxa" w:w="60"/>
+              <w:right w:type="dxa" w:w="100"/>
+            </w:tcMar>
+          </w:tcPr>
+          <w:p>
+            <w:pPr>
+              <w:spacing w:line="276"/>
+              <w:jc w:val="left"/>
+            </w:pPr>
+            <w:r>
+              <w:rPr>
+                <w:rFonts w:ascii="Times New Roman" w:cs="Times New Roman" w:eastAsia="Times New Roman" w:hAnsi="Times New Roman"/>
+                <w:b/>
+                <w:bCs/>
+                <w:sz w:val="24"/>
+                <w:szCs w:val="24"/>
+              </w:rPr>
+              <w:t xml:space="preserve">Neural - AIMD</w:t>
+            </w:r>
+          </w:p>
+        </w:tc>
+        <w:tc>
+          <w:tcPr>
+            <w:tcW w:type="dxa" w:w="1126"/>
+            <w:tcBorders>
+              <w:top w:val="single" w:color="000000" w:sz="4"/>
+              <w:left w:val="single" w:color="000000" w:sz="4"/>
+              <w:bottom w:val="single" w:color="000000" w:sz="4"/>
+              <w:right w:val="single" w:color="000000" w:sz="4"/>
+            </w:tcBorders>
+            <w:shd w:fill="D9D9D9" w:color="auto" w:val="clear"/>
+            <w:tcMar>
+              <w:top w:type="dxa" w:w="60"/>
+              <w:left w:type="dxa" w:w="100"/>
+              <w:bottom w:type="dxa" w:w="60"/>
+              <w:right w:type="dxa" w:w="100"/>
+            </w:tcMar>
+          </w:tcPr>
+          <w:p>
+            <w:pPr>
+              <w:spacing w:line="276"/>
+              <w:jc w:val="left"/>
+            </w:pPr>
+            <w:r>
+              <w:rPr>
+                <w:rFonts w:ascii="Times New Roman" w:cs="Times New Roman" w:eastAsia="Times New Roman" w:hAnsi="Times New Roman"/>
+                <w:b/>
+                <w:bCs/>
+                <w:sz w:val="24"/>
+                <w:szCs w:val="24"/>
+              </w:rPr>
+              <w:t xml:space="preserve">Runs</w:t>
+            </w:r>
+          </w:p>
+        </w:tc>
+      </w:tr>
+      <w:tr>
+        <w:trPr>
+          <w:cantSplit/>
+          <w:tblHeader w:val="false"/>
+        </w:trPr>
+        <w:tc>
+          <w:tcPr>
+            <w:tcW w:type="dxa" w:w="2000"/>
+            <w:tcBorders>
+              <w:top w:val="single" w:color="000000" w:sz="4"/>
+              <w:left w:val="single" w:color="000000" w:sz="4"/>
+              <w:bottom w:val="single" w:color="000000" w:sz="4"/>
+              <w:right w:val="single" w:color="000000" w:sz="4"/>
+            </w:tcBorders>
+            <w:tcMar>
+              <w:top w:type="dxa" w:w="60"/>
+              <w:left w:type="dxa" w:w="100"/>
+              <w:bottom w:type="dxa" w:w="60"/>
+              <w:right w:type="dxa" w:w="100"/>
+            </w:tcMar>
+          </w:tcPr>
+          <w:p>
+            <w:pPr>
+              <w:spacing w:line="276"/>
+              <w:jc w:val="left"/>
+            </w:pPr>
+            <w:r>
+              <w:rPr>
+                <w:rFonts w:ascii="Times New Roman" w:cs="Times New Roman" w:eastAsia="Times New Roman" w:hAnsi="Times New Roman"/>
+                <w:b w:val="false"/>
+                <w:bCs w:val="false"/>
+                <w:sz w:val="24"/>
+                <w:szCs w:val="24"/>
+              </w:rPr>
+              <w:t xml:space="preserve">5G-like</w:t>
+            </w:r>
+          </w:p>
+        </w:tc>
+        <w:tc>
+          <w:tcPr>
+            <w:tcW w:type="dxa" w:w="1500"/>
+            <w:tcBorders>
+              <w:top w:val="single" w:color="000000" w:sz="4"/>
+              <w:left w:val="single" w:color="000000" w:sz="4"/>
+              <w:bottom w:val="single" w:color="000000" w:sz="4"/>
+              <w:right w:val="single" w:color="000000" w:sz="4"/>
+            </w:tcBorders>
+            <w:tcMar>
+              <w:top w:type="dxa" w:w="60"/>
+              <w:left w:type="dxa" w:w="100"/>
+              <w:bottom w:type="dxa" w:w="60"/>
+              <w:right w:type="dxa" w:w="100"/>
+            </w:tcMar>
+          </w:tcPr>
+          <w:p>
+            <w:pPr>
+              <w:spacing w:line="276"/>
+              <w:jc w:val="left"/>
+            </w:pPr>
+            <w:r>
+              <w:rPr>
+                <w:rFonts w:ascii="Times New Roman" w:cs="Times New Roman" w:eastAsia="Times New Roman" w:hAnsi="Times New Roman"/>
+                <w:b w:val="false"/>
+                <w:bCs w:val="false"/>
+                <w:sz w:val="24"/>
+                <w:szCs w:val="24"/>
+              </w:rPr>
+              <w:t xml:space="preserve">1.27 +/- 0.10</w:t>
+            </w:r>
+          </w:p>
+        </w:tc>
+        <w:tc>
+          <w:tcPr>
+            <w:tcW w:type="dxa" w:w="1500"/>
+            <w:tcBorders>
+              <w:top w:val="single" w:color="000000" w:sz="4"/>
+              <w:left w:val="single" w:color="000000" w:sz="4"/>
+              <w:bottom w:val="single" w:color="000000" w:sz="4"/>
+              <w:right w:val="single" w:color="000000" w:sz="4"/>
+            </w:tcBorders>
+            <w:tcMar>
+              <w:top w:type="dxa" w:w="60"/>
+              <w:left w:type="dxa" w:w="100"/>
+              <w:bottom w:type="dxa" w:w="60"/>
+              <w:right w:type="dxa" w:w="100"/>
+            </w:tcMar>
+          </w:tcPr>
+          <w:p>
+            <w:pPr>
+              <w:spacing w:line="276"/>
+              <w:jc w:val="left"/>
+            </w:pPr>
+            <w:r>
+              <w:rPr>
+                <w:rFonts w:ascii="Times New Roman" w:cs="Times New Roman" w:eastAsia="Times New Roman" w:hAnsi="Times New Roman"/>
+                <w:b w:val="false"/>
+                <w:bCs w:val="false"/>
+                <w:sz w:val="24"/>
+                <w:szCs w:val="24"/>
+              </w:rPr>
+              <w:t xml:space="preserve">1.16 +/- 0.02</w:t>
+            </w:r>
+          </w:p>
+        </w:tc>
+        <w:tc>
+          <w:tcPr>
+            <w:tcW w:type="dxa" w:w="1500"/>
+            <w:tcBorders>
+              <w:top w:val="single" w:color="000000" w:sz="4"/>
+              <w:left w:val="single" w:color="000000" w:sz="4"/>
+              <w:bottom w:val="single" w:color="000000" w:sz="4"/>
+              <w:right w:val="single" w:color="000000" w:sz="4"/>
+            </w:tcBorders>
+            <w:tcMar>
+              <w:top w:type="dxa" w:w="60"/>
+              <w:left w:type="dxa" w:w="100"/>
+              <w:bottom w:type="dxa" w:w="60"/>
+              <w:right w:type="dxa" w:w="100"/>
+            </w:tcMar>
+          </w:tcPr>
+          <w:p>
+            <w:pPr>
+              <w:spacing w:line="276"/>
+              <w:jc w:val="left"/>
+            </w:pPr>
+            <w:r>
+              <w:rPr>
+                <w:rFonts w:ascii="Times New Roman" w:cs="Times New Roman" w:eastAsia="Times New Roman" w:hAnsi="Times New Roman"/>
+                <w:b w:val="false"/>
+                <w:bCs w:val="false"/>
+                <w:sz w:val="24"/>
+                <w:szCs w:val="24"/>
+              </w:rPr>
+              <w:t xml:space="preserve">1.16 +/- 0.02</w:t>
+            </w:r>
+          </w:p>
+        </w:tc>
+        <w:tc>
+          <w:tcPr>
+            <w:tcW w:type="dxa" w:w="1400"/>
+            <w:tcBorders>
+              <w:top w:val="single" w:color="000000" w:sz="4"/>
+              <w:left w:val="single" w:color="000000" w:sz="4"/>
+              <w:bottom w:val="single" w:color="000000" w:sz="4"/>
+              <w:right w:val="single" w:color="000000" w:sz="4"/>
+            </w:tcBorders>
+            <w:tcMar>
+              <w:top w:type="dxa" w:w="60"/>
+              <w:left w:type="dxa" w:w="100"/>
+              <w:bottom w:type="dxa" w:w="60"/>
+              <w:right w:type="dxa" w:w="100"/>
+            </w:tcMar>
+          </w:tcPr>
+          <w:p>
+            <w:pPr>
+              <w:spacing w:line="276"/>
+              <w:jc w:val="left"/>
+            </w:pPr>
+            <w:r>
+              <w:rPr>
+                <w:rFonts w:ascii="Times New Roman" w:cs="Times New Roman" w:eastAsia="Times New Roman" w:hAnsi="Times New Roman"/>
+                <w:b w:val="false"/>
+                <w:bCs w:val="false"/>
+                <w:sz w:val="24"/>
+                <w:szCs w:val="24"/>
+              </w:rPr>
+              <w:t xml:space="preserve">-0.11 s</w:t>
+            </w:r>
+          </w:p>
+        </w:tc>
+        <w:tc>
+          <w:tcPr>
+            <w:tcW w:type="dxa" w:w="1126"/>
+            <w:tcBorders>
+              <w:top w:val="single" w:color="000000" w:sz="4"/>
+              <w:left w:val="single" w:color="000000" w:sz="4"/>
+              <w:bottom w:val="single" w:color="000000" w:sz="4"/>
+              <w:right w:val="single" w:color="000000" w:sz="4"/>
+            </w:tcBorders>
+            <w:tcMar>
+              <w:top w:type="dxa" w:w="60"/>
+              <w:left w:type="dxa" w:w="100"/>
+              <w:bottom w:type="dxa" w:w="60"/>
+              <w:right w:type="dxa" w:w="100"/>
+            </w:tcMar>
+          </w:tcPr>
+          <w:p>
+            <w:pPr>
+              <w:spacing w:line="276"/>
+              <w:jc w:val="left"/>
+            </w:pPr>
+            <w:r>
+              <w:rPr>
+                <w:rFonts w:ascii="Times New Roman" w:cs="Times New Roman" w:eastAsia="Times New Roman" w:hAnsi="Times New Roman"/>
+                <w:b w:val="false"/>
+                <w:bCs w:val="false"/>
+                <w:sz w:val="24"/>
+                <w:szCs w:val="24"/>
+              </w:rPr>
+              <w:t xml:space="preserve">10</w:t>
+            </w:r>
+          </w:p>
+        </w:tc>
+      </w:tr>
+      <w:tr>
+        <w:trPr>
+          <w:cantSplit/>
+          <w:tblHeader w:val="false"/>
+        </w:trPr>
+        <w:tc>
+          <w:tcPr>
+            <w:tcW w:type="dxa" w:w="2000"/>
+            <w:tcBorders>
+              <w:top w:val="single" w:color="000000" w:sz="4"/>
+              <w:left w:val="single" w:color="000000" w:sz="4"/>
+              <w:bottom w:val="single" w:color="000000" w:sz="4"/>
+              <w:right w:val="single" w:color="000000" w:sz="4"/>
+            </w:tcBorders>
+            <w:tcMar>
+              <w:top w:type="dxa" w:w="60"/>
+              <w:left w:type="dxa" w:w="100"/>
+              <w:bottom w:type="dxa" w:w="60"/>
+              <w:right w:type="dxa" w:w="100"/>
+            </w:tcMar>
+          </w:tcPr>
+          <w:p>
+            <w:pPr>
+              <w:spacing w:line="276"/>
+              <w:jc w:val="left"/>
+            </w:pPr>
+            <w:r>
+              <w:rPr>
+                <w:rFonts w:ascii="Times New Roman" w:cs="Times New Roman" w:eastAsia="Times New Roman" w:hAnsi="Times New Roman"/>
+                <w:b w:val="false"/>
+                <w:bCs w:val="false"/>
+                <w:sz w:val="24"/>
+                <w:szCs w:val="24"/>
+              </w:rPr>
+              <w:t xml:space="preserve">Lossy wireless (2%)</w:t>
+            </w:r>
+          </w:p>
+        </w:tc>
+        <w:tc>
+          <w:tcPr>
+            <w:tcW w:type="dxa" w:w="1500"/>
+            <w:tcBorders>
+              <w:top w:val="single" w:color="000000" w:sz="4"/>
+              <w:left w:val="single" w:color="000000" w:sz="4"/>
+              <w:bottom w:val="single" w:color="000000" w:sz="4"/>
+              <w:right w:val="single" w:color="000000" w:sz="4"/>
+            </w:tcBorders>
+            <w:tcMar>
+              <w:top w:type="dxa" w:w="60"/>
+              <w:left w:type="dxa" w:w="100"/>
+              <w:bottom w:type="dxa" w:w="60"/>
+              <w:right w:type="dxa" w:w="100"/>
+            </w:tcMar>
+          </w:tcPr>
+          <w:p>
+            <w:pPr>
+              <w:spacing w:line="276"/>
+              <w:jc w:val="left"/>
+            </w:pPr>
+            <w:r>
+              <w:rPr>
+                <w:rFonts w:ascii="Times New Roman" w:cs="Times New Roman" w:eastAsia="Times New Roman" w:hAnsi="Times New Roman"/>
+                <w:b w:val="false"/>
+                <w:bCs w:val="false"/>
+                <w:sz w:val="24"/>
+                <w:szCs w:val="24"/>
+              </w:rPr>
+              <w:t xml:space="preserve">7.99 +/- 0.70</w:t>
+            </w:r>
+          </w:p>
+        </w:tc>
+        <w:tc>
+          <w:tcPr>
+            <w:tcW w:type="dxa" w:w="1500"/>
+            <w:tcBorders>
+              <w:top w:val="single" w:color="000000" w:sz="4"/>
+              <w:left w:val="single" w:color="000000" w:sz="4"/>
+              <w:bottom w:val="single" w:color="000000" w:sz="4"/>
+              <w:right w:val="single" w:color="000000" w:sz="4"/>
+            </w:tcBorders>
+            <w:tcMar>
+              <w:top w:type="dxa" w:w="60"/>
+              <w:left w:type="dxa" w:w="100"/>
+              <w:bottom w:type="dxa" w:w="60"/>
+              <w:right w:type="dxa" w:w="100"/>
+            </w:tcMar>
+          </w:tcPr>
+          <w:p>
+            <w:pPr>
+              <w:spacing w:line="276"/>
+              <w:jc w:val="left"/>
+            </w:pPr>
+            <w:r>
+              <w:rPr>
+                <w:rFonts w:ascii="Times New Roman" w:cs="Times New Roman" w:eastAsia="Times New Roman" w:hAnsi="Times New Roman"/>
+                <w:b w:val="false"/>
+                <w:bCs w:val="false"/>
+                <w:sz w:val="24"/>
+                <w:szCs w:val="24"/>
+              </w:rPr>
+              <w:t xml:space="preserve">4.29 +/- 0.29</w:t>
+            </w:r>
+          </w:p>
+        </w:tc>
+        <w:tc>
+          <w:tcPr>
+            <w:tcW w:type="dxa" w:w="1500"/>
+            <w:tcBorders>
+              <w:top w:val="single" w:color="000000" w:sz="4"/>
+              <w:left w:val="single" w:color="000000" w:sz="4"/>
+              <w:bottom w:val="single" w:color="000000" w:sz="4"/>
+              <w:right w:val="single" w:color="000000" w:sz="4"/>
+            </w:tcBorders>
+            <w:tcMar>
+              <w:top w:type="dxa" w:w="60"/>
+              <w:left w:type="dxa" w:w="100"/>
+              <w:bottom w:type="dxa" w:w="60"/>
+              <w:right w:type="dxa" w:w="100"/>
+            </w:tcMar>
+          </w:tcPr>
+          <w:p>
+            <w:pPr>
+              <w:spacing w:line="276"/>
+              <w:jc w:val="left"/>
+            </w:pPr>
+            <w:r>
+              <w:rPr>
+                <w:rFonts w:ascii="Times New Roman" w:cs="Times New Roman" w:eastAsia="Times New Roman" w:hAnsi="Times New Roman"/>
+                <w:b w:val="false"/>
+                <w:bCs w:val="false"/>
+                <w:sz w:val="24"/>
+                <w:szCs w:val="24"/>
+              </w:rPr>
+              <w:t xml:space="preserve">4.29 +/- 0.30</w:t>
+            </w:r>
+          </w:p>
+        </w:tc>
+        <w:tc>
+          <w:tcPr>
+            <w:tcW w:type="dxa" w:w="1400"/>
+            <w:tcBorders>
+              <w:top w:val="single" w:color="000000" w:sz="4"/>
+              <w:left w:val="single" w:color="000000" w:sz="4"/>
+              <w:bottom w:val="single" w:color="000000" w:sz="4"/>
+              <w:right w:val="single" w:color="000000" w:sz="4"/>
+            </w:tcBorders>
+            <w:tcMar>
+              <w:top w:type="dxa" w:w="60"/>
+              <w:left w:type="dxa" w:w="100"/>
+              <w:bottom w:type="dxa" w:w="60"/>
+              <w:right w:type="dxa" w:w="100"/>
+            </w:tcMar>
+          </w:tcPr>
+          <w:p>
+            <w:pPr>
+              <w:spacing w:line="276"/>
+              <w:jc w:val="left"/>
+            </w:pPr>
+            <w:r>
+              <w:rPr>
+                <w:rFonts w:ascii="Times New Roman" w:cs="Times New Roman" w:eastAsia="Times New Roman" w:hAnsi="Times New Roman"/>
+                <w:b w:val="false"/>
+                <w:bCs w:val="false"/>
+                <w:sz w:val="24"/>
+                <w:szCs w:val="24"/>
+              </w:rPr>
+              <w:t xml:space="preserve">-3.69 s</w:t>
+            </w:r>
+          </w:p>
+        </w:tc>
+        <w:tc>
+          <w:tcPr>
+            <w:tcW w:type="dxa" w:w="1126"/>
+            <w:tcBorders>
+              <w:top w:val="single" w:color="000000" w:sz="4"/>
+              <w:left w:val="single" w:color="000000" w:sz="4"/>
+              <w:bottom w:val="single" w:color="000000" w:sz="4"/>
+              <w:right w:val="single" w:color="000000" w:sz="4"/>
+            </w:tcBorders>
+            <w:tcMar>
+              <w:top w:type="dxa" w:w="60"/>
+              <w:left w:type="dxa" w:w="100"/>
+              <w:bottom w:type="dxa" w:w="60"/>
+              <w:right w:type="dxa" w:w="100"/>
+            </w:tcMar>
+          </w:tcPr>
+          <w:p>
+            <w:pPr>
+              <w:spacing w:line="276"/>
+              <w:jc w:val="left"/>
+            </w:pPr>
+            <w:r>
+              <w:rPr>
+                <w:rFonts w:ascii="Times New Roman" w:cs="Times New Roman" w:eastAsia="Times New Roman" w:hAnsi="Times New Roman"/>
+                <w:b w:val="false"/>
+                <w:bCs w:val="false"/>
+                <w:sz w:val="24"/>
+                <w:szCs w:val="24"/>
+              </w:rPr>
+              <w:t xml:space="preserve">10</w:t>
+            </w:r>
+          </w:p>
+        </w:tc>
+      </w:tr>
+      <w:tr>
+        <w:trPr>
+          <w:cantSplit/>
+          <w:tblHeader w:val="false"/>
+        </w:trPr>
+        <w:tc>
+          <w:tcPr>
+            <w:tcW w:type="dxa" w:w="2000"/>
+            <w:tcBorders>
+              <w:top w:val="single" w:color="000000" w:sz="4"/>
+              <w:left w:val="single" w:color="000000" w:sz="4"/>
+              <w:bottom w:val="single" w:color="000000" w:sz="4"/>
+              <w:right w:val="single" w:color="000000" w:sz="4"/>
+            </w:tcBorders>
+            <w:tcMar>
+              <w:top w:type="dxa" w:w="60"/>
+              <w:left w:type="dxa" w:w="100"/>
+              <w:bottom w:type="dxa" w:w="60"/>
+              <w:right w:type="dxa" w:w="100"/>
+            </w:tcMar>
+          </w:tcPr>
+          <w:p>
+            <w:pPr>
+              <w:spacing w:line="276"/>
+              <w:jc w:val="left"/>
+            </w:pPr>
+            <w:r>
+              <w:rPr>
+                <w:rFonts w:ascii="Times New Roman" w:cs="Times New Roman" w:eastAsia="Times New Roman" w:hAnsi="Times New Roman"/>
+                <w:b w:val="false"/>
+                <w:bCs w:val="false"/>
+                <w:sz w:val="24"/>
+                <w:szCs w:val="24"/>
+              </w:rPr>
+              <w:t xml:space="preserve">Satellite-like</w:t>
+            </w:r>
+          </w:p>
+        </w:tc>
+        <w:tc>
+          <w:tcPr>
+            <w:tcW w:type="dxa" w:w="1500"/>
+            <w:tcBorders>
+              <w:top w:val="single" w:color="000000" w:sz="4"/>
+              <w:left w:val="single" w:color="000000" w:sz="4"/>
+              <w:bottom w:val="single" w:color="000000" w:sz="4"/>
+              <w:right w:val="single" w:color="000000" w:sz="4"/>
+            </w:tcBorders>
+            <w:tcMar>
+              <w:top w:type="dxa" w:w="60"/>
+              <w:left w:type="dxa" w:w="100"/>
+              <w:bottom w:type="dxa" w:w="60"/>
+              <w:right w:type="dxa" w:w="100"/>
+            </w:tcMar>
+          </w:tcPr>
+          <w:p>
+            <w:pPr>
+              <w:spacing w:line="276"/>
+              <w:jc w:val="left"/>
+            </w:pPr>
+            <w:r>
+              <w:rPr>
+                <w:rFonts w:ascii="Times New Roman" w:cs="Times New Roman" w:eastAsia="Times New Roman" w:hAnsi="Times New Roman"/>
+                <w:b w:val="false"/>
+                <w:bCs w:val="false"/>
+                <w:sz w:val="24"/>
+                <w:szCs w:val="24"/>
+              </w:rPr>
+              <w:t xml:space="preserve">25.70 +/- 2.82</w:t>
+            </w:r>
+          </w:p>
+        </w:tc>
+        <w:tc>
+          <w:tcPr>
+            <w:tcW w:type="dxa" w:w="1500"/>
+            <w:tcBorders>
+              <w:top w:val="single" w:color="000000" w:sz="4"/>
+              <w:left w:val="single" w:color="000000" w:sz="4"/>
+              <w:bottom w:val="single" w:color="000000" w:sz="4"/>
+              <w:right w:val="single" w:color="000000" w:sz="4"/>
+            </w:tcBorders>
+            <w:tcMar>
+              <w:top w:type="dxa" w:w="60"/>
+              <w:left w:type="dxa" w:w="100"/>
+              <w:bottom w:type="dxa" w:w="60"/>
+              <w:right w:type="dxa" w:w="100"/>
+            </w:tcMar>
+          </w:tcPr>
+          <w:p>
+            <w:pPr>
+              <w:spacing w:line="276"/>
+              <w:jc w:val="left"/>
+            </w:pPr>
+            <w:r>
+              <w:rPr>
+                <w:rFonts w:ascii="Times New Roman" w:cs="Times New Roman" w:eastAsia="Times New Roman" w:hAnsi="Times New Roman"/>
+                <w:b w:val="false"/>
+                <w:bCs w:val="false"/>
+                <w:sz w:val="24"/>
+                <w:szCs w:val="24"/>
+              </w:rPr>
+              <w:t xml:space="preserve">12.91 +/- 0.26</w:t>
+            </w:r>
+          </w:p>
+        </w:tc>
+        <w:tc>
+          <w:tcPr>
+            <w:tcW w:type="dxa" w:w="1500"/>
+            <w:tcBorders>
+              <w:top w:val="single" w:color="000000" w:sz="4"/>
+              <w:left w:val="single" w:color="000000" w:sz="4"/>
+              <w:bottom w:val="single" w:color="000000" w:sz="4"/>
+              <w:right w:val="single" w:color="000000" w:sz="4"/>
+            </w:tcBorders>
+            <w:tcMar>
+              <w:top w:type="dxa" w:w="60"/>
+              <w:left w:type="dxa" w:w="100"/>
+              <w:bottom w:type="dxa" w:w="60"/>
+              <w:right w:type="dxa" w:w="100"/>
+            </w:tcMar>
+          </w:tcPr>
+          <w:p>
+            <w:pPr>
+              <w:spacing w:line="276"/>
+              <w:jc w:val="left"/>
+            </w:pPr>
+            <w:r>
+              <w:rPr>
+                <w:rFonts w:ascii="Times New Roman" w:cs="Times New Roman" w:eastAsia="Times New Roman" w:hAnsi="Times New Roman"/>
+                <w:b w:val="false"/>
+                <w:bCs w:val="false"/>
+                <w:sz w:val="24"/>
+                <w:szCs w:val="24"/>
+              </w:rPr>
+              <w:t xml:space="preserve">13.00 +/- 0.27</w:t>
+            </w:r>
+          </w:p>
+        </w:tc>
+        <w:tc>
+          <w:tcPr>
+            <w:tcW w:type="dxa" w:w="1400"/>
+            <w:tcBorders>
+              <w:top w:val="single" w:color="000000" w:sz="4"/>
+              <w:left w:val="single" w:color="000000" w:sz="4"/>
+              <w:bottom w:val="single" w:color="000000" w:sz="4"/>
+              <w:right w:val="single" w:color="000000" w:sz="4"/>
+            </w:tcBorders>
+            <w:tcMar>
+              <w:top w:type="dxa" w:w="60"/>
+              <w:left w:type="dxa" w:w="100"/>
+              <w:bottom w:type="dxa" w:w="60"/>
+              <w:right w:type="dxa" w:w="100"/>
+            </w:tcMar>
+          </w:tcPr>
+          <w:p>
+            <w:pPr>
+              <w:spacing w:line="276"/>
+              <w:jc w:val="left"/>
+            </w:pPr>
+            <w:r>
+              <w:rPr>
+                <w:rFonts w:ascii="Times New Roman" w:cs="Times New Roman" w:eastAsia="Times New Roman" w:hAnsi="Times New Roman"/>
+                <w:b w:val="false"/>
+                <w:bCs w:val="false"/>
+                <w:sz w:val="24"/>
+                <w:szCs w:val="24"/>
+              </w:rPr>
+              <w:t xml:space="preserve">-12.78 s</w:t>
+            </w:r>
+          </w:p>
+        </w:tc>
+        <w:tc>
+          <w:tcPr>
+            <w:tcW w:type="dxa" w:w="1126"/>
+            <w:tcBorders>
+              <w:top w:val="single" w:color="000000" w:sz="4"/>
+              <w:left w:val="single" w:color="000000" w:sz="4"/>
+              <w:bottom w:val="single" w:color="000000" w:sz="4"/>
+              <w:right w:val="single" w:color="000000" w:sz="4"/>
+            </w:tcBorders>
+            <w:tcMar>
+              <w:top w:type="dxa" w:w="60"/>
+              <w:left w:type="dxa" w:w="100"/>
+              <w:bottom w:type="dxa" w:w="60"/>
+              <w:right w:type="dxa" w:w="100"/>
+            </w:tcMar>
+          </w:tcPr>
+          <w:p>
+            <w:pPr>
+              <w:spacing w:line="276"/>
+              <w:jc w:val="left"/>
+            </w:pPr>
+            <w:r>
+              <w:rPr>
+                <w:rFonts w:ascii="Times New Roman" w:cs="Times New Roman" w:eastAsia="Times New Roman" w:hAnsi="Times New Roman"/>
+                <w:b w:val="false"/>
+                <w:bCs w:val="false"/>
+                <w:sz w:val="24"/>
+                <w:szCs w:val="24"/>
+              </w:rPr>
+              <w:t xml:space="preserve">10</w:t>
+            </w:r>
+          </w:p>
+        </w:tc>
+      </w:tr>
+      <w:tr>
+        <w:trPr>
+          <w:cantSplit/>
+          <w:tblHeader w:val="false"/>
+        </w:trPr>
+        <w:tc>
+          <w:tcPr>
+            <w:tcW w:type="dxa" w:w="2000"/>
+            <w:tcBorders>
+              <w:top w:val="single" w:color="000000" w:sz="4"/>
+              <w:left w:val="single" w:color="000000" w:sz="4"/>
+              <w:bottom w:val="single" w:color="000000" w:sz="4"/>
+              <w:right w:val="single" w:color="000000" w:sz="4"/>
+            </w:tcBorders>
+            <w:tcMar>
+              <w:top w:type="dxa" w:w="60"/>
+              <w:left w:type="dxa" w:w="100"/>
+              <w:bottom w:type="dxa" w:w="60"/>
+              <w:right w:type="dxa" w:w="100"/>
+            </w:tcMar>
+          </w:tcPr>
+          <w:p>
+            <w:pPr>
+              <w:spacing w:line="276"/>
+              <w:jc w:val="left"/>
+            </w:pPr>
+            <w:r>
+              <w:rPr>
+                <w:rFonts w:ascii="Times New Roman" w:cs="Times New Roman" w:eastAsia="Times New Roman" w:hAnsi="Times New Roman"/>
+                <w:b w:val="false"/>
+                <w:bCs w:val="false"/>
+                <w:sz w:val="24"/>
+                <w:szCs w:val="24"/>
+              </w:rPr>
+              <w:t xml:space="preserve">Hostile, 10% loss (300 packets)</w:t>
+            </w:r>
+          </w:p>
+        </w:tc>
+        <w:tc>
+          <w:tcPr>
+            <w:tcW w:type="dxa" w:w="1500"/>
+            <w:tcBorders>
+              <w:top w:val="single" w:color="000000" w:sz="4"/>
+              <w:left w:val="single" w:color="000000" w:sz="4"/>
+              <w:bottom w:val="single" w:color="000000" w:sz="4"/>
+              <w:right w:val="single" w:color="000000" w:sz="4"/>
+            </w:tcBorders>
+            <w:tcMar>
+              <w:top w:type="dxa" w:w="60"/>
+              <w:left w:type="dxa" w:w="100"/>
+              <w:bottom w:type="dxa" w:w="60"/>
+              <w:right w:type="dxa" w:w="100"/>
+            </w:tcMar>
+          </w:tcPr>
+          <w:p>
+            <w:pPr>
+              <w:spacing w:line="276"/>
+              <w:jc w:val="left"/>
+            </w:pPr>
+            <w:r>
+              <w:rPr>
+                <w:rFonts w:ascii="Times New Roman" w:cs="Times New Roman" w:eastAsia="Times New Roman" w:hAnsi="Times New Roman"/>
+                <w:b w:val="false"/>
+                <w:bCs w:val="false"/>
+                <w:sz w:val="24"/>
+                <w:szCs w:val="24"/>
+              </w:rPr>
+              <w:t xml:space="preserve">7.34 +/- 1.96</w:t>
+            </w:r>
+          </w:p>
+        </w:tc>
+        <w:tc>
+          <w:tcPr>
+            <w:tcW w:type="dxa" w:w="1500"/>
+            <w:tcBorders>
+              <w:top w:val="single" w:color="000000" w:sz="4"/>
+              <w:left w:val="single" w:color="000000" w:sz="4"/>
+              <w:bottom w:val="single" w:color="000000" w:sz="4"/>
+              <w:right w:val="single" w:color="000000" w:sz="4"/>
+            </w:tcBorders>
+            <w:tcMar>
+              <w:top w:type="dxa" w:w="60"/>
+              <w:left w:type="dxa" w:w="100"/>
+              <w:bottom w:type="dxa" w:w="60"/>
+              <w:right w:type="dxa" w:w="100"/>
+            </w:tcMar>
+          </w:tcPr>
+          <w:p>
+            <w:pPr>
+              <w:spacing w:line="276"/>
+              <w:jc w:val="left"/>
+            </w:pPr>
+            <w:r>
+              <w:rPr>
+                <w:rFonts w:ascii="Times New Roman" w:cs="Times New Roman" w:eastAsia="Times New Roman" w:hAnsi="Times New Roman"/>
+                <w:b w:val="false"/>
+                <w:bCs w:val="false"/>
+                <w:sz w:val="24"/>
+                <w:szCs w:val="24"/>
+              </w:rPr>
+              <w:t xml:space="preserve">8.07 +/- 6.97</w:t>
+            </w:r>
+          </w:p>
+        </w:tc>
+        <w:tc>
+          <w:tcPr>
+            <w:tcW w:type="dxa" w:w="1500"/>
+            <w:tcBorders>
+              <w:top w:val="single" w:color="000000" w:sz="4"/>
+              <w:left w:val="single" w:color="000000" w:sz="4"/>
+              <w:bottom w:val="single" w:color="000000" w:sz="4"/>
+              <w:right w:val="single" w:color="000000" w:sz="4"/>
+            </w:tcBorders>
+            <w:tcMar>
+              <w:top w:type="dxa" w:w="60"/>
+              <w:left w:type="dxa" w:w="100"/>
+              <w:bottom w:type="dxa" w:w="60"/>
+              <w:right w:type="dxa" w:w="100"/>
+            </w:tcMar>
+          </w:tcPr>
+          <w:p>
+            <w:pPr>
+              <w:spacing w:line="276"/>
+              <w:jc w:val="left"/>
+            </w:pPr>
+            <w:r>
+              <w:rPr>
+                <w:rFonts w:ascii="Times New Roman" w:cs="Times New Roman" w:eastAsia="Times New Roman" w:hAnsi="Times New Roman"/>
+                <w:b w:val="false"/>
+                <w:bCs w:val="false"/>
+                <w:sz w:val="24"/>
+                <w:szCs w:val="24"/>
+              </w:rPr>
+              <w:t xml:space="preserve">6.90 +/- 4.09</w:t>
+            </w:r>
+          </w:p>
+        </w:tc>
+        <w:tc>
+          <w:tcPr>
+            <w:tcW w:type="dxa" w:w="1400"/>
+            <w:tcBorders>
+              <w:top w:val="single" w:color="000000" w:sz="4"/>
+              <w:left w:val="single" w:color="000000" w:sz="4"/>
+              <w:bottom w:val="single" w:color="000000" w:sz="4"/>
+              <w:right w:val="single" w:color="000000" w:sz="4"/>
+            </w:tcBorders>
+            <w:tcMar>
+              <w:top w:type="dxa" w:w="60"/>
+              <w:left w:type="dxa" w:w="100"/>
+              <w:bottom w:type="dxa" w:w="60"/>
+              <w:right w:type="dxa" w:w="100"/>
+            </w:tcMar>
+          </w:tcPr>
+          <w:p>
+            <w:pPr>
+              <w:spacing w:line="276"/>
+              <w:jc w:val="left"/>
+            </w:pPr>
+            <w:r>
+              <w:rPr>
+                <w:rFonts w:ascii="Times New Roman" w:cs="Times New Roman" w:eastAsia="Times New Roman" w:hAnsi="Times New Roman"/>
+                <w:b w:val="false"/>
+                <w:bCs w:val="false"/>
+                <w:sz w:val="24"/>
+                <w:szCs w:val="24"/>
+              </w:rPr>
+              <w:t xml:space="preserve">+0.74 s (n.s.)</w:t>
+            </w:r>
+          </w:p>
+        </w:tc>
+        <w:tc>
+          <w:tcPr>
+            <w:tcW w:type="dxa" w:w="1126"/>
+            <w:tcBorders>
+              <w:top w:val="single" w:color="000000" w:sz="4"/>
+              <w:left w:val="single" w:color="000000" w:sz="4"/>
+              <w:bottom w:val="single" w:color="000000" w:sz="4"/>
+              <w:right w:val="single" w:color="000000" w:sz="4"/>
+            </w:tcBorders>
+            <w:tcMar>
+              <w:top w:type="dxa" w:w="60"/>
+              <w:left w:type="dxa" w:w="100"/>
+              <w:bottom w:type="dxa" w:w="60"/>
+              <w:right w:type="dxa" w:w="100"/>
+            </w:tcMar>
+          </w:tcPr>
+          <w:p>
+            <w:pPr>
+              <w:spacing w:line="276"/>
+              <w:jc w:val="left"/>
+            </w:pPr>
+            <w:r>
+              <w:rPr>
+                <w:rFonts w:ascii="Times New Roman" w:cs="Times New Roman" w:eastAsia="Times New Roman" w:hAnsi="Times New Roman"/>
+                <w:b w:val="false"/>
+                <w:bCs w:val="false"/>
+                <w:sz w:val="24"/>
+                <w:szCs w:val="24"/>
+              </w:rPr>
+              <w:t xml:space="preserve">5</w:t>
+            </w:r>
+          </w:p>
+        </w:tc>
+      </w:tr>
+    </w:tbl>
+    <w:p>
+      <w:pPr>
+        <w:spacing w:after="160"/>
+      </w:pPr>
+    </w:p>
+    <w:p>
+      <w:pPr>
+        <w:spacing w:after="120" w:line="360"/>
+        <w:jc w:val="both"/>
+      </w:pPr>
+      <w:r>
+        <w:rPr>
+          <w:rFonts w:ascii="Times New Roman" w:cs="Times New Roman" w:eastAsia="Times New Roman" w:hAnsi="Times New Roman"/>
+          <w:sz w:val="24"/>
+          <w:szCs w:val="24"/>
+        </w:rPr>
+        <w:t xml:space="preserve">The other implementations show the same direction. In the web gateway with 10% loss in each direction and 50 ms delay, 200 messages took 6.4 s with AIMD and Selective Repeat (23 retransmissions) against 11.9 s (141 retransmissions) with Go-Back-N, and 2.7 s against 8.6 s for the neural agent (37 against 877 retransmissions); every message arrived complete and in order. In the terminal chat at 30% loss in each direction, 30 messages were delivered with 53 packets sent (23 retransmissions) against 132 (102). These are single runs and illustrate the effect rather than measure it. A Go-Back-N sender talking to a Selective Repeat receiver still works but gets none of the benefit, and the reverse pairing delivers correctly but resends each missing packet only when its own timer expires.</w:t>
       </w:r>
     </w:p>
     <w:p>
@@ -23456,7 +24584,7 @@
           <w:sz w:val="24"/>
           <w:szCs w:val="24"/>
         </w:rPr>
-        <w:t xml:space="preserve"> One lost packet forces retransmission of the whole in-flight window on timeout, which wastes bandwidth compared with Selective Repeat.</w:t>
+        <w:t xml:space="preserve"> One lost packet forces retransmission of the whole in-flight window on timeout, which wastes bandwidth compared with Selective Repeat. It was the original strategy; the default is now Selective Repeat.</w:t>
       </w:r>
     </w:p>
     <w:p>
@@ -23477,15 +24605,15 @@
           <w:sz w:val="24"/>
           <w:szCs w:val="24"/>
         </w:rPr>
-        <w:t xml:space="preserve">Fixed timeout in the original client.</w:t>
-      </w:r>
-      <w:r>
-        <w:rPr>
-          <w:rFonts w:ascii="Times New Roman" w:cs="Times New Roman" w:eastAsia="Times New Roman" w:hAnsi="Times New Roman"/>
-          <w:sz w:val="24"/>
-          <w:szCs w:val="24"/>
-        </w:rPr>
-        <w:t xml:space="preserve"> The 500 ms retransmission timeout of the benchmarked client is not estimated from measured round-trip time and does not back off; the Smart-RUDP client of Section 8 adds an adaptive timeout with backoff.</w:t>
+        <w:t xml:space="preserve">Selective Repeat.</w:t>
+      </w:r>
+      <w:r>
+        <w:rPr>
+          <w:rFonts w:ascii="Times New Roman" w:cs="Times New Roman" w:eastAsia="Times New Roman" w:hAnsi="Times New Roman"/>
+          <w:sz w:val="24"/>
+          <w:szCs w:val="24"/>
+        </w:rPr>
+        <w:t xml:space="preserve"> The receiver buffers out-of-order packets and the sender resends only the packets that are missing, each with its own timer. Here the receiver reports what it holds in a 64-bit bitmap inside every cumulative ACK.</w:t>
       </w:r>
     </w:p>
     <w:p>
@@ -23506,15 +24634,15 @@
           <w:sz w:val="24"/>
           <w:szCs w:val="24"/>
         </w:rPr>
-        <w:t xml:space="preserve">Simplified fast recovery.</w:t>
-      </w:r>
-      <w:r>
-        <w:rPr>
-          <w:rFonts w:ascii="Times New Roman" w:cs="Times New Roman" w:eastAsia="Times New Roman" w:hAnsi="Times New Roman"/>
-          <w:sz w:val="24"/>
-          <w:szCs w:val="24"/>
-        </w:rPr>
-        <w:t xml:space="preserve"> The window is halved on three duplicate ACKs, but window inflation from RFC 5681 is not implemented.</w:t>
+        <w:t xml:space="preserve">Fixed timeout in the original client.</w:t>
+      </w:r>
+      <w:r>
+        <w:rPr>
+          <w:rFonts w:ascii="Times New Roman" w:cs="Times New Roman" w:eastAsia="Times New Roman" w:hAnsi="Times New Roman"/>
+          <w:sz w:val="24"/>
+          <w:szCs w:val="24"/>
+        </w:rPr>
+        <w:t xml:space="preserve"> The 500 ms retransmission timeout of the benchmarked client is not estimated from measured round-trip time and does not back off; the Smart-RUDP client of Section 8 adds an adaptive timeout with backoff.</w:t>
       </w:r>
     </w:p>
     <w:p>
@@ -23535,15 +24663,15 @@
           <w:sz w:val="24"/>
           <w:szCs w:val="24"/>
         </w:rPr>
-        <w:t xml:space="preserve">Limited test conditions.</w:t>
-      </w:r>
-      <w:r>
-        <w:rPr>
-          <w:rFonts w:ascii="Times New Roman" w:cs="Times New Roman" w:eastAsia="Times New Roman" w:hAnsi="Times New Roman"/>
-          <w:sz w:val="24"/>
-          <w:szCs w:val="24"/>
-        </w:rPr>
-        <w:t xml:space="preserve"> All tests ran on one machine over the loopback interface. The simulator drops only client data packets, and delay, jitter and reordering were not tested.</w:t>
+        <w:t xml:space="preserve">Simplified fast recovery.</w:t>
+      </w:r>
+      <w:r>
+        <w:rPr>
+          <w:rFonts w:ascii="Times New Roman" w:cs="Times New Roman" w:eastAsia="Times New Roman" w:hAnsi="Times New Roman"/>
+          <w:sz w:val="24"/>
+          <w:szCs w:val="24"/>
+        </w:rPr>
+        <w:t xml:space="preserve"> The window is halved on three duplicate ACKs, but window inflation from RFC 5681 is not implemented.</w:t>
       </w:r>
     </w:p>
     <w:p>
@@ -23564,15 +24692,15 @@
           <w:sz w:val="24"/>
           <w:szCs w:val="24"/>
         </w:rPr>
-        <w:t xml:space="preserve">Single runs.</w:t>
-      </w:r>
-      <w:r>
-        <w:rPr>
-          <w:rFonts w:ascii="Times New Roman" w:cs="Times New Roman" w:eastAsia="Times New Roman" w:hAnsi="Times New Roman"/>
-          <w:sz w:val="24"/>
-          <w:szCs w:val="24"/>
-        </w:rPr>
-        <w:t xml:space="preserve"> Each benchmark level was run once with a clock-seeded random generator, so small differences between levels are not statistically meaningful.</w:t>
+        <w:t xml:space="preserve">Limited test conditions.</w:t>
+      </w:r>
+      <w:r>
+        <w:rPr>
+          <w:rFonts w:ascii="Times New Roman" w:cs="Times New Roman" w:eastAsia="Times New Roman" w:hAnsi="Times New Roman"/>
+          <w:sz w:val="24"/>
+          <w:szCs w:val="24"/>
+        </w:rPr>
+        <w:t xml:space="preserve"> All tests ran on one machine over the loopback interface. The simulator drops only client data packets, and delay, jitter and reordering were not tested.</w:t>
       </w:r>
     </w:p>
     <w:p>
@@ -23593,88 +24721,15 @@
           <w:sz w:val="24"/>
           <w:szCs w:val="24"/>
         </w:rPr>
-        <w:t xml:space="preserve">No encryption or multiplexing.</w:t>
-      </w:r>
-      <w:r>
-        <w:rPr>
-          <w:rFonts w:ascii="Times New Roman" w:cs="Times New Roman" w:eastAsia="Times New Roman" w:hAnsi="Times New Roman"/>
-          <w:sz w:val="24"/>
-          <w:szCs w:val="24"/>
-        </w:rPr>
-        <w:t xml:space="preserve"> RUDP does not provide the security or stream features of QUIC.</w:t>
-      </w:r>
-    </w:p>
-    <w:p>
-      <w:pPr>
-        <w:pStyle w:val="Heading1"/>
-        <w:keepNext/>
-        <w:spacing w:after="120" w:before="240" w:line="360"/>
-      </w:pPr>
-      <w:r>
-        <w:rPr>
-          <w:rFonts w:ascii="Times New Roman" w:cs="Times New Roman" w:eastAsia="Times New Roman" w:hAnsi="Times New Roman"/>
-          <w:b/>
-          <w:bCs/>
-          <w:sz w:val="24"/>
-          <w:szCs w:val="24"/>
-        </w:rPr>
-        <w:t xml:space="preserve">13. CONCLUSION AND FUTURE ENHANCEMENTS</w:t>
-      </w:r>
-    </w:p>
-    <w:p>
-      <w:pPr>
-        <w:spacing w:after="120" w:line="360"/>
-        <w:jc w:val="both"/>
-      </w:pPr>
-      <w:r>
-        <w:rPr>
-          <w:rFonts w:ascii="Times New Roman" w:cs="Times New Roman" w:eastAsia="Times New Roman" w:hAnsi="Times New Roman"/>
-          <w:sz w:val="24"/>
-          <w:szCs w:val="24"/>
-        </w:rPr>
-        <w:t xml:space="preserve">RUDP shows that TCP's core guarantees, ordered and complete delivery over a lossy datagram service together with a self-limiting sending rate, can be built and verified from first principles. The final system delivered all 62 packets of a 2,442-byte message at every simulated loss level from 0% to 40%. The congestion window responded as AIMD predicts, shrinking from 18.71 to 2.00 packets as loss rose, and the 500 ms retransmission interval was visible both in the cwnd graph and in the packet capture.</w:t>
-      </w:r>
-    </w:p>
-    <w:p>
-      <w:pPr>
-        <w:spacing w:after="120" w:line="360"/>
-        <w:jc w:val="both"/>
-      </w:pPr>
-      <w:r>
-        <w:rPr>
-          <w:rFonts w:ascii="Times New Roman" w:cs="Times New Roman" w:eastAsia="Times New Roman" w:hAnsi="Times New Roman"/>
-          <w:sz w:val="24"/>
-          <w:szCs w:val="24"/>
-        </w:rPr>
-        <w:t xml:space="preserve">Smart-RUDP then tested whether a learned window policy could improve on the rule. A tabular Q-learning agent matched AIMD on the lossy path and was slower on the 5G-like and satellite-like paths, with somewhat fewer retransmissions; the honest finding is that this simple agent does not beat a well-tuned rule. A neural agent trained in simulation did beat AIMD on all three paths in the C transport (by 15%, 27% and 24%), and selective acknowledgments cut retransmissions about tenfold without changing completion time significantly (Section 8.5). The network design adds a four-router OSPF network with VLANs, DHCP, an access list and a tested link failover in Cisco Packet Tracer, and the Wireshark work adds a dissector and traces that make the protocol behaviour visible packet by packet.</w:t>
-      </w:r>
-    </w:p>
-    <w:p>
-      <w:pPr>
-        <w:spacing w:after="120" w:line="360"/>
-        <w:jc w:val="both"/>
-      </w:pPr>
-      <w:r>
-        <w:rPr>
-          <w:rFonts w:ascii="Times New Roman" w:cs="Times New Roman" w:eastAsia="Times New Roman" w:hAnsi="Times New Roman"/>
-          <w:sz w:val="24"/>
-          <w:szCs w:val="24"/>
-        </w:rPr>
-        <w:t xml:space="preserve">The project also taught that reliable transport is largely timers and edge cases, that congestion control is a feedback loop in which the sender listens to the network, that independent evidence such as a packet capture matters, and that debugging the environment is as important as debugging the code.</w:t>
-      </w:r>
-    </w:p>
-    <w:p>
-      <w:pPr>
-        <w:spacing w:after="120" w:line="360"/>
-        <w:jc w:val="both"/>
-      </w:pPr>
-      <w:r>
-        <w:rPr>
-          <w:rFonts w:ascii="Times New Roman" w:cs="Times New Roman" w:eastAsia="Times New Roman" w:hAnsi="Times New Roman"/>
-          <w:sz w:val="24"/>
-          <w:szCs w:val="24"/>
-        </w:rPr>
-        <w:t xml:space="preserve">Future enhancements are:</w:t>
+        <w:t xml:space="preserve">Single runs.</w:t>
+      </w:r>
+      <w:r>
+        <w:rPr>
+          <w:rFonts w:ascii="Times New Roman" w:cs="Times New Roman" w:eastAsia="Times New Roman" w:hAnsi="Times New Roman"/>
+          <w:sz w:val="24"/>
+          <w:szCs w:val="24"/>
+        </w:rPr>
+        <w:t xml:space="preserve"> Each benchmark level was run once with a clock-seeded random generator, so small differences between levels are not statistically meaningful.</w:t>
       </w:r>
     </w:p>
     <w:p>
@@ -23690,10 +24745,112 @@
       <w:r>
         <w:rPr>
           <w:rFonts w:ascii="Times New Roman" w:cs="Times New Roman" w:eastAsia="Times New Roman" w:hAnsi="Times New Roman"/>
-          <w:sz w:val="24"/>
-          <w:szCs w:val="24"/>
-        </w:rPr>
-        <w:t xml:space="preserve">Making selective acknowledgment the default and testing it on a real path where throughput, not the bottleneck rate, limits the transfer (the option exists in Section 8.5).</w:t>
+          <w:b/>
+          <w:bCs/>
+          <w:sz w:val="24"/>
+          <w:szCs w:val="24"/>
+        </w:rPr>
+        <w:t xml:space="preserve">No encryption or multiplexing.</w:t>
+      </w:r>
+      <w:r>
+        <w:rPr>
+          <w:rFonts w:ascii="Times New Roman" w:cs="Times New Roman" w:eastAsia="Times New Roman" w:hAnsi="Times New Roman"/>
+          <w:sz w:val="24"/>
+          <w:szCs w:val="24"/>
+        </w:rPr>
+        <w:t xml:space="preserve"> RUDP does not provide the security or stream features of QUIC.</w:t>
+      </w:r>
+    </w:p>
+    <w:p>
+      <w:pPr>
+        <w:pStyle w:val="Heading1"/>
+        <w:keepNext/>
+        <w:spacing w:after="120" w:before="240" w:line="360"/>
+      </w:pPr>
+      <w:r>
+        <w:rPr>
+          <w:rFonts w:ascii="Times New Roman" w:cs="Times New Roman" w:eastAsia="Times New Roman" w:hAnsi="Times New Roman"/>
+          <w:b/>
+          <w:bCs/>
+          <w:sz w:val="24"/>
+          <w:szCs w:val="24"/>
+        </w:rPr>
+        <w:t xml:space="preserve">13. CONCLUSION AND FUTURE ENHANCEMENTS</w:t>
+      </w:r>
+    </w:p>
+    <w:p>
+      <w:pPr>
+        <w:spacing w:after="120" w:line="360"/>
+        <w:jc w:val="both"/>
+      </w:pPr>
+      <w:r>
+        <w:rPr>
+          <w:rFonts w:ascii="Times New Roman" w:cs="Times New Roman" w:eastAsia="Times New Roman" w:hAnsi="Times New Roman"/>
+          <w:sz w:val="24"/>
+          <w:szCs w:val="24"/>
+        </w:rPr>
+        <w:t xml:space="preserve">RUDP shows that TCP's core guarantees, ordered and complete delivery over a lossy datagram service together with a self-limiting sending rate, can be built and verified from first principles. The final system delivered all 62 packets of a 2,442-byte message at every simulated loss level from 0% to 40%. The congestion window responded as AIMD predicts, shrinking from 18.71 to 2.00 packets as loss rose, and the 500 ms retransmission interval was visible both in the cwnd graph and in the packet capture.</w:t>
+      </w:r>
+    </w:p>
+    <w:p>
+      <w:pPr>
+        <w:spacing w:after="120" w:line="360"/>
+        <w:jc w:val="both"/>
+      </w:pPr>
+      <w:r>
+        <w:rPr>
+          <w:rFonts w:ascii="Times New Roman" w:cs="Times New Roman" w:eastAsia="Times New Roman" w:hAnsi="Times New Roman"/>
+          <w:sz w:val="24"/>
+          <w:szCs w:val="24"/>
+        </w:rPr>
+        <w:t xml:space="preserve">Smart-RUDP then tested whether a learned window policy could improve on the rule. A tabular Q-learning agent matched AIMD on the lossy path and was slower on the 5G-like and satellite-like paths, with somewhat fewer retransmissions; the honest finding is that this simple agent does not beat a well-tuned rule. A neural agent trained in simulation did beat AIMD on all three paths in the C transport (by 15%, 27% and 24%), and selective acknowledgments cut retransmissions about tenfold without changing completion time significantly (Section 8.5). The network design adds a four-router OSPF network with VLANs, DHCP, an access list and a tested link failover in Cisco Packet Tracer, and the Wireshark work adds a dissector and traces that make the protocol behaviour visible packet by packet.</w:t>
+      </w:r>
+    </w:p>
+    <w:p>
+      <w:pPr>
+        <w:spacing w:after="120" w:line="360"/>
+        <w:jc w:val="both"/>
+      </w:pPr>
+      <w:r>
+        <w:rPr>
+          <w:rFonts w:ascii="Times New Roman" w:cs="Times New Roman" w:eastAsia="Times New Roman" w:hAnsi="Times New Roman"/>
+          <w:sz w:val="24"/>
+          <w:szCs w:val="24"/>
+        </w:rPr>
+        <w:t xml:space="preserve">The project also taught that reliable transport is largely timers and edge cases, that congestion control is a feedback loop in which the sender listens to the network, that independent evidence such as a packet capture matters, and that debugging the environment is as important as debugging the code.</w:t>
+      </w:r>
+    </w:p>
+    <w:p>
+      <w:pPr>
+        <w:spacing w:after="120" w:line="360"/>
+        <w:jc w:val="both"/>
+      </w:pPr>
+      <w:r>
+        <w:rPr>
+          <w:rFonts w:ascii="Times New Roman" w:cs="Times New Roman" w:eastAsia="Times New Roman" w:hAnsi="Times New Roman"/>
+          <w:sz w:val="24"/>
+          <w:szCs w:val="24"/>
+        </w:rPr>
+        <w:t xml:space="preserve">Future enhancements are:</w:t>
+      </w:r>
+    </w:p>
+    <w:p>
+      <w:pPr>
+        <w:pStyle w:val="ListParagraph"/>
+        <w:numPr>
+          <w:ilvl w:val="0"/>
+          <w:numId w:val="2"/>
+        </w:numPr>
+        <w:spacing w:after="60" w:line="360"/>
+        <w:jc w:val="both"/>
+      </w:pPr>
+      <w:r>
+        <w:rPr>
+          <w:rFonts w:ascii="Times New Roman" w:cs="Times New Roman" w:eastAsia="Times New Roman" w:hAnsi="Times New Roman"/>
+          <w:sz w:val="24"/>
+          <w:szCs w:val="24"/>
+        </w:rPr>
+        <w:t xml:space="preserve">Testing Selective Repeat on a real path where throughput, not the bottleneck rate, limits the transfer, and re-running the simulator studies with it as the default (RUDP_SR=1).</w:t>
       </w:r>
     </w:p>
     <w:p>

</xml_diff>

<commit_message>
Performance pass: 256-packet receive window, larger caps, tuned AIMD baseline, CUBIC, neural agent defaults (cap 128 + hand-over); eval_perf*; docs
Co-Authored-By: Claude Sonnet 5.5 <noreply@anthropic.com>
Claude-Session: https://claude.ai/code/session_01NX2zRNpdVAnzFNKmqomzKu
</commit_message>
<xml_diff>
--- a/docs/RUDP_Final_Project_Report.docx
+++ b/docs/RUDP_Final_Project_Report.docx
@@ -17896,6 +17896,2137 @@
     </w:p>
     <w:p>
       <w:pPr>
+        <w:pStyle w:val="Heading2"/>
+        <w:keepNext/>
+        <w:spacing w:after="120" w:before="120" w:line="360"/>
+      </w:pPr>
+      <w:r>
+        <w:rPr>
+          <w:rFonts w:ascii="Times New Roman" w:cs="Times New Roman" w:eastAsia="Times New Roman" w:hAnsi="Times New Roman"/>
+          <w:b/>
+          <w:bCs/>
+          <w:sz w:val="24"/>
+          <w:szCs w:val="24"/>
+        </w:rPr>
+        <w:t xml:space="preserve">8.10 Performance tuning: larger windows and the new defaults</w:t>
+      </w:r>
+    </w:p>
+    <w:p>
+      <w:pPr>
+        <w:spacing w:after="120" w:line="360"/>
+        <w:jc w:val="both"/>
+      </w:pPr>
+      <w:r>
+        <w:rPr>
+          <w:rFonts w:ascii="Times New Roman" w:cs="Times New Roman" w:eastAsia="Times New Roman" w:hAnsi="Times New Roman"/>
+          <w:sz w:val="24"/>
+          <w:szCs w:val="24"/>
+        </w:rPr>
+        <w:t xml:space="preserve">The performance pass started from two measured limits. First, the window cap: the satellite-like path (150 ms each way, 400 packets per second) can hold about 120 packets in flight, but the agents and the AIMD baseline were capped at 32, so throughput could not exceed about 107 packets per second. Second, the AIMD baseline itself: it starts additive growth at a window of 16, which at 300 ms round trip takes about 22 round trips to reach 32. To remove the first limit the Selective Repeat receiver window was raised from 64 to 256 packets (a 32-byte bitmap in every ACK) and the sender cap to 250. To keep the comparison honest the baseline was tuned as well: AIMD with a 128 cap and an initial threshold of 128 (aimd_128) is reported next to the original (cap 32, threshold 16). CUBIC (cap 128) was also implemented and tested (--mode cubic): it beat tuned AIMD on the satellite-like and fast paths (16.7 s against 19.1 s and 14.4 s against 17.7 s) but lost on the 5G-like path and was twice as slow on the 2% loss path (17.5 s against 8.1 s), and the neural agent was faster than CUBIC on every path, so CUBIC is not used.</w:t>
+      </w:r>
+    </w:p>
+    <w:p>
+      <w:pPr>
+        <w:spacing w:after="120" w:line="360"/>
+        <w:jc w:val="both"/>
+      </w:pPr>
+      <w:r>
+        <w:rPr>
+          <w:rFonts w:ascii="Times New Roman" w:cs="Times New Roman" w:eastAsia="Times New Roman" w:hAnsi="Times New Roman"/>
+          <w:sz w:val="24"/>
+          <w:szCs w:val="24"/>
+        </w:rPr>
+        <w:t xml:space="preserve">Table 8j reports the screening runs (5 runs per cell, seeds 9001 to 9005) and Table 8k the final comparison (10 runs, 5 for the hostile path). The neural agent was not retrained for larger windows: its inputs still divide the window by 32, so it sees values outside its training range, yet it generalised. Raising its cap from 32 to 64 cut the satellite-like time from 13.1 s to 8.2 s, and 128 to 6.3 s; 250 gave no further gain on that path (6.9 s) and was slightly faster only on the fast path (3.7 s against 4.0 s) at the cost of more retransmissions. The new default is therefore a cap of 128 together with the AIMD hand-over of Section 8.8 (--hybrid 0.10). The older settings remain available (--maxcwnd 32 --hybrid 0, or RUDP_CLASSIC=1, which the earlier evaluation scripts now set).</w:t>
+      </w:r>
+    </w:p>
+    <w:p>
+      <w:pPr>
+        <w:keepNext/>
+        <w:spacing w:after="80" w:before="120"/>
+        <w:jc w:val="center"/>
+      </w:pPr>
+      <w:r>
+        <w:rPr>
+          <w:rFonts w:ascii="Times New Roman" w:cs="Times New Roman" w:eastAsia="Times New Roman" w:hAnsi="Times New Roman"/>
+          <w:b/>
+          <w:bCs/>
+          <w:sz w:val="24"/>
+          <w:szCs w:val="24"/>
+        </w:rPr>
+        <w:t xml:space="preserve">Table 8k: Mean completion time (s) with the final configuration (Selective Repeat; seeds 9701 onward; n.s. = not significant at 95%)</w:t>
+      </w:r>
+    </w:p>
+    <w:tbl>
+      <w:tblPr>
+        <w:tblW w:type="dxa" w:w="8526"/>
+        <w:tblBorders>
+          <w:top w:val="single" w:color="auto" w:sz="4"/>
+          <w:left w:val="single" w:color="auto" w:sz="4"/>
+          <w:bottom w:val="single" w:color="auto" w:sz="4"/>
+          <w:right w:val="single" w:color="auto" w:sz="4"/>
+          <w:insideH w:val="single" w:color="auto" w:sz="4"/>
+          <w:insideV w:val="single" w:color="auto" w:sz="4"/>
+        </w:tblBorders>
+      </w:tblPr>
+      <w:tblGrid>
+        <w:gridCol w:w="2600"/>
+        <w:gridCol w:w="1500"/>
+        <w:gridCol w:w="1500"/>
+        <w:gridCol w:w="1500"/>
+        <w:gridCol w:w="1426"/>
+      </w:tblGrid>
+      <w:tr>
+        <w:trPr>
+          <w:cantSplit/>
+          <w:tblHeader/>
+        </w:trPr>
+        <w:tc>
+          <w:tcPr>
+            <w:tcW w:type="dxa" w:w="2600"/>
+            <w:tcBorders>
+              <w:top w:val="single" w:color="000000" w:sz="4"/>
+              <w:left w:val="single" w:color="000000" w:sz="4"/>
+              <w:bottom w:val="single" w:color="000000" w:sz="4"/>
+              <w:right w:val="single" w:color="000000" w:sz="4"/>
+            </w:tcBorders>
+            <w:shd w:fill="D9D9D9" w:color="auto" w:val="clear"/>
+            <w:tcMar>
+              <w:top w:type="dxa" w:w="60"/>
+              <w:left w:type="dxa" w:w="100"/>
+              <w:bottom w:type="dxa" w:w="60"/>
+              <w:right w:type="dxa" w:w="100"/>
+            </w:tcMar>
+          </w:tcPr>
+          <w:p>
+            <w:pPr>
+              <w:spacing w:line="276"/>
+              <w:jc w:val="left"/>
+            </w:pPr>
+            <w:r>
+              <w:rPr>
+                <w:rFonts w:ascii="Times New Roman" w:cs="Times New Roman" w:eastAsia="Times New Roman" w:hAnsi="Times New Roman"/>
+                <w:b/>
+                <w:bCs/>
+                <w:sz w:val="24"/>
+                <w:szCs w:val="24"/>
+              </w:rPr>
+              <w:t xml:space="preserve">Path (10 runs)</w:t>
+            </w:r>
+          </w:p>
+        </w:tc>
+        <w:tc>
+          <w:tcPr>
+            <w:tcW w:type="dxa" w:w="1500"/>
+            <w:tcBorders>
+              <w:top w:val="single" w:color="000000" w:sz="4"/>
+              <w:left w:val="single" w:color="000000" w:sz="4"/>
+              <w:bottom w:val="single" w:color="000000" w:sz="4"/>
+              <w:right w:val="single" w:color="000000" w:sz="4"/>
+            </w:tcBorders>
+            <w:shd w:fill="D9D9D9" w:color="auto" w:val="clear"/>
+            <w:tcMar>
+              <w:top w:type="dxa" w:w="60"/>
+              <w:left w:type="dxa" w:w="100"/>
+              <w:bottom w:type="dxa" w:w="60"/>
+              <w:right w:type="dxa" w:w="100"/>
+            </w:tcMar>
+          </w:tcPr>
+          <w:p>
+            <w:pPr>
+              <w:spacing w:line="276"/>
+              <w:jc w:val="left"/>
+            </w:pPr>
+            <w:r>
+              <w:rPr>
+                <w:rFonts w:ascii="Times New Roman" w:cs="Times New Roman" w:eastAsia="Times New Roman" w:hAnsi="Times New Roman"/>
+                <w:b/>
+                <w:bCs/>
+                <w:sz w:val="24"/>
+                <w:szCs w:val="24"/>
+              </w:rPr>
+              <w:t xml:space="preserve">AIMD, cap 32</w:t>
+            </w:r>
+          </w:p>
+        </w:tc>
+        <w:tc>
+          <w:tcPr>
+            <w:tcW w:type="dxa" w:w="1500"/>
+            <w:tcBorders>
+              <w:top w:val="single" w:color="000000" w:sz="4"/>
+              <w:left w:val="single" w:color="000000" w:sz="4"/>
+              <w:bottom w:val="single" w:color="000000" w:sz="4"/>
+              <w:right w:val="single" w:color="000000" w:sz="4"/>
+            </w:tcBorders>
+            <w:shd w:fill="D9D9D9" w:color="auto" w:val="clear"/>
+            <w:tcMar>
+              <w:top w:type="dxa" w:w="60"/>
+              <w:left w:type="dxa" w:w="100"/>
+              <w:bottom w:type="dxa" w:w="60"/>
+              <w:right w:type="dxa" w:w="100"/>
+            </w:tcMar>
+          </w:tcPr>
+          <w:p>
+            <w:pPr>
+              <w:spacing w:line="276"/>
+              <w:jc w:val="left"/>
+            </w:pPr>
+            <w:r>
+              <w:rPr>
+                <w:rFonts w:ascii="Times New Roman" w:cs="Times New Roman" w:eastAsia="Times New Roman" w:hAnsi="Times New Roman"/>
+                <w:b/>
+                <w:bCs/>
+                <w:sz w:val="24"/>
+                <w:szCs w:val="24"/>
+              </w:rPr>
+              <w:t xml:space="preserve">AIMD, cap 128</w:t>
+            </w:r>
+          </w:p>
+        </w:tc>
+        <w:tc>
+          <w:tcPr>
+            <w:tcW w:type="dxa" w:w="1500"/>
+            <w:tcBorders>
+              <w:top w:val="single" w:color="000000" w:sz="4"/>
+              <w:left w:val="single" w:color="000000" w:sz="4"/>
+              <w:bottom w:val="single" w:color="000000" w:sz="4"/>
+              <w:right w:val="single" w:color="000000" w:sz="4"/>
+            </w:tcBorders>
+            <w:shd w:fill="D9D9D9" w:color="auto" w:val="clear"/>
+            <w:tcMar>
+              <w:top w:type="dxa" w:w="60"/>
+              <w:left w:type="dxa" w:w="100"/>
+              <w:bottom w:type="dxa" w:w="60"/>
+              <w:right w:type="dxa" w:w="100"/>
+            </w:tcMar>
+          </w:tcPr>
+          <w:p>
+            <w:pPr>
+              <w:spacing w:line="276"/>
+              <w:jc w:val="left"/>
+            </w:pPr>
+            <w:r>
+              <w:rPr>
+                <w:rFonts w:ascii="Times New Roman" w:cs="Times New Roman" w:eastAsia="Times New Roman" w:hAnsi="Times New Roman"/>
+                <w:b/>
+                <w:bCs/>
+                <w:sz w:val="24"/>
+                <w:szCs w:val="24"/>
+              </w:rPr>
+              <w:t xml:space="preserve">Neural, new default</w:t>
+            </w:r>
+          </w:p>
+        </w:tc>
+        <w:tc>
+          <w:tcPr>
+            <w:tcW w:type="dxa" w:w="1426"/>
+            <w:tcBorders>
+              <w:top w:val="single" w:color="000000" w:sz="4"/>
+              <w:left w:val="single" w:color="000000" w:sz="4"/>
+              <w:bottom w:val="single" w:color="000000" w:sz="4"/>
+              <w:right w:val="single" w:color="000000" w:sz="4"/>
+            </w:tcBorders>
+            <w:shd w:fill="D9D9D9" w:color="auto" w:val="clear"/>
+            <w:tcMar>
+              <w:top w:type="dxa" w:w="60"/>
+              <w:left w:type="dxa" w:w="100"/>
+              <w:bottom w:type="dxa" w:w="60"/>
+              <w:right w:type="dxa" w:w="100"/>
+            </w:tcMar>
+          </w:tcPr>
+          <w:p>
+            <w:pPr>
+              <w:spacing w:line="276"/>
+              <w:jc w:val="left"/>
+            </w:pPr>
+            <w:r>
+              <w:rPr>
+                <w:rFonts w:ascii="Times New Roman" w:cs="Times New Roman" w:eastAsia="Times New Roman" w:hAnsi="Times New Roman"/>
+                <w:b/>
+                <w:bCs/>
+                <w:sz w:val="24"/>
+                <w:szCs w:val="24"/>
+              </w:rPr>
+              <w:t xml:space="preserve">Gain over cap-128 AIMD</w:t>
+            </w:r>
+          </w:p>
+        </w:tc>
+      </w:tr>
+      <w:tr>
+        <w:trPr>
+          <w:cantSplit/>
+          <w:tblHeader w:val="false"/>
+        </w:trPr>
+        <w:tc>
+          <w:tcPr>
+            <w:tcW w:type="dxa" w:w="2600"/>
+            <w:tcBorders>
+              <w:top w:val="single" w:color="000000" w:sz="4"/>
+              <w:left w:val="single" w:color="000000" w:sz="4"/>
+              <w:bottom w:val="single" w:color="000000" w:sz="4"/>
+              <w:right w:val="single" w:color="000000" w:sz="4"/>
+            </w:tcBorders>
+            <w:tcMar>
+              <w:top w:type="dxa" w:w="60"/>
+              <w:left w:type="dxa" w:w="100"/>
+              <w:bottom w:type="dxa" w:w="60"/>
+              <w:right w:type="dxa" w:w="100"/>
+            </w:tcMar>
+          </w:tcPr>
+          <w:p>
+            <w:pPr>
+              <w:spacing w:line="276"/>
+              <w:jc w:val="left"/>
+            </w:pPr>
+            <w:r>
+              <w:rPr>
+                <w:rFonts w:ascii="Times New Roman" w:cs="Times New Roman" w:eastAsia="Times New Roman" w:hAnsi="Times New Roman"/>
+                <w:b w:val="false"/>
+                <w:bCs w:val="false"/>
+                <w:sz w:val="24"/>
+                <w:szCs w:val="24"/>
+              </w:rPr>
+              <w:t xml:space="preserve">5G-like, 1,200 packets</w:t>
+            </w:r>
+          </w:p>
+        </w:tc>
+        <w:tc>
+          <w:tcPr>
+            <w:tcW w:type="dxa" w:w="1500"/>
+            <w:tcBorders>
+              <w:top w:val="single" w:color="000000" w:sz="4"/>
+              <w:left w:val="single" w:color="000000" w:sz="4"/>
+              <w:bottom w:val="single" w:color="000000" w:sz="4"/>
+              <w:right w:val="single" w:color="000000" w:sz="4"/>
+            </w:tcBorders>
+            <w:tcMar>
+              <w:top w:type="dxa" w:w="60"/>
+              <w:left w:type="dxa" w:w="100"/>
+              <w:bottom w:type="dxa" w:w="60"/>
+              <w:right w:type="dxa" w:w="100"/>
+            </w:tcMar>
+          </w:tcPr>
+          <w:p>
+            <w:pPr>
+              <w:spacing w:line="276"/>
+              <w:jc w:val="left"/>
+            </w:pPr>
+            <w:r>
+              <w:rPr>
+                <w:rFonts w:ascii="Times New Roman" w:cs="Times New Roman" w:eastAsia="Times New Roman" w:hAnsi="Times New Roman"/>
+                <w:b w:val="false"/>
+                <w:bCs w:val="false"/>
+                <w:sz w:val="24"/>
+                <w:szCs w:val="24"/>
+              </w:rPr>
+              <w:t xml:space="preserve">1.30 +/- 0.12</w:t>
+            </w:r>
+          </w:p>
+        </w:tc>
+        <w:tc>
+          <w:tcPr>
+            <w:tcW w:type="dxa" w:w="1500"/>
+            <w:tcBorders>
+              <w:top w:val="single" w:color="000000" w:sz="4"/>
+              <w:left w:val="single" w:color="000000" w:sz="4"/>
+              <w:bottom w:val="single" w:color="000000" w:sz="4"/>
+              <w:right w:val="single" w:color="000000" w:sz="4"/>
+            </w:tcBorders>
+            <w:tcMar>
+              <w:top w:type="dxa" w:w="60"/>
+              <w:left w:type="dxa" w:w="100"/>
+              <w:bottom w:type="dxa" w:w="60"/>
+              <w:right w:type="dxa" w:w="100"/>
+            </w:tcMar>
+          </w:tcPr>
+          <w:p>
+            <w:pPr>
+              <w:spacing w:line="276"/>
+              <w:jc w:val="left"/>
+            </w:pPr>
+            <w:r>
+              <w:rPr>
+                <w:rFonts w:ascii="Times New Roman" w:cs="Times New Roman" w:eastAsia="Times New Roman" w:hAnsi="Times New Roman"/>
+                <w:b w:val="false"/>
+                <w:bCs w:val="false"/>
+                <w:sz w:val="24"/>
+                <w:szCs w:val="24"/>
+              </w:rPr>
+              <w:t xml:space="preserve">1.09 +/- 0.13</w:t>
+            </w:r>
+          </w:p>
+        </w:tc>
+        <w:tc>
+          <w:tcPr>
+            <w:tcW w:type="dxa" w:w="1500"/>
+            <w:tcBorders>
+              <w:top w:val="single" w:color="000000" w:sz="4"/>
+              <w:left w:val="single" w:color="000000" w:sz="4"/>
+              <w:bottom w:val="single" w:color="000000" w:sz="4"/>
+              <w:right w:val="single" w:color="000000" w:sz="4"/>
+            </w:tcBorders>
+            <w:tcMar>
+              <w:top w:type="dxa" w:w="60"/>
+              <w:left w:type="dxa" w:w="100"/>
+              <w:bottom w:type="dxa" w:w="60"/>
+              <w:right w:type="dxa" w:w="100"/>
+            </w:tcMar>
+          </w:tcPr>
+          <w:p>
+            <w:pPr>
+              <w:spacing w:line="276"/>
+              <w:jc w:val="left"/>
+            </w:pPr>
+            <w:r>
+              <w:rPr>
+                <w:rFonts w:ascii="Times New Roman" w:cs="Times New Roman" w:eastAsia="Times New Roman" w:hAnsi="Times New Roman"/>
+                <w:b w:val="false"/>
+                <w:bCs w:val="false"/>
+                <w:sz w:val="24"/>
+                <w:szCs w:val="24"/>
+              </w:rPr>
+              <w:t xml:space="preserve">1.09 +/- 0.05</w:t>
+            </w:r>
+          </w:p>
+        </w:tc>
+        <w:tc>
+          <w:tcPr>
+            <w:tcW w:type="dxa" w:w="1426"/>
+            <w:tcBorders>
+              <w:top w:val="single" w:color="000000" w:sz="4"/>
+              <w:left w:val="single" w:color="000000" w:sz="4"/>
+              <w:bottom w:val="single" w:color="000000" w:sz="4"/>
+              <w:right w:val="single" w:color="000000" w:sz="4"/>
+            </w:tcBorders>
+            <w:tcMar>
+              <w:top w:type="dxa" w:w="60"/>
+              <w:left w:type="dxa" w:w="100"/>
+              <w:bottom w:type="dxa" w:w="60"/>
+              <w:right w:type="dxa" w:w="100"/>
+            </w:tcMar>
+          </w:tcPr>
+          <w:p>
+            <w:pPr>
+              <w:spacing w:line="276"/>
+              <w:jc w:val="left"/>
+            </w:pPr>
+            <w:r>
+              <w:rPr>
+                <w:rFonts w:ascii="Times New Roman" w:cs="Times New Roman" w:eastAsia="Times New Roman" w:hAnsi="Times New Roman"/>
+                <w:b w:val="false"/>
+                <w:bCs w:val="false"/>
+                <w:sz w:val="24"/>
+                <w:szCs w:val="24"/>
+              </w:rPr>
+              <w:t xml:space="preserve">0% (n.s.)</w:t>
+            </w:r>
+          </w:p>
+        </w:tc>
+      </w:tr>
+      <w:tr>
+        <w:trPr>
+          <w:cantSplit/>
+          <w:tblHeader w:val="false"/>
+        </w:trPr>
+        <w:tc>
+          <w:tcPr>
+            <w:tcW w:type="dxa" w:w="2600"/>
+            <w:tcBorders>
+              <w:top w:val="single" w:color="000000" w:sz="4"/>
+              <w:left w:val="single" w:color="000000" w:sz="4"/>
+              <w:bottom w:val="single" w:color="000000" w:sz="4"/>
+              <w:right w:val="single" w:color="000000" w:sz="4"/>
+            </w:tcBorders>
+            <w:tcMar>
+              <w:top w:type="dxa" w:w="60"/>
+              <w:left w:type="dxa" w:w="100"/>
+              <w:bottom w:type="dxa" w:w="60"/>
+              <w:right w:type="dxa" w:w="100"/>
+            </w:tcMar>
+          </w:tcPr>
+          <w:p>
+            <w:pPr>
+              <w:spacing w:line="276"/>
+              <w:jc w:val="left"/>
+            </w:pPr>
+            <w:r>
+              <w:rPr>
+                <w:rFonts w:ascii="Times New Roman" w:cs="Times New Roman" w:eastAsia="Times New Roman" w:hAnsi="Times New Roman"/>
+                <w:b w:val="false"/>
+                <w:bCs w:val="false"/>
+                <w:sz w:val="24"/>
+                <w:szCs w:val="24"/>
+              </w:rPr>
+              <w:t xml:space="preserve">Lossy 2%, 1,200 packets</w:t>
+            </w:r>
+          </w:p>
+        </w:tc>
+        <w:tc>
+          <w:tcPr>
+            <w:tcW w:type="dxa" w:w="1500"/>
+            <w:tcBorders>
+              <w:top w:val="single" w:color="000000" w:sz="4"/>
+              <w:left w:val="single" w:color="000000" w:sz="4"/>
+              <w:bottom w:val="single" w:color="000000" w:sz="4"/>
+              <w:right w:val="single" w:color="000000" w:sz="4"/>
+            </w:tcBorders>
+            <w:tcMar>
+              <w:top w:type="dxa" w:w="60"/>
+              <w:left w:type="dxa" w:w="100"/>
+              <w:bottom w:type="dxa" w:w="60"/>
+              <w:right w:type="dxa" w:w="100"/>
+            </w:tcMar>
+          </w:tcPr>
+          <w:p>
+            <w:pPr>
+              <w:spacing w:line="276"/>
+              <w:jc w:val="left"/>
+            </w:pPr>
+            <w:r>
+              <w:rPr>
+                <w:rFonts w:ascii="Times New Roman" w:cs="Times New Roman" w:eastAsia="Times New Roman" w:hAnsi="Times New Roman"/>
+                <w:b w:val="false"/>
+                <w:bCs w:val="false"/>
+                <w:sz w:val="24"/>
+                <w:szCs w:val="24"/>
+              </w:rPr>
+              <w:t xml:space="preserve">8.44 +/- 0.72</w:t>
+            </w:r>
+          </w:p>
+        </w:tc>
+        <w:tc>
+          <w:tcPr>
+            <w:tcW w:type="dxa" w:w="1500"/>
+            <w:tcBorders>
+              <w:top w:val="single" w:color="000000" w:sz="4"/>
+              <w:left w:val="single" w:color="000000" w:sz="4"/>
+              <w:bottom w:val="single" w:color="000000" w:sz="4"/>
+              <w:right w:val="single" w:color="000000" w:sz="4"/>
+            </w:tcBorders>
+            <w:tcMar>
+              <w:top w:type="dxa" w:w="60"/>
+              <w:left w:type="dxa" w:w="100"/>
+              <w:bottom w:type="dxa" w:w="60"/>
+              <w:right w:type="dxa" w:w="100"/>
+            </w:tcMar>
+          </w:tcPr>
+          <w:p>
+            <w:pPr>
+              <w:spacing w:line="276"/>
+              <w:jc w:val="left"/>
+            </w:pPr>
+            <w:r>
+              <w:rPr>
+                <w:rFonts w:ascii="Times New Roman" w:cs="Times New Roman" w:eastAsia="Times New Roman" w:hAnsi="Times New Roman"/>
+                <w:b w:val="false"/>
+                <w:bCs w:val="false"/>
+                <w:sz w:val="24"/>
+                <w:szCs w:val="24"/>
+              </w:rPr>
+              <w:t xml:space="preserve">8.27 +/- 0.54</w:t>
+            </w:r>
+          </w:p>
+        </w:tc>
+        <w:tc>
+          <w:tcPr>
+            <w:tcW w:type="dxa" w:w="1500"/>
+            <w:tcBorders>
+              <w:top w:val="single" w:color="000000" w:sz="4"/>
+              <w:left w:val="single" w:color="000000" w:sz="4"/>
+              <w:bottom w:val="single" w:color="000000" w:sz="4"/>
+              <w:right w:val="single" w:color="000000" w:sz="4"/>
+            </w:tcBorders>
+            <w:tcMar>
+              <w:top w:type="dxa" w:w="60"/>
+              <w:left w:type="dxa" w:w="100"/>
+              <w:bottom w:type="dxa" w:w="60"/>
+              <w:right w:type="dxa" w:w="100"/>
+            </w:tcMar>
+          </w:tcPr>
+          <w:p>
+            <w:pPr>
+              <w:spacing w:line="276"/>
+              <w:jc w:val="left"/>
+            </w:pPr>
+            <w:r>
+              <w:rPr>
+                <w:rFonts w:ascii="Times New Roman" w:cs="Times New Roman" w:eastAsia="Times New Roman" w:hAnsi="Times New Roman"/>
+                <w:b w:val="false"/>
+                <w:bCs w:val="false"/>
+                <w:sz w:val="24"/>
+                <w:szCs w:val="24"/>
+              </w:rPr>
+              <w:t xml:space="preserve">4.52 +/- 0.55</w:t>
+            </w:r>
+          </w:p>
+        </w:tc>
+        <w:tc>
+          <w:tcPr>
+            <w:tcW w:type="dxa" w:w="1426"/>
+            <w:tcBorders>
+              <w:top w:val="single" w:color="000000" w:sz="4"/>
+              <w:left w:val="single" w:color="000000" w:sz="4"/>
+              <w:bottom w:val="single" w:color="000000" w:sz="4"/>
+              <w:right w:val="single" w:color="000000" w:sz="4"/>
+            </w:tcBorders>
+            <w:tcMar>
+              <w:top w:type="dxa" w:w="60"/>
+              <w:left w:type="dxa" w:w="100"/>
+              <w:bottom w:type="dxa" w:w="60"/>
+              <w:right w:type="dxa" w:w="100"/>
+            </w:tcMar>
+          </w:tcPr>
+          <w:p>
+            <w:pPr>
+              <w:spacing w:line="276"/>
+              <w:jc w:val="left"/>
+            </w:pPr>
+            <w:r>
+              <w:rPr>
+                <w:rFonts w:ascii="Times New Roman" w:cs="Times New Roman" w:eastAsia="Times New Roman" w:hAnsi="Times New Roman"/>
+                <w:b w:val="false"/>
+                <w:bCs w:val="false"/>
+                <w:sz w:val="24"/>
+                <w:szCs w:val="24"/>
+              </w:rPr>
+              <w:t xml:space="preserve">45%</w:t>
+            </w:r>
+          </w:p>
+        </w:tc>
+      </w:tr>
+      <w:tr>
+        <w:trPr>
+          <w:cantSplit/>
+          <w:tblHeader w:val="false"/>
+        </w:trPr>
+        <w:tc>
+          <w:tcPr>
+            <w:tcW w:type="dxa" w:w="2600"/>
+            <w:tcBorders>
+              <w:top w:val="single" w:color="000000" w:sz="4"/>
+              <w:left w:val="single" w:color="000000" w:sz="4"/>
+              <w:bottom w:val="single" w:color="000000" w:sz="4"/>
+              <w:right w:val="single" w:color="000000" w:sz="4"/>
+            </w:tcBorders>
+            <w:tcMar>
+              <w:top w:type="dxa" w:w="60"/>
+              <w:left w:type="dxa" w:w="100"/>
+              <w:bottom w:type="dxa" w:w="60"/>
+              <w:right w:type="dxa" w:w="100"/>
+            </w:tcMar>
+          </w:tcPr>
+          <w:p>
+            <w:pPr>
+              <w:spacing w:line="276"/>
+              <w:jc w:val="left"/>
+            </w:pPr>
+            <w:r>
+              <w:rPr>
+                <w:rFonts w:ascii="Times New Roman" w:cs="Times New Roman" w:eastAsia="Times New Roman" w:hAnsi="Times New Roman"/>
+                <w:b w:val="false"/>
+                <w:bCs w:val="false"/>
+                <w:sz w:val="24"/>
+                <w:szCs w:val="24"/>
+              </w:rPr>
+              <w:t xml:space="preserve">Satellite-like, 1,200 packets</w:t>
+            </w:r>
+          </w:p>
+        </w:tc>
+        <w:tc>
+          <w:tcPr>
+            <w:tcW w:type="dxa" w:w="1500"/>
+            <w:tcBorders>
+              <w:top w:val="single" w:color="000000" w:sz="4"/>
+              <w:left w:val="single" w:color="000000" w:sz="4"/>
+              <w:bottom w:val="single" w:color="000000" w:sz="4"/>
+              <w:right w:val="single" w:color="000000" w:sz="4"/>
+            </w:tcBorders>
+            <w:tcMar>
+              <w:top w:type="dxa" w:w="60"/>
+              <w:left w:type="dxa" w:w="100"/>
+              <w:bottom w:type="dxa" w:w="60"/>
+              <w:right w:type="dxa" w:w="100"/>
+            </w:tcMar>
+          </w:tcPr>
+          <w:p>
+            <w:pPr>
+              <w:spacing w:line="276"/>
+              <w:jc w:val="left"/>
+            </w:pPr>
+            <w:r>
+              <w:rPr>
+                <w:rFonts w:ascii="Times New Roman" w:cs="Times New Roman" w:eastAsia="Times New Roman" w:hAnsi="Times New Roman"/>
+                <w:b w:val="false"/>
+                <w:bCs w:val="false"/>
+                <w:sz w:val="24"/>
+                <w:szCs w:val="24"/>
+              </w:rPr>
+              <w:t xml:space="preserve">25.13 +/- 2.94</w:t>
+            </w:r>
+          </w:p>
+        </w:tc>
+        <w:tc>
+          <w:tcPr>
+            <w:tcW w:type="dxa" w:w="1500"/>
+            <w:tcBorders>
+              <w:top w:val="single" w:color="000000" w:sz="4"/>
+              <w:left w:val="single" w:color="000000" w:sz="4"/>
+              <w:bottom w:val="single" w:color="000000" w:sz="4"/>
+              <w:right w:val="single" w:color="000000" w:sz="4"/>
+            </w:tcBorders>
+            <w:tcMar>
+              <w:top w:type="dxa" w:w="60"/>
+              <w:left w:type="dxa" w:w="100"/>
+              <w:bottom w:type="dxa" w:w="60"/>
+              <w:right w:type="dxa" w:w="100"/>
+            </w:tcMar>
+          </w:tcPr>
+          <w:p>
+            <w:pPr>
+              <w:spacing w:line="276"/>
+              <w:jc w:val="left"/>
+            </w:pPr>
+            <w:r>
+              <w:rPr>
+                <w:rFonts w:ascii="Times New Roman" w:cs="Times New Roman" w:eastAsia="Times New Roman" w:hAnsi="Times New Roman"/>
+                <w:b w:val="false"/>
+                <w:bCs w:val="false"/>
+                <w:sz w:val="24"/>
+                <w:szCs w:val="24"/>
+              </w:rPr>
+              <w:t xml:space="preserve">20.04 +/- 4.19</w:t>
+            </w:r>
+          </w:p>
+        </w:tc>
+        <w:tc>
+          <w:tcPr>
+            <w:tcW w:type="dxa" w:w="1500"/>
+            <w:tcBorders>
+              <w:top w:val="single" w:color="000000" w:sz="4"/>
+              <w:left w:val="single" w:color="000000" w:sz="4"/>
+              <w:bottom w:val="single" w:color="000000" w:sz="4"/>
+              <w:right w:val="single" w:color="000000" w:sz="4"/>
+            </w:tcBorders>
+            <w:tcMar>
+              <w:top w:type="dxa" w:w="60"/>
+              <w:left w:type="dxa" w:w="100"/>
+              <w:bottom w:type="dxa" w:w="60"/>
+              <w:right w:type="dxa" w:w="100"/>
+            </w:tcMar>
+          </w:tcPr>
+          <w:p>
+            <w:pPr>
+              <w:spacing w:line="276"/>
+              <w:jc w:val="left"/>
+            </w:pPr>
+            <w:r>
+              <w:rPr>
+                <w:rFonts w:ascii="Times New Roman" w:cs="Times New Roman" w:eastAsia="Times New Roman" w:hAnsi="Times New Roman"/>
+                <w:b w:val="false"/>
+                <w:bCs w:val="false"/>
+                <w:sz w:val="24"/>
+                <w:szCs w:val="24"/>
+              </w:rPr>
+              <w:t xml:space="preserve">6.32 +/- 0.42</w:t>
+            </w:r>
+          </w:p>
+        </w:tc>
+        <w:tc>
+          <w:tcPr>
+            <w:tcW w:type="dxa" w:w="1426"/>
+            <w:tcBorders>
+              <w:top w:val="single" w:color="000000" w:sz="4"/>
+              <w:left w:val="single" w:color="000000" w:sz="4"/>
+              <w:bottom w:val="single" w:color="000000" w:sz="4"/>
+              <w:right w:val="single" w:color="000000" w:sz="4"/>
+            </w:tcBorders>
+            <w:tcMar>
+              <w:top w:type="dxa" w:w="60"/>
+              <w:left w:type="dxa" w:w="100"/>
+              <w:bottom w:type="dxa" w:w="60"/>
+              <w:right w:type="dxa" w:w="100"/>
+            </w:tcMar>
+          </w:tcPr>
+          <w:p>
+            <w:pPr>
+              <w:spacing w:line="276"/>
+              <w:jc w:val="left"/>
+            </w:pPr>
+            <w:r>
+              <w:rPr>
+                <w:rFonts w:ascii="Times New Roman" w:cs="Times New Roman" w:eastAsia="Times New Roman" w:hAnsi="Times New Roman"/>
+                <w:b w:val="false"/>
+                <w:bCs w:val="false"/>
+                <w:sz w:val="24"/>
+                <w:szCs w:val="24"/>
+              </w:rPr>
+              <w:t xml:space="preserve">68%</w:t>
+            </w:r>
+          </w:p>
+        </w:tc>
+      </w:tr>
+      <w:tr>
+        <w:trPr>
+          <w:cantSplit/>
+          <w:tblHeader w:val="false"/>
+        </w:trPr>
+        <w:tc>
+          <w:tcPr>
+            <w:tcW w:type="dxa" w:w="2600"/>
+            <w:tcBorders>
+              <w:top w:val="single" w:color="000000" w:sz="4"/>
+              <w:left w:val="single" w:color="000000" w:sz="4"/>
+              <w:bottom w:val="single" w:color="000000" w:sz="4"/>
+              <w:right w:val="single" w:color="000000" w:sz="4"/>
+            </w:tcBorders>
+            <w:tcMar>
+              <w:top w:type="dxa" w:w="60"/>
+              <w:left w:type="dxa" w:w="100"/>
+              <w:bottom w:type="dxa" w:w="60"/>
+              <w:right w:type="dxa" w:w="100"/>
+            </w:tcMar>
+          </w:tcPr>
+          <w:p>
+            <w:pPr>
+              <w:spacing w:line="276"/>
+              <w:jc w:val="left"/>
+            </w:pPr>
+            <w:r>
+              <w:rPr>
+                <w:rFonts w:ascii="Times New Roman" w:cs="Times New Roman" w:eastAsia="Times New Roman" w:hAnsi="Times New Roman"/>
+                <w:b w:val="false"/>
+                <w:bCs w:val="false"/>
+                <w:sz w:val="24"/>
+                <w:szCs w:val="24"/>
+              </w:rPr>
+              <w:t xml:space="preserve">Fast, high-delay, 3,000 packets</w:t>
+            </w:r>
+          </w:p>
+        </w:tc>
+        <w:tc>
+          <w:tcPr>
+            <w:tcW w:type="dxa" w:w="1500"/>
+            <w:tcBorders>
+              <w:top w:val="single" w:color="000000" w:sz="4"/>
+              <w:left w:val="single" w:color="000000" w:sz="4"/>
+              <w:bottom w:val="single" w:color="000000" w:sz="4"/>
+              <w:right w:val="single" w:color="000000" w:sz="4"/>
+            </w:tcBorders>
+            <w:tcMar>
+              <w:top w:type="dxa" w:w="60"/>
+              <w:left w:type="dxa" w:w="100"/>
+              <w:bottom w:type="dxa" w:w="60"/>
+              <w:right w:type="dxa" w:w="100"/>
+            </w:tcMar>
+          </w:tcPr>
+          <w:p>
+            <w:pPr>
+              <w:spacing w:line="276"/>
+              <w:jc w:val="left"/>
+            </w:pPr>
+            <w:r>
+              <w:rPr>
+                <w:rFonts w:ascii="Times New Roman" w:cs="Times New Roman" w:eastAsia="Times New Roman" w:hAnsi="Times New Roman"/>
+                <w:b w:val="false"/>
+                <w:bCs w:val="false"/>
+                <w:sz w:val="24"/>
+                <w:szCs w:val="24"/>
+              </w:rPr>
+              <w:t xml:space="preserve">19.79 +/- 1.08</w:t>
+            </w:r>
+          </w:p>
+        </w:tc>
+        <w:tc>
+          <w:tcPr>
+            <w:tcW w:type="dxa" w:w="1500"/>
+            <w:tcBorders>
+              <w:top w:val="single" w:color="000000" w:sz="4"/>
+              <w:left w:val="single" w:color="000000" w:sz="4"/>
+              <w:bottom w:val="single" w:color="000000" w:sz="4"/>
+              <w:right w:val="single" w:color="000000" w:sz="4"/>
+            </w:tcBorders>
+            <w:tcMar>
+              <w:top w:type="dxa" w:w="60"/>
+              <w:left w:type="dxa" w:w="100"/>
+              <w:bottom w:type="dxa" w:w="60"/>
+              <w:right w:type="dxa" w:w="100"/>
+            </w:tcMar>
+          </w:tcPr>
+          <w:p>
+            <w:pPr>
+              <w:spacing w:line="276"/>
+              <w:jc w:val="left"/>
+            </w:pPr>
+            <w:r>
+              <w:rPr>
+                <w:rFonts w:ascii="Times New Roman" w:cs="Times New Roman" w:eastAsia="Times New Roman" w:hAnsi="Times New Roman"/>
+                <w:b w:val="false"/>
+                <w:bCs w:val="false"/>
+                <w:sz w:val="24"/>
+                <w:szCs w:val="24"/>
+              </w:rPr>
+              <w:t xml:space="preserve">17.29 +/- 1.43</w:t>
+            </w:r>
+          </w:p>
+        </w:tc>
+        <w:tc>
+          <w:tcPr>
+            <w:tcW w:type="dxa" w:w="1500"/>
+            <w:tcBorders>
+              <w:top w:val="single" w:color="000000" w:sz="4"/>
+              <w:left w:val="single" w:color="000000" w:sz="4"/>
+              <w:bottom w:val="single" w:color="000000" w:sz="4"/>
+              <w:right w:val="single" w:color="000000" w:sz="4"/>
+            </w:tcBorders>
+            <w:tcMar>
+              <w:top w:type="dxa" w:w="60"/>
+              <w:left w:type="dxa" w:w="100"/>
+              <w:bottom w:type="dxa" w:w="60"/>
+              <w:right w:type="dxa" w:w="100"/>
+            </w:tcMar>
+          </w:tcPr>
+          <w:p>
+            <w:pPr>
+              <w:spacing w:line="276"/>
+              <w:jc w:val="left"/>
+            </w:pPr>
+            <w:r>
+              <w:rPr>
+                <w:rFonts w:ascii="Times New Roman" w:cs="Times New Roman" w:eastAsia="Times New Roman" w:hAnsi="Times New Roman"/>
+                <w:b w:val="false"/>
+                <w:bCs w:val="false"/>
+                <w:sz w:val="24"/>
+                <w:szCs w:val="24"/>
+              </w:rPr>
+              <w:t xml:space="preserve">4.01 +/- 0.22</w:t>
+            </w:r>
+          </w:p>
+        </w:tc>
+        <w:tc>
+          <w:tcPr>
+            <w:tcW w:type="dxa" w:w="1426"/>
+            <w:tcBorders>
+              <w:top w:val="single" w:color="000000" w:sz="4"/>
+              <w:left w:val="single" w:color="000000" w:sz="4"/>
+              <w:bottom w:val="single" w:color="000000" w:sz="4"/>
+              <w:right w:val="single" w:color="000000" w:sz="4"/>
+            </w:tcBorders>
+            <w:tcMar>
+              <w:top w:type="dxa" w:w="60"/>
+              <w:left w:type="dxa" w:w="100"/>
+              <w:bottom w:type="dxa" w:w="60"/>
+              <w:right w:type="dxa" w:w="100"/>
+            </w:tcMar>
+          </w:tcPr>
+          <w:p>
+            <w:pPr>
+              <w:spacing w:line="276"/>
+              <w:jc w:val="left"/>
+            </w:pPr>
+            <w:r>
+              <w:rPr>
+                <w:rFonts w:ascii="Times New Roman" w:cs="Times New Roman" w:eastAsia="Times New Roman" w:hAnsi="Times New Roman"/>
+                <w:b w:val="false"/>
+                <w:bCs w:val="false"/>
+                <w:sz w:val="24"/>
+                <w:szCs w:val="24"/>
+              </w:rPr>
+              <w:t xml:space="preserve">77%</w:t>
+            </w:r>
+          </w:p>
+        </w:tc>
+      </w:tr>
+      <w:tr>
+        <w:trPr>
+          <w:cantSplit/>
+          <w:tblHeader w:val="false"/>
+        </w:trPr>
+        <w:tc>
+          <w:tcPr>
+            <w:tcW w:type="dxa" w:w="2600"/>
+            <w:tcBorders>
+              <w:top w:val="single" w:color="000000" w:sz="4"/>
+              <w:left w:val="single" w:color="000000" w:sz="4"/>
+              <w:bottom w:val="single" w:color="000000" w:sz="4"/>
+              <w:right w:val="single" w:color="000000" w:sz="4"/>
+            </w:tcBorders>
+            <w:tcMar>
+              <w:top w:type="dxa" w:w="60"/>
+              <w:left w:type="dxa" w:w="100"/>
+              <w:bottom w:type="dxa" w:w="60"/>
+              <w:right w:type="dxa" w:w="100"/>
+            </w:tcMar>
+          </w:tcPr>
+          <w:p>
+            <w:pPr>
+              <w:spacing w:line="276"/>
+              <w:jc w:val="left"/>
+            </w:pPr>
+            <w:r>
+              <w:rPr>
+                <w:rFonts w:ascii="Times New Roman" w:cs="Times New Roman" w:eastAsia="Times New Roman" w:hAnsi="Times New Roman"/>
+                <w:b w:val="false"/>
+                <w:bCs w:val="false"/>
+                <w:sz w:val="24"/>
+                <w:szCs w:val="24"/>
+              </w:rPr>
+              <w:t xml:space="preserve">Hostile 10% loss, 300 packets (5 runs)</w:t>
+            </w:r>
+          </w:p>
+        </w:tc>
+        <w:tc>
+          <w:tcPr>
+            <w:tcW w:type="dxa" w:w="1500"/>
+            <w:tcBorders>
+              <w:top w:val="single" w:color="000000" w:sz="4"/>
+              <w:left w:val="single" w:color="000000" w:sz="4"/>
+              <w:bottom w:val="single" w:color="000000" w:sz="4"/>
+              <w:right w:val="single" w:color="000000" w:sz="4"/>
+            </w:tcBorders>
+            <w:tcMar>
+              <w:top w:type="dxa" w:w="60"/>
+              <w:left w:type="dxa" w:w="100"/>
+              <w:bottom w:type="dxa" w:w="60"/>
+              <w:right w:type="dxa" w:w="100"/>
+            </w:tcMar>
+          </w:tcPr>
+          <w:p>
+            <w:pPr>
+              <w:spacing w:line="276"/>
+              <w:jc w:val="left"/>
+            </w:pPr>
+            <w:r>
+              <w:rPr>
+                <w:rFonts w:ascii="Times New Roman" w:cs="Times New Roman" w:eastAsia="Times New Roman" w:hAnsi="Times New Roman"/>
+                <w:b w:val="false"/>
+                <w:bCs w:val="false"/>
+                <w:sz w:val="24"/>
+                <w:szCs w:val="24"/>
+              </w:rPr>
+              <w:t xml:space="preserve">7.53 +/- 1.10</w:t>
+            </w:r>
+          </w:p>
+        </w:tc>
+        <w:tc>
+          <w:tcPr>
+            <w:tcW w:type="dxa" w:w="1500"/>
+            <w:tcBorders>
+              <w:top w:val="single" w:color="000000" w:sz="4"/>
+              <w:left w:val="single" w:color="000000" w:sz="4"/>
+              <w:bottom w:val="single" w:color="000000" w:sz="4"/>
+              <w:right w:val="single" w:color="000000" w:sz="4"/>
+            </w:tcBorders>
+            <w:tcMar>
+              <w:top w:type="dxa" w:w="60"/>
+              <w:left w:type="dxa" w:w="100"/>
+              <w:bottom w:type="dxa" w:w="60"/>
+              <w:right w:type="dxa" w:w="100"/>
+            </w:tcMar>
+          </w:tcPr>
+          <w:p>
+            <w:pPr>
+              <w:spacing w:line="276"/>
+              <w:jc w:val="left"/>
+            </w:pPr>
+            <w:r>
+              <w:rPr>
+                <w:rFonts w:ascii="Times New Roman" w:cs="Times New Roman" w:eastAsia="Times New Roman" w:hAnsi="Times New Roman"/>
+                <w:b w:val="false"/>
+                <w:bCs w:val="false"/>
+                <w:sz w:val="24"/>
+                <w:szCs w:val="24"/>
+              </w:rPr>
+              <w:t xml:space="preserve">8.51 +/- 1.70</w:t>
+            </w:r>
+          </w:p>
+        </w:tc>
+        <w:tc>
+          <w:tcPr>
+            <w:tcW w:type="dxa" w:w="1500"/>
+            <w:tcBorders>
+              <w:top w:val="single" w:color="000000" w:sz="4"/>
+              <w:left w:val="single" w:color="000000" w:sz="4"/>
+              <w:bottom w:val="single" w:color="000000" w:sz="4"/>
+              <w:right w:val="single" w:color="000000" w:sz="4"/>
+            </w:tcBorders>
+            <w:tcMar>
+              <w:top w:type="dxa" w:w="60"/>
+              <w:left w:type="dxa" w:w="100"/>
+              <w:bottom w:type="dxa" w:w="60"/>
+              <w:right w:type="dxa" w:w="100"/>
+            </w:tcMar>
+          </w:tcPr>
+          <w:p>
+            <w:pPr>
+              <w:spacing w:line="276"/>
+              <w:jc w:val="left"/>
+            </w:pPr>
+            <w:r>
+              <w:rPr>
+                <w:rFonts w:ascii="Times New Roman" w:cs="Times New Roman" w:eastAsia="Times New Roman" w:hAnsi="Times New Roman"/>
+                <w:b w:val="false"/>
+                <w:bCs w:val="false"/>
+                <w:sz w:val="24"/>
+                <w:szCs w:val="24"/>
+              </w:rPr>
+              <w:t xml:space="preserve">5.89 +/- 2.50</w:t>
+            </w:r>
+          </w:p>
+        </w:tc>
+        <w:tc>
+          <w:tcPr>
+            <w:tcW w:type="dxa" w:w="1426"/>
+            <w:tcBorders>
+              <w:top w:val="single" w:color="000000" w:sz="4"/>
+              <w:left w:val="single" w:color="000000" w:sz="4"/>
+              <w:bottom w:val="single" w:color="000000" w:sz="4"/>
+              <w:right w:val="single" w:color="000000" w:sz="4"/>
+            </w:tcBorders>
+            <w:tcMar>
+              <w:top w:type="dxa" w:w="60"/>
+              <w:left w:type="dxa" w:w="100"/>
+              <w:bottom w:type="dxa" w:w="60"/>
+              <w:right w:type="dxa" w:w="100"/>
+            </w:tcMar>
+          </w:tcPr>
+          <w:p>
+            <w:pPr>
+              <w:spacing w:line="276"/>
+              <w:jc w:val="left"/>
+            </w:pPr>
+            <w:r>
+              <w:rPr>
+                <w:rFonts w:ascii="Times New Roman" w:cs="Times New Roman" w:eastAsia="Times New Roman" w:hAnsi="Times New Roman"/>
+                <w:b w:val="false"/>
+                <w:bCs w:val="false"/>
+                <w:sz w:val="24"/>
+                <w:szCs w:val="24"/>
+              </w:rPr>
+              <w:t xml:space="preserve">31% (n.s.)</w:t>
+            </w:r>
+          </w:p>
+        </w:tc>
+      </w:tr>
+    </w:tbl>
+    <w:p>
+      <w:pPr>
+        <w:spacing w:after="160"/>
+      </w:pPr>
+    </w:p>
+    <w:p>
+      <w:pPr>
+        <w:spacing w:after="120" w:line="360"/>
+        <w:jc w:val="both"/>
+      </w:pPr>
+      <w:r>
+        <w:rPr>
+          <w:rFonts w:ascii="Times New Roman" w:cs="Times New Roman" w:eastAsia="Times New Roman" w:hAnsi="Times New Roman"/>
+          <w:sz w:val="24"/>
+          <w:szCs w:val="24"/>
+        </w:rPr>
+        <w:t xml:space="preserve">The fast path (60 ms each way, 3,000 packets per second, queue 300) is new in this section. The new default finishes 3,000 packets in 4.0 s (750 packets per second) against 17.3 s for tuned AIMD; the paired differences against both baselines are significant on the lossy, satellite-like and fast paths (45 to 80% faster), equal on the 5G-like path (where the transfer is short) and not significant on the hostile path. It sends more retransmissions than AIMD on the fast path (262 against 44 for 3,000 packets), which is the price of its aggressive growth into a bottleneck queue. Two limits remain: the agent was trained only for windows up to 32 and for short transfers, and all paths are emulated in the client, so none of this is a measurement of a real network.</w:t>
+      </w:r>
+    </w:p>
+    <w:p>
+      <w:pPr>
+        <w:keepNext/>
+        <w:spacing w:after="80" w:before="120"/>
+        <w:jc w:val="center"/>
+      </w:pPr>
+      <w:r>
+        <w:rPr>
+          <w:rFonts w:ascii="Times New Roman" w:cs="Times New Roman" w:eastAsia="Times New Roman" w:hAnsi="Times New Roman"/>
+          <w:b/>
+          <w:bCs/>
+          <w:sz w:val="24"/>
+          <w:szCs w:val="24"/>
+        </w:rPr>
+        <w:t xml:space="preserve">Table 8j: Screening of window policies and caps (Selective Repeat; the neural cap-128 column is from the second screening, seeds 9501 to 9505, and is the same agent with no hand-over)</w:t>
+      </w:r>
+    </w:p>
+    <w:tbl>
+      <w:tblPr>
+        <w:tblW w:type="dxa" w:w="9026"/>
+        <w:tblBorders>
+          <w:top w:val="single" w:color="auto" w:sz="4"/>
+          <w:left w:val="single" w:color="auto" w:sz="4"/>
+          <w:bottom w:val="single" w:color="auto" w:sz="4"/>
+          <w:right w:val="single" w:color="auto" w:sz="4"/>
+          <w:insideH w:val="single" w:color="auto" w:sz="4"/>
+          <w:insideV w:val="single" w:color="auto" w:sz="4"/>
+        </w:tblBorders>
+      </w:tblPr>
+      <w:tblGrid>
+        <w:gridCol w:w="2300"/>
+        <w:gridCol w:w="1100"/>
+        <w:gridCol w:w="1100"/>
+        <w:gridCol w:w="1100"/>
+        <w:gridCol w:w="1100"/>
+        <w:gridCol w:w="1100"/>
+        <w:gridCol w:w="1226"/>
+      </w:tblGrid>
+      <w:tr>
+        <w:trPr>
+          <w:cantSplit/>
+          <w:tblHeader/>
+        </w:trPr>
+        <w:tc>
+          <w:tcPr>
+            <w:tcW w:type="dxa" w:w="2300"/>
+            <w:tcBorders>
+              <w:top w:val="single" w:color="000000" w:sz="4"/>
+              <w:left w:val="single" w:color="000000" w:sz="4"/>
+              <w:bottom w:val="single" w:color="000000" w:sz="4"/>
+              <w:right w:val="single" w:color="000000" w:sz="4"/>
+            </w:tcBorders>
+            <w:shd w:fill="D9D9D9" w:color="auto" w:val="clear"/>
+            <w:tcMar>
+              <w:top w:type="dxa" w:w="60"/>
+              <w:left w:type="dxa" w:w="100"/>
+              <w:bottom w:type="dxa" w:w="60"/>
+              <w:right w:type="dxa" w:w="100"/>
+            </w:tcMar>
+          </w:tcPr>
+          <w:p>
+            <w:pPr>
+              <w:spacing w:line="276"/>
+              <w:jc w:val="left"/>
+            </w:pPr>
+            <w:r>
+              <w:rPr>
+                <w:rFonts w:ascii="Times New Roman" w:cs="Times New Roman" w:eastAsia="Times New Roman" w:hAnsi="Times New Roman"/>
+                <w:b/>
+                <w:bCs/>
+                <w:sz w:val="24"/>
+                <w:szCs w:val="24"/>
+              </w:rPr>
+              <w:t xml:space="preserve">Screening, mean s (5 runs)</w:t>
+            </w:r>
+          </w:p>
+        </w:tc>
+        <w:tc>
+          <w:tcPr>
+            <w:tcW w:type="dxa" w:w="1100"/>
+            <w:tcBorders>
+              <w:top w:val="single" w:color="000000" w:sz="4"/>
+              <w:left w:val="single" w:color="000000" w:sz="4"/>
+              <w:bottom w:val="single" w:color="000000" w:sz="4"/>
+              <w:right w:val="single" w:color="000000" w:sz="4"/>
+            </w:tcBorders>
+            <w:shd w:fill="D9D9D9" w:color="auto" w:val="clear"/>
+            <w:tcMar>
+              <w:top w:type="dxa" w:w="60"/>
+              <w:left w:type="dxa" w:w="100"/>
+              <w:bottom w:type="dxa" w:w="60"/>
+              <w:right w:type="dxa" w:w="100"/>
+            </w:tcMar>
+          </w:tcPr>
+          <w:p>
+            <w:pPr>
+              <w:spacing w:line="276"/>
+              <w:jc w:val="left"/>
+            </w:pPr>
+            <w:r>
+              <w:rPr>
+                <w:rFonts w:ascii="Times New Roman" w:cs="Times New Roman" w:eastAsia="Times New Roman" w:hAnsi="Times New Roman"/>
+                <w:b/>
+                <w:bCs/>
+                <w:sz w:val="24"/>
+                <w:szCs w:val="24"/>
+              </w:rPr>
+              <w:t xml:space="preserve">AIMD cap 32</w:t>
+            </w:r>
+          </w:p>
+        </w:tc>
+        <w:tc>
+          <w:tcPr>
+            <w:tcW w:type="dxa" w:w="1100"/>
+            <w:tcBorders>
+              <w:top w:val="single" w:color="000000" w:sz="4"/>
+              <w:left w:val="single" w:color="000000" w:sz="4"/>
+              <w:bottom w:val="single" w:color="000000" w:sz="4"/>
+              <w:right w:val="single" w:color="000000" w:sz="4"/>
+            </w:tcBorders>
+            <w:shd w:fill="D9D9D9" w:color="auto" w:val="clear"/>
+            <w:tcMar>
+              <w:top w:type="dxa" w:w="60"/>
+              <w:left w:type="dxa" w:w="100"/>
+              <w:bottom w:type="dxa" w:w="60"/>
+              <w:right w:type="dxa" w:w="100"/>
+            </w:tcMar>
+          </w:tcPr>
+          <w:p>
+            <w:pPr>
+              <w:spacing w:line="276"/>
+              <w:jc w:val="left"/>
+            </w:pPr>
+            <w:r>
+              <w:rPr>
+                <w:rFonts w:ascii="Times New Roman" w:cs="Times New Roman" w:eastAsia="Times New Roman" w:hAnsi="Times New Roman"/>
+                <w:b/>
+                <w:bCs/>
+                <w:sz w:val="24"/>
+                <w:szCs w:val="24"/>
+              </w:rPr>
+              <w:t xml:space="preserve">AIMD tuned</w:t>
+            </w:r>
+          </w:p>
+        </w:tc>
+        <w:tc>
+          <w:tcPr>
+            <w:tcW w:type="dxa" w:w="1100"/>
+            <w:tcBorders>
+              <w:top w:val="single" w:color="000000" w:sz="4"/>
+              <w:left w:val="single" w:color="000000" w:sz="4"/>
+              <w:bottom w:val="single" w:color="000000" w:sz="4"/>
+              <w:right w:val="single" w:color="000000" w:sz="4"/>
+            </w:tcBorders>
+            <w:shd w:fill="D9D9D9" w:color="auto" w:val="clear"/>
+            <w:tcMar>
+              <w:top w:type="dxa" w:w="60"/>
+              <w:left w:type="dxa" w:w="100"/>
+              <w:bottom w:type="dxa" w:w="60"/>
+              <w:right w:type="dxa" w:w="100"/>
+            </w:tcMar>
+          </w:tcPr>
+          <w:p>
+            <w:pPr>
+              <w:spacing w:line="276"/>
+              <w:jc w:val="left"/>
+            </w:pPr>
+            <w:r>
+              <w:rPr>
+                <w:rFonts w:ascii="Times New Roman" w:cs="Times New Roman" w:eastAsia="Times New Roman" w:hAnsi="Times New Roman"/>
+                <w:b/>
+                <w:bCs/>
+                <w:sz w:val="24"/>
+                <w:szCs w:val="24"/>
+              </w:rPr>
+              <w:t xml:space="preserve">CUBIC 128</w:t>
+            </w:r>
+          </w:p>
+        </w:tc>
+        <w:tc>
+          <w:tcPr>
+            <w:tcW w:type="dxa" w:w="1100"/>
+            <w:tcBorders>
+              <w:top w:val="single" w:color="000000" w:sz="4"/>
+              <w:left w:val="single" w:color="000000" w:sz="4"/>
+              <w:bottom w:val="single" w:color="000000" w:sz="4"/>
+              <w:right w:val="single" w:color="000000" w:sz="4"/>
+            </w:tcBorders>
+            <w:shd w:fill="D9D9D9" w:color="auto" w:val="clear"/>
+            <w:tcMar>
+              <w:top w:type="dxa" w:w="60"/>
+              <w:left w:type="dxa" w:w="100"/>
+              <w:bottom w:type="dxa" w:w="60"/>
+              <w:right w:type="dxa" w:w="100"/>
+            </w:tcMar>
+          </w:tcPr>
+          <w:p>
+            <w:pPr>
+              <w:spacing w:line="276"/>
+              <w:jc w:val="left"/>
+            </w:pPr>
+            <w:r>
+              <w:rPr>
+                <w:rFonts w:ascii="Times New Roman" w:cs="Times New Roman" w:eastAsia="Times New Roman" w:hAnsi="Times New Roman"/>
+                <w:b/>
+                <w:bCs/>
+                <w:sz w:val="24"/>
+                <w:szCs w:val="24"/>
+              </w:rPr>
+              <w:t xml:space="preserve">Neural cap 32</w:t>
+            </w:r>
+          </w:p>
+        </w:tc>
+        <w:tc>
+          <w:tcPr>
+            <w:tcW w:type="dxa" w:w="1100"/>
+            <w:tcBorders>
+              <w:top w:val="single" w:color="000000" w:sz="4"/>
+              <w:left w:val="single" w:color="000000" w:sz="4"/>
+              <w:bottom w:val="single" w:color="000000" w:sz="4"/>
+              <w:right w:val="single" w:color="000000" w:sz="4"/>
+            </w:tcBorders>
+            <w:shd w:fill="D9D9D9" w:color="auto" w:val="clear"/>
+            <w:tcMar>
+              <w:top w:type="dxa" w:w="60"/>
+              <w:left w:type="dxa" w:w="100"/>
+              <w:bottom w:type="dxa" w:w="60"/>
+              <w:right w:type="dxa" w:w="100"/>
+            </w:tcMar>
+          </w:tcPr>
+          <w:p>
+            <w:pPr>
+              <w:spacing w:line="276"/>
+              <w:jc w:val="left"/>
+            </w:pPr>
+            <w:r>
+              <w:rPr>
+                <w:rFonts w:ascii="Times New Roman" w:cs="Times New Roman" w:eastAsia="Times New Roman" w:hAnsi="Times New Roman"/>
+                <w:b/>
+                <w:bCs/>
+                <w:sz w:val="24"/>
+                <w:szCs w:val="24"/>
+              </w:rPr>
+              <w:t xml:space="preserve">Neural cap 64</w:t>
+            </w:r>
+          </w:p>
+        </w:tc>
+        <w:tc>
+          <w:tcPr>
+            <w:tcW w:type="dxa" w:w="1226"/>
+            <w:tcBorders>
+              <w:top w:val="single" w:color="000000" w:sz="4"/>
+              <w:left w:val="single" w:color="000000" w:sz="4"/>
+              <w:bottom w:val="single" w:color="000000" w:sz="4"/>
+              <w:right w:val="single" w:color="000000" w:sz="4"/>
+            </w:tcBorders>
+            <w:shd w:fill="D9D9D9" w:color="auto" w:val="clear"/>
+            <w:tcMar>
+              <w:top w:type="dxa" w:w="60"/>
+              <w:left w:type="dxa" w:w="100"/>
+              <w:bottom w:type="dxa" w:w="60"/>
+              <w:right w:type="dxa" w:w="100"/>
+            </w:tcMar>
+          </w:tcPr>
+          <w:p>
+            <w:pPr>
+              <w:spacing w:line="276"/>
+              <w:jc w:val="left"/>
+            </w:pPr>
+            <w:r>
+              <w:rPr>
+                <w:rFonts w:ascii="Times New Roman" w:cs="Times New Roman" w:eastAsia="Times New Roman" w:hAnsi="Times New Roman"/>
+                <w:b/>
+                <w:bCs/>
+                <w:sz w:val="24"/>
+                <w:szCs w:val="24"/>
+              </w:rPr>
+              <w:t xml:space="preserve">Neural cap 128</w:t>
+            </w:r>
+          </w:p>
+        </w:tc>
+      </w:tr>
+      <w:tr>
+        <w:trPr>
+          <w:cantSplit/>
+          <w:tblHeader w:val="false"/>
+        </w:trPr>
+        <w:tc>
+          <w:tcPr>
+            <w:tcW w:type="dxa" w:w="2300"/>
+            <w:tcBorders>
+              <w:top w:val="single" w:color="000000" w:sz="4"/>
+              <w:left w:val="single" w:color="000000" w:sz="4"/>
+              <w:bottom w:val="single" w:color="000000" w:sz="4"/>
+              <w:right w:val="single" w:color="000000" w:sz="4"/>
+            </w:tcBorders>
+            <w:tcMar>
+              <w:top w:type="dxa" w:w="60"/>
+              <w:left w:type="dxa" w:w="100"/>
+              <w:bottom w:type="dxa" w:w="60"/>
+              <w:right w:type="dxa" w:w="100"/>
+            </w:tcMar>
+          </w:tcPr>
+          <w:p>
+            <w:pPr>
+              <w:spacing w:line="276"/>
+              <w:jc w:val="left"/>
+            </w:pPr>
+            <w:r>
+              <w:rPr>
+                <w:rFonts w:ascii="Times New Roman" w:cs="Times New Roman" w:eastAsia="Times New Roman" w:hAnsi="Times New Roman"/>
+                <w:b w:val="false"/>
+                <w:bCs w:val="false"/>
+                <w:sz w:val="24"/>
+                <w:szCs w:val="24"/>
+              </w:rPr>
+              <w:t xml:space="preserve">Lossy 2%</w:t>
+            </w:r>
+          </w:p>
+        </w:tc>
+        <w:tc>
+          <w:tcPr>
+            <w:tcW w:type="dxa" w:w="1100"/>
+            <w:tcBorders>
+              <w:top w:val="single" w:color="000000" w:sz="4"/>
+              <w:left w:val="single" w:color="000000" w:sz="4"/>
+              <w:bottom w:val="single" w:color="000000" w:sz="4"/>
+              <w:right w:val="single" w:color="000000" w:sz="4"/>
+            </w:tcBorders>
+            <w:tcMar>
+              <w:top w:type="dxa" w:w="60"/>
+              <w:left w:type="dxa" w:w="100"/>
+              <w:bottom w:type="dxa" w:w="60"/>
+              <w:right w:type="dxa" w:w="100"/>
+            </w:tcMar>
+          </w:tcPr>
+          <w:p>
+            <w:pPr>
+              <w:spacing w:line="276"/>
+              <w:jc w:val="left"/>
+            </w:pPr>
+            <w:r>
+              <w:rPr>
+                <w:rFonts w:ascii="Times New Roman" w:cs="Times New Roman" w:eastAsia="Times New Roman" w:hAnsi="Times New Roman"/>
+                <w:b w:val="false"/>
+                <w:bCs w:val="false"/>
+                <w:sz w:val="24"/>
+                <w:szCs w:val="24"/>
+              </w:rPr>
+              <w:t xml:space="preserve">7.98</w:t>
+            </w:r>
+          </w:p>
+        </w:tc>
+        <w:tc>
+          <w:tcPr>
+            <w:tcW w:type="dxa" w:w="1100"/>
+            <w:tcBorders>
+              <w:top w:val="single" w:color="000000" w:sz="4"/>
+              <w:left w:val="single" w:color="000000" w:sz="4"/>
+              <w:bottom w:val="single" w:color="000000" w:sz="4"/>
+              <w:right w:val="single" w:color="000000" w:sz="4"/>
+            </w:tcBorders>
+            <w:tcMar>
+              <w:top w:type="dxa" w:w="60"/>
+              <w:left w:type="dxa" w:w="100"/>
+              <w:bottom w:type="dxa" w:w="60"/>
+              <w:right w:type="dxa" w:w="100"/>
+            </w:tcMar>
+          </w:tcPr>
+          <w:p>
+            <w:pPr>
+              <w:spacing w:line="276"/>
+              <w:jc w:val="left"/>
+            </w:pPr>
+            <w:r>
+              <w:rPr>
+                <w:rFonts w:ascii="Times New Roman" w:cs="Times New Roman" w:eastAsia="Times New Roman" w:hAnsi="Times New Roman"/>
+                <w:b w:val="false"/>
+                <w:bCs w:val="false"/>
+                <w:sz w:val="24"/>
+                <w:szCs w:val="24"/>
+              </w:rPr>
+              <w:t xml:space="preserve">8.05</w:t>
+            </w:r>
+          </w:p>
+        </w:tc>
+        <w:tc>
+          <w:tcPr>
+            <w:tcW w:type="dxa" w:w="1100"/>
+            <w:tcBorders>
+              <w:top w:val="single" w:color="000000" w:sz="4"/>
+              <w:left w:val="single" w:color="000000" w:sz="4"/>
+              <w:bottom w:val="single" w:color="000000" w:sz="4"/>
+              <w:right w:val="single" w:color="000000" w:sz="4"/>
+            </w:tcBorders>
+            <w:tcMar>
+              <w:top w:type="dxa" w:w="60"/>
+              <w:left w:type="dxa" w:w="100"/>
+              <w:bottom w:type="dxa" w:w="60"/>
+              <w:right w:type="dxa" w:w="100"/>
+            </w:tcMar>
+          </w:tcPr>
+          <w:p>
+            <w:pPr>
+              <w:spacing w:line="276"/>
+              <w:jc w:val="left"/>
+            </w:pPr>
+            <w:r>
+              <w:rPr>
+                <w:rFonts w:ascii="Times New Roman" w:cs="Times New Roman" w:eastAsia="Times New Roman" w:hAnsi="Times New Roman"/>
+                <w:b w:val="false"/>
+                <w:bCs w:val="false"/>
+                <w:sz w:val="24"/>
+                <w:szCs w:val="24"/>
+              </w:rPr>
+              <w:t xml:space="preserve">17.45</w:t>
+            </w:r>
+          </w:p>
+        </w:tc>
+        <w:tc>
+          <w:tcPr>
+            <w:tcW w:type="dxa" w:w="1100"/>
+            <w:tcBorders>
+              <w:top w:val="single" w:color="000000" w:sz="4"/>
+              <w:left w:val="single" w:color="000000" w:sz="4"/>
+              <w:bottom w:val="single" w:color="000000" w:sz="4"/>
+              <w:right w:val="single" w:color="000000" w:sz="4"/>
+            </w:tcBorders>
+            <w:tcMar>
+              <w:top w:type="dxa" w:w="60"/>
+              <w:left w:type="dxa" w:w="100"/>
+              <w:bottom w:type="dxa" w:w="60"/>
+              <w:right w:type="dxa" w:w="100"/>
+            </w:tcMar>
+          </w:tcPr>
+          <w:p>
+            <w:pPr>
+              <w:spacing w:line="276"/>
+              <w:jc w:val="left"/>
+            </w:pPr>
+            <w:r>
+              <w:rPr>
+                <w:rFonts w:ascii="Times New Roman" w:cs="Times New Roman" w:eastAsia="Times New Roman" w:hAnsi="Times New Roman"/>
+                <w:b w:val="false"/>
+                <w:bCs w:val="false"/>
+                <w:sz w:val="24"/>
+                <w:szCs w:val="24"/>
+              </w:rPr>
+              <w:t xml:space="preserve">4.36</w:t>
+            </w:r>
+          </w:p>
+        </w:tc>
+        <w:tc>
+          <w:tcPr>
+            <w:tcW w:type="dxa" w:w="1100"/>
+            <w:tcBorders>
+              <w:top w:val="single" w:color="000000" w:sz="4"/>
+              <w:left w:val="single" w:color="000000" w:sz="4"/>
+              <w:bottom w:val="single" w:color="000000" w:sz="4"/>
+              <w:right w:val="single" w:color="000000" w:sz="4"/>
+            </w:tcBorders>
+            <w:tcMar>
+              <w:top w:type="dxa" w:w="60"/>
+              <w:left w:type="dxa" w:w="100"/>
+              <w:bottom w:type="dxa" w:w="60"/>
+              <w:right w:type="dxa" w:w="100"/>
+            </w:tcMar>
+          </w:tcPr>
+          <w:p>
+            <w:pPr>
+              <w:spacing w:line="276"/>
+              <w:jc w:val="left"/>
+            </w:pPr>
+            <w:r>
+              <w:rPr>
+                <w:rFonts w:ascii="Times New Roman" w:cs="Times New Roman" w:eastAsia="Times New Roman" w:hAnsi="Times New Roman"/>
+                <w:b w:val="false"/>
+                <w:bCs w:val="false"/>
+                <w:sz w:val="24"/>
+                <w:szCs w:val="24"/>
+              </w:rPr>
+              <w:t xml:space="preserve">4.26</w:t>
+            </w:r>
+          </w:p>
+        </w:tc>
+        <w:tc>
+          <w:tcPr>
+            <w:tcW w:type="dxa" w:w="1226"/>
+            <w:tcBorders>
+              <w:top w:val="single" w:color="000000" w:sz="4"/>
+              <w:left w:val="single" w:color="000000" w:sz="4"/>
+              <w:bottom w:val="single" w:color="000000" w:sz="4"/>
+              <w:right w:val="single" w:color="000000" w:sz="4"/>
+            </w:tcBorders>
+            <w:tcMar>
+              <w:top w:type="dxa" w:w="60"/>
+              <w:left w:type="dxa" w:w="100"/>
+              <w:bottom w:type="dxa" w:w="60"/>
+              <w:right w:type="dxa" w:w="100"/>
+            </w:tcMar>
+          </w:tcPr>
+          <w:p>
+            <w:pPr>
+              <w:spacing w:line="276"/>
+              <w:jc w:val="left"/>
+            </w:pPr>
+            <w:r>
+              <w:rPr>
+                <w:rFonts w:ascii="Times New Roman" w:cs="Times New Roman" w:eastAsia="Times New Roman" w:hAnsi="Times New Roman"/>
+                <w:b w:val="false"/>
+                <w:bCs w:val="false"/>
+                <w:sz w:val="24"/>
+                <w:szCs w:val="24"/>
+              </w:rPr>
+              <w:t xml:space="preserve">4.04</w:t>
+            </w:r>
+          </w:p>
+        </w:tc>
+      </w:tr>
+      <w:tr>
+        <w:trPr>
+          <w:cantSplit/>
+          <w:tblHeader w:val="false"/>
+        </w:trPr>
+        <w:tc>
+          <w:tcPr>
+            <w:tcW w:type="dxa" w:w="2300"/>
+            <w:tcBorders>
+              <w:top w:val="single" w:color="000000" w:sz="4"/>
+              <w:left w:val="single" w:color="000000" w:sz="4"/>
+              <w:bottom w:val="single" w:color="000000" w:sz="4"/>
+              <w:right w:val="single" w:color="000000" w:sz="4"/>
+            </w:tcBorders>
+            <w:tcMar>
+              <w:top w:type="dxa" w:w="60"/>
+              <w:left w:type="dxa" w:w="100"/>
+              <w:bottom w:type="dxa" w:w="60"/>
+              <w:right w:type="dxa" w:w="100"/>
+            </w:tcMar>
+          </w:tcPr>
+          <w:p>
+            <w:pPr>
+              <w:spacing w:line="276"/>
+              <w:jc w:val="left"/>
+            </w:pPr>
+            <w:r>
+              <w:rPr>
+                <w:rFonts w:ascii="Times New Roman" w:cs="Times New Roman" w:eastAsia="Times New Roman" w:hAnsi="Times New Roman"/>
+                <w:b w:val="false"/>
+                <w:bCs w:val="false"/>
+                <w:sz w:val="24"/>
+                <w:szCs w:val="24"/>
+              </w:rPr>
+              <w:t xml:space="preserve">Satellite-like</w:t>
+            </w:r>
+          </w:p>
+        </w:tc>
+        <w:tc>
+          <w:tcPr>
+            <w:tcW w:type="dxa" w:w="1100"/>
+            <w:tcBorders>
+              <w:top w:val="single" w:color="000000" w:sz="4"/>
+              <w:left w:val="single" w:color="000000" w:sz="4"/>
+              <w:bottom w:val="single" w:color="000000" w:sz="4"/>
+              <w:right w:val="single" w:color="000000" w:sz="4"/>
+            </w:tcBorders>
+            <w:tcMar>
+              <w:top w:type="dxa" w:w="60"/>
+              <w:left w:type="dxa" w:w="100"/>
+              <w:bottom w:type="dxa" w:w="60"/>
+              <w:right w:type="dxa" w:w="100"/>
+            </w:tcMar>
+          </w:tcPr>
+          <w:p>
+            <w:pPr>
+              <w:spacing w:line="276"/>
+              <w:jc w:val="left"/>
+            </w:pPr>
+            <w:r>
+              <w:rPr>
+                <w:rFonts w:ascii="Times New Roman" w:cs="Times New Roman" w:eastAsia="Times New Roman" w:hAnsi="Times New Roman"/>
+                <w:b w:val="false"/>
+                <w:bCs w:val="false"/>
+                <w:sz w:val="24"/>
+                <w:szCs w:val="24"/>
+              </w:rPr>
+              <w:t xml:space="preserve">26.67</w:t>
+            </w:r>
+          </w:p>
+        </w:tc>
+        <w:tc>
+          <w:tcPr>
+            <w:tcW w:type="dxa" w:w="1100"/>
+            <w:tcBorders>
+              <w:top w:val="single" w:color="000000" w:sz="4"/>
+              <w:left w:val="single" w:color="000000" w:sz="4"/>
+              <w:bottom w:val="single" w:color="000000" w:sz="4"/>
+              <w:right w:val="single" w:color="000000" w:sz="4"/>
+            </w:tcBorders>
+            <w:tcMar>
+              <w:top w:type="dxa" w:w="60"/>
+              <w:left w:type="dxa" w:w="100"/>
+              <w:bottom w:type="dxa" w:w="60"/>
+              <w:right w:type="dxa" w:w="100"/>
+            </w:tcMar>
+          </w:tcPr>
+          <w:p>
+            <w:pPr>
+              <w:spacing w:line="276"/>
+              <w:jc w:val="left"/>
+            </w:pPr>
+            <w:r>
+              <w:rPr>
+                <w:rFonts w:ascii="Times New Roman" w:cs="Times New Roman" w:eastAsia="Times New Roman" w:hAnsi="Times New Roman"/>
+                <w:b w:val="false"/>
+                <w:bCs w:val="false"/>
+                <w:sz w:val="24"/>
+                <w:szCs w:val="24"/>
+              </w:rPr>
+              <w:t xml:space="preserve">19.10</w:t>
+            </w:r>
+          </w:p>
+        </w:tc>
+        <w:tc>
+          <w:tcPr>
+            <w:tcW w:type="dxa" w:w="1100"/>
+            <w:tcBorders>
+              <w:top w:val="single" w:color="000000" w:sz="4"/>
+              <w:left w:val="single" w:color="000000" w:sz="4"/>
+              <w:bottom w:val="single" w:color="000000" w:sz="4"/>
+              <w:right w:val="single" w:color="000000" w:sz="4"/>
+            </w:tcBorders>
+            <w:tcMar>
+              <w:top w:type="dxa" w:w="60"/>
+              <w:left w:type="dxa" w:w="100"/>
+              <w:bottom w:type="dxa" w:w="60"/>
+              <w:right w:type="dxa" w:w="100"/>
+            </w:tcMar>
+          </w:tcPr>
+          <w:p>
+            <w:pPr>
+              <w:spacing w:line="276"/>
+              <w:jc w:val="left"/>
+            </w:pPr>
+            <w:r>
+              <w:rPr>
+                <w:rFonts w:ascii="Times New Roman" w:cs="Times New Roman" w:eastAsia="Times New Roman" w:hAnsi="Times New Roman"/>
+                <w:b w:val="false"/>
+                <w:bCs w:val="false"/>
+                <w:sz w:val="24"/>
+                <w:szCs w:val="24"/>
+              </w:rPr>
+              <w:t xml:space="preserve">16.68</w:t>
+            </w:r>
+          </w:p>
+        </w:tc>
+        <w:tc>
+          <w:tcPr>
+            <w:tcW w:type="dxa" w:w="1100"/>
+            <w:tcBorders>
+              <w:top w:val="single" w:color="000000" w:sz="4"/>
+              <w:left w:val="single" w:color="000000" w:sz="4"/>
+              <w:bottom w:val="single" w:color="000000" w:sz="4"/>
+              <w:right w:val="single" w:color="000000" w:sz="4"/>
+            </w:tcBorders>
+            <w:tcMar>
+              <w:top w:type="dxa" w:w="60"/>
+              <w:left w:type="dxa" w:w="100"/>
+              <w:bottom w:type="dxa" w:w="60"/>
+              <w:right w:type="dxa" w:w="100"/>
+            </w:tcMar>
+          </w:tcPr>
+          <w:p>
+            <w:pPr>
+              <w:spacing w:line="276"/>
+              <w:jc w:val="left"/>
+            </w:pPr>
+            <w:r>
+              <w:rPr>
+                <w:rFonts w:ascii="Times New Roman" w:cs="Times New Roman" w:eastAsia="Times New Roman" w:hAnsi="Times New Roman"/>
+                <w:b w:val="false"/>
+                <w:bCs w:val="false"/>
+                <w:sz w:val="24"/>
+                <w:szCs w:val="24"/>
+              </w:rPr>
+              <w:t xml:space="preserve">13.06</w:t>
+            </w:r>
+          </w:p>
+        </w:tc>
+        <w:tc>
+          <w:tcPr>
+            <w:tcW w:type="dxa" w:w="1100"/>
+            <w:tcBorders>
+              <w:top w:val="single" w:color="000000" w:sz="4"/>
+              <w:left w:val="single" w:color="000000" w:sz="4"/>
+              <w:bottom w:val="single" w:color="000000" w:sz="4"/>
+              <w:right w:val="single" w:color="000000" w:sz="4"/>
+            </w:tcBorders>
+            <w:tcMar>
+              <w:top w:type="dxa" w:w="60"/>
+              <w:left w:type="dxa" w:w="100"/>
+              <w:bottom w:type="dxa" w:w="60"/>
+              <w:right w:type="dxa" w:w="100"/>
+            </w:tcMar>
+          </w:tcPr>
+          <w:p>
+            <w:pPr>
+              <w:spacing w:line="276"/>
+              <w:jc w:val="left"/>
+            </w:pPr>
+            <w:r>
+              <w:rPr>
+                <w:rFonts w:ascii="Times New Roman" w:cs="Times New Roman" w:eastAsia="Times New Roman" w:hAnsi="Times New Roman"/>
+                <w:b w:val="false"/>
+                <w:bCs w:val="false"/>
+                <w:sz w:val="24"/>
+                <w:szCs w:val="24"/>
+              </w:rPr>
+              <w:t xml:space="preserve">8.20</w:t>
+            </w:r>
+          </w:p>
+        </w:tc>
+        <w:tc>
+          <w:tcPr>
+            <w:tcW w:type="dxa" w:w="1226"/>
+            <w:tcBorders>
+              <w:top w:val="single" w:color="000000" w:sz="4"/>
+              <w:left w:val="single" w:color="000000" w:sz="4"/>
+              <w:bottom w:val="single" w:color="000000" w:sz="4"/>
+              <w:right w:val="single" w:color="000000" w:sz="4"/>
+            </w:tcBorders>
+            <w:tcMar>
+              <w:top w:type="dxa" w:w="60"/>
+              <w:left w:type="dxa" w:w="100"/>
+              <w:bottom w:type="dxa" w:w="60"/>
+              <w:right w:type="dxa" w:w="100"/>
+            </w:tcMar>
+          </w:tcPr>
+          <w:p>
+            <w:pPr>
+              <w:spacing w:line="276"/>
+              <w:jc w:val="left"/>
+            </w:pPr>
+            <w:r>
+              <w:rPr>
+                <w:rFonts w:ascii="Times New Roman" w:cs="Times New Roman" w:eastAsia="Times New Roman" w:hAnsi="Times New Roman"/>
+                <w:b w:val="false"/>
+                <w:bCs w:val="false"/>
+                <w:sz w:val="24"/>
+                <w:szCs w:val="24"/>
+              </w:rPr>
+              <w:t xml:space="preserve">6.30</w:t>
+            </w:r>
+          </w:p>
+        </w:tc>
+      </w:tr>
+      <w:tr>
+        <w:trPr>
+          <w:cantSplit/>
+          <w:tblHeader w:val="false"/>
+        </w:trPr>
+        <w:tc>
+          <w:tcPr>
+            <w:tcW w:type="dxa" w:w="2300"/>
+            <w:tcBorders>
+              <w:top w:val="single" w:color="000000" w:sz="4"/>
+              <w:left w:val="single" w:color="000000" w:sz="4"/>
+              <w:bottom w:val="single" w:color="000000" w:sz="4"/>
+              <w:right w:val="single" w:color="000000" w:sz="4"/>
+            </w:tcBorders>
+            <w:tcMar>
+              <w:top w:type="dxa" w:w="60"/>
+              <w:left w:type="dxa" w:w="100"/>
+              <w:bottom w:type="dxa" w:w="60"/>
+              <w:right w:type="dxa" w:w="100"/>
+            </w:tcMar>
+          </w:tcPr>
+          <w:p>
+            <w:pPr>
+              <w:spacing w:line="276"/>
+              <w:jc w:val="left"/>
+            </w:pPr>
+            <w:r>
+              <w:rPr>
+                <w:rFonts w:ascii="Times New Roman" w:cs="Times New Roman" w:eastAsia="Times New Roman" w:hAnsi="Times New Roman"/>
+                <w:b w:val="false"/>
+                <w:bCs w:val="false"/>
+                <w:sz w:val="24"/>
+                <w:szCs w:val="24"/>
+              </w:rPr>
+              <w:t xml:space="preserve">Fast</w:t>
+            </w:r>
+          </w:p>
+        </w:tc>
+        <w:tc>
+          <w:tcPr>
+            <w:tcW w:type="dxa" w:w="1100"/>
+            <w:tcBorders>
+              <w:top w:val="single" w:color="000000" w:sz="4"/>
+              <w:left w:val="single" w:color="000000" w:sz="4"/>
+              <w:bottom w:val="single" w:color="000000" w:sz="4"/>
+              <w:right w:val="single" w:color="000000" w:sz="4"/>
+            </w:tcBorders>
+            <w:tcMar>
+              <w:top w:type="dxa" w:w="60"/>
+              <w:left w:type="dxa" w:w="100"/>
+              <w:bottom w:type="dxa" w:w="60"/>
+              <w:right w:type="dxa" w:w="100"/>
+            </w:tcMar>
+          </w:tcPr>
+          <w:p>
+            <w:pPr>
+              <w:spacing w:line="276"/>
+              <w:jc w:val="left"/>
+            </w:pPr>
+            <w:r>
+              <w:rPr>
+                <w:rFonts w:ascii="Times New Roman" w:cs="Times New Roman" w:eastAsia="Times New Roman" w:hAnsi="Times New Roman"/>
+                <w:b w:val="false"/>
+                <w:bCs w:val="false"/>
+                <w:sz w:val="24"/>
+                <w:szCs w:val="24"/>
+              </w:rPr>
+              <w:t xml:space="preserve">18.53</w:t>
+            </w:r>
+          </w:p>
+        </w:tc>
+        <w:tc>
+          <w:tcPr>
+            <w:tcW w:type="dxa" w:w="1100"/>
+            <w:tcBorders>
+              <w:top w:val="single" w:color="000000" w:sz="4"/>
+              <w:left w:val="single" w:color="000000" w:sz="4"/>
+              <w:bottom w:val="single" w:color="000000" w:sz="4"/>
+              <w:right w:val="single" w:color="000000" w:sz="4"/>
+            </w:tcBorders>
+            <w:tcMar>
+              <w:top w:type="dxa" w:w="60"/>
+              <w:left w:type="dxa" w:w="100"/>
+              <w:bottom w:type="dxa" w:w="60"/>
+              <w:right w:type="dxa" w:w="100"/>
+            </w:tcMar>
+          </w:tcPr>
+          <w:p>
+            <w:pPr>
+              <w:spacing w:line="276"/>
+              <w:jc w:val="left"/>
+            </w:pPr>
+            <w:r>
+              <w:rPr>
+                <w:rFonts w:ascii="Times New Roman" w:cs="Times New Roman" w:eastAsia="Times New Roman" w:hAnsi="Times New Roman"/>
+                <w:b w:val="false"/>
+                <w:bCs w:val="false"/>
+                <w:sz w:val="24"/>
+                <w:szCs w:val="24"/>
+              </w:rPr>
+              <w:t xml:space="preserve">17.66</w:t>
+            </w:r>
+          </w:p>
+        </w:tc>
+        <w:tc>
+          <w:tcPr>
+            <w:tcW w:type="dxa" w:w="1100"/>
+            <w:tcBorders>
+              <w:top w:val="single" w:color="000000" w:sz="4"/>
+              <w:left w:val="single" w:color="000000" w:sz="4"/>
+              <w:bottom w:val="single" w:color="000000" w:sz="4"/>
+              <w:right w:val="single" w:color="000000" w:sz="4"/>
+            </w:tcBorders>
+            <w:tcMar>
+              <w:top w:type="dxa" w:w="60"/>
+              <w:left w:type="dxa" w:w="100"/>
+              <w:bottom w:type="dxa" w:w="60"/>
+              <w:right w:type="dxa" w:w="100"/>
+            </w:tcMar>
+          </w:tcPr>
+          <w:p>
+            <w:pPr>
+              <w:spacing w:line="276"/>
+              <w:jc w:val="left"/>
+            </w:pPr>
+            <w:r>
+              <w:rPr>
+                <w:rFonts w:ascii="Times New Roman" w:cs="Times New Roman" w:eastAsia="Times New Roman" w:hAnsi="Times New Roman"/>
+                <w:b w:val="false"/>
+                <w:bCs w:val="false"/>
+                <w:sz w:val="24"/>
+                <w:szCs w:val="24"/>
+              </w:rPr>
+              <w:t xml:space="preserve">14.39</w:t>
+            </w:r>
+          </w:p>
+        </w:tc>
+        <w:tc>
+          <w:tcPr>
+            <w:tcW w:type="dxa" w:w="1100"/>
+            <w:tcBorders>
+              <w:top w:val="single" w:color="000000" w:sz="4"/>
+              <w:left w:val="single" w:color="000000" w:sz="4"/>
+              <w:bottom w:val="single" w:color="000000" w:sz="4"/>
+              <w:right w:val="single" w:color="000000" w:sz="4"/>
+            </w:tcBorders>
+            <w:tcMar>
+              <w:top w:type="dxa" w:w="60"/>
+              <w:left w:type="dxa" w:w="100"/>
+              <w:bottom w:type="dxa" w:w="60"/>
+              <w:right w:type="dxa" w:w="100"/>
+            </w:tcMar>
+          </w:tcPr>
+          <w:p>
+            <w:pPr>
+              <w:spacing w:line="276"/>
+              <w:jc w:val="left"/>
+            </w:pPr>
+            <w:r>
+              <w:rPr>
+                <w:rFonts w:ascii="Times New Roman" w:cs="Times New Roman" w:eastAsia="Times New Roman" w:hAnsi="Times New Roman"/>
+                <w:b w:val="false"/>
+                <w:bCs w:val="false"/>
+                <w:sz w:val="24"/>
+                <w:szCs w:val="24"/>
+              </w:rPr>
+              <w:t xml:space="preserve">12.21</w:t>
+            </w:r>
+          </w:p>
+        </w:tc>
+        <w:tc>
+          <w:tcPr>
+            <w:tcW w:type="dxa" w:w="1100"/>
+            <w:tcBorders>
+              <w:top w:val="single" w:color="000000" w:sz="4"/>
+              <w:left w:val="single" w:color="000000" w:sz="4"/>
+              <w:bottom w:val="single" w:color="000000" w:sz="4"/>
+              <w:right w:val="single" w:color="000000" w:sz="4"/>
+            </w:tcBorders>
+            <w:tcMar>
+              <w:top w:type="dxa" w:w="60"/>
+              <w:left w:type="dxa" w:w="100"/>
+              <w:bottom w:type="dxa" w:w="60"/>
+              <w:right w:type="dxa" w:w="100"/>
+            </w:tcMar>
+          </w:tcPr>
+          <w:p>
+            <w:pPr>
+              <w:spacing w:line="276"/>
+              <w:jc w:val="left"/>
+            </w:pPr>
+            <w:r>
+              <w:rPr>
+                <w:rFonts w:ascii="Times New Roman" w:cs="Times New Roman" w:eastAsia="Times New Roman" w:hAnsi="Times New Roman"/>
+                <w:b w:val="false"/>
+                <w:bCs w:val="false"/>
+                <w:sz w:val="24"/>
+                <w:szCs w:val="24"/>
+              </w:rPr>
+              <w:t xml:space="preserve">6.64</w:t>
+            </w:r>
+          </w:p>
+        </w:tc>
+        <w:tc>
+          <w:tcPr>
+            <w:tcW w:type="dxa" w:w="1226"/>
+            <w:tcBorders>
+              <w:top w:val="single" w:color="000000" w:sz="4"/>
+              <w:left w:val="single" w:color="000000" w:sz="4"/>
+              <w:bottom w:val="single" w:color="000000" w:sz="4"/>
+              <w:right w:val="single" w:color="000000" w:sz="4"/>
+            </w:tcBorders>
+            <w:tcMar>
+              <w:top w:type="dxa" w:w="60"/>
+              <w:left w:type="dxa" w:w="100"/>
+              <w:bottom w:type="dxa" w:w="60"/>
+              <w:right w:type="dxa" w:w="100"/>
+            </w:tcMar>
+          </w:tcPr>
+          <w:p>
+            <w:pPr>
+              <w:spacing w:line="276"/>
+              <w:jc w:val="left"/>
+            </w:pPr>
+            <w:r>
+              <w:rPr>
+                <w:rFonts w:ascii="Times New Roman" w:cs="Times New Roman" w:eastAsia="Times New Roman" w:hAnsi="Times New Roman"/>
+                <w:b w:val="false"/>
+                <w:bCs w:val="false"/>
+                <w:sz w:val="24"/>
+                <w:szCs w:val="24"/>
+              </w:rPr>
+              <w:t xml:space="preserve">3.99</w:t>
+            </w:r>
+          </w:p>
+        </w:tc>
+      </w:tr>
+    </w:tbl>
+    <w:p>
+      <w:pPr>
+        <w:spacing w:after="160"/>
+      </w:pPr>
+    </w:p>
+    <w:p>
+      <w:pPr>
         <w:pStyle w:val="Heading1"/>
         <w:keepNext/>
         <w:spacing w:after="120" w:before="240" w:line="360"/>
@@ -24851,6 +26982,25 @@
           <w:szCs w:val="24"/>
         </w:rPr>
         <w:t xml:space="preserve">Testing Selective Repeat on a real path where throughput, not the bottleneck rate, limits the transfer, and re-running the simulator studies with it as the default (RUDP_SR=1).</w:t>
+      </w:r>
+    </w:p>
+    <w:p>
+      <w:pPr>
+        <w:pStyle w:val="ListParagraph"/>
+        <w:numPr>
+          <w:ilvl w:val="0"/>
+          <w:numId w:val="2"/>
+        </w:numPr>
+        <w:spacing w:after="60" w:line="360"/>
+        <w:jc w:val="both"/>
+      </w:pPr>
+      <w:r>
+        <w:rPr>
+          <w:rFonts w:ascii="Times New Roman" w:cs="Times New Roman" w:eastAsia="Times New Roman" w:hAnsi="Times New Roman"/>
+          <w:sz w:val="24"/>
+          <w:szCs w:val="24"/>
+        </w:rPr>
+        <w:t xml:space="preserve">Retraining the agent for larger windows (it was trained for a cap of 32) and for long transfers, and testing on a real high-bandwidth, high-delay path.</w:t>
       </w:r>
     </w:p>
     <w:p>

</xml_diff>